<commit_message>
Update R-readme with correct figure 4 - powerpoint file
</commit_message>
<xml_diff>
--- a/LakeMeadWaterConservationProgramSuccessChallengesSuggestions_v4.docx
+++ b/LakeMeadWaterConservationProgramSuccessChallengesSuggestions_v4.docx
@@ -379,19 +379,13 @@
         <w:t>, with</w:t>
       </w:r>
       <w:r>
-        <w:t xml:space="preserve"> 3.6 million acre</w:t>
-      </w:r>
-      <w:r>
-        <w:t xml:space="preserve">-feet </w:t>
-      </w:r>
-      <w:r>
-        <w:t xml:space="preserve">of </w:t>
-      </w:r>
-      <w:r>
-        <w:t xml:space="preserve">conserved water </w:t>
-      </w:r>
-      <w:r>
-        <w:t>presently remaining in Lake Mead. These efforts kept Lake Mead storage above critical elevations through the recent 20-year (and ongoing) dry period. The voluntary water conservation program operates on the assumption that annual physically available water (reservoir inflow minus evaporation) exceeds legal entitlements of 9.0 million acre-feet per year to allow reservoirs to recover. This assumption is challenged as the Colorado River Basin becomes more arid. Additionally, as reservoir storage declines towards catastrophic elevations, users will face difficulty accessing and withdrawing their conserved water. We suggest two novel improvements that tie accounting of reductions to the annual physically available water, rather than historical entitlements: 1) Proportionally reduce credits for conserved water, and 2) Create a new protection account to be managed by the U.S. Bureau of Reclamation (USBR), with separate water accounts for each user. Through these structures, the USBR would first take a share of the physically available water that is equal to reservoir evaporation to sustain the protected volume. Then, users would</w:t>
+        <w:t xml:space="preserve"> 3.6 million acre-feet </w:t>
+      </w:r>
+      <w:r>
+        <w:t xml:space="preserve">of conserved water </w:t>
+      </w:r>
+      <w:r>
+        <w:t>presently remaining in Lake Mead. These efforts kept Lake Mead storage above critical elevations through the recent 20-year (and ongoing) dry period. The voluntary water conservation program operates on the assumption that annual physically available water (reservoir inflow minus evaporation) exceeds legal entitlements of 9.0 million acre-feet per year. This assumption is challenged as the Colorado River Basin becomes more arid. Additionally, as reservoir storage declines towards catastrophic elevations, users will face difficulty accessing and withdrawing their conserved water. We suggest two novel improvements that tie accounting of reductions to the annual physically available water, rather than historical entitlements: 1) Proportionally reduce credits for conserved water, and 2) Create a new protection account to be managed by the U.S. Bureau of Reclamation (USBR), with separate water accounts for each user. Through these structures, the USBR would first take a share of the physically available water that is equal to reservoir evaporation to sustain the protected volume. Then, users would</w:t>
       </w:r>
       <w:r>
         <w:t xml:space="preserve"> </w:t>
@@ -409,7 +403,7 @@
         <w:t xml:space="preserve"> more adaptability and </w:t>
       </w:r>
       <w:r>
-        <w:t xml:space="preserve"> autonomy to manage their differing and, sometimes, conflicting risks of declining flows. These strategies can serve as examples for other water systems that face aridity, declining reservoir storage, and user conflicts.</w:t>
+        <w:t>autonomy to manage their differing and, sometimes, conflicting risks of declining flows. These strategies can serve as examples for other water systems that face aridity, declining reservoir storage, and user conflicts.</w:t>
       </w:r>
     </w:p>
     <w:p>
@@ -1655,32 +1649,40 @@
           <w:sz w:val="24"/>
           <w:szCs w:val="24"/>
         </w:rPr>
-        <w:t xml:space="preserve"> wrote that the program was the “most imaginative” part of the 2007 Interim Guidelines and that the program will increase water supply or make supply more productive.  Agencies that participate in the program are no longer subject to "use it or lose it" common to laws that do not incentivize conservation and continue to govern water use in many western states. If a water user consumes less than their legal entitlement, without the program, a state could potentially reclaim the water users’ allocation and assign the water right to a different user or use. </w:t>
-      </w:r>
-    </w:p>
-    <w:p>
-      <w:pPr>
-        <w:rPr>
-          <w:rFonts w:asciiTheme="majorBidi" w:hAnsiTheme="majorBidi" w:cstheme="majorBidi"/>
-          <w:sz w:val="24"/>
-          <w:szCs w:val="24"/>
-        </w:rPr>
-      </w:pPr>
-      <w:r>
-        <w:rPr>
-          <w:rFonts w:asciiTheme="majorBidi" w:hAnsiTheme="majorBidi" w:cstheme="majorBidi"/>
-          <w:sz w:val="24"/>
-          <w:szCs w:val="24"/>
-        </w:rPr>
-        <w:t xml:space="preserve">The program had </w:t>
-      </w:r>
-      <w:r>
-        <w:rPr>
-          <w:rFonts w:asciiTheme="majorBidi" w:hAnsiTheme="majorBidi" w:cstheme="majorBidi"/>
-          <w:sz w:val="24"/>
-          <w:szCs w:val="24"/>
-        </w:rPr>
-        <w:t xml:space="preserve">modest activities through 2015 </w:t>
+        <w:t xml:space="preserve"> wrote that the program was the “most imaginative” part of the 2007 Interim Guidelines and that the program will increase water supply or make supply more productive.  Agencies that participate in the program are no longer subject to "use it or lose it" common to laws that do not incentivize conservation and continue to govern water use in many western states. </w:t>
+      </w:r>
+      <w:r>
+        <w:rPr>
+          <w:rFonts w:asciiTheme="majorBidi" w:hAnsiTheme="majorBidi" w:cstheme="majorBidi"/>
+          <w:sz w:val="24"/>
+          <w:szCs w:val="24"/>
+        </w:rPr>
+        <w:t>Without the program, i</w:t>
+      </w:r>
+      <w:r>
+        <w:rPr>
+          <w:rFonts w:asciiTheme="majorBidi" w:hAnsiTheme="majorBidi" w:cstheme="majorBidi"/>
+          <w:sz w:val="24"/>
+          <w:szCs w:val="24"/>
+        </w:rPr>
+        <w:t xml:space="preserve">f a water user consumes less than their legal entitlement, a state could potentially reclaim the water users’ allocation and assign the water right to a different user or use. </w:t>
+      </w:r>
+    </w:p>
+    <w:p>
+      <w:pPr>
+        <w:rPr>
+          <w:rFonts w:asciiTheme="majorBidi" w:hAnsiTheme="majorBidi" w:cstheme="majorBidi"/>
+          <w:sz w:val="24"/>
+          <w:szCs w:val="24"/>
+        </w:rPr>
+      </w:pPr>
+      <w:r>
+        <w:rPr>
+          <w:rFonts w:asciiTheme="majorBidi" w:hAnsiTheme="majorBidi" w:cstheme="majorBidi"/>
+          <w:sz w:val="24"/>
+          <w:szCs w:val="24"/>
+        </w:rPr>
+        <w:t xml:space="preserve">The program had modest activities through 2015 </w:t>
       </w:r>
       <w:r>
         <w:rPr>
@@ -2014,15 +2016,7 @@
           <w:sz w:val="24"/>
           <w:szCs w:val="24"/>
         </w:rPr>
-        <w:t xml:space="preserve"> proposed and tested water accounts in a combined Lake Powell-Lake Mead system. Recently, USBR proposed several ways to improve the program </w:t>
-      </w:r>
-      <w:r>
-        <w:rPr>
-          <w:rFonts w:asciiTheme="majorBidi" w:hAnsiTheme="majorBidi" w:cstheme="majorBidi"/>
-          <w:sz w:val="24"/>
-          <w:szCs w:val="24"/>
-        </w:rPr>
-        <w:t xml:space="preserve">(now called Storage and </w:t>
+        <w:t xml:space="preserve"> proposed and tested water accounts in a combined Lake Powell-Lake Mead system. Recently, USBR proposed several ways to improve the program (now called Storage and </w:t>
       </w:r>
       <w:r>
         <w:rPr>
@@ -2080,15 +2074,7 @@
           <w:sz w:val="24"/>
           <w:szCs w:val="24"/>
         </w:rPr>
-        <w:t xml:space="preserve">. One option is to remove gaming between the voluntary water conservation and mandatory water shortage programs by tying mandatory shortages to the anticipated Lake Mead level if there was no voluntary activity (colloquially called “operational neutrality”). </w:t>
-      </w:r>
-      <w:r>
-        <w:rPr>
-          <w:rFonts w:asciiTheme="majorBidi" w:hAnsiTheme="majorBidi" w:cstheme="majorBidi"/>
-          <w:sz w:val="24"/>
-          <w:szCs w:val="24"/>
-        </w:rPr>
-        <w:t>A second option can move voluntarily conserved water upstream to Lake Powell to increase operational flexibility.</w:t>
+        <w:t>. One option is to remove gaming between the voluntary water conservation and mandatory water shortage programs by tying mandatory shortages to the anticipated Lake Mead level if there was no voluntary activity (colloquially called “operational neutrality”). A second option can move voluntarily conserved water upstream to Lake Powell to increase operational flexibility.</w:t>
       </w:r>
     </w:p>
     <w:p>
@@ -2393,53 +2379,16 @@
         <w:pStyle w:val="NoSpacing"/>
       </w:pPr>
       <w:r>
-        <w:t xml:space="preserve">This article provides an overview of the program, analyzes its operations to date, and </w:t>
-      </w:r>
-      <w:ins w:id="1" w:author="Erik Porse" w:date="2026-07-14T23:53:00Z" w16du:dateUtc="2026-07-14T23:53:41Z">
-        <w:r>
-          <w:t xml:space="preserve">its </w:t>
-        </w:r>
-      </w:ins>
-      <w:r>
-        <w:t xml:space="preserve">capacity for future success. The analysis is broken into five sections. First, we provide definitions and examples of Lake Mead water conservation program activities (Section 2).  Next, we share program successes and challenges (Sections 3 and 4). Finally, we share suggestions to increase </w:t>
-      </w:r>
-      <w:ins w:id="2" w:author="Anabelle Myers" w:date="2026-07-23T22:24:00Z" w16du:dateUtc="2026-07-23T22:24:54Z">
-        <w:r>
-          <w:t xml:space="preserve">water </w:t>
-        </w:r>
-      </w:ins>
-      <w:r>
-        <w:t xml:space="preserve">user autonomy to manage risk with declining flows (Section 5). The suggestions switch reservoir accounting structures for tracking water from reductions of historical entitlements to water accounting based on </w:t>
-      </w:r>
-      <w:ins w:id="3" w:author="Brittany Fager" w:date="2026-07-27T15:55:00Z" w16du:dateUtc="2026-07-27T15:55:42Z">
-        <w:r>
-          <w:t xml:space="preserve">the </w:t>
-        </w:r>
-      </w:ins>
-      <w:r>
-        <w:t xml:space="preserve">apportionment of physical reservoir inflow. We illustrate some of </w:t>
-      </w:r>
-      <w:ins w:id="4" w:author="Brittany Fager" w:date="2026-07-27T15:56:00Z" w16du:dateUtc="2026-07-27T15:56:01Z">
-        <w:r>
-          <w:t xml:space="preserve">the </w:t>
-        </w:r>
-      </w:ins>
-      <w:r>
-        <w:t xml:space="preserve">many more </w:t>
+        <w:t xml:space="preserve">This article provides an overview of the </w:t>
+      </w:r>
+      <w:r>
+        <w:t xml:space="preserve">program, analyzes its operations to date, and its capacity for future success. The analysis is broken into five sections. First, we provide definitions and examples of Lake Mead water conservation program activities (Section 2).  Next, we share program successes and challenges (Sections 3 and 4). Finally, we share suggestions to increase water user autonomy to manage risk with declining flows (Section 5). The suggestions switch reservoir accounting structures for tracking water from reductions of historical entitlements to water accounting based on the apportionment of physical reservoir inflow. We illustrate some of the many more </w:t>
       </w:r>
       <w:r>
         <w:t xml:space="preserve">adaptive and </w:t>
       </w:r>
       <w:r>
-        <w:t xml:space="preserve">autonomous strategies that water users can adopt within a water accounting framework (Section 6). The next section discusses our suggestions in the context of prior work and lists additional benefits and limitations of water accounting. This work has potential benefits to stabilize and recover Lake Mead storage while increasing </w:t>
-      </w:r>
-      <w:ins w:id="5" w:author="Anabelle Myers" w:date="2026-07-23T22:27:00Z" w16du:dateUtc="2026-07-23T22:27:44Z">
-        <w:r>
-          <w:t xml:space="preserve">water </w:t>
-        </w:r>
-      </w:ins>
-      <w:r>
-        <w:t>users autonomy to manage their differing and sometimes conflicting risks of declining and low Colorado River flow.</w:t>
+        <w:t>autonomous strategies that water users can adopt within a water accounting framework (Section 6). The next section discusses our suggestions in the context of prior work and lists additional benefits and limitations of water accounting. This work has potential benefits to stabilize and recover Lake Mead storage while increasing water users autonomy to manage their differing and sometimes conflicting risks of declining and low Colorado River flow.</w:t>
       </w:r>
     </w:p>
     <w:p>
@@ -3649,28 +3598,6 @@
           <w:szCs w:val="24"/>
         </w:rPr>
       </w:pPr>
-      <w:del w:id="6" w:author="Erik Porse" w:date="2026-07-21T23:41:00Z" w16du:dateUtc="2026-07-21T23:41:14Z">
-        <w:r>
-          <w:rPr>
-            <w:rFonts w:asciiTheme="majorBidi" w:hAnsiTheme="majorBidi" w:cstheme="majorBidi"/>
-            <w:noProof/>
-            <w:sz w:val="24"/>
-            <w:szCs w:val="24"/>
-          </w:rPr>
-          <w:delText>The e</w:delText>
-        </w:r>
-      </w:del>
-      <w:ins w:id="7" w:author="Erik Porse" w:date="2026-07-21T23:41:00Z" w16du:dateUtc="2026-07-21T23:41:14Z">
-        <w:r>
-          <w:rPr>
-            <w:rFonts w:asciiTheme="majorBidi" w:hAnsiTheme="majorBidi" w:cstheme="majorBidi"/>
-            <w:noProof/>
-            <w:sz w:val="24"/>
-            <w:szCs w:val="24"/>
-          </w:rPr>
-          <w:t>E</w:t>
-        </w:r>
-      </w:ins>
       <w:r>
         <w:rPr>
           <w:rFonts w:asciiTheme="majorBidi" w:hAnsiTheme="majorBidi" w:cstheme="majorBidi"/>
@@ -3678,7 +3605,7 @@
           <w:sz w:val="24"/>
           <w:szCs w:val="24"/>
         </w:rPr>
-        <w:t xml:space="preserve">xisting voluntary </w:t>
+        <w:t xml:space="preserve">Existing voluntary </w:t>
       </w:r>
       <w:r>
         <w:rPr>
@@ -3975,25 +3902,7 @@
           <w:sz w:val="24"/>
           <w:szCs w:val="24"/>
         </w:rPr>
-        <w:t>’s annual legal entitlement and consumptive use (</w:t>
-      </w:r>
-      <w:ins w:id="8" w:author="Anabelle Myers" w:date="2026-07-23T22:30:00Z" w16du:dateUtc="2026-07-23T22:30:48Z">
-        <w:r>
-          <w:rPr>
-            <w:rFonts w:asciiTheme="majorBidi" w:hAnsiTheme="majorBidi" w:cstheme="majorBidi"/>
-            <w:sz w:val="24"/>
-            <w:szCs w:val="24"/>
-          </w:rPr>
-          <w:t xml:space="preserve">million acre-feet or </w:t>
-        </w:r>
-      </w:ins>
-      <w:r>
-        <w:rPr>
-          <w:rFonts w:asciiTheme="majorBidi" w:hAnsiTheme="majorBidi" w:cstheme="majorBidi"/>
-          <w:sz w:val="24"/>
-          <w:szCs w:val="24"/>
-        </w:rPr>
-        <w:t>maf).</w:t>
+        <w:t>’s annual legal entitlement and consumptive use (million acre-feet or maf).</w:t>
       </w:r>
     </w:p>
     <w:p>
@@ -4657,44 +4566,40 @@
           <w:sz w:val="24"/>
           <w:szCs w:val="24"/>
         </w:rPr>
+        <w:t>Program structure</w:t>
+      </w:r>
+      <w:r>
+        <w:rPr>
+          <w:rFonts w:asciiTheme="majorBidi" w:hAnsiTheme="majorBidi" w:cstheme="majorBidi"/>
+          <w:sz w:val="24"/>
+          <w:szCs w:val="24"/>
+        </w:rPr>
+        <w:t xml:space="preserve">. The program limits credits and debits each year. The program also sets maximum water conservation account balances for the three Lower Basin states. The program </w:t>
+      </w:r>
+      <w:r>
+        <w:rPr>
+          <w:rFonts w:asciiTheme="majorBidi" w:hAnsiTheme="majorBidi" w:cstheme="majorBidi"/>
+          <w:sz w:val="24"/>
+          <w:szCs w:val="24"/>
+        </w:rPr>
         <w:lastRenderedPageBreak/>
-        <w:t>Program structure</w:t>
-      </w:r>
-      <w:r>
-        <w:rPr>
-          <w:rFonts w:asciiTheme="majorBidi" w:hAnsiTheme="majorBidi" w:cstheme="majorBidi"/>
-          <w:sz w:val="24"/>
-          <w:szCs w:val="24"/>
-        </w:rPr>
-        <w:t xml:space="preserve">. The program limits credits and debits each year. The program also sets maximum water conservation account balances for the three Lower Basin states. The program also prohibits </w:t>
-      </w:r>
-      <w:del w:id="9" w:author="Erik Porse" w:date="2026-07-21T23:42:00Z" w16du:dateUtc="2026-07-21T23:42:56Z">
-        <w:r>
-          <w:rPr>
-            <w:rFonts w:asciiTheme="majorBidi" w:hAnsiTheme="majorBidi" w:cstheme="majorBidi"/>
-            <w:sz w:val="24"/>
-            <w:szCs w:val="24"/>
-          </w:rPr>
-          <w:delText>withdraws</w:delText>
-        </w:r>
-      </w:del>
-      <w:ins w:id="10" w:author="Erik Porse" w:date="2026-07-21T23:42:00Z" w16du:dateUtc="2026-07-21T23:42:56Z">
-        <w:r>
-          <w:rPr>
-            <w:rFonts w:asciiTheme="majorBidi" w:hAnsiTheme="majorBidi" w:cstheme="majorBidi"/>
-            <w:sz w:val="24"/>
-            <w:szCs w:val="24"/>
-          </w:rPr>
-          <w:t>withdrawals</w:t>
-        </w:r>
-      </w:ins>
-      <w:r>
-        <w:rPr>
-          <w:rFonts w:asciiTheme="majorBidi" w:hAnsiTheme="majorBidi" w:cstheme="majorBidi"/>
-          <w:sz w:val="24"/>
-          <w:szCs w:val="24"/>
-        </w:rPr>
-        <w:t xml:space="preserve"> above legal entitlements when Lake Mead storage is at or below 6.0 million acre-feet (reservoir elevation of 1,025 feet). The program assesses a 5% reduction in the first year to cover increased reservoir evaporation associated with a higher Lake Mead level and surface area. The program assesses a 3% reduction in subsequent years.</w:t>
+        <w:t xml:space="preserve">also </w:t>
+      </w:r>
+      <w:r>
+        <w:rPr>
+          <w:rFonts w:asciiTheme="majorBidi" w:hAnsiTheme="majorBidi" w:cstheme="majorBidi"/>
+          <w:sz w:val="24"/>
+          <w:szCs w:val="24"/>
+        </w:rPr>
+        <w:t xml:space="preserve">prohibits withdrawals above legal </w:t>
+      </w:r>
+      <w:r>
+        <w:rPr>
+          <w:rFonts w:asciiTheme="majorBidi" w:hAnsiTheme="majorBidi" w:cstheme="majorBidi"/>
+          <w:sz w:val="24"/>
+          <w:szCs w:val="24"/>
+        </w:rPr>
+        <w:t>entitlements when Lake Mead storage is at or below 6.0 million acre-feet (reservoir elevation of 1,025 feet). The program assesses a 5% reduction in the first year to cover increased reservoir evaporation associated with a higher Lake Mead level and surface area. The program assesses a 3% reduction in subsequent years.</w:t>
       </w:r>
     </w:p>
     <w:p>
@@ -5177,26 +5082,14 @@
         </w:rPr>
         <w:t xml:space="preserve">proposed to exclude mandatory </w:t>
       </w:r>
-      <w:del w:id="11" w:author="Erik Porse" w:date="2026-07-21T23:42:00Z" w16du:dateUtc="2026-07-21T23:42:26Z">
-        <w:r>
-          <w:rPr>
-            <w:rFonts w:asciiTheme="majorBidi" w:hAnsiTheme="majorBidi" w:cstheme="majorBidi"/>
-            <w:sz w:val="24"/>
-            <w:szCs w:val="24"/>
-          </w:rPr>
-          <w:delText>shotrages</w:delText>
-        </w:r>
-      </w:del>
-      <w:ins w:id="12" w:author="Erik Porse" w:date="2026-07-21T23:42:00Z" w16du:dateUtc="2026-07-21T23:42:26Z">
-        <w:r>
-          <w:rPr>
-            <w:rFonts w:asciiTheme="majorBidi" w:hAnsiTheme="majorBidi" w:cstheme="majorBidi"/>
-            <w:sz w:val="24"/>
-            <w:szCs w:val="24"/>
-          </w:rPr>
-          <w:t>shortages</w:t>
-        </w:r>
-      </w:ins>
+      <w:r>
+        <w:rPr>
+          <w:rFonts w:asciiTheme="majorBidi" w:hAnsiTheme="majorBidi" w:cstheme="majorBidi"/>
+          <w:sz w:val="24"/>
+          <w:szCs w:val="24"/>
+        </w:rPr>
+        <w:t>shortages</w:t>
+      </w:r>
       <w:r>
         <w:rPr>
           <w:rFonts w:asciiTheme="majorBidi" w:hAnsiTheme="majorBidi" w:cstheme="majorBidi"/>
@@ -5242,7 +5135,15 @@
           <w:sz w:val="24"/>
           <w:szCs w:val="24"/>
         </w:rPr>
-        <w:t>[million acre-feet per year]</w:t>
+        <w:t>[</w:t>
+      </w:r>
+      <w:r>
+        <w:rPr>
+          <w:rFonts w:asciiTheme="majorBidi" w:hAnsiTheme="majorBidi" w:cstheme="majorBidi"/>
+          <w:sz w:val="24"/>
+          <w:szCs w:val="24"/>
+        </w:rPr>
+        <w:t>million acre-feet per year]</w:t>
       </w:r>
       <w:r>
         <w:rPr>
@@ -5548,28 +5449,16 @@
           <w:sz w:val="24"/>
           <w:szCs w:val="24"/>
         </w:rPr>
-        <w:t xml:space="preserve">Since 2007, California, Arizona, and Nevada have collectively conserved and </w:t>
-      </w:r>
-      <w:ins w:id="13" w:author="Anabelle Myers" w:date="2026-07-23T22:32:00Z" w16du:dateUtc="2026-07-23T22:32:18Z">
-        <w:r>
-          <w:rPr>
-            <w:rFonts w:asciiTheme="majorBidi" w:hAnsiTheme="majorBidi" w:cstheme="majorBidi"/>
-            <w:sz w:val="24"/>
-            <w:szCs w:val="24"/>
-          </w:rPr>
-          <w:t xml:space="preserve">have </w:t>
-        </w:r>
-      </w:ins>
-      <w:ins w:id="14" w:author="Erik Porse" w:date="2026-07-21T23:43:00Z" w16du:dateUtc="2026-07-21T23:43:27Z">
-        <w:r>
-          <w:rPr>
-            <w:rFonts w:asciiTheme="majorBidi" w:hAnsiTheme="majorBidi" w:cstheme="majorBidi"/>
-            <w:sz w:val="24"/>
-            <w:szCs w:val="24"/>
-          </w:rPr>
-          <w:t xml:space="preserve">been </w:t>
-        </w:r>
-      </w:ins>
+        <w:t xml:space="preserve">Since 2007, California, Arizona, and Nevada have collectively conserved </w:t>
+      </w:r>
+      <w:r>
+        <w:rPr>
+          <w:rFonts w:asciiTheme="majorBidi" w:hAnsiTheme="majorBidi" w:cstheme="majorBidi"/>
+          <w:sz w:val="24"/>
+          <w:szCs w:val="24"/>
+        </w:rPr>
+        <w:t xml:space="preserve">and have been </w:t>
+      </w:r>
       <w:r>
         <w:rPr>
           <w:rFonts w:asciiTheme="majorBidi" w:hAnsiTheme="majorBidi" w:cstheme="majorBidi"/>
@@ -5684,25 +5573,7 @@
           <w:sz w:val="24"/>
           <w:szCs w:val="24"/>
         </w:rPr>
-        <w:t xml:space="preserve">Each state holds account balances </w:t>
-      </w:r>
-      <w:del w:id="15" w:author="Anabelle Myers" w:date="2026-07-23T22:33:00Z" w16du:dateUtc="2026-07-23T22:33:10Z">
-        <w:r>
-          <w:rPr>
-            <w:rFonts w:asciiTheme="majorBidi" w:hAnsiTheme="majorBidi" w:cstheme="majorBidi"/>
-            <w:sz w:val="24"/>
-            <w:szCs w:val="24"/>
-          </w:rPr>
-          <w:delText xml:space="preserve">of </w:delText>
-        </w:r>
-      </w:del>
-      <w:r>
-        <w:rPr>
-          <w:rFonts w:asciiTheme="majorBidi" w:hAnsiTheme="majorBidi" w:cstheme="majorBidi"/>
-          <w:sz w:val="24"/>
-          <w:szCs w:val="24"/>
-        </w:rPr>
-        <w:t>between 0.7 (Arizona) to 1.7 (California) million acre-feet (Figure 2).</w:t>
+        <w:t>Each state holds account balances between 0.7 (Arizona) to 1.7 (California) million acre-feet (Figure 2).</w:t>
       </w:r>
     </w:p>
     <w:p>
@@ -5724,35 +5595,15 @@
           <w:sz w:val="24"/>
           <w:szCs w:val="24"/>
         </w:rPr>
-        <w:t xml:space="preserve">Account balances are often significant by comparison to consumptive use. For example, Nevada's 2025 water conservation account balance of 890,000 acre-feet is nearly </w:t>
-      </w:r>
-      <w:del w:id="16" w:author="Anabelle Myers" w:date="2026-07-23T22:36:00Z" w16du:dateUtc="2026-07-23T22:36:08Z">
-        <w:r>
-          <w:rPr>
-            <w:rFonts w:asciiTheme="majorBidi" w:hAnsiTheme="majorBidi" w:cstheme="majorBidi"/>
-            <w:sz w:val="24"/>
-            <w:szCs w:val="24"/>
-          </w:rPr>
-          <w:delText>3</w:delText>
-        </w:r>
-      </w:del>
-      <w:ins w:id="17" w:author="Anabelle Myers" w:date="2026-07-23T22:36:00Z" w16du:dateUtc="2026-07-23T22:36:06Z">
-        <w:r>
-          <w:rPr>
-            <w:rFonts w:asciiTheme="majorBidi" w:hAnsiTheme="majorBidi" w:cstheme="majorBidi"/>
-            <w:sz w:val="24"/>
-            <w:szCs w:val="24"/>
-          </w:rPr>
-          <w:t>three</w:t>
-        </w:r>
-      </w:ins>
-      <w:r>
-        <w:rPr>
-          <w:rFonts w:asciiTheme="majorBidi" w:hAnsiTheme="majorBidi" w:cstheme="majorBidi"/>
-          <w:sz w:val="24"/>
-          <w:szCs w:val="24"/>
-        </w:rPr>
-        <w:t xml:space="preserve"> times its legal entitlement of 300,000 acre-feet and almost 4.5 times its recent consumptive use of near 200,000 acre-feet per year.</w:t>
+        <w:t xml:space="preserve">Account balances are often significant by comparison to consumptive use. For example, Nevada's 2025 water conservation account balance of 890,000 acre-feet is </w:t>
+      </w:r>
+      <w:r>
+        <w:rPr>
+          <w:rFonts w:asciiTheme="majorBidi" w:hAnsiTheme="majorBidi" w:cstheme="majorBidi"/>
+          <w:sz w:val="24"/>
+          <w:szCs w:val="24"/>
+        </w:rPr>
+        <w:t>nearly three times its legal entitlement of 300,000 acre-feet and almost 4.5 times its recent consumptive use of near 200,000 acre-feet per year.</w:t>
       </w:r>
     </w:p>
     <w:p>
@@ -5820,55 +5671,7 @@
           <w:sz w:val="24"/>
           <w:szCs w:val="24"/>
         </w:rPr>
-        <w:t>Participation has exceeded the upper limits for credits allowed by the Interim Guidelines (Figure 2)</w:t>
-      </w:r>
-      <w:del w:id="18" w:author="Erik Porse" w:date="2026-07-21T23:44:00Z" w16du:dateUtc="2026-07-21T23:44:00Z">
-        <w:r>
-          <w:rPr>
-            <w:rFonts w:asciiTheme="majorBidi" w:hAnsiTheme="majorBidi" w:cstheme="majorBidi"/>
-            <w:sz w:val="24"/>
-            <w:szCs w:val="24"/>
-          </w:rPr>
-          <w:delText xml:space="preserve">. This </w:delText>
-        </w:r>
-      </w:del>
-      <w:del w:id="19" w:author="Erik Porse" w:date="2026-07-21T23:43:00Z" w16du:dateUtc="2026-07-21T23:43:54Z">
-        <w:r>
-          <w:rPr>
-            <w:rFonts w:asciiTheme="majorBidi" w:hAnsiTheme="majorBidi" w:cstheme="majorBidi"/>
-            <w:sz w:val="24"/>
-            <w:szCs w:val="24"/>
-          </w:rPr>
-          <w:delText xml:space="preserve">excess </w:delText>
-        </w:r>
-      </w:del>
-      <w:del w:id="20" w:author="Erik Porse" w:date="2026-07-21T23:44:00Z" w16du:dateUtc="2026-07-21T23:44:00Z">
-        <w:r>
-          <w:rPr>
-            <w:rFonts w:asciiTheme="majorBidi" w:hAnsiTheme="majorBidi" w:cstheme="majorBidi"/>
-            <w:sz w:val="24"/>
-            <w:szCs w:val="24"/>
-          </w:rPr>
-          <w:delText>shows</w:delText>
-        </w:r>
-      </w:del>
-      <w:ins w:id="21" w:author="Erik Porse" w:date="2026-07-21T23:44:00Z" w16du:dateUtc="2026-07-21T23:44:01Z">
-        <w:r>
-          <w:rPr>
-            <w:rFonts w:asciiTheme="majorBidi" w:hAnsiTheme="majorBidi" w:cstheme="majorBidi"/>
-            <w:sz w:val="24"/>
-            <w:szCs w:val="24"/>
-          </w:rPr>
-          <w:t>, showing that</w:t>
-        </w:r>
-      </w:ins>
-      <w:r>
-        <w:rPr>
-          <w:rFonts w:asciiTheme="majorBidi" w:hAnsiTheme="majorBidi" w:cstheme="majorBidi"/>
-          <w:sz w:val="24"/>
-          <w:szCs w:val="24"/>
-        </w:rPr>
-        <w:t xml:space="preserve"> the program has grown beyond the expectations of the designers of the program.</w:t>
+        <w:t>Participation has exceeded the upper limits for credits allowed by the Interim Guidelines (Figure 2), showing that the program has grown beyond the expectations of the designers of the program.</w:t>
       </w:r>
     </w:p>
     <w:p>
@@ -6140,14 +5943,22 @@
         <w:lastRenderedPageBreak/>
         <w:t xml:space="preserve">Mexico has conserved and </w:t>
       </w:r>
-      <w:ins w:id="22" w:author="Anabelle Myers" w:date="2026-07-23T22:44:00Z" w16du:dateUtc="2026-07-23T22:44:32Z">
+      <w:r>
+        <w:rPr>
+          <w:rFonts w:asciiTheme="majorBidi" w:hAnsiTheme="majorBidi" w:cstheme="majorBidi"/>
+          <w:sz w:val="24"/>
+          <w:szCs w:val="24"/>
+        </w:rPr>
+        <w:t>was</w:t>
+      </w:r>
+      <w:ins w:id="1" w:author="Anabelle Myers" w:date="2026-07-23T22:44:00Z" w16du:dateUtc="2026-07-23T22:44:32Z">
         <w:r>
           <w:rPr>
             <w:rFonts w:asciiTheme="majorBidi" w:hAnsiTheme="majorBidi" w:cstheme="majorBidi"/>
             <w:sz w:val="24"/>
             <w:szCs w:val="24"/>
           </w:rPr>
-          <w:t xml:space="preserve">have been </w:t>
+          <w:t xml:space="preserve"> </w:t>
         </w:r>
       </w:ins>
       <w:r>
@@ -6244,7 +6055,7 @@
         </w:rPr>
         <w:t>water conservation program</w:t>
       </w:r>
-      <w:ins w:id="23" w:author="Erik Porse" w:date="2026-07-21T23:45:00Z" w16du:dateUtc="2026-07-21T23:45:19Z">
+      <w:ins w:id="2" w:author="Erik Porse" w:date="2026-07-21T23:45:00Z" w16du:dateUtc="2026-07-21T23:45:19Z">
         <w:r>
           <w:rPr>
             <w:rFonts w:asciiTheme="majorBidi" w:hAnsiTheme="majorBidi" w:cstheme="majorBidi"/>
@@ -6636,16 +6447,32 @@
         </w:rPr>
         <w:t xml:space="preserve">States have some additional autonomy for reservoir </w:t>
       </w:r>
-      <w:commentRangeStart w:id="24"/>
-      <w:r>
-        <w:rPr>
-          <w:rFonts w:asciiTheme="majorBidi" w:hAnsiTheme="majorBidi" w:cstheme="majorBidi"/>
-          <w:sz w:val="24"/>
-          <w:szCs w:val="24"/>
-        </w:rPr>
-        <w:t xml:space="preserve">withdraws </w:t>
-      </w:r>
-      <w:commentRangeEnd w:id="24"/>
+      <w:commentRangeStart w:id="3"/>
+      <w:r>
+        <w:rPr>
+          <w:rFonts w:asciiTheme="majorBidi" w:hAnsiTheme="majorBidi" w:cstheme="majorBidi"/>
+          <w:sz w:val="24"/>
+          <w:szCs w:val="24"/>
+        </w:rPr>
+        <w:t>withdraw</w:t>
+      </w:r>
+      <w:r>
+        <w:rPr>
+          <w:rFonts w:asciiTheme="majorBidi" w:hAnsiTheme="majorBidi" w:cstheme="majorBidi"/>
+          <w:sz w:val="24"/>
+          <w:szCs w:val="24"/>
+        </w:rPr>
+        <w:t>l</w:t>
+      </w:r>
+      <w:r>
+        <w:rPr>
+          <w:rFonts w:asciiTheme="majorBidi" w:hAnsiTheme="majorBidi" w:cstheme="majorBidi"/>
+          <w:sz w:val="24"/>
+          <w:szCs w:val="24"/>
+        </w:rPr>
+        <w:t xml:space="preserve">s </w:t>
+      </w:r>
+      <w:commentRangeEnd w:id="3"/>
       <w:r>
         <w:rPr>
           <w:rStyle w:val="CommentReference"/>
@@ -6653,107 +6480,15 @@
           <w:sz w:val="24"/>
           <w:szCs w:val="24"/>
         </w:rPr>
-        <w:commentReference w:id="24"/>
-      </w:r>
-      <w:r>
-        <w:rPr>
-          <w:rFonts w:asciiTheme="majorBidi" w:hAnsiTheme="majorBidi" w:cstheme="majorBidi"/>
-          <w:sz w:val="24"/>
-          <w:szCs w:val="24"/>
-        </w:rPr>
-        <w:t xml:space="preserve">and </w:t>
-      </w:r>
-      <w:del w:id="25" w:author="Anabelle Myers" w:date="2026-07-23T22:46:00Z" w16du:dateUtc="2026-07-23T22:46:21Z">
-        <w:r>
-          <w:rPr>
-            <w:rFonts w:asciiTheme="majorBidi" w:hAnsiTheme="majorBidi" w:cstheme="majorBidi"/>
-            <w:sz w:val="24"/>
-            <w:szCs w:val="24"/>
-          </w:rPr>
-          <w:delText>to manage</w:delText>
-        </w:r>
-      </w:del>
-      <w:r>
-        <w:rPr>
-          <w:rFonts w:asciiTheme="majorBidi" w:hAnsiTheme="majorBidi" w:cstheme="majorBidi"/>
-          <w:sz w:val="24"/>
-          <w:szCs w:val="24"/>
-        </w:rPr>
-        <w:t xml:space="preserve"> vulnerability </w:t>
-      </w:r>
-      <w:ins w:id="26" w:author="Anabelle Myers" w:date="2026-07-23T22:46:00Z" w16du:dateUtc="2026-07-23T22:46:25Z">
-        <w:r>
-          <w:rPr>
-            <w:rFonts w:asciiTheme="majorBidi" w:hAnsiTheme="majorBidi" w:cstheme="majorBidi"/>
-            <w:sz w:val="24"/>
-            <w:szCs w:val="24"/>
-          </w:rPr>
-          <w:t xml:space="preserve">management </w:t>
-        </w:r>
-      </w:ins>
-      <w:r>
-        <w:rPr>
-          <w:rFonts w:asciiTheme="majorBidi" w:hAnsiTheme="majorBidi" w:cstheme="majorBidi"/>
-          <w:sz w:val="24"/>
-          <w:szCs w:val="24"/>
-        </w:rPr>
-        <w:t xml:space="preserve">independent of other </w:t>
-      </w:r>
-      <w:del w:id="27" w:author="Erik Porse" w:date="2026-07-21T23:46:00Z" w16du:dateUtc="2026-07-21T23:46:45Z">
-        <w:r>
-          <w:rPr>
-            <w:rFonts w:asciiTheme="majorBidi" w:hAnsiTheme="majorBidi" w:cstheme="majorBidi"/>
-            <w:sz w:val="24"/>
-            <w:szCs w:val="24"/>
-          </w:rPr>
-          <w:delText>states</w:delText>
-        </w:r>
-      </w:del>
-      <w:ins w:id="28" w:author="Erik Porse" w:date="2026-07-21T23:46:00Z" w16du:dateUtc="2026-07-21T23:46:45Z">
-        <w:r>
-          <w:rPr>
-            <w:rFonts w:asciiTheme="majorBidi" w:hAnsiTheme="majorBidi" w:cstheme="majorBidi"/>
-            <w:sz w:val="24"/>
-            <w:szCs w:val="24"/>
-          </w:rPr>
-          <w:t>states'</w:t>
-        </w:r>
-      </w:ins>
-      <w:r>
-        <w:rPr>
-          <w:rFonts w:asciiTheme="majorBidi" w:hAnsiTheme="majorBidi" w:cstheme="majorBidi"/>
-          <w:sz w:val="24"/>
-          <w:szCs w:val="24"/>
-        </w:rPr>
-        <w:t xml:space="preserve"> activities</w:t>
-      </w:r>
-      <w:ins w:id="29" w:author="Anabelle Myers" w:date="2026-07-23T22:47:00Z" w16du:dateUtc="2026-07-23T22:47:08Z">
-        <w:r>
-          <w:rPr>
-            <w:rFonts w:asciiTheme="majorBidi" w:hAnsiTheme="majorBidi" w:cstheme="majorBidi"/>
-            <w:sz w:val="24"/>
-            <w:szCs w:val="24"/>
-          </w:rPr>
-          <w:t xml:space="preserve"> which</w:t>
-        </w:r>
-      </w:ins>
-      <w:del w:id="30" w:author="Anabelle Myers" w:date="2026-07-23T22:47:00Z" w16du:dateUtc="2026-07-23T22:47:05Z">
-        <w:r>
-          <w:rPr>
-            <w:rFonts w:asciiTheme="majorBidi" w:hAnsiTheme="majorBidi" w:cstheme="majorBidi"/>
-            <w:sz w:val="24"/>
-            <w:szCs w:val="24"/>
-          </w:rPr>
-          <w:delText>. This autonomy</w:delText>
-        </w:r>
-      </w:del>
-      <w:r>
-        <w:rPr>
-          <w:rFonts w:asciiTheme="majorBidi" w:hAnsiTheme="majorBidi" w:cstheme="majorBidi"/>
-          <w:sz w:val="24"/>
-          <w:szCs w:val="24"/>
-        </w:rPr>
-        <w:t xml:space="preserve"> reduces conflict.</w:t>
+        <w:commentReference w:id="3"/>
+      </w:r>
+      <w:r>
+        <w:rPr>
+          <w:rFonts w:asciiTheme="majorBidi" w:hAnsiTheme="majorBidi" w:cstheme="majorBidi"/>
+          <w:sz w:val="24"/>
+          <w:szCs w:val="24"/>
+        </w:rPr>
+        <w:t>and  vulnerability management independent of other states' activities which reduces conflict.</w:t>
       </w:r>
     </w:p>
     <w:p>
@@ -6959,16 +6694,14 @@
         </w:rPr>
         <w:t xml:space="preserve">Since 2022, the conservation program has kept Lake Mead level above its protection elevation </w:t>
       </w:r>
-      <w:ins w:id="31" w:author="Anabelle Myers" w:date="2026-07-23T22:55:00Z" w16du:dateUtc="2026-07-23T22:55:54Z">
-        <w:r>
-          <w:rPr>
-            <w:rFonts w:asciiTheme="majorBidi" w:hAnsiTheme="majorBidi" w:cstheme="majorBidi"/>
-            <w:sz w:val="24"/>
-            <w:szCs w:val="24"/>
-          </w:rPr>
-          <w:t xml:space="preserve">of </w:t>
-        </w:r>
-      </w:ins>
+      <w:r>
+        <w:rPr>
+          <w:rFonts w:asciiTheme="majorBidi" w:hAnsiTheme="majorBidi" w:cstheme="majorBidi"/>
+          <w:sz w:val="24"/>
+          <w:szCs w:val="24"/>
+        </w:rPr>
+        <w:t xml:space="preserve">of </w:t>
+      </w:r>
       <w:r>
         <w:rPr>
           <w:rFonts w:asciiTheme="majorBidi" w:hAnsiTheme="majorBidi" w:cstheme="majorBidi"/>
@@ -7014,25 +6747,7 @@
           <w:sz w:val="24"/>
           <w:szCs w:val="24"/>
         </w:rPr>
-        <w:t xml:space="preserve">Despite successes, there are challenges to motivating users to continue to conserve </w:t>
-      </w:r>
-      <w:del w:id="32" w:author="Anabelle Myers" w:date="2026-07-23T22:59:00Z" w16du:dateUtc="2026-07-23T22:59:17Z">
-        <w:r>
-          <w:rPr>
-            <w:rFonts w:asciiTheme="majorBidi" w:hAnsiTheme="majorBidi" w:cstheme="majorBidi"/>
-            <w:sz w:val="24"/>
-            <w:szCs w:val="24"/>
-          </w:rPr>
-          <w:delText xml:space="preserve">water and leave that </w:delText>
-        </w:r>
-      </w:del>
-      <w:r>
-        <w:rPr>
-          <w:rFonts w:asciiTheme="majorBidi" w:hAnsiTheme="majorBidi" w:cstheme="majorBidi"/>
-          <w:sz w:val="24"/>
-          <w:szCs w:val="24"/>
-        </w:rPr>
-        <w:t>water in Lake Mead. There are also challenges to access conserved water as inflow and reservoir storage decline.</w:t>
+        <w:t>Despite successes, there are challenges to motivating users to continue to conserve water in Lake Mead. There are also challenges to access conserved water as inflow and reservoir storage decline.</w:t>
       </w:r>
     </w:p>
     <w:p>
@@ -7059,192 +6774,48 @@
           <w:sz w:val="24"/>
           <w:szCs w:val="24"/>
         </w:rPr>
-        <w:t xml:space="preserve">. States and contractors </w:t>
-      </w:r>
-      <w:ins w:id="33" w:author="Anabelle Myers" w:date="2026-07-23T23:01:00Z" w16du:dateUtc="2026-07-23T23:01:04Z">
-        <w:r>
-          <w:rPr>
-            <w:rFonts w:asciiTheme="majorBidi" w:hAnsiTheme="majorBidi" w:cstheme="majorBidi"/>
-            <w:sz w:val="24"/>
-            <w:szCs w:val="24"/>
-          </w:rPr>
-          <w:t xml:space="preserve">have </w:t>
-        </w:r>
-      </w:ins>
-      <w:r>
-        <w:rPr>
-          <w:rFonts w:asciiTheme="majorBidi" w:hAnsiTheme="majorBidi" w:cstheme="majorBidi"/>
-          <w:sz w:val="24"/>
-          <w:szCs w:val="24"/>
-        </w:rPr>
-        <w:t xml:space="preserve">conserved water with the understanding that this water would be accessible for </w:t>
-      </w:r>
-      <w:del w:id="34" w:author="Erik Porse" w:date="2026-07-21T23:47:00Z" w16du:dateUtc="2026-07-21T23:47:28Z">
-        <w:r>
-          <w:rPr>
-            <w:rFonts w:asciiTheme="majorBidi" w:hAnsiTheme="majorBidi" w:cstheme="majorBidi"/>
-            <w:sz w:val="24"/>
-            <w:szCs w:val="24"/>
-          </w:rPr>
-          <w:delText>withdraw</w:delText>
-        </w:r>
-      </w:del>
-      <w:ins w:id="35" w:author="Erik Porse" w:date="2026-07-21T23:47:00Z" w16du:dateUtc="2026-07-21T23:47:28Z">
-        <w:r>
-          <w:rPr>
-            <w:rFonts w:asciiTheme="majorBidi" w:hAnsiTheme="majorBidi" w:cstheme="majorBidi"/>
-            <w:sz w:val="24"/>
-            <w:szCs w:val="24"/>
-          </w:rPr>
-          <w:t>withdrawal</w:t>
-        </w:r>
-      </w:ins>
-      <w:r>
-        <w:rPr>
-          <w:rFonts w:asciiTheme="majorBidi" w:hAnsiTheme="majorBidi" w:cstheme="majorBidi"/>
-          <w:sz w:val="24"/>
-          <w:szCs w:val="24"/>
-        </w:rPr>
-        <w:t xml:space="preserve"> in the future. With a June 26, 2026, elevation of 1,045.6 feet (7.37 million acre-feet active storage), multiple years of debits can drawdown Lake Mead close to the protection elevation in a few years. Within the current conservation framework, Lower Basin states and Mexico </w:t>
-      </w:r>
-      <w:ins w:id="36" w:author="Anabelle Myers" w:date="2026-07-23T23:02:00Z" w16du:dateUtc="2026-07-23T23:02:56Z">
-        <w:r>
-          <w:rPr>
-            <w:rFonts w:asciiTheme="majorBidi" w:hAnsiTheme="majorBidi" w:cstheme="majorBidi"/>
-            <w:sz w:val="24"/>
-            <w:szCs w:val="24"/>
-          </w:rPr>
-          <w:t xml:space="preserve">have </w:t>
-        </w:r>
-      </w:ins>
-      <w:r>
-        <w:rPr>
-          <w:rFonts w:asciiTheme="majorBidi" w:hAnsiTheme="majorBidi" w:cstheme="majorBidi"/>
-          <w:sz w:val="24"/>
-          <w:szCs w:val="24"/>
-        </w:rPr>
-        <w:t xml:space="preserve">loaned the Colorado River system 3.6 million acre-feet of water, which </w:t>
-      </w:r>
-      <w:del w:id="37" w:author="Anabelle Myers" w:date="2026-07-23T23:04:00Z" w16du:dateUtc="2026-07-23T23:04:05Z">
-        <w:r>
-          <w:rPr>
-            <w:rFonts w:asciiTheme="majorBidi" w:hAnsiTheme="majorBidi" w:cstheme="majorBidi"/>
-            <w:sz w:val="24"/>
-            <w:szCs w:val="24"/>
-          </w:rPr>
-          <w:delText xml:space="preserve">some or all </w:delText>
-        </w:r>
-      </w:del>
-      <w:r>
-        <w:rPr>
-          <w:rFonts w:asciiTheme="majorBidi" w:hAnsiTheme="majorBidi" w:cstheme="majorBidi"/>
-          <w:sz w:val="24"/>
-          <w:szCs w:val="24"/>
-        </w:rPr>
-        <w:t xml:space="preserve">they may want to </w:t>
-      </w:r>
-      <w:del w:id="38" w:author="Anabelle Myers" w:date="2026-07-23T23:04:00Z" w16du:dateUtc="2026-07-23T23:04:12Z">
-        <w:r>
-          <w:rPr>
-            <w:rFonts w:asciiTheme="majorBidi" w:hAnsiTheme="majorBidi" w:cstheme="majorBidi"/>
-            <w:sz w:val="24"/>
-            <w:szCs w:val="24"/>
-          </w:rPr>
-          <w:delText>recover</w:delText>
-        </w:r>
-      </w:del>
-      <w:ins w:id="39" w:author="Anabelle Myers" w:date="2026-07-23T23:04:00Z" w16du:dateUtc="2026-07-23T23:04:22Z">
-        <w:r>
-          <w:rPr>
-            <w:rFonts w:asciiTheme="majorBidi" w:hAnsiTheme="majorBidi" w:cstheme="majorBidi"/>
-            <w:sz w:val="24"/>
-            <w:szCs w:val="24"/>
-          </w:rPr>
-          <w:t>withdraw</w:t>
-        </w:r>
-      </w:ins>
-      <w:r>
-        <w:rPr>
-          <w:rFonts w:asciiTheme="majorBidi" w:hAnsiTheme="majorBidi" w:cstheme="majorBidi"/>
-          <w:sz w:val="24"/>
-          <w:szCs w:val="24"/>
-        </w:rPr>
-        <w:t xml:space="preserve"> in the future. Absent systemwide goals, once users perceive that Lake Mead will drawdown close to the protection volume, they may race to </w:t>
-      </w:r>
-      <w:ins w:id="40" w:author="Anabelle Myers" w:date="2026-07-23T23:05:00Z" w16du:dateUtc="2026-07-23T23:05:48Z">
-        <w:r>
-          <w:rPr>
-            <w:rFonts w:asciiTheme="majorBidi" w:hAnsiTheme="majorBidi" w:cstheme="majorBidi"/>
-            <w:sz w:val="24"/>
-            <w:szCs w:val="24"/>
-          </w:rPr>
-          <w:t>withdraw</w:t>
-        </w:r>
-      </w:ins>
-      <w:del w:id="41" w:author="Anabelle Myers" w:date="2026-07-23T23:05:00Z" w16du:dateUtc="2026-07-23T23:05:46Z">
-        <w:r>
-          <w:rPr>
-            <w:rFonts w:asciiTheme="majorBidi" w:hAnsiTheme="majorBidi" w:cstheme="majorBidi"/>
-            <w:sz w:val="24"/>
-            <w:szCs w:val="24"/>
-          </w:rPr>
-          <w:delText>debit</w:delText>
-        </w:r>
-      </w:del>
-      <w:r>
-        <w:rPr>
-          <w:rFonts w:asciiTheme="majorBidi" w:hAnsiTheme="majorBidi" w:cstheme="majorBidi"/>
-          <w:sz w:val="24"/>
-          <w:szCs w:val="24"/>
-        </w:rPr>
-        <w:t xml:space="preserve"> their </w:t>
-      </w:r>
-      <w:ins w:id="42" w:author="Anabelle Myers" w:date="2026-07-23T23:06:00Z" w16du:dateUtc="2026-07-23T23:06:20Z">
-        <w:r>
-          <w:rPr>
-            <w:rFonts w:asciiTheme="majorBidi" w:hAnsiTheme="majorBidi" w:cstheme="majorBidi"/>
-            <w:sz w:val="24"/>
-            <w:szCs w:val="24"/>
-          </w:rPr>
-          <w:t xml:space="preserve">conserved </w:t>
-        </w:r>
-      </w:ins>
-      <w:r>
-        <w:rPr>
-          <w:rFonts w:asciiTheme="majorBidi" w:hAnsiTheme="majorBidi" w:cstheme="majorBidi"/>
-          <w:sz w:val="24"/>
-          <w:szCs w:val="24"/>
-        </w:rPr>
-        <w:t>water</w:t>
-      </w:r>
-      <w:del w:id="43" w:author="Anabelle Myers" w:date="2026-07-23T23:06:00Z" w16du:dateUtc="2026-07-23T23:06:10Z">
-        <w:r>
-          <w:rPr>
-            <w:rFonts w:asciiTheme="majorBidi" w:hAnsiTheme="majorBidi" w:cstheme="majorBidi"/>
-            <w:sz w:val="24"/>
-            <w:szCs w:val="24"/>
-          </w:rPr>
-          <w:delText xml:space="preserve"> conservation</w:delText>
-        </w:r>
-      </w:del>
-      <w:r>
-        <w:rPr>
-          <w:rFonts w:asciiTheme="majorBidi" w:hAnsiTheme="majorBidi" w:cstheme="majorBidi"/>
-          <w:sz w:val="24"/>
-          <w:szCs w:val="24"/>
-        </w:rPr>
-        <w:t xml:space="preserve"> account balances</w:t>
-      </w:r>
-      <w:del w:id="44" w:author="Anabelle Myers" w:date="2026-07-23T23:05:00Z" w16du:dateUtc="2026-07-23T23:05:37Z">
-        <w:r>
-          <w:rPr>
-            <w:rFonts w:asciiTheme="majorBidi" w:hAnsiTheme="majorBidi" w:cstheme="majorBidi"/>
-            <w:sz w:val="24"/>
-            <w:szCs w:val="24"/>
-          </w:rPr>
-          <w:delText xml:space="preserve"> to access their conserved water</w:delText>
-        </w:r>
-      </w:del>
+        <w:t xml:space="preserve">. States and contractors have conserved water with the understanding that this water would be accessible for </w:t>
+      </w:r>
+      <w:r>
+        <w:rPr>
+          <w:rFonts w:asciiTheme="majorBidi" w:hAnsiTheme="majorBidi" w:cstheme="majorBidi"/>
+          <w:sz w:val="24"/>
+          <w:szCs w:val="24"/>
+        </w:rPr>
+        <w:t xml:space="preserve">future </w:t>
+      </w:r>
+      <w:r>
+        <w:rPr>
+          <w:rFonts w:asciiTheme="majorBidi" w:hAnsiTheme="majorBidi" w:cstheme="majorBidi"/>
+          <w:sz w:val="24"/>
+          <w:szCs w:val="24"/>
+        </w:rPr>
+        <w:t xml:space="preserve">withdrawal. With a </w:t>
+      </w:r>
+      <w:r>
+        <w:rPr>
+          <w:rFonts w:asciiTheme="majorBidi" w:hAnsiTheme="majorBidi" w:cstheme="majorBidi"/>
+          <w:sz w:val="24"/>
+          <w:szCs w:val="24"/>
+        </w:rPr>
+        <w:t>July 20</w:t>
+      </w:r>
+      <w:r>
+        <w:rPr>
+          <w:rFonts w:asciiTheme="majorBidi" w:hAnsiTheme="majorBidi" w:cstheme="majorBidi"/>
+          <w:sz w:val="24"/>
+          <w:szCs w:val="24"/>
+        </w:rPr>
+        <w:t>, 2026, elevation of 1,04</w:t>
+      </w:r>
+      <w:r>
+        <w:rPr>
+          <w:rFonts w:asciiTheme="majorBidi" w:hAnsiTheme="majorBidi" w:cstheme="majorBidi"/>
+          <w:sz w:val="24"/>
+          <w:szCs w:val="24"/>
+        </w:rPr>
+        <w:t>1</w:t>
+      </w:r>
       <w:r>
         <w:rPr>
           <w:rFonts w:asciiTheme="majorBidi" w:hAnsiTheme="majorBidi" w:cstheme="majorBidi"/>
@@ -7252,6 +6823,38 @@
           <w:szCs w:val="24"/>
         </w:rPr>
         <w:t>.</w:t>
+      </w:r>
+      <w:r>
+        <w:rPr>
+          <w:rFonts w:asciiTheme="majorBidi" w:hAnsiTheme="majorBidi" w:cstheme="majorBidi"/>
+          <w:sz w:val="24"/>
+          <w:szCs w:val="24"/>
+        </w:rPr>
+        <w:t>7</w:t>
+      </w:r>
+      <w:r>
+        <w:rPr>
+          <w:rFonts w:asciiTheme="majorBidi" w:hAnsiTheme="majorBidi" w:cstheme="majorBidi"/>
+          <w:sz w:val="24"/>
+          <w:szCs w:val="24"/>
+        </w:rPr>
+        <w:t xml:space="preserve"> feet (7.</w:t>
+      </w:r>
+      <w:r>
+        <w:rPr>
+          <w:rFonts w:asciiTheme="majorBidi" w:hAnsiTheme="majorBidi" w:cstheme="majorBidi"/>
+          <w:sz w:val="24"/>
+          <w:szCs w:val="24"/>
+        </w:rPr>
+        <w:t>1</w:t>
+      </w:r>
+      <w:r>
+        <w:rPr>
+          <w:rFonts w:asciiTheme="majorBidi" w:hAnsiTheme="majorBidi" w:cstheme="majorBidi"/>
+          <w:sz w:val="24"/>
+          <w:szCs w:val="24"/>
+        </w:rPr>
+        <w:t xml:space="preserve"> million acre-feet active storage), multiple years of debits can drawdown Lake Mead close to the protection elevation in a few years. Within the current conservation framework, Lower Basin states and Mexico have loaned the Colorado River system 3.6 million acre-feet of water, which they may want to withdraw in the future. Absent systemwide goals, once users perceive that Lake Mead will drawdown close to the protection volume, they may race to withdraw their conserved water account balances.</w:t>
       </w:r>
     </w:p>
     <w:p>
@@ -7281,7 +6884,7 @@
         </w:rPr>
         <w:t xml:space="preserve">As reservoir storage </w:t>
       </w:r>
-      <w:del w:id="45" w:author="Erik Porse" w:date="2026-07-21T23:48:00Z" w16du:dateUtc="2026-07-21T23:48:08Z">
+      <w:del w:id="4" w:author="Erik Porse" w:date="2026-07-21T23:48:00Z" w16du:dateUtc="2026-07-21T23:48:08Z">
         <w:r>
           <w:rPr>
             <w:rFonts w:asciiTheme="majorBidi" w:hAnsiTheme="majorBidi" w:cstheme="majorBidi"/>
@@ -7291,7 +6894,7 @@
           <w:delText>draws down</w:delText>
         </w:r>
       </w:del>
-      <w:ins w:id="46" w:author="Erik Porse" w:date="2026-07-21T23:48:00Z" w16du:dateUtc="2026-07-21T23:48:10Z">
+      <w:ins w:id="5" w:author="Erik Porse" w:date="2026-07-21T23:48:00Z" w16du:dateUtc="2026-07-21T23:48:10Z">
         <w:r>
           <w:rPr>
             <w:rFonts w:asciiTheme="majorBidi" w:hAnsiTheme="majorBidi" w:cstheme="majorBidi"/>
@@ -7309,7 +6912,7 @@
         </w:rPr>
         <w:t xml:space="preserve"> to the protection volume, states and contractors face increasing difficulty </w:t>
       </w:r>
-      <w:del w:id="47" w:author="Erik Porse" w:date="2026-07-21T23:48:00Z" w16du:dateUtc="2026-07-21T23:48:26Z">
+      <w:del w:id="6" w:author="Erik Porse" w:date="2026-07-21T23:48:00Z" w16du:dateUtc="2026-07-21T23:48:26Z">
         <w:r>
           <w:rPr>
             <w:rFonts w:asciiTheme="majorBidi" w:hAnsiTheme="majorBidi" w:cstheme="majorBidi"/>
@@ -7319,7 +6922,7 @@
           <w:delText>to access</w:delText>
         </w:r>
       </w:del>
-      <w:ins w:id="48" w:author="Erik Porse" w:date="2026-07-21T23:48:00Z" w16du:dateUtc="2026-07-21T23:48:26Z">
+      <w:ins w:id="7" w:author="Erik Porse" w:date="2026-07-21T23:48:00Z" w16du:dateUtc="2026-07-21T23:48:26Z">
         <w:r>
           <w:rPr>
             <w:rFonts w:asciiTheme="majorBidi" w:hAnsiTheme="majorBidi" w:cstheme="majorBidi"/>
@@ -7337,7 +6940,7 @@
         </w:rPr>
         <w:t xml:space="preserve"> </w:t>
       </w:r>
-      <w:del w:id="49" w:author="Erik Porse" w:date="2026-07-21T23:48:00Z" w16du:dateUtc="2026-07-21T23:48:20Z">
+      <w:del w:id="8" w:author="Erik Porse" w:date="2026-07-21T23:48:00Z" w16du:dateUtc="2026-07-21T23:48:20Z">
         <w:r>
           <w:rPr>
             <w:rFonts w:asciiTheme="majorBidi" w:hAnsiTheme="majorBidi" w:cstheme="majorBidi"/>
@@ -7353,37 +6956,9 @@
           <w:sz w:val="24"/>
           <w:szCs w:val="24"/>
         </w:rPr>
-        <w:t xml:space="preserve">their conserved water. Their prior conserved water </w:t>
-      </w:r>
-      <w:del w:id="50" w:author="Erik Porse" w:date="2026-07-21T23:48:00Z" w16du:dateUtc="2026-07-21T23:48:43Z">
-        <w:r>
-          <w:rPr>
-            <w:rFonts w:asciiTheme="majorBidi" w:hAnsiTheme="majorBidi" w:cstheme="majorBidi"/>
-            <w:sz w:val="24"/>
-            <w:szCs w:val="24"/>
-          </w:rPr>
-          <w:delText>becomes a stranded asset</w:delText>
-        </w:r>
-      </w:del>
-      <w:ins w:id="51" w:author="Erik Porse" w:date="2026-07-21T23:49:00Z" w16du:dateUtc="2026-07-21T23:49:08Z">
-        <w:r>
-          <w:rPr>
-            <w:rFonts w:asciiTheme="majorBidi" w:hAnsiTheme="majorBidi" w:cstheme="majorBidi"/>
-            <w:sz w:val="24"/>
-            <w:szCs w:val="24"/>
-          </w:rPr>
-          <w:t>may not fully exist in the reservoir</w:t>
-        </w:r>
-      </w:ins>
-      <w:r>
-        <w:rPr>
-          <w:rFonts w:asciiTheme="majorBidi" w:hAnsiTheme="majorBidi" w:cstheme="majorBidi"/>
-          <w:sz w:val="24"/>
-          <w:szCs w:val="24"/>
-        </w:rPr>
-        <w:t xml:space="preserve">. This challenge can </w:t>
-      </w:r>
-      <w:del w:id="52" w:author="Erik Porse" w:date="2026-07-21T23:48:00Z" w16du:dateUtc="2026-07-21T23:48:50Z">
+        <w:t xml:space="preserve">their conserved water. This challenge can </w:t>
+      </w:r>
+      <w:del w:id="9" w:author="Erik Porse" w:date="2026-07-21T23:48:00Z" w16du:dateUtc="2026-07-21T23:48:50Z">
         <w:r>
           <w:rPr>
             <w:rFonts w:asciiTheme="majorBidi" w:hAnsiTheme="majorBidi" w:cstheme="majorBidi"/>
@@ -7405,16 +6980,6 @@
     <w:p>
       <w:pPr>
         <w:pStyle w:val="ListParagraph"/>
-        <w:rPr>
-          <w:rFonts w:asciiTheme="majorBidi" w:hAnsiTheme="majorBidi" w:cstheme="majorBidi"/>
-          <w:sz w:val="24"/>
-          <w:szCs w:val="24"/>
-        </w:rPr>
-      </w:pPr>
-    </w:p>
-    <w:p>
-      <w:pPr>
-        <w:pStyle w:val="ListParagraph"/>
         <w:numPr>
           <w:ilvl w:val="1"/>
           <w:numId w:val="18"/>
@@ -7434,7 +6999,7 @@
         </w:rPr>
         <w:t>Multiple states simultaneously want to withdraw</w:t>
       </w:r>
-      <w:ins w:id="53" w:author="Anabelle Myers" w:date="2026-07-23T23:07:00Z" w16du:dateUtc="2026-07-23T23:07:42Z">
+      <w:ins w:id="10" w:author="Anabelle Myers" w:date="2026-07-23T23:07:00Z" w16du:dateUtc="2026-07-23T23:07:42Z">
         <w:r>
           <w:rPr>
             <w:rFonts w:asciiTheme="majorBidi" w:hAnsiTheme="majorBidi" w:cstheme="majorBidi"/>
@@ -7484,7 +7049,7 @@
         </w:rPr>
         <w:t xml:space="preserve"> withdraws their conserved water which </w:t>
       </w:r>
-      <w:ins w:id="54" w:author="Anabelle Myers" w:date="2026-07-23T23:09:00Z" w16du:dateUtc="2026-07-23T23:09:53Z">
+      <w:ins w:id="11" w:author="Anabelle Myers" w:date="2026-07-23T23:09:00Z" w16du:dateUtc="2026-07-23T23:09:53Z">
         <w:r>
           <w:rPr>
             <w:rFonts w:asciiTheme="majorBidi" w:hAnsiTheme="majorBidi" w:cstheme="majorBidi"/>
@@ -7494,7 +7059,7 @@
           <w:t>brings</w:t>
         </w:r>
       </w:ins>
-      <w:del w:id="55" w:author="Anabelle Myers" w:date="2026-07-23T23:09:00Z" w16du:dateUtc="2026-07-23T23:09:51Z">
+      <w:del w:id="12" w:author="Anabelle Myers" w:date="2026-07-23T23:09:00Z" w16du:dateUtc="2026-07-23T23:09:51Z">
         <w:r>
           <w:rPr>
             <w:rFonts w:asciiTheme="majorBidi" w:hAnsiTheme="majorBidi" w:cstheme="majorBidi"/>
@@ -7512,7 +7077,7 @@
         </w:rPr>
         <w:t xml:space="preserve"> Lake Mead</w:t>
       </w:r>
-      <w:ins w:id="56" w:author="Anabelle Myers" w:date="2026-07-23T23:10:00Z" w16du:dateUtc="2026-07-23T23:10:05Z">
+      <w:ins w:id="13" w:author="Anabelle Myers" w:date="2026-07-23T23:10:00Z" w16du:dateUtc="2026-07-23T23:10:05Z">
         <w:r>
           <w:rPr>
             <w:rFonts w:asciiTheme="majorBidi" w:hAnsiTheme="majorBidi" w:cstheme="majorBidi"/>
@@ -7530,7 +7095,7 @@
         </w:rPr>
         <w:t xml:space="preserve"> storage towards the protection volume. This act</w:t>
       </w:r>
-      <w:del w:id="57" w:author="Anabelle Myers" w:date="2026-07-23T23:09:00Z" w16du:dateUtc="2026-07-23T23:09:09Z">
+      <w:del w:id="14" w:author="Anabelle Myers" w:date="2026-07-23T23:09:00Z" w16du:dateUtc="2026-07-23T23:09:09Z">
         <w:r>
           <w:rPr>
             <w:rFonts w:asciiTheme="majorBidi" w:hAnsiTheme="majorBidi" w:cstheme="majorBidi"/>
@@ -7548,7 +7113,7 @@
         </w:rPr>
         <w:t xml:space="preserve"> will prevent other states</w:t>
       </w:r>
-      <w:ins w:id="58" w:author="Anabelle Myers" w:date="2026-07-23T23:13:00Z" w16du:dateUtc="2026-07-23T23:13:04Z">
+      <w:ins w:id="15" w:author="Anabelle Myers" w:date="2026-07-23T23:13:00Z" w16du:dateUtc="2026-07-23T23:13:04Z">
         <w:r>
           <w:rPr>
             <w:rFonts w:asciiTheme="majorBidi" w:hAnsiTheme="majorBidi" w:cstheme="majorBidi"/>
@@ -7558,7 +7123,7 @@
           <w:t>’</w:t>
         </w:r>
       </w:ins>
-      <w:del w:id="59" w:author="Anabelle Myers" w:date="2026-07-23T23:10:00Z" w16du:dateUtc="2026-07-23T23:10:27Z">
+      <w:del w:id="16" w:author="Anabelle Myers" w:date="2026-07-23T23:10:00Z" w16du:dateUtc="2026-07-23T23:10:27Z">
         <w:r>
           <w:rPr>
             <w:rFonts w:asciiTheme="majorBidi" w:hAnsiTheme="majorBidi" w:cstheme="majorBidi"/>
@@ -7568,7 +7133,7 @@
           <w:delText xml:space="preserve"> in future years</w:delText>
         </w:r>
       </w:del>
-      <w:ins w:id="60" w:author="Anabelle Myers" w:date="2026-07-23T23:13:00Z" w16du:dateUtc="2026-07-23T23:13:15Z">
+      <w:ins w:id="17" w:author="Anabelle Myers" w:date="2026-07-23T23:13:00Z" w16du:dateUtc="2026-07-23T23:13:15Z">
         <w:r>
           <w:rPr>
             <w:rFonts w:asciiTheme="majorBidi" w:hAnsiTheme="majorBidi" w:cstheme="majorBidi"/>
@@ -7578,7 +7143,7 @@
           <w:t xml:space="preserve"> </w:t>
         </w:r>
       </w:ins>
-      <w:del w:id="61" w:author="Anabelle Myers" w:date="2026-07-23T23:13:00Z" w16du:dateUtc="2026-07-23T23:13:09Z">
+      <w:del w:id="18" w:author="Anabelle Myers" w:date="2026-07-23T23:13:00Z" w16du:dateUtc="2026-07-23T23:13:09Z">
         <w:r>
           <w:rPr>
             <w:rFonts w:asciiTheme="majorBidi" w:hAnsiTheme="majorBidi" w:cstheme="majorBidi"/>
@@ -7588,7 +7153,7 @@
           <w:delText xml:space="preserve"> from</w:delText>
         </w:r>
       </w:del>
-      <w:ins w:id="62" w:author="Anabelle Myers" w:date="2026-07-23T23:10:00Z" w16du:dateUtc="2026-07-23T23:10:48Z">
+      <w:ins w:id="19" w:author="Anabelle Myers" w:date="2026-07-23T23:10:00Z" w16du:dateUtc="2026-07-23T23:10:48Z">
         <w:r>
           <w:rPr>
             <w:rFonts w:asciiTheme="majorBidi" w:hAnsiTheme="majorBidi" w:cstheme="majorBidi"/>
@@ -7606,7 +7171,7 @@
         </w:rPr>
         <w:t xml:space="preserve"> </w:t>
       </w:r>
-      <w:ins w:id="63" w:author="Anabelle Myers" w:date="2026-07-23T23:11:00Z" w16du:dateUtc="2026-07-23T23:11:49Z">
+      <w:ins w:id="20" w:author="Anabelle Myers" w:date="2026-07-23T23:11:00Z" w16du:dateUtc="2026-07-23T23:11:49Z">
         <w:r>
           <w:rPr>
             <w:rFonts w:asciiTheme="majorBidi" w:hAnsiTheme="majorBidi" w:cstheme="majorBidi"/>
@@ -7616,7 +7181,7 @@
           <w:t>access</w:t>
         </w:r>
       </w:ins>
-      <w:ins w:id="64" w:author="Anabelle Myers" w:date="2026-07-23T23:12:00Z" w16du:dateUtc="2026-07-23T23:12:05Z">
+      <w:ins w:id="21" w:author="Anabelle Myers" w:date="2026-07-23T23:12:00Z" w16du:dateUtc="2026-07-23T23:12:05Z">
         <w:r>
           <w:rPr>
             <w:rFonts w:asciiTheme="majorBidi" w:hAnsiTheme="majorBidi" w:cstheme="majorBidi"/>
@@ -7626,7 +7191,7 @@
           <w:t xml:space="preserve"> </w:t>
         </w:r>
       </w:ins>
-      <w:del w:id="65" w:author="Anabelle Myers" w:date="2026-07-23T23:11:00Z" w16du:dateUtc="2026-07-23T23:11:46Z">
+      <w:del w:id="22" w:author="Anabelle Myers" w:date="2026-07-23T23:11:00Z" w16du:dateUtc="2026-07-23T23:11:46Z">
         <w:r>
           <w:rPr>
             <w:rFonts w:asciiTheme="majorBidi" w:hAnsiTheme="majorBidi" w:cstheme="majorBidi"/>
@@ -7636,7 +7201,7 @@
           <w:delText>draw</w:delText>
         </w:r>
       </w:del>
-      <w:del w:id="66" w:author="Anabelle Myers" w:date="2026-07-23T23:11:00Z" w16du:dateUtc="2026-07-23T23:11:06Z">
+      <w:del w:id="23" w:author="Anabelle Myers" w:date="2026-07-23T23:11:00Z" w16du:dateUtc="2026-07-23T23:11:06Z">
         <w:r>
           <w:rPr>
             <w:rFonts w:asciiTheme="majorBidi" w:hAnsiTheme="majorBidi" w:cstheme="majorBidi"/>
@@ -7657,125 +7222,6 @@
     </w:p>
     <w:p>
       <w:pPr>
-        <w:pStyle w:val="ListParagraph"/>
-        <w:numPr>
-          <w:ilvl w:val="1"/>
-          <w:numId w:val="18"/>
-        </w:numPr>
-        <w:ind w:left="630" w:hanging="270"/>
-        <w:rPr>
-          <w:rFonts w:asciiTheme="majorBidi" w:hAnsiTheme="majorBidi" w:cstheme="majorBidi"/>
-          <w:sz w:val="24"/>
-          <w:szCs w:val="24"/>
-        </w:rPr>
-      </w:pPr>
-      <w:commentRangeStart w:id="67"/>
-      <w:r>
-        <w:rPr>
-          <w:rFonts w:asciiTheme="majorBidi" w:hAnsiTheme="majorBidi" w:cstheme="majorBidi"/>
-          <w:sz w:val="24"/>
-          <w:szCs w:val="24"/>
-        </w:rPr>
-        <w:t xml:space="preserve">Other states and users take counter measures to increase their ability to access conserved water with the undesired effect </w:t>
-      </w:r>
-      <w:ins w:id="68" w:author="Anabelle Myers" w:date="2026-07-23T23:14:00Z" w16du:dateUtc="2026-07-23T23:14:41Z">
-        <w:r>
-          <w:rPr>
-            <w:rFonts w:asciiTheme="majorBidi" w:hAnsiTheme="majorBidi" w:cstheme="majorBidi"/>
-            <w:sz w:val="24"/>
-            <w:szCs w:val="24"/>
-          </w:rPr>
-          <w:t>of</w:t>
-        </w:r>
-      </w:ins>
-      <w:del w:id="69" w:author="Anabelle Myers" w:date="2026-07-23T23:14:00Z" w16du:dateUtc="2026-07-23T23:14:40Z">
-        <w:r>
-          <w:rPr>
-            <w:rFonts w:asciiTheme="majorBidi" w:hAnsiTheme="majorBidi" w:cstheme="majorBidi"/>
-            <w:sz w:val="24"/>
-            <w:szCs w:val="24"/>
-          </w:rPr>
-          <w:delText>to</w:delText>
-        </w:r>
-      </w:del>
-      <w:r>
-        <w:rPr>
-          <w:rFonts w:asciiTheme="majorBidi" w:hAnsiTheme="majorBidi" w:cstheme="majorBidi"/>
-          <w:sz w:val="24"/>
-          <w:szCs w:val="24"/>
-        </w:rPr>
-        <w:t xml:space="preserve"> further </w:t>
-      </w:r>
-      <w:ins w:id="70" w:author="Anabelle Myers" w:date="2026-07-23T23:15:00Z" w16du:dateUtc="2026-07-23T23:15:02Z">
-        <w:r>
-          <w:rPr>
-            <w:rFonts w:asciiTheme="majorBidi" w:hAnsiTheme="majorBidi" w:cstheme="majorBidi"/>
-            <w:sz w:val="24"/>
-            <w:szCs w:val="24"/>
-          </w:rPr>
-          <w:t>reducing</w:t>
-        </w:r>
-      </w:ins>
-      <w:del w:id="71" w:author="Anabelle Myers" w:date="2026-07-23T23:15:00Z" w16du:dateUtc="2026-07-23T23:15:00Z">
-        <w:r>
-          <w:rPr>
-            <w:rFonts w:asciiTheme="majorBidi" w:hAnsiTheme="majorBidi" w:cstheme="majorBidi"/>
-            <w:sz w:val="24"/>
-            <w:szCs w:val="24"/>
-          </w:rPr>
-          <w:delText>draw down</w:delText>
-        </w:r>
-      </w:del>
-      <w:r>
-        <w:rPr>
-          <w:rFonts w:asciiTheme="majorBidi" w:hAnsiTheme="majorBidi" w:cstheme="majorBidi"/>
-          <w:sz w:val="24"/>
-          <w:szCs w:val="24"/>
-        </w:rPr>
-        <w:t xml:space="preserve"> Lake</w:t>
-      </w:r>
-      <w:del w:id="72" w:author="Anabelle Myers" w:date="2026-07-23T23:15:00Z" w16du:dateUtc="2026-07-23T23:15:04Z">
-        <w:r>
-          <w:rPr>
-            <w:rFonts w:asciiTheme="majorBidi" w:hAnsiTheme="majorBidi" w:cstheme="majorBidi"/>
-            <w:sz w:val="24"/>
-            <w:szCs w:val="24"/>
-          </w:rPr>
-          <w:delText>n</w:delText>
-        </w:r>
-      </w:del>
-      <w:r>
-        <w:rPr>
-          <w:rFonts w:asciiTheme="majorBidi" w:hAnsiTheme="majorBidi" w:cstheme="majorBidi"/>
-          <w:sz w:val="24"/>
-          <w:szCs w:val="24"/>
-        </w:rPr>
-        <w:t xml:space="preserve"> Mead.</w:t>
-      </w:r>
-      <w:commentRangeEnd w:id="67"/>
-      <w:r>
-        <w:rPr>
-          <w:rStyle w:val="CommentReference"/>
-          <w:rFonts w:asciiTheme="majorBidi" w:hAnsiTheme="majorBidi" w:cstheme="majorBidi"/>
-          <w:sz w:val="24"/>
-          <w:szCs w:val="24"/>
-        </w:rPr>
-        <w:commentReference w:id="67"/>
-      </w:r>
-    </w:p>
-    <w:p>
-      <w:pPr>
-        <w:pStyle w:val="ListParagraph"/>
-        <w:ind w:left="1440"/>
-        <w:rPr>
-          <w:rFonts w:asciiTheme="majorBidi" w:hAnsiTheme="majorBidi" w:cstheme="majorBidi"/>
-          <w:sz w:val="24"/>
-          <w:szCs w:val="24"/>
-        </w:rPr>
-      </w:pPr>
-    </w:p>
-    <w:p>
-      <w:pPr>
         <w:rPr>
           <w:rFonts w:asciiTheme="majorBidi" w:hAnsiTheme="majorBidi" w:cstheme="majorBidi"/>
           <w:sz w:val="24"/>
@@ -7817,7 +7263,7 @@
         </w:rPr>
         <w:t xml:space="preserve"> Century. These needs include water for Tribal Nations</w:t>
       </w:r>
-      <w:ins w:id="73" w:author="Anabelle Myers" w:date="2026-07-23T23:23:00Z" w16du:dateUtc="2026-07-23T23:23:13Z">
+      <w:ins w:id="24" w:author="Anabelle Myers" w:date="2026-07-23T23:23:00Z" w16du:dateUtc="2026-07-23T23:23:13Z">
         <w:r>
           <w:rPr>
             <w:rFonts w:asciiTheme="majorBidi" w:hAnsiTheme="majorBidi" w:cstheme="majorBidi"/>
@@ -7827,7 +7273,7 @@
           <w:t>,</w:t>
         </w:r>
       </w:ins>
-      <w:del w:id="74" w:author="Anabelle Myers" w:date="2026-07-23T23:23:00Z" w16du:dateUtc="2026-07-23T23:23:11Z">
+      <w:del w:id="25" w:author="Anabelle Myers" w:date="2026-07-23T23:23:00Z" w16du:dateUtc="2026-07-23T23:23:11Z">
         <w:r>
           <w:rPr>
             <w:rFonts w:asciiTheme="majorBidi" w:hAnsiTheme="majorBidi" w:cstheme="majorBidi"/>
@@ -7845,7 +7291,7 @@
         </w:rPr>
         <w:t xml:space="preserve"> multi-species conservation between Hoover Dam and the Northern International Boundary with Mexico</w:t>
       </w:r>
-      <w:ins w:id="75" w:author="Anabelle Myers" w:date="2026-07-23T23:23:00Z" w16du:dateUtc="2026-07-23T23:23:29Z">
+      <w:ins w:id="26" w:author="Anabelle Myers" w:date="2026-07-23T23:23:00Z" w16du:dateUtc="2026-07-23T23:23:29Z">
         <w:r>
           <w:rPr>
             <w:rFonts w:asciiTheme="majorBidi" w:hAnsiTheme="majorBidi" w:cstheme="majorBidi"/>
@@ -7861,182 +7307,9 @@
           <w:sz w:val="24"/>
           <w:szCs w:val="24"/>
         </w:rPr>
-        <w:t xml:space="preserve">. </w:t>
-      </w:r>
-      <w:commentRangeStart w:id="76"/>
-      <w:r>
-        <w:rPr>
-          <w:rFonts w:asciiTheme="majorBidi" w:hAnsiTheme="majorBidi" w:cstheme="majorBidi"/>
-          <w:sz w:val="24"/>
-          <w:szCs w:val="24"/>
-        </w:rPr>
-        <w:t>Counter</w:t>
-      </w:r>
-      <w:ins w:id="77" w:author="Anabelle Myers" w:date="2026-07-23T23:19:00Z" w16du:dateUtc="2026-07-23T23:19:42Z">
-        <w:r>
-          <w:rPr>
-            <w:rFonts w:asciiTheme="majorBidi" w:hAnsiTheme="majorBidi" w:cstheme="majorBidi"/>
-            <w:sz w:val="24"/>
-            <w:szCs w:val="24"/>
-          </w:rPr>
-          <w:t>productivly</w:t>
-        </w:r>
-      </w:ins>
-      <w:del w:id="78" w:author="Anabelle Myers" w:date="2026-07-23T23:19:00Z" w16du:dateUtc="2026-07-23T23:19:36Z">
-        <w:r>
-          <w:rPr>
-            <w:rFonts w:asciiTheme="majorBidi" w:hAnsiTheme="majorBidi" w:cstheme="majorBidi"/>
-            <w:sz w:val="24"/>
-            <w:szCs w:val="24"/>
-          </w:rPr>
-          <w:delText>-intuitively</w:delText>
-        </w:r>
-      </w:del>
-      <w:r>
-        <w:rPr>
-          <w:rFonts w:asciiTheme="majorBidi" w:hAnsiTheme="majorBidi" w:cstheme="majorBidi"/>
-          <w:sz w:val="24"/>
-          <w:szCs w:val="24"/>
-        </w:rPr>
-        <w:t xml:space="preserve">, </w:t>
-      </w:r>
-      <w:ins w:id="79" w:author="Anabelle Myers" w:date="2026-07-23T23:19:00Z" w16du:dateUtc="2026-07-23T23:19:52Z">
-        <w:r>
-          <w:rPr>
-            <w:rFonts w:asciiTheme="majorBidi" w:hAnsiTheme="majorBidi" w:cstheme="majorBidi"/>
-            <w:sz w:val="24"/>
-            <w:szCs w:val="24"/>
-          </w:rPr>
-          <w:t xml:space="preserve">a </w:t>
-        </w:r>
-      </w:ins>
-      <w:r>
-        <w:rPr>
-          <w:rFonts w:asciiTheme="majorBidi" w:hAnsiTheme="majorBidi" w:cstheme="majorBidi"/>
-          <w:sz w:val="24"/>
-          <w:szCs w:val="24"/>
-        </w:rPr>
-        <w:t xml:space="preserve">Lake Mead </w:t>
-      </w:r>
-      <w:del w:id="80" w:author="Anabelle Myers" w:date="2026-07-23T23:20:00Z" w16du:dateUtc="2026-07-23T23:20:27Z">
-        <w:r>
-          <w:rPr>
-            <w:rFonts w:asciiTheme="majorBidi" w:hAnsiTheme="majorBidi" w:cstheme="majorBidi"/>
-            <w:sz w:val="24"/>
-            <w:szCs w:val="24"/>
-          </w:rPr>
-          <w:delText xml:space="preserve">storage above an </w:delText>
-        </w:r>
-      </w:del>
-      <w:r>
-        <w:rPr>
-          <w:rFonts w:asciiTheme="majorBidi" w:hAnsiTheme="majorBidi" w:cstheme="majorBidi"/>
-          <w:sz w:val="24"/>
-          <w:szCs w:val="24"/>
-        </w:rPr>
-        <w:t>elevation of 1,135 feet</w:t>
-      </w:r>
-      <w:ins w:id="81" w:author="Anabelle Myers" w:date="2026-07-23T23:20:00Z" w16du:dateUtc="2026-07-23T23:20:41Z">
-        <w:r>
-          <w:rPr>
-            <w:rFonts w:asciiTheme="majorBidi" w:hAnsiTheme="majorBidi" w:cstheme="majorBidi"/>
-            <w:sz w:val="24"/>
-            <w:szCs w:val="24"/>
-          </w:rPr>
-          <w:t xml:space="preserve"> or above</w:t>
-        </w:r>
-      </w:ins>
-      <w:r>
-        <w:rPr>
-          <w:rFonts w:asciiTheme="majorBidi" w:hAnsiTheme="majorBidi" w:cstheme="majorBidi"/>
-          <w:sz w:val="24"/>
-          <w:szCs w:val="24"/>
-        </w:rPr>
-        <w:t xml:space="preserve">, will submerge the Pearce Rapid and allow invasive fish in the reservoir to swim upstream </w:t>
-      </w:r>
-      <w:ins w:id="82" w:author="Anabelle Myers" w:date="2026-07-23T23:17:00Z" w16du:dateUtc="2026-07-23T23:17:58Z">
-        <w:r>
-          <w:rPr>
-            <w:rFonts w:asciiTheme="majorBidi" w:hAnsiTheme="majorBidi" w:cstheme="majorBidi"/>
-            <w:sz w:val="24"/>
-            <w:szCs w:val="24"/>
-          </w:rPr>
-          <w:t xml:space="preserve">and </w:t>
-        </w:r>
-      </w:ins>
-      <w:del w:id="83" w:author="Anabelle Myers" w:date="2026-07-23T23:17:00Z" w16du:dateUtc="2026-07-23T23:17:50Z">
-        <w:r>
-          <w:rPr>
-            <w:rFonts w:asciiTheme="majorBidi" w:hAnsiTheme="majorBidi" w:cstheme="majorBidi"/>
-            <w:sz w:val="24"/>
-            <w:szCs w:val="24"/>
-          </w:rPr>
-          <w:delText xml:space="preserve">to the </w:delText>
-        </w:r>
-      </w:del>
-      <w:r>
-        <w:rPr>
-          <w:rFonts w:asciiTheme="majorBidi" w:hAnsiTheme="majorBidi" w:cstheme="majorBidi"/>
-          <w:sz w:val="24"/>
-          <w:szCs w:val="24"/>
-        </w:rPr>
-        <w:t>detriment</w:t>
-      </w:r>
-      <w:del w:id="84" w:author="Anabelle Myers" w:date="2026-07-23T23:17:00Z" w16du:dateUtc="2026-07-23T23:17:54Z">
-        <w:r>
-          <w:rPr>
-            <w:rFonts w:asciiTheme="majorBidi" w:hAnsiTheme="majorBidi" w:cstheme="majorBidi"/>
-            <w:sz w:val="24"/>
-            <w:szCs w:val="24"/>
-          </w:rPr>
-          <w:delText xml:space="preserve"> of</w:delText>
-        </w:r>
-      </w:del>
-      <w:r>
-        <w:rPr>
-          <w:rFonts w:asciiTheme="majorBidi" w:hAnsiTheme="majorBidi" w:cstheme="majorBidi"/>
-          <w:sz w:val="24"/>
-          <w:szCs w:val="24"/>
-        </w:rPr>
-        <w:t xml:space="preserve"> native fish</w:t>
-      </w:r>
-      <w:del w:id="85" w:author="Anabelle Myers" w:date="2026-07-23T23:18:00Z" w16du:dateUtc="2026-07-23T23:18:19Z">
-        <w:r>
-          <w:rPr>
-            <w:rFonts w:asciiTheme="majorBidi" w:hAnsiTheme="majorBidi" w:cstheme="majorBidi"/>
-            <w:sz w:val="24"/>
-            <w:szCs w:val="24"/>
-          </w:rPr>
-          <w:delText xml:space="preserve"> in Grand Canyon</w:delText>
-        </w:r>
-      </w:del>
-      <w:r>
-        <w:rPr>
-          <w:rFonts w:asciiTheme="majorBidi" w:hAnsiTheme="majorBidi" w:cstheme="majorBidi"/>
-          <w:sz w:val="24"/>
-          <w:szCs w:val="24"/>
-        </w:rPr>
-        <w:t>.</w:t>
-      </w:r>
-      <w:commentRangeEnd w:id="76"/>
-      <w:r>
-        <w:rPr>
-          <w:rStyle w:val="CommentReference"/>
-          <w:rFonts w:asciiTheme="majorBidi" w:hAnsiTheme="majorBidi" w:cstheme="majorBidi"/>
-          <w:sz w:val="24"/>
-          <w:szCs w:val="24"/>
-        </w:rPr>
-        <w:commentReference w:id="76"/>
-      </w:r>
-      <w:r>
-        <w:rPr>
-          <w:rFonts w:asciiTheme="majorBidi" w:hAnsiTheme="majorBidi" w:cstheme="majorBidi"/>
-          <w:sz w:val="24"/>
-          <w:szCs w:val="24"/>
-        </w:rPr>
-        <w:t xml:space="preserve"> There is </w:t>
-      </w:r>
-      <w:ins w:id="86" w:author="Anabelle Myers" w:date="2026-07-23T23:25:00Z" w16du:dateUtc="2026-07-23T23:25:06Z">
+        <w:t xml:space="preserve">. There is </w:t>
+      </w:r>
+      <w:ins w:id="27" w:author="Anabelle Myers" w:date="2026-07-23T23:25:00Z" w16du:dateUtc="2026-07-23T23:25:06Z">
         <w:r>
           <w:rPr>
             <w:rFonts w:asciiTheme="majorBidi" w:hAnsiTheme="majorBidi" w:cstheme="majorBidi"/>
@@ -8046,7 +7319,7 @@
           <w:t>an</w:t>
         </w:r>
       </w:ins>
-      <w:del w:id="87" w:author="Anabelle Myers" w:date="2026-07-23T23:25:00Z" w16du:dateUtc="2026-07-23T23:25:05Z">
+      <w:del w:id="28" w:author="Anabelle Myers" w:date="2026-07-23T23:25:00Z" w16du:dateUtc="2026-07-23T23:25:05Z">
         <w:r>
           <w:rPr>
             <w:rFonts w:asciiTheme="majorBidi" w:hAnsiTheme="majorBidi" w:cstheme="majorBidi"/>
@@ -8064,7 +7337,7 @@
         </w:rPr>
         <w:t xml:space="preserve"> ongoing debate about what is the minimum volume of supply for municipal use</w:t>
       </w:r>
-      <w:del w:id="88" w:author="Anabelle Myers" w:date="2026-07-23T23:22:00Z" w16du:dateUtc="2026-07-23T23:22:03Z">
+      <w:del w:id="29" w:author="Anabelle Myers" w:date="2026-07-23T23:22:00Z" w16du:dateUtc="2026-07-23T23:22:03Z">
         <w:r>
           <w:rPr>
             <w:rFonts w:asciiTheme="majorBidi" w:hAnsiTheme="majorBidi" w:cstheme="majorBidi"/>
@@ -8107,36 +7380,25 @@
           <w:sz w:val="24"/>
           <w:szCs w:val="24"/>
         </w:rPr>
-        <w:t xml:space="preserve">The voluntary water conservation program functions under the assumption that the </w:t>
-      </w:r>
-      <w:commentRangeStart w:id="89"/>
-      <w:r>
-        <w:rPr>
-          <w:rFonts w:asciiTheme="majorBidi" w:hAnsiTheme="majorBidi" w:cstheme="majorBidi"/>
-          <w:sz w:val="24"/>
-          <w:szCs w:val="24"/>
-        </w:rPr>
-        <w:t>annual Lake Mead inflow minus evaporation—the annual physically available water</w:t>
-      </w:r>
-      <w:commentRangeEnd w:id="89"/>
-      <w:r>
-        <w:rPr>
-          <w:rStyle w:val="CommentReference"/>
-          <w:rFonts w:asciiTheme="majorBidi" w:hAnsiTheme="majorBidi" w:cstheme="majorBidi"/>
-          <w:sz w:val="24"/>
-          <w:szCs w:val="24"/>
-        </w:rPr>
-        <w:commentReference w:id="89"/>
-      </w:r>
-      <w:r>
-        <w:rPr>
-          <w:rFonts w:asciiTheme="majorBidi" w:hAnsiTheme="majorBidi" w:cstheme="majorBidi"/>
-          <w:sz w:val="24"/>
-          <w:szCs w:val="24"/>
-        </w:rPr>
-        <w:t>—exceeds the sum of legal entitlements of 9.0 million acre-feet per year to California, Arizona, Nevada, and Mexico. When this assumption is false, Lake Mead will draw down even as states leave conserved water in Lake Mead. Essentially, states got credit for water conservation activity even though the physical water</w:t>
-      </w:r>
-      <w:ins w:id="90" w:author="Brittany Fager" w:date="2026-07-27T15:58:00Z" w16du:dateUtc="2026-07-27T15:58:26Z">
+        <w:t>The voluntary water conservation program functions under the assumption that the annual physically available water</w:t>
+      </w:r>
+      <w:r>
+        <w:rPr>
+          <w:rFonts w:asciiTheme="majorBidi" w:hAnsiTheme="majorBidi" w:cstheme="majorBidi"/>
+          <w:sz w:val="24"/>
+          <w:szCs w:val="24"/>
+        </w:rPr>
+        <w:t xml:space="preserve"> </w:t>
+      </w:r>
+      <w:r>
+        <w:rPr>
+          <w:rFonts w:asciiTheme="majorBidi" w:hAnsiTheme="majorBidi" w:cstheme="majorBidi"/>
+          <w:sz w:val="24"/>
+          <w:szCs w:val="24"/>
+        </w:rPr>
+        <w:t>exceeds the sum of legal entitlements of 9.0 million acre-feet per year to California, Arizona, Nevada, and Mexico. When this assumption is false, Lake Mead will draw down even as states leave conserved water in Lake Mead. Essentially, states got credit for water conservation activity even though the physical water</w:t>
+      </w:r>
+      <w:ins w:id="30" w:author="Brittany Fager" w:date="2026-07-27T15:58:00Z" w16du:dateUtc="2026-07-27T15:58:26Z">
         <w:r>
           <w:rPr>
             <w:rFonts w:asciiTheme="majorBidi" w:hAnsiTheme="majorBidi" w:cstheme="majorBidi"/>
@@ -8154,7 +7416,7 @@
         </w:rPr>
         <w:t xml:space="preserve"> never entered the reservoir. There are </w:t>
       </w:r>
-      <w:del w:id="91" w:author="Erik Porse" w:date="2026-07-21T23:50:00Z" w16du:dateUtc="2026-07-21T23:50:18Z">
+      <w:del w:id="31" w:author="Erik Porse" w:date="2026-07-21T23:50:00Z" w16du:dateUtc="2026-07-21T23:50:18Z">
         <w:r>
           <w:rPr>
             <w:rFonts w:asciiTheme="majorBidi" w:hAnsiTheme="majorBidi" w:cstheme="majorBidi"/>
@@ -8201,9 +7463,8 @@
           <w:sz w:val="24"/>
           <w:szCs w:val="24"/>
         </w:rPr>
-        <w:lastRenderedPageBreak/>
         <w:drawing>
-          <wp:inline distT="0" distB="0" distL="0" distR="0" wp14:anchorId="1DF02D15" wp14:editId="4A3BB8AC">
+          <wp:inline distT="0" distB="0" distL="0" distR="0" wp14:anchorId="1DF02D15" wp14:editId="1ED5A914">
             <wp:extent cx="5845696" cy="3329343"/>
             <wp:effectExtent l="0" t="0" r="0" b="0"/>
             <wp:docPr id="708746801" name="Picture 2"/>
@@ -8266,6 +7527,7 @@
           <w:sz w:val="24"/>
           <w:szCs w:val="24"/>
         </w:rPr>
+        <w:lastRenderedPageBreak/>
         <w:t xml:space="preserve">Figure </w:t>
       </w:r>
       <w:r>
@@ -9462,7 +8724,6 @@
         <w:rPr>
           <w:noProof/>
         </w:rPr>
-        <w:lastRenderedPageBreak/>
         <w:drawing>
           <wp:inline distT="0" distB="0" distL="0" distR="0" wp14:anchorId="3B21795B" wp14:editId="355BD940">
             <wp:extent cx="4755895" cy="3140110"/>
@@ -9685,23 +8946,31 @@
           <w:b/>
           <w:bCs/>
         </w:rPr>
-        <w:t>in relation to total legal entitlements of 9.0 million acre-feet</w:t>
+        <w:t xml:space="preserve">in relation to total legal </w:t>
       </w:r>
       <w:r>
         <w:rPr>
           <w:b/>
           <w:bCs/>
         </w:rPr>
-        <w:t xml:space="preserve"> (black horizontal dashed line)</w:t>
+        <w:lastRenderedPageBreak/>
+        <w:t>entitlements of 9.0 million acre-feet</w:t>
       </w:r>
       <w:r>
         <w:rPr>
           <w:b/>
           <w:bCs/>
         </w:rPr>
+        <w:t xml:space="preserve"> (black horizontal dashed line)</w:t>
+      </w:r>
+      <w:r>
+        <w:rPr>
+          <w:b/>
+          <w:bCs/>
+        </w:rPr>
         <w:t>.</w:t>
       </w:r>
-      <w:ins w:id="92" w:author="David Rosenberg" w:date="2026-06-19T15:22:00Z" w16du:dateUtc="2026-06-19T21:22:00Z">
+      <w:ins w:id="32" w:author="David Rosenberg" w:date="2026-06-19T15:22:00Z" w16du:dateUtc="2026-06-19T21:22:00Z">
         <w:r>
           <w:rPr>
             <w:b/>
@@ -9732,12 +9001,12 @@
       <w:r>
         <w:t>Conditions where the Physically Available Water is less tha</w:t>
       </w:r>
-      <w:ins w:id="93" w:author="Erik Porse" w:date="2026-07-21T23:50:00Z" w16du:dateUtc="2026-07-21T23:50:59Z">
+      <w:ins w:id="33" w:author="Erik Porse" w:date="2026-07-21T23:50:00Z" w16du:dateUtc="2026-07-21T23:50:59Z">
         <w:r>
           <w:t>n</w:t>
         </w:r>
       </w:ins>
-      <w:del w:id="94" w:author="Erik Porse" w:date="2026-07-21T23:50:00Z" w16du:dateUtc="2026-07-21T23:50:58Z">
+      <w:del w:id="34" w:author="Erik Porse" w:date="2026-07-21T23:50:00Z" w16du:dateUtc="2026-07-21T23:50:58Z">
         <w:r>
           <w:delText>t</w:delText>
         </w:r>
@@ -9745,12 +9014,12 @@
       <w:r>
         <w:t xml:space="preserve"> Total Legal Entitlements </w:t>
       </w:r>
-      <w:del w:id="95" w:author="Erik Porse" w:date="2026-07-21T23:51:00Z" w16du:dateUtc="2026-07-21T23:51:10Z">
+      <w:del w:id="35" w:author="Erik Porse" w:date="2026-07-21T23:51:00Z" w16du:dateUtc="2026-07-21T23:51:10Z">
         <w:r>
           <w:delText>will increasingly</w:delText>
         </w:r>
       </w:del>
-      <w:ins w:id="96" w:author="Erik Porse" w:date="2026-07-21T23:51:00Z" w16du:dateUtc="2026-07-21T23:51:13Z">
+      <w:ins w:id="36" w:author="Erik Porse" w:date="2026-07-21T23:51:00Z" w16du:dateUtc="2026-07-21T23:51:13Z">
         <w:r>
           <w:t>will likely continue to</w:t>
         </w:r>
@@ -9893,18 +9162,18 @@
       <w:r>
         <w:t xml:space="preserve">Strategies to </w:t>
       </w:r>
-      <w:commentRangeStart w:id="97"/>
+      <w:commentRangeStart w:id="37"/>
       <w:r>
         <w:t xml:space="preserve">Motivate Conservation and Increase User Autonomy </w:t>
       </w:r>
-      <w:commentRangeEnd w:id="97"/>
+      <w:commentRangeEnd w:id="37"/>
       <w:r>
         <w:rPr>
           <w:rStyle w:val="CommentReference"/>
           <w:sz w:val="24"/>
           <w:szCs w:val="24"/>
         </w:rPr>
-        <w:commentReference w:id="97"/>
+        <w:commentReference w:id="37"/>
       </w:r>
     </w:p>
     <w:p>
@@ -9955,7 +9224,7 @@
         </w:rPr>
         <w:t xml:space="preserve"> </w:t>
       </w:r>
-      <w:ins w:id="98" w:author="Erik Porse" w:date="2026-07-21T23:52:00Z" w16du:dateUtc="2026-07-21T23:52:57Z">
+      <w:ins w:id="38" w:author="Erik Porse" w:date="2026-07-21T23:52:00Z" w16du:dateUtc="2026-07-21T23:52:57Z">
         <w:r>
           <w:rPr>
             <w:rFonts w:asciiTheme="majorBidi" w:hAnsiTheme="majorBidi" w:cstheme="majorBidi"/>
@@ -10021,7 +9290,7 @@
         </w:rPr>
         <w:t xml:space="preserve"> raise the elevation trigger that prohibits </w:t>
       </w:r>
-      <w:commentRangeStart w:id="99"/>
+      <w:commentRangeStart w:id="39"/>
       <w:r>
         <w:rPr>
           <w:rFonts w:asciiTheme="majorBidi" w:hAnsiTheme="majorBidi" w:cstheme="majorBidi"/>
@@ -10030,7 +9299,7 @@
         </w:rPr>
         <w:t xml:space="preserve">withdraws </w:t>
       </w:r>
-      <w:commentRangeEnd w:id="99"/>
+      <w:commentRangeEnd w:id="39"/>
       <w:r>
         <w:rPr>
           <w:rStyle w:val="CommentReference"/>
@@ -10038,7 +9307,7 @@
           <w:sz w:val="24"/>
           <w:szCs w:val="24"/>
         </w:rPr>
-        <w:commentReference w:id="99"/>
+        <w:commentReference w:id="39"/>
       </w:r>
       <w:r>
         <w:rPr>
@@ -10647,7 +9916,7 @@
         </w:rPr>
         <w:t xml:space="preserve">Here we </w:t>
       </w:r>
-      <w:del w:id="100" w:author="Erik Porse" w:date="2026-07-21T23:53:00Z" w16du:dateUtc="2026-07-21T23:53:50Z">
+      <w:del w:id="40" w:author="Erik Porse" w:date="2026-07-21T23:53:00Z" w16du:dateUtc="2026-07-21T23:53:50Z">
         <w:r>
           <w:rPr>
             <w:rFonts w:asciiTheme="majorBidi" w:hAnsiTheme="majorBidi" w:cstheme="majorBidi"/>
@@ -10657,7 +9926,7 @@
           <w:delText xml:space="preserve">describe </w:delText>
         </w:r>
       </w:del>
-      <w:ins w:id="101" w:author="Erik Porse" w:date="2026-07-21T23:53:00Z" w16du:dateUtc="2026-07-21T23:53:52Z">
+      <w:ins w:id="41" w:author="Erik Porse" w:date="2026-07-21T23:53:00Z" w16du:dateUtc="2026-07-21T23:53:52Z">
         <w:r>
           <w:rPr>
             <w:rFonts w:asciiTheme="majorBidi" w:hAnsiTheme="majorBidi" w:cstheme="majorBidi"/>
@@ -10675,7 +9944,7 @@
         </w:rPr>
         <w:t xml:space="preserve">two novel program improvements that </w:t>
       </w:r>
-      <w:ins w:id="102" w:author="Erik Porse" w:date="2026-07-21T23:53:00Z" w16du:dateUtc="2026-07-21T23:53:36Z">
+      <w:ins w:id="42" w:author="Erik Porse" w:date="2026-07-21T23:53:00Z" w16du:dateUtc="2026-07-21T23:53:36Z">
         <w:r>
           <w:rPr>
             <w:rFonts w:asciiTheme="majorBidi" w:hAnsiTheme="majorBidi" w:cstheme="majorBidi"/>
@@ -10693,7 +9962,7 @@
         </w:rPr>
         <w:t xml:space="preserve">motivate water conservation behavior while </w:t>
       </w:r>
-      <w:del w:id="103" w:author="Erik Porse" w:date="2026-07-21T23:53:00Z" w16du:dateUtc="2026-07-21T23:53:40Z">
+      <w:del w:id="43" w:author="Erik Porse" w:date="2026-07-21T23:53:00Z" w16du:dateUtc="2026-07-21T23:53:40Z">
         <w:r>
           <w:rPr>
             <w:rFonts w:asciiTheme="majorBidi" w:hAnsiTheme="majorBidi" w:cstheme="majorBidi"/>
@@ -10703,7 +9972,7 @@
           <w:delText>give</w:delText>
         </w:r>
       </w:del>
-      <w:ins w:id="104" w:author="Erik Porse" w:date="2026-07-21T23:53:00Z" w16du:dateUtc="2026-07-21T23:53:40Z">
+      <w:ins w:id="44" w:author="Erik Porse" w:date="2026-07-21T23:53:00Z" w16du:dateUtc="2026-07-21T23:53:40Z">
         <w:r>
           <w:rPr>
             <w:rFonts w:asciiTheme="majorBidi" w:hAnsiTheme="majorBidi" w:cstheme="majorBidi"/>
@@ -10721,7 +9990,7 @@
         </w:rPr>
         <w:t xml:space="preserve"> </w:t>
       </w:r>
-      <w:commentRangeStart w:id="105"/>
+      <w:commentRangeStart w:id="45"/>
       <w:r>
         <w:rPr>
           <w:rFonts w:asciiTheme="majorBidi" w:hAnsiTheme="majorBidi" w:cstheme="majorBidi"/>
@@ -10730,7 +9999,7 @@
         </w:rPr>
         <w:t>users</w:t>
       </w:r>
-      <w:commentRangeEnd w:id="105"/>
+      <w:commentRangeEnd w:id="45"/>
       <w:r>
         <w:rPr>
           <w:rStyle w:val="CommentReference"/>
@@ -10738,7 +10007,7 @@
           <w:sz w:val="24"/>
           <w:szCs w:val="24"/>
         </w:rPr>
-        <w:commentReference w:id="105"/>
+        <w:commentReference w:id="45"/>
       </w:r>
       <w:r>
         <w:rPr>
@@ -10764,22 +10033,22 @@
       <w:r>
         <w:t xml:space="preserve">In this strategy, </w:t>
       </w:r>
-      <w:del w:id="106" w:author="Erik Porse" w:date="2026-07-21T23:54:00Z" w16du:dateUtc="2026-07-21T23:54:07Z">
+      <w:del w:id="46" w:author="Erik Porse" w:date="2026-07-21T23:54:00Z" w16du:dateUtc="2026-07-21T23:54:07Z">
         <w:r>
           <w:delText xml:space="preserve">we </w:delText>
         </w:r>
       </w:del>
-      <w:ins w:id="107" w:author="Erik Porse" w:date="2026-07-21T23:54:00Z" w16du:dateUtc="2026-07-21T23:54:08Z">
+      <w:ins w:id="47" w:author="Erik Porse" w:date="2026-07-21T23:54:00Z" w16du:dateUtc="2026-07-21T23:54:08Z">
         <w:r>
           <w:t>agencies</w:t>
         </w:r>
       </w:ins>
-      <w:del w:id="108" w:author="Erik Porse" w:date="2026-07-21T23:54:00Z" w16du:dateUtc="2026-07-21T23:54:09Z">
+      <w:del w:id="48" w:author="Erik Porse" w:date="2026-07-21T23:54:00Z" w16du:dateUtc="2026-07-21T23:54:09Z">
         <w:r>
           <w:delText>only</w:delText>
         </w:r>
       </w:del>
-      <w:ins w:id="109" w:author="Erik Porse" w:date="2026-07-21T23:54:00Z" w16du:dateUtc="2026-07-21T23:54:11Z">
+      <w:ins w:id="49" w:author="Erik Porse" w:date="2026-07-21T23:54:00Z" w16du:dateUtc="2026-07-21T23:54:11Z">
         <w:r>
           <w:t xml:space="preserve"> only receive</w:t>
         </w:r>
@@ -10787,12 +10056,12 @@
       <w:r>
         <w:t xml:space="preserve"> credit</w:t>
       </w:r>
-      <w:ins w:id="110" w:author="Erik Porse" w:date="2026-07-21T23:54:00Z" w16du:dateUtc="2026-07-21T23:54:14Z">
+      <w:ins w:id="50" w:author="Erik Porse" w:date="2026-07-21T23:54:00Z" w16du:dateUtc="2026-07-21T23:54:14Z">
         <w:r>
           <w:t xml:space="preserve">s for </w:t>
         </w:r>
       </w:ins>
-      <w:del w:id="111" w:author="Erik Porse" w:date="2026-07-21T23:54:00Z" w16du:dateUtc="2026-07-21T23:54:14Z">
+      <w:del w:id="51" w:author="Erik Porse" w:date="2026-07-21T23:54:00Z" w16du:dateUtc="2026-07-21T23:54:14Z">
         <w:r>
           <w:delText xml:space="preserve"> </w:delText>
         </w:r>
@@ -10800,7 +10069,7 @@
       <w:r>
         <w:t xml:space="preserve">water that physically flowed into the reservoir and can be stored for later release. </w:t>
       </w:r>
-      <w:commentRangeStart w:id="112"/>
+      <w:commentRangeStart w:id="52"/>
       <w:r>
         <w:t>Never allow total annual assigned credits (A</w:t>
       </w:r>
@@ -10813,14 +10082,14 @@
       <w:r>
         <w:t>) and consumptive use to exceed total annual physically available water (Eq 4):</w:t>
       </w:r>
-      <w:commentRangeEnd w:id="112"/>
+      <w:commentRangeEnd w:id="52"/>
       <w:r>
         <w:rPr>
           <w:rStyle w:val="CommentReference"/>
           <w:sz w:val="24"/>
           <w:szCs w:val="24"/>
         </w:rPr>
-        <w:commentReference w:id="112"/>
+        <w:commentReference w:id="52"/>
       </w:r>
     </w:p>
     <w:p>
@@ -11164,7 +10433,7 @@
         </w:rPr>
         <w:t xml:space="preserve">This strategy uses a proportional scaling factor to assign each </w:t>
       </w:r>
-      <w:del w:id="113" w:author="Anabelle Myers" w:date="2026-07-23T22:41:00Z" w16du:dateUtc="2026-07-23T22:41:49Z">
+      <w:del w:id="53" w:author="Anabelle Myers" w:date="2026-07-23T22:41:00Z" w16du:dateUtc="2026-07-23T22:41:49Z">
         <w:r>
           <w:rPr>
             <w:rFonts w:asciiTheme="majorBidi" w:hAnsiTheme="majorBidi" w:cstheme="majorBidi"/>
@@ -11174,7 +10443,7 @@
           <w:delText>user’s</w:delText>
         </w:r>
       </w:del>
-      <w:ins w:id="114" w:author="Anabelle Myers" w:date="2026-07-23T22:41:00Z" w16du:dateUtc="2026-07-23T22:41:49Z">
+      <w:ins w:id="54" w:author="Anabelle Myers" w:date="2026-07-23T22:41:00Z" w16du:dateUtc="2026-07-23T22:41:49Z">
         <w:r>
           <w:rPr>
             <w:rFonts w:asciiTheme="majorBidi" w:hAnsiTheme="majorBidi" w:cstheme="majorBidi"/>
@@ -12078,7 +11347,7 @@
       <w:pPr>
         <w:pStyle w:val="NoSpacing"/>
       </w:pPr>
-      <w:del w:id="115" w:author="Erik Porse" w:date="2026-07-21T23:55:00Z" w16du:dateUtc="2026-07-21T23:55:12Z">
+      <w:del w:id="55" w:author="Erik Porse" w:date="2026-07-21T23:55:00Z" w16du:dateUtc="2026-07-21T23:55:12Z">
         <w:r>
           <w:rPr>
             <w:b/>
@@ -12087,7 +11356,7 @@
           <w:delText>Water Accounting</w:delText>
         </w:r>
       </w:del>
-      <w:ins w:id="116" w:author="Erik Porse" w:date="2026-07-21T23:55:00Z" w16du:dateUtc="2026-07-21T23:55:14Z">
+      <w:ins w:id="56" w:author="Erik Porse" w:date="2026-07-21T23:55:00Z" w16du:dateUtc="2026-07-21T23:55:14Z">
         <w:r>
           <w:rPr>
             <w:b/>
@@ -12096,7 +11365,7 @@
           <w:t xml:space="preserve">Reservoir </w:t>
         </w:r>
       </w:ins>
-      <w:ins w:id="117" w:author="Erik Porse" w:date="2026-07-21T23:57:00Z" w16du:dateUtc="2026-07-21T23:57:54Z">
+      <w:ins w:id="57" w:author="Erik Porse" w:date="2026-07-21T23:57:00Z" w16du:dateUtc="2026-07-21T23:57:54Z">
         <w:r>
           <w:rPr>
             <w:b/>
@@ -12105,7 +11374,7 @@
           <w:t xml:space="preserve">Storage </w:t>
         </w:r>
       </w:ins>
-      <w:ins w:id="118" w:author="Erik Porse" w:date="2026-07-21T23:55:00Z" w16du:dateUtc="2026-07-21T23:55:14Z">
+      <w:ins w:id="58" w:author="Erik Porse" w:date="2026-07-21T23:55:00Z" w16du:dateUtc="2026-07-21T23:55:14Z">
         <w:r>
           <w:rPr>
             <w:b/>
@@ -12152,18 +11421,18 @@
       <w:r>
         <w:t xml:space="preserve">, the protection account is allocated a first share of the Lake Mead inflow to offset the annual Lake Mead evaporation (Eq. 6). </w:t>
       </w:r>
-      <w:commentRangeStart w:id="119"/>
+      <w:commentRangeStart w:id="59"/>
       <w:r>
         <w:t>The remaining reservoir inflow is divided among the water users.</w:t>
       </w:r>
-      <w:commentRangeEnd w:id="119"/>
+      <w:commentRangeEnd w:id="59"/>
       <w:r>
         <w:rPr>
           <w:rStyle w:val="CommentReference"/>
           <w:sz w:val="24"/>
           <w:szCs w:val="24"/>
         </w:rPr>
-        <w:commentReference w:id="119"/>
+        <w:commentReference w:id="59"/>
       </w:r>
       <w:r>
         <w:t xml:space="preserve"> Each user </w:t>
@@ -12224,12 +11493,12 @@
       <w:r>
         <w:t xml:space="preserve"> [million acre-feet]) is the sum of the Lake Mead protection account and the other </w:t>
       </w:r>
-      <w:del w:id="120" w:author="Anabelle Myers" w:date="2026-07-23T22:41:00Z" w16du:dateUtc="2026-07-23T22:41:52Z">
+      <w:del w:id="60" w:author="Anabelle Myers" w:date="2026-07-23T22:41:00Z" w16du:dateUtc="2026-07-23T22:41:52Z">
         <w:r>
           <w:delText>user’s</w:delText>
         </w:r>
       </w:del>
-      <w:ins w:id="121" w:author="Anabelle Myers" w:date="2026-07-23T22:41:00Z" w16du:dateUtc="2026-07-23T22:41:52Z">
+      <w:ins w:id="61" w:author="Anabelle Myers" w:date="2026-07-23T22:41:00Z" w16du:dateUtc="2026-07-23T22:41:52Z">
         <w:r>
           <w:t>users'</w:t>
         </w:r>
@@ -12883,7 +12152,7 @@
       <w:r>
         <w:t xml:space="preserve"> With water accounting, each user can </w:t>
       </w:r>
-      <w:del w:id="122" w:author="Erik Porse" w:date="2026-07-21T23:55:00Z" w16du:dateUtc="2026-07-21T23:55:50Z">
+      <w:del w:id="62" w:author="Erik Porse" w:date="2026-07-21T23:55:00Z" w16du:dateUtc="2026-07-21T23:55:50Z">
         <w:r>
           <w:delText xml:space="preserve">an </w:delText>
         </w:r>
@@ -12960,18 +12229,18 @@
       <w:r>
         <w:t xml:space="preserve">Illustrations of </w:t>
       </w:r>
-      <w:commentRangeStart w:id="123"/>
+      <w:commentRangeStart w:id="63"/>
       <w:r>
         <w:t>Water Accounting</w:t>
       </w:r>
-      <w:commentRangeEnd w:id="123"/>
+      <w:commentRangeEnd w:id="63"/>
       <w:r>
         <w:rPr>
           <w:rStyle w:val="CommentReference"/>
           <w:sz w:val="24"/>
           <w:szCs w:val="24"/>
         </w:rPr>
-        <w:commentReference w:id="123"/>
+        <w:commentReference w:id="63"/>
       </w:r>
     </w:p>
     <w:p>
@@ -13039,7 +12308,7 @@
         </w:rPr>
         <w:t xml:space="preserve">, it is difficult to predict and model </w:t>
       </w:r>
-      <w:del w:id="124" w:author="Anabelle Myers" w:date="2026-07-23T22:42:00Z" w16du:dateUtc="2026-07-23T22:42:02Z">
+      <w:del w:id="64" w:author="Anabelle Myers" w:date="2026-07-23T22:42:00Z" w16du:dateUtc="2026-07-23T22:42:02Z">
         <w:r>
           <w:rPr>
             <w:rFonts w:asciiTheme="majorBidi" w:hAnsiTheme="majorBidi" w:cstheme="majorBidi"/>
@@ -13049,7 +12318,7 @@
           <w:delText>user’s</w:delText>
         </w:r>
       </w:del>
-      <w:ins w:id="125" w:author="Anabelle Myers" w:date="2026-07-23T22:42:00Z" w16du:dateUtc="2026-07-23T22:42:02Z">
+      <w:ins w:id="65" w:author="Anabelle Myers" w:date="2026-07-23T22:42:00Z" w16du:dateUtc="2026-07-23T22:42:02Z">
         <w:r>
           <w:rPr>
             <w:rFonts w:asciiTheme="majorBidi" w:hAnsiTheme="majorBidi" w:cstheme="majorBidi"/>
@@ -13067,7 +12336,7 @@
         </w:rPr>
         <w:t xml:space="preserve"> water consumption and conservation choices, and corresponding Lake Mead storage volumes. Prediction is difficult because with more </w:t>
       </w:r>
-      <w:commentRangeStart w:id="126"/>
+      <w:commentRangeStart w:id="66"/>
       <w:r>
         <w:rPr>
           <w:rFonts w:asciiTheme="majorBidi" w:hAnsiTheme="majorBidi" w:cstheme="majorBidi"/>
@@ -13076,7 +12345,7 @@
         </w:rPr>
         <w:t>autonomy</w:t>
       </w:r>
-      <w:commentRangeEnd w:id="126"/>
+      <w:commentRangeEnd w:id="66"/>
       <w:r>
         <w:rPr>
           <w:rStyle w:val="CommentReference"/>
@@ -13084,7 +12353,7 @@
           <w:sz w:val="24"/>
           <w:szCs w:val="24"/>
         </w:rPr>
-        <w:commentReference w:id="126"/>
+        <w:commentReference w:id="66"/>
       </w:r>
       <w:r>
         <w:rPr>
@@ -13094,7 +12363,7 @@
         </w:rPr>
         <w:t xml:space="preserve">, users can adapt their choices year-to-year for a variety of reasons that are not readily coded into simulation models and rules. Here, we instead use collaborator choices in recent immersive, online, collaborative modeling sessions to illustrate a few possibilities of water accounting. Within a session, collaborators immersed in and personified a Lake Mead user. The user roles were Reclamation (protection volume), California, Arizona, Nevada, Mexico, and Tribal Nations of the Lower Basin. Each year, we </w:t>
       </w:r>
-      <w:del w:id="127" w:author="Erik Porse" w:date="2026-07-21T23:58:00Z" w16du:dateUtc="2026-07-21T23:58:26Z">
+      <w:del w:id="67" w:author="Erik Porse" w:date="2026-07-21T23:58:00Z" w16du:dateUtc="2026-07-21T23:58:26Z">
         <w:r>
           <w:rPr>
             <w:rFonts w:asciiTheme="majorBidi" w:hAnsiTheme="majorBidi" w:cstheme="majorBidi"/>
@@ -13104,7 +12373,7 @@
           <w:delText xml:space="preserve">choose </w:delText>
         </w:r>
       </w:del>
-      <w:ins w:id="128" w:author="Erik Porse" w:date="2026-07-21T23:58:00Z" w16du:dateUtc="2026-07-21T23:58:27Z">
+      <w:ins w:id="68" w:author="Erik Porse" w:date="2026-07-21T23:58:00Z" w16du:dateUtc="2026-07-21T23:58:27Z">
         <w:r>
           <w:rPr>
             <w:rFonts w:asciiTheme="majorBidi" w:hAnsiTheme="majorBidi" w:cstheme="majorBidi"/>
@@ -13122,7 +12391,7 @@
         </w:rPr>
         <w:t xml:space="preserve">and </w:t>
       </w:r>
-      <w:commentRangeStart w:id="129"/>
+      <w:commentRangeStart w:id="69"/>
       <w:r>
         <w:rPr>
           <w:rFonts w:asciiTheme="majorBidi" w:hAnsiTheme="majorBidi" w:cstheme="majorBidi"/>
@@ -13131,7 +12400,7 @@
         </w:rPr>
         <w:t xml:space="preserve">revealed </w:t>
       </w:r>
-      <w:commentRangeEnd w:id="129"/>
+      <w:commentRangeEnd w:id="69"/>
       <w:r>
         <w:rPr>
           <w:rStyle w:val="CommentReference"/>
@@ -13139,7 +12408,7 @@
           <w:sz w:val="24"/>
           <w:szCs w:val="24"/>
         </w:rPr>
-        <w:commentReference w:id="129"/>
+        <w:commentReference w:id="69"/>
       </w:r>
       <w:r>
         <w:rPr>
@@ -13158,7 +12427,7 @@
         <w:lastRenderedPageBreak/>
         <w:t xml:space="preserve">Then, each collaborator consumed, conserved, or traded within their account balance. Collaborators carried over account balances to the next year, which also kept Lake Mead storage above the protection volume. Each collaborator participated in one </w:t>
       </w:r>
-      <w:del w:id="130" w:author="Erik Porse" w:date="2026-07-21T23:58:00Z" w16du:dateUtc="2026-07-21T23:58:20Z">
+      <w:del w:id="70" w:author="Erik Porse" w:date="2026-07-21T23:58:00Z" w16du:dateUtc="2026-07-21T23:58:20Z">
         <w:r>
           <w:rPr>
             <w:rFonts w:asciiTheme="majorBidi" w:hAnsiTheme="majorBidi" w:cstheme="majorBidi"/>
@@ -13168,7 +12437,7 @@
           <w:delText>session</w:delText>
         </w:r>
       </w:del>
-      <w:ins w:id="131" w:author="Erik Porse" w:date="2026-07-21T23:58:00Z" w16du:dateUtc="2026-07-21T23:58:20Z">
+      <w:ins w:id="71" w:author="Erik Porse" w:date="2026-07-21T23:58:00Z" w16du:dateUtc="2026-07-21T23:58:20Z">
         <w:r>
           <w:rPr>
             <w:rFonts w:asciiTheme="majorBidi" w:hAnsiTheme="majorBidi" w:cstheme="majorBidi"/>
@@ -13252,7 +12521,7 @@
         </w:rPr>
         <w:t xml:space="preserve">Figure 6 shows results from one session where the person who immersed in the </w:t>
       </w:r>
-      <w:commentRangeStart w:id="132"/>
+      <w:commentRangeStart w:id="72"/>
       <w:r>
         <w:rPr>
           <w:rFonts w:asciiTheme="majorBidi" w:hAnsiTheme="majorBidi" w:cstheme="majorBidi"/>
@@ -13261,7 +12530,7 @@
         </w:rPr>
         <w:t xml:space="preserve">Reclamation </w:t>
       </w:r>
-      <w:commentRangeEnd w:id="132"/>
+      <w:commentRangeEnd w:id="72"/>
       <w:r>
         <w:rPr>
           <w:rStyle w:val="CommentReference"/>
@@ -13269,7 +12538,7 @@
           <w:sz w:val="24"/>
           <w:szCs w:val="24"/>
         </w:rPr>
-        <w:commentReference w:id="132"/>
+        <w:commentReference w:id="72"/>
       </w:r>
       <w:r>
         <w:rPr>
@@ -13279,7 +12548,7 @@
         </w:rPr>
         <w:t xml:space="preserve">role </w:t>
       </w:r>
-      <w:del w:id="133" w:author="Erik Porse" w:date="2026-07-21T23:58:00Z" w16du:dateUtc="2026-07-21T23:58:13Z">
+      <w:del w:id="73" w:author="Erik Porse" w:date="2026-07-21T23:58:00Z" w16du:dateUtc="2026-07-21T23:58:13Z">
         <w:r>
           <w:rPr>
             <w:rFonts w:asciiTheme="majorBidi" w:hAnsiTheme="majorBidi" w:cstheme="majorBidi"/>
@@ -13289,7 +12558,7 @@
           <w:delText xml:space="preserve">choose </w:delText>
         </w:r>
       </w:del>
-      <w:ins w:id="134" w:author="Erik Porse" w:date="2026-07-21T23:58:00Z" w16du:dateUtc="2026-07-21T23:58:13Z">
+      <w:ins w:id="74" w:author="Erik Porse" w:date="2026-07-21T23:58:00Z" w16du:dateUtc="2026-07-21T23:58:13Z">
         <w:r>
           <w:rPr>
             <w:rFonts w:asciiTheme="majorBidi" w:hAnsiTheme="majorBidi" w:cstheme="majorBidi"/>
@@ -13652,7 +12921,7 @@
         </w:rPr>
         <w:t xml:space="preserve">We report numerous Lake Mead water conservation program successes, including that the program has conserved more water than any other Colorado River Basin conservation program to date. Presently, </w:t>
       </w:r>
-      <w:ins w:id="135" w:author="Anabelle Myers" w:date="2026-07-23T23:38:00Z" w16du:dateUtc="2026-07-23T23:38:07Z">
+      <w:ins w:id="75" w:author="Anabelle Myers" w:date="2026-07-23T23:38:00Z" w16du:dateUtc="2026-07-23T23:38:07Z">
         <w:r>
           <w:rPr>
             <w:rFonts w:asciiTheme="majorBidi" w:hAnsiTheme="majorBidi" w:cstheme="majorBidi"/>
@@ -13662,7 +12931,7 @@
           <w:t>~</w:t>
         </w:r>
       </w:ins>
-      <w:del w:id="136" w:author="Anabelle Myers" w:date="2026-07-23T23:37:00Z" w16du:dateUtc="2026-07-23T23:37:59Z">
+      <w:del w:id="76" w:author="Anabelle Myers" w:date="2026-07-23T23:37:00Z" w16du:dateUtc="2026-07-23T23:37:59Z">
         <w:r>
           <w:rPr>
             <w:rFonts w:asciiTheme="majorBidi" w:hAnsiTheme="majorBidi" w:cstheme="majorBidi"/>
@@ -13672,7 +12941,7 @@
           <w:delText>some now</w:delText>
         </w:r>
       </w:del>
-      <w:del w:id="137" w:author="Anabelle Myers" w:date="2026-07-23T23:38:00Z" w16du:dateUtc="2026-07-23T23:38:16Z">
+      <w:del w:id="77" w:author="Anabelle Myers" w:date="2026-07-23T23:38:00Z" w16du:dateUtc="2026-07-23T23:38:16Z">
         <w:r>
           <w:rPr>
             <w:rFonts w:asciiTheme="majorBidi" w:hAnsiTheme="majorBidi" w:cstheme="majorBidi"/>
@@ -13690,7 +12959,7 @@
         </w:rPr>
         <w:t xml:space="preserve">3.6 million acre-feet of conserved water remains in Lake Mead—quadruple the volume of </w:t>
       </w:r>
-      <w:ins w:id="138" w:author="Anabelle Myers" w:date="2026-07-23T23:38:00Z" w16du:dateUtc="2026-07-23T23:38:27Z">
+      <w:ins w:id="78" w:author="Anabelle Myers" w:date="2026-07-23T23:38:00Z" w16du:dateUtc="2026-07-23T23:38:27Z">
         <w:r>
           <w:rPr>
             <w:rFonts w:asciiTheme="majorBidi" w:hAnsiTheme="majorBidi" w:cstheme="majorBidi"/>
@@ -13774,7 +13043,7 @@
         </w:rPr>
         <w:t xml:space="preserve">To expand program participation and increase operational flexibility, prior researchers suggested </w:t>
       </w:r>
-      <w:del w:id="139" w:author="Erik Porse" w:date="2026-07-21T23:59:00Z" w16du:dateUtc="2026-07-21T23:59:57Z">
+      <w:del w:id="79" w:author="Erik Porse" w:date="2026-07-21T23:59:00Z" w16du:dateUtc="2026-07-21T23:59:57Z">
         <w:r>
           <w:rPr>
             <w:rFonts w:asciiTheme="majorBidi" w:hAnsiTheme="majorBidi" w:cstheme="majorBidi"/>
@@ -13784,7 +13053,7 @@
           <w:delText>to raise</w:delText>
         </w:r>
       </w:del>
-      <w:ins w:id="140" w:author="Erik Porse" w:date="2026-07-21T23:59:00Z" w16du:dateUtc="2026-07-21T23:59:57Z">
+      <w:ins w:id="80" w:author="Erik Porse" w:date="2026-07-21T23:59:00Z" w16du:dateUtc="2026-07-21T23:59:57Z">
         <w:r>
           <w:rPr>
             <w:rFonts w:asciiTheme="majorBidi" w:hAnsiTheme="majorBidi" w:cstheme="majorBidi"/>
@@ -13802,7 +13071,7 @@
         </w:rPr>
         <w:t xml:space="preserve"> </w:t>
       </w:r>
-      <w:del w:id="141" w:author="Erik Porse" w:date="2026-07-22T00:00:00Z" w16du:dateUtc="2026-07-22T00:00:02Z">
+      <w:del w:id="81" w:author="Erik Porse" w:date="2026-07-22T00:00:00Z" w16du:dateUtc="2026-07-22T00:00:02Z">
         <w:r>
           <w:rPr>
             <w:rFonts w:asciiTheme="majorBidi" w:hAnsiTheme="majorBidi" w:cstheme="majorBidi"/>
@@ -13812,7 +13081,7 @@
           <w:delText xml:space="preserve">caps </w:delText>
         </w:r>
       </w:del>
-      <w:ins w:id="142" w:author="Erik Porse" w:date="2026-07-22T00:00:00Z" w16du:dateUtc="2026-07-22T00:00:05Z">
+      <w:ins w:id="82" w:author="Erik Porse" w:date="2026-07-22T00:00:00Z" w16du:dateUtc="2026-07-22T00:00:05Z">
         <w:r>
           <w:rPr>
             <w:rFonts w:asciiTheme="majorBidi" w:hAnsiTheme="majorBidi" w:cstheme="majorBidi"/>
@@ -14093,7 +13362,7 @@
         </w:rPr>
         <w:t xml:space="preserve">. They also proposed to exclude mandatory reductions from the calculation of voluntary credits. Larger shortages that trigger at higher reservoir levels will help Lake Mead. But there is also a downside. Shortages will vary year-to-year in response to volatile Colorado River flow and Lake Mead or system storage. Swings in shortages limit </w:t>
       </w:r>
-      <w:del w:id="143" w:author="Anabelle Myers" w:date="2026-07-23T22:42:00Z" w16du:dateUtc="2026-07-23T22:42:03Z">
+      <w:del w:id="83" w:author="Anabelle Myers" w:date="2026-07-23T22:42:00Z" w16du:dateUtc="2026-07-23T22:42:03Z">
         <w:r>
           <w:rPr>
             <w:rFonts w:asciiTheme="majorBidi" w:hAnsiTheme="majorBidi" w:cstheme="majorBidi"/>
@@ -14103,7 +13372,7 @@
           <w:delText>user’s</w:delText>
         </w:r>
       </w:del>
-      <w:ins w:id="144" w:author="Anabelle Myers" w:date="2026-07-23T22:42:00Z" w16du:dateUtc="2026-07-23T22:42:03Z">
+      <w:ins w:id="84" w:author="Anabelle Myers" w:date="2026-07-23T22:42:00Z" w16du:dateUtc="2026-07-23T22:42:03Z">
         <w:r>
           <w:rPr>
             <w:rFonts w:asciiTheme="majorBidi" w:hAnsiTheme="majorBidi" w:cstheme="majorBidi"/>
@@ -14121,7 +13390,7 @@
         </w:rPr>
         <w:t xml:space="preserve"> autonomy and make it difficult for </w:t>
       </w:r>
-      <w:del w:id="145" w:author="Erik Porse" w:date="2026-07-22T00:00:00Z" w16du:dateUtc="2026-07-22T00:00:14Z">
+      <w:del w:id="85" w:author="Erik Porse" w:date="2026-07-22T00:00:00Z" w16du:dateUtc="2026-07-22T00:00:14Z">
         <w:r>
           <w:rPr>
             <w:rFonts w:asciiTheme="majorBidi" w:hAnsiTheme="majorBidi" w:cstheme="majorBidi"/>
@@ -14131,7 +13400,7 @@
           <w:delText xml:space="preserve">user’s </w:delText>
         </w:r>
       </w:del>
-      <w:ins w:id="146" w:author="Erik Porse" w:date="2026-07-22T00:00:00Z" w16du:dateUtc="2026-07-22T00:00:20Z">
+      <w:ins w:id="86" w:author="Erik Porse" w:date="2026-07-22T00:00:00Z" w16du:dateUtc="2026-07-22T00:00:20Z">
         <w:r>
           <w:rPr>
             <w:rFonts w:asciiTheme="majorBidi" w:hAnsiTheme="majorBidi" w:cstheme="majorBidi"/>
@@ -14448,7 +13717,7 @@
         </w:rPr>
         <w:t>Both of our proposals address the challenge of sustainability</w:t>
       </w:r>
-      <w:del w:id="147" w:author="Erik Porse" w:date="2026-07-22T00:00:00Z" w16du:dateUtc="2026-07-22T00:00:39Z">
+      <w:del w:id="87" w:author="Erik Porse" w:date="2026-07-22T00:00:00Z" w16du:dateUtc="2026-07-22T00:00:39Z">
         <w:r>
           <w:rPr>
             <w:rFonts w:asciiTheme="majorBidi" w:hAnsiTheme="majorBidi" w:cstheme="majorBidi"/>
@@ -14466,7 +13735,7 @@
         </w:rPr>
         <w:t xml:space="preserve">. Our first proposal constrains total water consumption and credits to be less than the annual reservoir inflow. Our second proposal apportions reservoir inflow among Reclamation and the users and allows users to consume, conserve, and trade within their water account balance. There are several other benefits of our proposals, </w:t>
       </w:r>
-      <w:del w:id="148" w:author="Anabelle Myers" w:date="2026-07-23T23:42:00Z" w16du:dateUtc="2026-07-23T23:42:34Z">
+      <w:del w:id="88" w:author="Anabelle Myers" w:date="2026-07-23T23:42:00Z" w16du:dateUtc="2026-07-23T23:42:34Z">
         <w:r>
           <w:rPr>
             <w:rFonts w:asciiTheme="majorBidi" w:hAnsiTheme="majorBidi" w:cstheme="majorBidi"/>
@@ -14564,7 +13833,7 @@
         </w:rPr>
         <w:t xml:space="preserve">Water accounting allows Reclamation and </w:t>
       </w:r>
-      <w:commentRangeStart w:id="149"/>
+      <w:commentRangeStart w:id="89"/>
       <w:r>
         <w:rPr>
           <w:b/>
@@ -14572,7 +13841,7 @@
         </w:rPr>
         <w:t>water users to more autonomously manage their differing interests and risks</w:t>
       </w:r>
-      <w:commentRangeEnd w:id="149"/>
+      <w:commentRangeEnd w:id="89"/>
       <w:r>
         <w:rPr>
           <w:rStyle w:val="CommentReference"/>
@@ -14581,7 +13850,7 @@
           <w:sz w:val="24"/>
           <w:szCs w:val="24"/>
         </w:rPr>
-        <w:commentReference w:id="149"/>
+        <w:commentReference w:id="89"/>
       </w:r>
       <w:r>
         <w:rPr>
@@ -14593,18 +13862,18 @@
       <w:r>
         <w:t xml:space="preserve"> For </w:t>
       </w:r>
-      <w:commentRangeStart w:id="150"/>
+      <w:commentRangeStart w:id="90"/>
       <w:r>
         <w:t>Reclamation</w:t>
       </w:r>
-      <w:commentRangeEnd w:id="150"/>
+      <w:commentRangeEnd w:id="90"/>
       <w:r>
         <w:rPr>
           <w:rStyle w:val="CommentReference"/>
           <w:sz w:val="24"/>
           <w:szCs w:val="24"/>
         </w:rPr>
-        <w:commentReference w:id="150"/>
+        <w:commentReference w:id="90"/>
       </w:r>
       <w:r>
         <w:t>, this is where to set the reservoir protection elevation. Reclamation does not need to consult with the other users. The other water users can more independently adapt their decisions to consume water, conserve water for future use, and trade in response to their account balances, others choices, the discussion of choices, and their perceptions—or fears—of future low flow. There can also be discussion of the (a) volumes, and (b) prices for Reclamation and users to purchase water from each other—purchase volumes and prices that may change from year to year as water becomes more scarce or available.</w:t>
@@ -18533,7 +17802,7 @@
       </w:r>
     </w:p>
   </w:comment>
-  <w:comment w:id="24" w:author="Erik Porse" w:date="2026-07-21T16:47:00Z" w:initials="EP">
+  <w:comment w:id="3" w:author="Erik Porse" w:date="2026-07-21T16:47:00Z" w:initials="EP">
     <w:p>
       <w:pPr>
         <w:pStyle w:val="CommentText"/>
@@ -18549,7 +17818,7 @@
       </w:r>
     </w:p>
   </w:comment>
-  <w:comment w:id="67" w:author="Anabelle Myers" w:date="2026-07-23T17:15:00Z" w:initials="AM">
+  <w:comment w:id="37" w:author="Erik Porse" w:date="2026-07-21T16:51:00Z" w:initials="EP">
     <w:p>
       <w:pPr>
         <w:pStyle w:val="CommentText"/>
@@ -18561,11 +17830,11 @@
         <w:annotationRef/>
       </w:r>
       <w:r>
-        <w:t>This point may be redundant</w:t>
+        <w:t>Are these two separate issues? Increasing user autonomy is normative.</w:t>
       </w:r>
     </w:p>
   </w:comment>
-  <w:comment w:id="76" w:author="Anabelle Myers" w:date="2026-07-23T17:24:00Z" w:initials="AM">
+  <w:comment w:id="39" w:author="Erik Porse" w:date="2026-07-21T16:52:00Z" w:initials="EP">
     <w:p>
       <w:pPr>
         <w:pStyle w:val="CommentText"/>
@@ -18577,11 +17846,11 @@
         <w:annotationRef/>
       </w:r>
       <w:r>
-        <w:t>I'm not sure this section is needed for the article and may be too in the weeds.</w:t>
+        <w:t>check throughout- should this be withdraw or withdrawls...</w:t>
       </w:r>
     </w:p>
   </w:comment>
-  <w:comment w:id="89" w:author="Anabelle Myers" w:date="2026-07-23T17:27:00Z" w:initials="AM">
+  <w:comment w:id="45" w:author="Anabelle Myers" w:date="2026-07-23T17:33:00Z" w:initials="AM">
     <w:p>
       <w:pPr>
         <w:pStyle w:val="CommentText"/>
@@ -18593,11 +17862,11 @@
         <w:annotationRef/>
       </w:r>
       <w:r>
-        <w:t>This is already defined above in the abstract and in the introduction so maybe we could just say, "the annual physically available water"</w:t>
+        <w:t>in the paper it says 'water users' and then just 'users'. I'm not sure if there is a difference, but we may want to pick one and use it throughout the paper.</w:t>
       </w:r>
     </w:p>
   </w:comment>
-  <w:comment w:id="97" w:author="Erik Porse" w:date="2026-07-21T16:51:00Z" w:initials="EP">
+  <w:comment w:id="52" w:author="Erik Porse" w:date="2026-07-21T16:54:00Z" w:initials="EP">
     <w:p>
       <w:pPr>
         <w:pStyle w:val="CommentText"/>
@@ -18609,11 +17878,11 @@
         <w:annotationRef/>
       </w:r>
       <w:r>
-        <w:t>Are these two separate issues? Increasing user autonomy is normative.</w:t>
+        <w:t>fragment</w:t>
       </w:r>
     </w:p>
   </w:comment>
-  <w:comment w:id="99" w:author="Erik Porse" w:date="2026-07-21T16:52:00Z" w:initials="EP">
+  <w:comment w:id="59" w:author="Erik Porse" w:date="2026-07-21T17:02:00Z" w:initials="EP">
     <w:p>
       <w:pPr>
         <w:pStyle w:val="CommentText"/>
@@ -18625,11 +17894,11 @@
         <w:annotationRef/>
       </w:r>
       <w:r>
-        <w:t>check throughout- should this be withdraw or withdrawls...</w:t>
+        <w:t xml:space="preserve">The main innovation here is the storage protection account. Dividing the balance between users is not necessarily all that different, but enabling trading of account shares may be. Can we be precise? </w:t>
       </w:r>
     </w:p>
   </w:comment>
-  <w:comment w:id="105" w:author="Anabelle Myers" w:date="2026-07-23T17:33:00Z" w:initials="AM">
+  <w:comment w:id="63" w:author="Erik Porse" w:date="2026-07-21T16:57:00Z" w:initials="EP">
     <w:p>
       <w:pPr>
         <w:pStyle w:val="CommentText"/>
@@ -18641,11 +17910,11 @@
         <w:annotationRef/>
       </w:r>
       <w:r>
-        <w:t>in the paper it says 'water users' and then just 'users'. I'm not sure if there is a difference, but we may want to pick one and use it throughout the paper.</w:t>
+        <w:t>Is this better labeled as a Storage Protection Account?</w:t>
       </w:r>
     </w:p>
   </w:comment>
-  <w:comment w:id="112" w:author="Erik Porse" w:date="2026-07-21T16:54:00Z" w:initials="EP">
+  <w:comment w:id="66" w:author="Erik Porse" w:date="2026-07-21T16:56:00Z" w:initials="EP">
     <w:p>
       <w:pPr>
         <w:pStyle w:val="CommentText"/>
@@ -18657,11 +17926,11 @@
         <w:annotationRef/>
       </w:r>
       <w:r>
-        <w:t>fragment</w:t>
+        <w:t xml:space="preserve">how do these arrangements increase autonomy? I am confused by the mixing of motivating conservation and the suggestion that more autonomy will increase conservation. </w:t>
       </w:r>
     </w:p>
   </w:comment>
-  <w:comment w:id="119" w:author="Erik Porse" w:date="2026-07-21T17:02:00Z" w:initials="EP">
+  <w:comment w:id="69" w:author="Erik Porse" w:date="2026-07-21T16:58:00Z" w:initials="EP">
     <w:p>
       <w:pPr>
         <w:pStyle w:val="CommentText"/>
@@ -18673,11 +17942,11 @@
         <w:annotationRef/>
       </w:r>
       <w:r>
-        <w:t xml:space="preserve">The main innovation here is the storage protection account. Dividing the balance between users is not necessarily all that different, but enabling trading of account shares may be. Can we be precise? </w:t>
+        <w:t>check grammar throughout and use a verb tense consistently</w:t>
       </w:r>
     </w:p>
   </w:comment>
-  <w:comment w:id="123" w:author="Erik Porse" w:date="2026-07-21T16:57:00Z" w:initials="EP">
+  <w:comment w:id="72" w:author="Erik Porse" w:date="2026-07-21T16:59:00Z" w:initials="EP">
     <w:p>
       <w:pPr>
         <w:pStyle w:val="CommentText"/>
@@ -18689,11 +17958,11 @@
         <w:annotationRef/>
       </w:r>
       <w:r>
-        <w:t>Is this better labeled as a Storage Protection Account?</w:t>
+        <w:t>suggest USBR throughout</w:t>
       </w:r>
     </w:p>
   </w:comment>
-  <w:comment w:id="126" w:author="Erik Porse" w:date="2026-07-21T16:56:00Z" w:initials="EP">
+  <w:comment w:id="89" w:author="Erik Porse" w:date="2026-07-21T17:02:00Z" w:initials="EP">
     <w:p>
       <w:pPr>
         <w:pStyle w:val="CommentText"/>
@@ -18705,59 +17974,11 @@
         <w:annotationRef/>
       </w:r>
       <w:r>
-        <w:t xml:space="preserve">how do these arrangements increase autonomy? I am confused by the mixing of motivating conservation and the suggestion that more autonomy will increase conservation. </w:t>
+        <w:t xml:space="preserve">It is a tool to manage risks, but aren't agencies operating with autonomy of water supply portfolios? </w:t>
       </w:r>
     </w:p>
   </w:comment>
-  <w:comment w:id="129" w:author="Erik Porse" w:date="2026-07-21T16:58:00Z" w:initials="EP">
-    <w:p>
-      <w:pPr>
-        <w:pStyle w:val="CommentText"/>
-      </w:pPr>
-      <w:r>
-        <w:rPr>
-          <w:rStyle w:val="CommentReference"/>
-        </w:rPr>
-        <w:annotationRef/>
-      </w:r>
-      <w:r>
-        <w:t>check grammar throughout and use a verb tense consistently</w:t>
-      </w:r>
-    </w:p>
-  </w:comment>
-  <w:comment w:id="132" w:author="Erik Porse" w:date="2026-07-21T16:59:00Z" w:initials="EP">
-    <w:p>
-      <w:pPr>
-        <w:pStyle w:val="CommentText"/>
-      </w:pPr>
-      <w:r>
-        <w:rPr>
-          <w:rStyle w:val="CommentReference"/>
-        </w:rPr>
-        <w:annotationRef/>
-      </w:r>
-      <w:r>
-        <w:t>suggest USBR throughout</w:t>
-      </w:r>
-    </w:p>
-  </w:comment>
-  <w:comment w:id="149" w:author="Erik Porse" w:date="2026-07-21T17:02:00Z" w:initials="EP">
-    <w:p>
-      <w:pPr>
-        <w:pStyle w:val="CommentText"/>
-      </w:pPr>
-      <w:r>
-        <w:rPr>
-          <w:rStyle w:val="CommentReference"/>
-        </w:rPr>
-        <w:annotationRef/>
-      </w:r>
-      <w:r>
-        <w:t xml:space="preserve">It is a tool to manage risks, but aren't agencies operating with autonomy of water supply portfolios? </w:t>
-      </w:r>
-    </w:p>
-  </w:comment>
-  <w:comment w:id="150" w:author="Anabelle Myers" w:date="2026-07-23T17:44:00Z" w:initials="AM">
+  <w:comment w:id="90" w:author="Anabelle Myers" w:date="2026-07-23T17:44:00Z" w:initials="AM">
     <w:p>
       <w:pPr>
         <w:pStyle w:val="CommentText"/>
@@ -18780,9 +18001,6 @@
 <w15:commentsEx xmlns:wpc="http://schemas.microsoft.com/office/word/2010/wordprocessingCanvas" xmlns:cx="http://schemas.microsoft.com/office/drawing/2014/chartex" xmlns:cx1="http://schemas.microsoft.com/office/drawing/2015/9/8/chartex" xmlns:cx2="http://schemas.microsoft.com/office/drawing/2015/10/21/chartex" xmlns:cx3="http://schemas.microsoft.com/office/drawing/2016/5/9/chartex" xmlns:cx4="http://schemas.microsoft.com/office/drawing/2016/5/10/chartex" xmlns:cx5="http://schemas.microsoft.com/office/drawing/2016/5/11/chartex" xmlns:cx6="http://schemas.microsoft.com/office/drawing/2016/5/12/chartex" xmlns:cx7="http://schemas.microsoft.com/office/drawing/2016/5/13/chartex" xmlns:cx8="http://schemas.microsoft.com/office/drawing/2016/5/14/chartex" xmlns:mc="http://schemas.openxmlformats.org/markup-compatibility/2006" xmlns:aink="http://schemas.microsoft.com/office/drawing/2016/ink" xmlns:am3d="http://schemas.microsoft.com/office/drawing/2017/model3d" xmlns:o="urn:schemas-microsoft-com:office:office" xmlns:oel="http://schemas.microsoft.com/office/2019/extlst" xmlns:r="http://schemas.openxmlformats.org/officeDocument/2006/relationships" xmlns:m="http://schemas.openxmlformats.org/officeDocument/2006/math" xmlns:v="urn:schemas-microsoft-com:vml" xmlns:wp14="http://schemas.microsoft.com/office/word/2010/wordprocessingDrawing" xmlns:wp="http://schemas.openxmlformats.org/drawingml/2006/wordprocessingDrawing" xmlns:w10="urn:schemas-microsoft-com:office:word" xmlns:w="http://schemas.openxmlformats.org/wordprocessingml/2006/main" xmlns:w14="http://schemas.microsoft.com/office/word/2010/wordml" xmlns:w15="http://schemas.microsoft.com/office/word/2012/wordml" xmlns:w16cei="http://schemas.microsoft.com/office/word/2026/wordml/cei" xmlns:w16cex="http://schemas.microsoft.com/office/word/2018/wordml/cex" xmlns:w16cid="http://schemas.microsoft.com/office/word/2016/wordml/cid" xmlns:w16="http://schemas.microsoft.com/office/word/2018/wordml" xmlns:w16du="http://schemas.microsoft.com/office/word/2023/wordml/word16du" xmlns:w16sdtdh="http://schemas.microsoft.com/office/word/2020/wordml/sdtdatahash" xmlns:w16sdtfl="http://schemas.microsoft.com/office/word/2024/wordml/sdtformatlock" xmlns:w16se="http://schemas.microsoft.com/office/word/2015/wordml/symex" xmlns:wpg="http://schemas.microsoft.com/office/word/2010/wordprocessingGroup" xmlns:wpi="http://schemas.microsoft.com/office/word/2010/wordprocessingInk" xmlns:wne="http://schemas.microsoft.com/office/word/2006/wordml" xmlns:wps="http://schemas.microsoft.com/office/word/2010/wordprocessingShape" mc:Ignorable="w14 w15 w16se w16cid w16 w16cex w16sdtdh w16sdtfl w16du wp14">
   <w15:commentEx w15:paraId="5028B586" w15:done="0"/>
   <w15:commentEx w15:paraId="2EF8EAEC" w15:done="0"/>
-  <w15:commentEx w15:paraId="04C243B5" w15:done="0"/>
-  <w15:commentEx w15:paraId="37C5771E" w15:done="0"/>
-  <w15:commentEx w15:paraId="5561B970" w15:done="0"/>
   <w15:commentEx w15:paraId="65F86C7F" w15:done="0"/>
   <w15:commentEx w15:paraId="629A21C5" w15:done="0"/>
   <w15:commentEx w15:paraId="22E5503D" w15:done="0"/>
@@ -18801,9 +18019,6 @@
 <w16cex:commentsExtensible xmlns:wpc="http://schemas.microsoft.com/office/word/2010/wordprocessingCanvas" xmlns:cx="http://schemas.microsoft.com/office/drawing/2014/chartex" xmlns:cx1="http://schemas.microsoft.com/office/drawing/2015/9/8/chartex" xmlns:cx2="http://schemas.microsoft.com/office/drawing/2015/10/21/chartex" xmlns:cx3="http://schemas.microsoft.com/office/drawing/2016/5/9/chartex" xmlns:cx4="http://schemas.microsoft.com/office/drawing/2016/5/10/chartex" xmlns:cx5="http://schemas.microsoft.com/office/drawing/2016/5/11/chartex" xmlns:cx6="http://schemas.microsoft.com/office/drawing/2016/5/12/chartex" xmlns:cx7="http://schemas.microsoft.com/office/drawing/2016/5/13/chartex" xmlns:cx8="http://schemas.microsoft.com/office/drawing/2016/5/14/chartex" xmlns:cr="http://schemas.microsoft.com/office/comments/2020/reactions" xmlns:mc="http://schemas.openxmlformats.org/markup-compatibility/2006" xmlns:aink="http://schemas.microsoft.com/office/drawing/2016/ink" xmlns:am3d="http://schemas.microsoft.com/office/drawing/2017/model3d" xmlns:o="urn:schemas-microsoft-com:office:office" xmlns:oel="http://schemas.microsoft.com/office/2019/extlst" xmlns:r="http://schemas.openxmlformats.org/officeDocument/2006/relationships" xmlns:m="http://schemas.openxmlformats.org/officeDocument/2006/math" xmlns:v="urn:schemas-microsoft-com:vml" xmlns:wp14="http://schemas.microsoft.com/office/word/2010/wordprocessingDrawing" xmlns:wp="http://schemas.openxmlformats.org/drawingml/2006/wordprocessingDrawing" xmlns:w10="urn:schemas-microsoft-com:office:word" xmlns:w="http://schemas.openxmlformats.org/wordprocessingml/2006/main" xmlns:w14="http://schemas.microsoft.com/office/word/2010/wordml" xmlns:w15="http://schemas.microsoft.com/office/word/2012/wordml" xmlns:w16cei="http://schemas.microsoft.com/office/word/2026/wordml/cei" xmlns:w16cex="http://schemas.microsoft.com/office/word/2018/wordml/cex" xmlns:w16cid="http://schemas.microsoft.com/office/word/2016/wordml/cid" xmlns:w16="http://schemas.microsoft.com/office/word/2018/wordml" xmlns:w16du="http://schemas.microsoft.com/office/word/2023/wordml/word16du" xmlns:w16sdtdh="http://schemas.microsoft.com/office/word/2020/wordml/sdtdatahash" xmlns:w16sdtfl="http://schemas.microsoft.com/office/word/2024/wordml/sdtformatlock" xmlns:w16se="http://schemas.microsoft.com/office/word/2015/wordml/symex" xmlns:wpg="http://schemas.microsoft.com/office/word/2010/wordprocessingGroup" xmlns:wpi="http://schemas.microsoft.com/office/word/2010/wordprocessingInk" xmlns:wne="http://schemas.microsoft.com/office/word/2006/wordml" xmlns:wps="http://schemas.microsoft.com/office/word/2010/wordprocessingShape" mc:Ignorable="w14 w15 w16se w16cid w16 w16cex w16sdtdh w16sdtfl cr w16du wp14">
   <w16cex:commentExtensible w16cex:durableId="29F1A260" w16cex:dateUtc="2026-05-27T19:47:00Z"/>
   <w16cex:commentExtensible w16cex:durableId="439BA784" w16cex:dateUtc="2026-07-21T23:47:00Z"/>
-  <w16cex:commentExtensible w16cex:durableId="5A8A6470" w16cex:dateUtc="2026-07-23T23:15:00Z"/>
-  <w16cex:commentExtensible w16cex:durableId="490E20A6" w16cex:dateUtc="2026-07-23T23:24:00Z"/>
-  <w16cex:commentExtensible w16cex:durableId="519C5851" w16cex:dateUtc="2026-07-23T23:27:00Z"/>
   <w16cex:commentExtensible w16cex:durableId="45F6D256" w16cex:dateUtc="2026-07-21T23:51:00Z"/>
   <w16cex:commentExtensible w16cex:durableId="0000772B" w16cex:dateUtc="2026-07-21T23:52:00Z"/>
   <w16cex:commentExtensible w16cex:durableId="68A69473" w16cex:dateUtc="2026-07-23T23:33:00Z"/>
@@ -18822,9 +18037,6 @@
 <w16cid:commentsIds xmlns:wpc="http://schemas.microsoft.com/office/word/2010/wordprocessingCanvas" xmlns:cx="http://schemas.microsoft.com/office/drawing/2014/chartex" xmlns:cx1="http://schemas.microsoft.com/office/drawing/2015/9/8/chartex" xmlns:cx2="http://schemas.microsoft.com/office/drawing/2015/10/21/chartex" xmlns:cx3="http://schemas.microsoft.com/office/drawing/2016/5/9/chartex" xmlns:cx4="http://schemas.microsoft.com/office/drawing/2016/5/10/chartex" xmlns:cx5="http://schemas.microsoft.com/office/drawing/2016/5/11/chartex" xmlns:cx6="http://schemas.microsoft.com/office/drawing/2016/5/12/chartex" xmlns:cx7="http://schemas.microsoft.com/office/drawing/2016/5/13/chartex" xmlns:cx8="http://schemas.microsoft.com/office/drawing/2016/5/14/chartex" xmlns:mc="http://schemas.openxmlformats.org/markup-compatibility/2006" xmlns:aink="http://schemas.microsoft.com/office/drawing/2016/ink" xmlns:am3d="http://schemas.microsoft.com/office/drawing/2017/model3d" xmlns:o="urn:schemas-microsoft-com:office:office" xmlns:oel="http://schemas.microsoft.com/office/2019/extlst" xmlns:r="http://schemas.openxmlformats.org/officeDocument/2006/relationships" xmlns:m="http://schemas.openxmlformats.org/officeDocument/2006/math" xmlns:v="urn:schemas-microsoft-com:vml" xmlns:wp14="http://schemas.microsoft.com/office/word/2010/wordprocessingDrawing" xmlns:wp="http://schemas.openxmlformats.org/drawingml/2006/wordprocessingDrawing" xmlns:w10="urn:schemas-microsoft-com:office:word" xmlns:w="http://schemas.openxmlformats.org/wordprocessingml/2006/main" xmlns:w14="http://schemas.microsoft.com/office/word/2010/wordml" xmlns:w15="http://schemas.microsoft.com/office/word/2012/wordml" xmlns:w16cei="http://schemas.microsoft.com/office/word/2026/wordml/cei" xmlns:w16cex="http://schemas.microsoft.com/office/word/2018/wordml/cex" xmlns:w16cid="http://schemas.microsoft.com/office/word/2016/wordml/cid" xmlns:w16="http://schemas.microsoft.com/office/word/2018/wordml" xmlns:w16du="http://schemas.microsoft.com/office/word/2023/wordml/word16du" xmlns:w16sdtdh="http://schemas.microsoft.com/office/word/2020/wordml/sdtdatahash" xmlns:w16sdtfl="http://schemas.microsoft.com/office/word/2024/wordml/sdtformatlock" xmlns:w16se="http://schemas.microsoft.com/office/word/2015/wordml/symex" xmlns:wpg="http://schemas.microsoft.com/office/word/2010/wordprocessingGroup" xmlns:wpi="http://schemas.microsoft.com/office/word/2010/wordprocessingInk" xmlns:wne="http://schemas.microsoft.com/office/word/2006/wordml" xmlns:wps="http://schemas.microsoft.com/office/word/2010/wordprocessingShape" mc:Ignorable="w14 w15 w16se w16cid w16 w16cex w16sdtdh w16sdtfl w16du wp14">
   <w16cid:commentId w16cid:paraId="5028B586" w16cid:durableId="29F1A260"/>
   <w16cid:commentId w16cid:paraId="2EF8EAEC" w16cid:durableId="439BA784"/>
-  <w16cid:commentId w16cid:paraId="04C243B5" w16cid:durableId="5A8A6470"/>
-  <w16cid:commentId w16cid:paraId="37C5771E" w16cid:durableId="490E20A6"/>
-  <w16cid:commentId w16cid:paraId="5561B970" w16cid:durableId="519C5851"/>
   <w16cid:commentId w16cid:paraId="65F86C7F" w16cid:durableId="45F6D256"/>
   <w16cid:commentId w16cid:paraId="629A21C5" w16cid:durableId="0000772B"/>
   <w16cid:commentId w16cid:paraId="22E5503D" w16cid:durableId="68A69473"/>

</xml_diff>

<commit_message>
Add acknowledgements to manuscript
</commit_message>
<xml_diff>
--- a/LakeMeadWaterConservationProgramSuccessChallengesSuggestions_v4.docx
+++ b/LakeMeadWaterConservationProgramSuccessChallengesSuggestions_v4.docx
@@ -3191,7 +3191,15 @@
             <w:sz w:val="24"/>
             <w:szCs w:val="24"/>
           </w:rPr>
-          <m:t>=max</m:t>
+          <m:t>=</m:t>
+        </m:r>
+        <m:r>
+          <w:rPr>
+            <w:rFonts w:ascii="Cambria Math" w:hAnsi="Cambria Math" w:cstheme="majorBidi"/>
+            <w:sz w:val="24"/>
+            <w:szCs w:val="24"/>
+          </w:rPr>
+          <m:t>max</m:t>
         </m:r>
         <m:d>
           <m:dPr>
@@ -3243,7 +3251,15 @@
                 <w:sz w:val="24"/>
                 <w:szCs w:val="24"/>
               </w:rPr>
-              <m:t xml:space="preserve">- </m:t>
+              <m:t>-</m:t>
+            </m:r>
+            <m:r>
+              <w:rPr>
+                <w:rFonts w:ascii="Cambria Math" w:hAnsi="Cambria Math" w:cstheme="majorBidi"/>
+                <w:sz w:val="24"/>
+                <w:szCs w:val="24"/>
+              </w:rPr>
+              <m:t xml:space="preserve"> </m:t>
             </m:r>
             <m:sSub>
               <m:sSubPr>
@@ -3293,7 +3309,15 @@
             <w:sz w:val="24"/>
             <w:szCs w:val="24"/>
           </w:rPr>
-          <m:t>,   ∀i</m:t>
+          <m:t>,   ∀</m:t>
+        </m:r>
+        <m:r>
+          <w:rPr>
+            <w:rFonts w:ascii="Cambria Math" w:hAnsi="Cambria Math" w:cstheme="majorBidi"/>
+            <w:sz w:val="24"/>
+            <w:szCs w:val="24"/>
+          </w:rPr>
+          <m:t>i</m:t>
         </m:r>
       </m:oMath>
       <w:r>
@@ -3912,7 +3936,13 @@
           <w:rPr>
             <w:rFonts w:ascii="Cambria Math" w:hAnsi="Cambria Math"/>
           </w:rPr>
-          <m:t>=max</m:t>
+          <m:t>=</m:t>
+        </m:r>
+        <m:r>
+          <w:rPr>
+            <w:rFonts w:ascii="Cambria Math" w:hAnsi="Cambria Math"/>
+          </w:rPr>
+          <m:t>max</m:t>
         </m:r>
         <m:d>
           <m:dPr>
@@ -3986,7 +4016,13 @@
               <w:rPr>
                 <w:rFonts w:ascii="Cambria Math" w:hAnsi="Cambria Math"/>
               </w:rPr>
-              <m:t xml:space="preserve">- </m:t>
+              <m:t>-</m:t>
+            </m:r>
+            <m:r>
+              <w:rPr>
+                <w:rFonts w:ascii="Cambria Math" w:hAnsi="Cambria Math"/>
+              </w:rPr>
+              <m:t xml:space="preserve"> </m:t>
             </m:r>
             <m:sSub>
               <m:sSubPr>
@@ -4026,7 +4062,13 @@
           <w:rPr>
             <w:rFonts w:ascii="Cambria Math" w:hAnsi="Cambria Math"/>
           </w:rPr>
-          <m:t>,   ∀i</m:t>
+          <m:t>,   ∀</m:t>
+        </m:r>
+        <m:r>
+          <w:rPr>
+            <w:rFonts w:ascii="Cambria Math" w:hAnsi="Cambria Math"/>
+          </w:rPr>
+          <m:t>i</m:t>
         </m:r>
       </m:oMath>
       <w:r>
@@ -5110,7 +5152,7 @@
           <w:szCs w:val="24"/>
         </w:rPr>
         <w:drawing>
-          <wp:inline distT="0" distB="0" distL="0" distR="0" wp14:anchorId="1DF02D15" wp14:editId="1D797D1A">
+          <wp:inline distT="0" distB="0" distL="0" distR="0" wp14:anchorId="1DF02D15" wp14:editId="7FC9E889">
             <wp:extent cx="5845696" cy="3329343"/>
             <wp:effectExtent l="0" t="0" r="0" b="0"/>
             <wp:docPr id="708746801" name="Picture 2"/>
@@ -5471,7 +5513,13 @@
           <w:rPr>
             <w:rFonts w:ascii="Cambria Math" w:hAnsi="Cambria Math"/>
           </w:rPr>
-          <m:t>=maximum</m:t>
+          <m:t>=</m:t>
+        </m:r>
+        <m:r>
+          <w:rPr>
+            <w:rFonts w:ascii="Cambria Math" w:hAnsi="Cambria Math"/>
+          </w:rPr>
+          <m:t>maximum</m:t>
         </m:r>
         <m:d>
           <m:dPr>
@@ -5545,7 +5593,13 @@
               <w:rPr>
                 <w:rFonts w:ascii="Cambria Math" w:hAnsi="Cambria Math"/>
               </w:rPr>
-              <m:t xml:space="preserve">- </m:t>
+              <m:t>-</m:t>
+            </m:r>
+            <m:r>
+              <w:rPr>
+                <w:rFonts w:ascii="Cambria Math" w:hAnsi="Cambria Math"/>
+              </w:rPr>
+              <m:t xml:space="preserve"> </m:t>
             </m:r>
             <m:sSub>
               <m:sSubPr>
@@ -6814,7 +6868,19 @@
               <w:rPr>
                 <w:rFonts w:ascii="Cambria Math" w:hAnsi="Cambria Math"/>
               </w:rPr>
-              <m:t>Physical</m:t>
+              <m:t>P</m:t>
+            </m:r>
+            <m:r>
+              <w:rPr>
+                <w:rFonts w:ascii="Cambria Math" w:hAnsi="Cambria Math"/>
+              </w:rPr>
+              <m:t>h</m:t>
+            </m:r>
+            <m:r>
+              <w:rPr>
+                <w:rFonts w:ascii="Cambria Math" w:hAnsi="Cambria Math"/>
+              </w:rPr>
+              <m:t>ysical</m:t>
             </m:r>
           </m:sub>
         </m:sSub>
@@ -6856,7 +6922,13 @@
           <w:rPr>
             <w:rFonts w:ascii="Cambria Math" w:hAnsi="Cambria Math"/>
           </w:rPr>
-          <m:t>≤max</m:t>
+          <m:t>≤</m:t>
+        </m:r>
+        <m:r>
+          <w:rPr>
+            <w:rFonts w:ascii="Cambria Math" w:hAnsi="Cambria Math"/>
+          </w:rPr>
+          <m:t>max</m:t>
         </m:r>
         <m:d>
           <m:dPr>
@@ -6890,7 +6962,19 @@
                   <w:rPr>
                     <w:rFonts w:ascii="Cambria Math" w:hAnsi="Cambria Math"/>
                   </w:rPr>
-                  <m:t>Physical</m:t>
+                  <m:t>P</m:t>
+                </m:r>
+                <m:r>
+                  <w:rPr>
+                    <w:rFonts w:ascii="Cambria Math" w:hAnsi="Cambria Math"/>
+                  </w:rPr>
+                  <m:t>h</m:t>
+                </m:r>
+                <m:r>
+                  <w:rPr>
+                    <w:rFonts w:ascii="Cambria Math" w:hAnsi="Cambria Math"/>
+                  </w:rPr>
+                  <m:t>ysical</m:t>
                 </m:r>
               </m:sub>
             </m:sSub>
@@ -6898,7 +6982,13 @@
               <w:rPr>
                 <w:rFonts w:ascii="Cambria Math" w:hAnsi="Cambria Math"/>
               </w:rPr>
-              <m:t xml:space="preserve">- </m:t>
+              <m:t>-</m:t>
+            </m:r>
+            <m:r>
+              <w:rPr>
+                <w:rFonts w:ascii="Cambria Math" w:hAnsi="Cambria Math"/>
+              </w:rPr>
+              <m:t xml:space="preserve"> </m:t>
             </m:r>
             <m:sSub>
               <m:sSubPr>
@@ -6994,7 +7084,13 @@
           <w:rPr>
             <w:rFonts w:ascii="Cambria Math" w:hAnsi="Cambria Math"/>
           </w:rPr>
-          <m:t>=max</m:t>
+          <m:t>=</m:t>
+        </m:r>
+        <m:r>
+          <w:rPr>
+            <w:rFonts w:ascii="Cambria Math" w:hAnsi="Cambria Math"/>
+          </w:rPr>
+          <m:t>max</m:t>
         </m:r>
         <m:d>
           <m:dPr>
@@ -7046,7 +7142,13 @@
                   <w:rPr>
                     <w:rFonts w:ascii="Cambria Math" w:hAnsi="Cambria Math"/>
                   </w:rPr>
-                  <m:t>-M</m:t>
+                  <m:t>-</m:t>
+                </m:r>
+                <m:r>
+                  <w:rPr>
+                    <w:rFonts w:ascii="Cambria Math" w:hAnsi="Cambria Math"/>
+                  </w:rPr>
+                  <m:t>M</m:t>
                 </m:r>
               </m:e>
               <m:sub>
@@ -7062,7 +7164,13 @@
               <w:rPr>
                 <w:rFonts w:ascii="Cambria Math" w:hAnsi="Cambria Math"/>
               </w:rPr>
-              <m:t xml:space="preserve">- </m:t>
+              <m:t>-</m:t>
+            </m:r>
+            <m:r>
+              <w:rPr>
+                <w:rFonts w:ascii="Cambria Math" w:hAnsi="Cambria Math"/>
+              </w:rPr>
+              <m:t xml:space="preserve"> </m:t>
             </m:r>
             <m:sSub>
               <m:sSubPr>
@@ -7102,7 +7210,13 @@
           <w:rPr>
             <w:rFonts w:ascii="Cambria Math" w:hAnsi="Cambria Math"/>
           </w:rPr>
-          <m:t>∙min</m:t>
+          <m:t>∙</m:t>
+        </m:r>
+        <m:r>
+          <w:rPr>
+            <w:rFonts w:ascii="Cambria Math" w:hAnsi="Cambria Math"/>
+          </w:rPr>
+          <m:t>min</m:t>
         </m:r>
         <m:d>
           <m:dPr>
@@ -7152,7 +7266,19 @@
                       <w:rPr>
                         <w:rFonts w:ascii="Cambria Math" w:hAnsi="Cambria Math"/>
                       </w:rPr>
-                      <m:t>Physical</m:t>
+                      <m:t>P</m:t>
+                    </m:r>
+                    <m:r>
+                      <w:rPr>
+                        <w:rFonts w:ascii="Cambria Math" w:hAnsi="Cambria Math"/>
+                      </w:rPr>
+                      <m:t>h</m:t>
+                    </m:r>
+                    <m:r>
+                      <w:rPr>
+                        <w:rFonts w:ascii="Cambria Math" w:hAnsi="Cambria Math"/>
+                      </w:rPr>
+                      <m:t>ysical</m:t>
                     </m:r>
                   </m:sub>
                 </m:sSub>
@@ -7224,7 +7350,13 @@
           <w:rPr>
             <w:rFonts w:ascii="Cambria Math" w:hAnsi="Cambria Math"/>
           </w:rPr>
-          <m:t>,   ∀i</m:t>
+          <m:t>,   ∀</m:t>
+        </m:r>
+        <m:r>
+          <w:rPr>
+            <w:rFonts w:ascii="Cambria Math" w:hAnsi="Cambria Math"/>
+          </w:rPr>
+          <m:t>i</m:t>
         </m:r>
       </m:oMath>
       <w:r>
@@ -7666,7 +7798,15 @@
                 <w:sz w:val="24"/>
                 <w:szCs w:val="24"/>
               </w:rPr>
-              <m:t>t+1</m:t>
+              <m:t>t</m:t>
+            </m:r>
+            <m:r>
+              <w:rPr>
+                <w:rFonts w:ascii="Cambria Math" w:hAnsi="Cambria Math" w:cstheme="majorBidi"/>
+                <w:sz w:val="24"/>
+                <w:szCs w:val="24"/>
+              </w:rPr>
+              <m:t>+1</m:t>
             </m:r>
           </m:sub>
         </m:sSub>
@@ -7728,7 +7868,79 @@
                 <w:sz w:val="24"/>
                 <w:szCs w:val="24"/>
               </w:rPr>
-              <m:t xml:space="preserve"> + USBR Share of Inflow</m:t>
+              <m:t xml:space="preserve"> + </m:t>
+            </m:r>
+            <m:r>
+              <w:rPr>
+                <w:rFonts w:ascii="Cambria Math" w:hAnsi="Cambria Math" w:cstheme="majorBidi"/>
+                <w:sz w:val="24"/>
+                <w:szCs w:val="24"/>
+              </w:rPr>
+              <m:t>USBR</m:t>
+            </m:r>
+            <m:r>
+              <w:rPr>
+                <w:rFonts w:ascii="Cambria Math" w:hAnsi="Cambria Math" w:cstheme="majorBidi"/>
+                <w:sz w:val="24"/>
+                <w:szCs w:val="24"/>
+              </w:rPr>
+              <m:t xml:space="preserve"> </m:t>
+            </m:r>
+            <m:r>
+              <w:rPr>
+                <w:rFonts w:ascii="Cambria Math" w:hAnsi="Cambria Math" w:cstheme="majorBidi"/>
+                <w:sz w:val="24"/>
+                <w:szCs w:val="24"/>
+              </w:rPr>
+              <m:t>S</m:t>
+            </m:r>
+            <m:r>
+              <w:rPr>
+                <w:rFonts w:ascii="Cambria Math" w:hAnsi="Cambria Math" w:cstheme="majorBidi"/>
+                <w:sz w:val="24"/>
+                <w:szCs w:val="24"/>
+              </w:rPr>
+              <m:t>h</m:t>
+            </m:r>
+            <m:r>
+              <w:rPr>
+                <w:rFonts w:ascii="Cambria Math" w:hAnsi="Cambria Math" w:cstheme="majorBidi"/>
+                <w:sz w:val="24"/>
+                <w:szCs w:val="24"/>
+              </w:rPr>
+              <m:t>are</m:t>
+            </m:r>
+            <m:r>
+              <w:rPr>
+                <w:rFonts w:ascii="Cambria Math" w:hAnsi="Cambria Math" w:cstheme="majorBidi"/>
+                <w:sz w:val="24"/>
+                <w:szCs w:val="24"/>
+              </w:rPr>
+              <m:t xml:space="preserve"> </m:t>
+            </m:r>
+            <m:r>
+              <w:rPr>
+                <w:rFonts w:ascii="Cambria Math" w:hAnsi="Cambria Math" w:cstheme="majorBidi"/>
+                <w:sz w:val="24"/>
+                <w:szCs w:val="24"/>
+              </w:rPr>
+              <m:t>of</m:t>
+            </m:r>
+            <m:r>
+              <w:rPr>
+                <w:rFonts w:ascii="Cambria Math" w:hAnsi="Cambria Math" w:cstheme="majorBidi"/>
+                <w:sz w:val="24"/>
+                <w:szCs w:val="24"/>
+              </w:rPr>
+              <m:t xml:space="preserve"> </m:t>
+            </m:r>
+            <m:r>
+              <w:rPr>
+                <w:rFonts w:ascii="Cambria Math" w:hAnsi="Cambria Math" w:cstheme="majorBidi"/>
+                <w:sz w:val="24"/>
+                <w:szCs w:val="24"/>
+              </w:rPr>
+              <m:t>Inflow</m:t>
             </m:r>
           </m:e>
           <m:sub>
@@ -7806,7 +8018,15 @@
             <w:sz w:val="24"/>
             <w:szCs w:val="24"/>
           </w:rPr>
-          <m:t>∀t</m:t>
+          <m:t>∀</m:t>
+        </m:r>
+        <m:r>
+          <w:rPr>
+            <w:rFonts w:ascii="Cambria Math" w:hAnsi="Cambria Math" w:cstheme="majorBidi"/>
+            <w:sz w:val="24"/>
+            <w:szCs w:val="24"/>
+          </w:rPr>
+          <m:t>t</m:t>
         </m:r>
       </m:oMath>
       <w:r>
@@ -7856,7 +8076,31 @@
                 <w:sz w:val="24"/>
                 <w:szCs w:val="24"/>
               </w:rPr>
-              <m:t>i,t+1</m:t>
+              <m:t>i</m:t>
+            </m:r>
+            <m:r>
+              <w:rPr>
+                <w:rFonts w:ascii="Cambria Math" w:hAnsi="Cambria Math" w:cstheme="majorBidi"/>
+                <w:sz w:val="24"/>
+                <w:szCs w:val="24"/>
+              </w:rPr>
+              <m:t>,</m:t>
+            </m:r>
+            <m:r>
+              <w:rPr>
+                <w:rFonts w:ascii="Cambria Math" w:hAnsi="Cambria Math" w:cstheme="majorBidi"/>
+                <w:sz w:val="24"/>
+                <w:szCs w:val="24"/>
+              </w:rPr>
+              <m:t>t</m:t>
+            </m:r>
+            <m:r>
+              <w:rPr>
+                <w:rFonts w:ascii="Cambria Math" w:hAnsi="Cambria Math" w:cstheme="majorBidi"/>
+                <w:sz w:val="24"/>
+                <w:szCs w:val="24"/>
+              </w:rPr>
+              <m:t>+1</m:t>
             </m:r>
           </m:sub>
         </m:sSub>
@@ -7896,7 +8140,23 @@
                 <w:sz w:val="24"/>
                 <w:szCs w:val="24"/>
               </w:rPr>
-              <m:t>i,t</m:t>
+              <m:t>i</m:t>
+            </m:r>
+            <m:r>
+              <w:rPr>
+                <w:rFonts w:ascii="Cambria Math" w:hAnsi="Cambria Math" w:cstheme="majorBidi"/>
+                <w:sz w:val="24"/>
+                <w:szCs w:val="24"/>
+              </w:rPr>
+              <m:t>,</m:t>
+            </m:r>
+            <m:r>
+              <w:rPr>
+                <w:rFonts w:ascii="Cambria Math" w:hAnsi="Cambria Math" w:cstheme="majorBidi"/>
+                <w:sz w:val="24"/>
+                <w:szCs w:val="24"/>
+              </w:rPr>
+              <m:t>t</m:t>
             </m:r>
           </m:sub>
         </m:sSub>
@@ -7926,7 +8186,55 @@
                 <w:sz w:val="24"/>
                 <w:szCs w:val="24"/>
               </w:rPr>
-              <m:t>Share of Inflow</m:t>
+              <m:t>S</m:t>
+            </m:r>
+            <m:r>
+              <w:rPr>
+                <w:rFonts w:ascii="Cambria Math" w:hAnsi="Cambria Math" w:cstheme="majorBidi"/>
+                <w:sz w:val="24"/>
+                <w:szCs w:val="24"/>
+              </w:rPr>
+              <m:t>h</m:t>
+            </m:r>
+            <m:r>
+              <w:rPr>
+                <w:rFonts w:ascii="Cambria Math" w:hAnsi="Cambria Math" w:cstheme="majorBidi"/>
+                <w:sz w:val="24"/>
+                <w:szCs w:val="24"/>
+              </w:rPr>
+              <m:t>are</m:t>
+            </m:r>
+            <m:r>
+              <w:rPr>
+                <w:rFonts w:ascii="Cambria Math" w:hAnsi="Cambria Math" w:cstheme="majorBidi"/>
+                <w:sz w:val="24"/>
+                <w:szCs w:val="24"/>
+              </w:rPr>
+              <m:t xml:space="preserve"> </m:t>
+            </m:r>
+            <m:r>
+              <w:rPr>
+                <w:rFonts w:ascii="Cambria Math" w:hAnsi="Cambria Math" w:cstheme="majorBidi"/>
+                <w:sz w:val="24"/>
+                <w:szCs w:val="24"/>
+              </w:rPr>
+              <m:t>of</m:t>
+            </m:r>
+            <m:r>
+              <w:rPr>
+                <w:rFonts w:ascii="Cambria Math" w:hAnsi="Cambria Math" w:cstheme="majorBidi"/>
+                <w:sz w:val="24"/>
+                <w:szCs w:val="24"/>
+              </w:rPr>
+              <m:t xml:space="preserve"> </m:t>
+            </m:r>
+            <m:r>
+              <w:rPr>
+                <w:rFonts w:ascii="Cambria Math" w:hAnsi="Cambria Math" w:cstheme="majorBidi"/>
+                <w:sz w:val="24"/>
+                <w:szCs w:val="24"/>
+              </w:rPr>
+              <m:t>Inflow</m:t>
             </m:r>
           </m:e>
           <m:sub>
@@ -7936,7 +8244,23 @@
                 <w:sz w:val="24"/>
                 <w:szCs w:val="24"/>
               </w:rPr>
-              <m:t>i,t</m:t>
+              <m:t>i</m:t>
+            </m:r>
+            <m:r>
+              <w:rPr>
+                <w:rFonts w:ascii="Cambria Math" w:hAnsi="Cambria Math" w:cstheme="majorBidi"/>
+                <w:sz w:val="24"/>
+                <w:szCs w:val="24"/>
+              </w:rPr>
+              <m:t>,</m:t>
+            </m:r>
+            <m:r>
+              <w:rPr>
+                <w:rFonts w:ascii="Cambria Math" w:hAnsi="Cambria Math" w:cstheme="majorBidi"/>
+                <w:sz w:val="24"/>
+                <w:szCs w:val="24"/>
+              </w:rPr>
+              <m:t>t</m:t>
             </m:r>
           </m:sub>
         </m:sSub>
@@ -7976,7 +8300,23 @@
                 <w:sz w:val="24"/>
                 <w:szCs w:val="24"/>
               </w:rPr>
-              <m:t>i,t</m:t>
+              <m:t>i</m:t>
+            </m:r>
+            <m:r>
+              <w:rPr>
+                <w:rFonts w:ascii="Cambria Math" w:hAnsi="Cambria Math" w:cstheme="majorBidi"/>
+                <w:sz w:val="24"/>
+                <w:szCs w:val="24"/>
+              </w:rPr>
+              <m:t>,</m:t>
+            </m:r>
+            <m:r>
+              <w:rPr>
+                <w:rFonts w:ascii="Cambria Math" w:hAnsi="Cambria Math" w:cstheme="majorBidi"/>
+                <w:sz w:val="24"/>
+                <w:szCs w:val="24"/>
+              </w:rPr>
+              <m:t>t</m:t>
             </m:r>
           </m:sub>
         </m:sSub>
@@ -7986,7 +8326,31 @@
             <w:sz w:val="24"/>
             <w:szCs w:val="24"/>
           </w:rPr>
-          <m:t>,   ∀i,t</m:t>
+          <m:t>,   ∀</m:t>
+        </m:r>
+        <m:r>
+          <w:rPr>
+            <w:rFonts w:ascii="Cambria Math" w:hAnsi="Cambria Math" w:cstheme="majorBidi"/>
+            <w:sz w:val="24"/>
+            <w:szCs w:val="24"/>
+          </w:rPr>
+          <m:t>i</m:t>
+        </m:r>
+        <m:r>
+          <w:rPr>
+            <w:rFonts w:ascii="Cambria Math" w:hAnsi="Cambria Math" w:cstheme="majorBidi"/>
+            <w:sz w:val="24"/>
+            <w:szCs w:val="24"/>
+          </w:rPr>
+          <m:t>,</m:t>
+        </m:r>
+        <m:r>
+          <w:rPr>
+            <w:rFonts w:ascii="Cambria Math" w:hAnsi="Cambria Math" w:cstheme="majorBidi"/>
+            <w:sz w:val="24"/>
+            <w:szCs w:val="24"/>
+          </w:rPr>
+          <m:t>t</m:t>
         </m:r>
       </m:oMath>
       <w:r>
@@ -8142,7 +8506,23 @@
                     <w:sz w:val="24"/>
                     <w:szCs w:val="24"/>
                   </w:rPr>
-                  <m:t>i,t</m:t>
+                  <m:t>i</m:t>
+                </m:r>
+                <m:r>
+                  <w:rPr>
+                    <w:rFonts w:ascii="Cambria Math" w:hAnsi="Cambria Math" w:cstheme="majorBidi"/>
+                    <w:sz w:val="24"/>
+                    <w:szCs w:val="24"/>
+                  </w:rPr>
+                  <m:t>,</m:t>
+                </m:r>
+                <m:r>
+                  <w:rPr>
+                    <w:rFonts w:ascii="Cambria Math" w:hAnsi="Cambria Math" w:cstheme="majorBidi"/>
+                    <w:sz w:val="24"/>
+                    <w:szCs w:val="24"/>
+                  </w:rPr>
+                  <m:t>t</m:t>
                 </m:r>
               </m:sub>
             </m:sSub>
@@ -8154,7 +8534,15 @@
             <w:sz w:val="24"/>
             <w:szCs w:val="24"/>
           </w:rPr>
-          <m:t>,   ∀t</m:t>
+          <m:t>,   ∀</m:t>
+        </m:r>
+        <m:r>
+          <w:rPr>
+            <w:rFonts w:ascii="Cambria Math" w:hAnsi="Cambria Math" w:cstheme="majorBidi"/>
+            <w:sz w:val="24"/>
+            <w:szCs w:val="24"/>
+          </w:rPr>
+          <m:t>t</m:t>
         </m:r>
       </m:oMath>
       <w:r>
@@ -10273,6 +10661,22 @@
         <w:pStyle w:val="Heading1"/>
       </w:pPr>
       <w:r>
+        <w:t>Acknowledgements</w:t>
+      </w:r>
+    </w:p>
+    <w:p>
+      <w:pPr>
+        <w:pStyle w:val="NoSpacing"/>
+      </w:pPr>
+      <w:r>
+        <w:t>This research was supported by the Cooperative Institute for Research to Operations in Hydrology (CIROH) with funding under award NA22NWS4320003 from the NOAA Cooperative Institute Program. The statements, findings, conclusions, and recommendations are those of the author(s) and do not necessarily reflect the opinions of NOAA.</w:t>
+      </w:r>
+    </w:p>
+    <w:p>
+      <w:pPr>
+        <w:pStyle w:val="Heading1"/>
+      </w:pPr>
+      <w:r>
         <w:t>Appendix A. Estimate Share</w:t>
       </w:r>
       <w:r>
@@ -10404,7 +10808,11 @@
         <w:t>W</w:t>
       </w:r>
       <w:r>
-        <w:t xml:space="preserve">ater is Total Legal Entitlements minus Total Shortage. </w:t>
+        <w:t xml:space="preserve">ater is Total Legal Entitlements minus </w:t>
+      </w:r>
+      <w:r>
+        <w:lastRenderedPageBreak/>
+        <w:t xml:space="preserve">Total Shortage. </w:t>
       </w:r>
       <w:r>
         <w:t xml:space="preserve">Third, each </w:t>
@@ -10597,6 +11005,9 @@
         </w:rPr>
       </w:pPr>
       <w:r>
+        <w:rPr>
+          <w:noProof/>
+        </w:rPr>
         <w:drawing>
           <wp:inline distT="0" distB="0" distL="0" distR="0" wp14:anchorId="305DA550" wp14:editId="084E76FC">
             <wp:extent cx="4213838" cy="2019869"/>
@@ -15784,6 +16195,7 @@
   <w:style w:type="character" w:default="1" w:styleId="DefaultParagraphFont">
     <w:name w:val="Default Paragraph Font"/>
     <w:uiPriority w:val="1"/>
+    <w:semiHidden/>
     <w:unhideWhenUsed/>
   </w:style>
   <w:style w:type="table" w:default="1" w:styleId="TableNormal">

</xml_diff>

<commit_message>
Update manuscript with link to Hydroshare
</commit_message>
<xml_diff>
--- a/LakeMeadWaterConservationProgramSuccessChallengesSuggestions_v4.docx
+++ b/LakeMeadWaterConservationProgramSuccessChallengesSuggestions_v4.docx
@@ -3191,15 +3191,7 @@
             <w:sz w:val="24"/>
             <w:szCs w:val="24"/>
           </w:rPr>
-          <m:t>=</m:t>
-        </m:r>
-        <m:r>
-          <w:rPr>
-            <w:rFonts w:ascii="Cambria Math" w:hAnsi="Cambria Math" w:cstheme="majorBidi"/>
-            <w:sz w:val="24"/>
-            <w:szCs w:val="24"/>
-          </w:rPr>
-          <m:t>max</m:t>
+          <m:t>=max</m:t>
         </m:r>
         <m:d>
           <m:dPr>
@@ -3251,15 +3243,7 @@
                 <w:sz w:val="24"/>
                 <w:szCs w:val="24"/>
               </w:rPr>
-              <m:t>-</m:t>
-            </m:r>
-            <m:r>
-              <w:rPr>
-                <w:rFonts w:ascii="Cambria Math" w:hAnsi="Cambria Math" w:cstheme="majorBidi"/>
-                <w:sz w:val="24"/>
-                <w:szCs w:val="24"/>
-              </w:rPr>
-              <m:t xml:space="preserve"> </m:t>
+              <m:t xml:space="preserve">- </m:t>
             </m:r>
             <m:sSub>
               <m:sSubPr>
@@ -3309,15 +3293,7 @@
             <w:sz w:val="24"/>
             <w:szCs w:val="24"/>
           </w:rPr>
-          <m:t>,   ∀</m:t>
-        </m:r>
-        <m:r>
-          <w:rPr>
-            <w:rFonts w:ascii="Cambria Math" w:hAnsi="Cambria Math" w:cstheme="majorBidi"/>
-            <w:sz w:val="24"/>
-            <w:szCs w:val="24"/>
-          </w:rPr>
-          <m:t>i</m:t>
+          <m:t>,   ∀i</m:t>
         </m:r>
       </m:oMath>
       <w:r>
@@ -3936,13 +3912,7 @@
           <w:rPr>
             <w:rFonts w:ascii="Cambria Math" w:hAnsi="Cambria Math"/>
           </w:rPr>
-          <m:t>=</m:t>
-        </m:r>
-        <m:r>
-          <w:rPr>
-            <w:rFonts w:ascii="Cambria Math" w:hAnsi="Cambria Math"/>
-          </w:rPr>
-          <m:t>max</m:t>
+          <m:t>=max</m:t>
         </m:r>
         <m:d>
           <m:dPr>
@@ -4016,13 +3986,7 @@
               <w:rPr>
                 <w:rFonts w:ascii="Cambria Math" w:hAnsi="Cambria Math"/>
               </w:rPr>
-              <m:t>-</m:t>
-            </m:r>
-            <m:r>
-              <w:rPr>
-                <w:rFonts w:ascii="Cambria Math" w:hAnsi="Cambria Math"/>
-              </w:rPr>
-              <m:t xml:space="preserve"> </m:t>
+              <m:t xml:space="preserve">- </m:t>
             </m:r>
             <m:sSub>
               <m:sSubPr>
@@ -4062,13 +4026,7 @@
           <w:rPr>
             <w:rFonts w:ascii="Cambria Math" w:hAnsi="Cambria Math"/>
           </w:rPr>
-          <m:t>,   ∀</m:t>
-        </m:r>
-        <m:r>
-          <w:rPr>
-            <w:rFonts w:ascii="Cambria Math" w:hAnsi="Cambria Math"/>
-          </w:rPr>
-          <m:t>i</m:t>
+          <m:t>,   ∀i</m:t>
         </m:r>
       </m:oMath>
       <w:r>
@@ -5152,7 +5110,7 @@
           <w:szCs w:val="24"/>
         </w:rPr>
         <w:drawing>
-          <wp:inline distT="0" distB="0" distL="0" distR="0" wp14:anchorId="1DF02D15" wp14:editId="7FC9E889">
+          <wp:inline distT="0" distB="0" distL="0" distR="0" wp14:anchorId="1DF02D15" wp14:editId="367F9435">
             <wp:extent cx="5845696" cy="3329343"/>
             <wp:effectExtent l="0" t="0" r="0" b="0"/>
             <wp:docPr id="708746801" name="Picture 2"/>
@@ -5513,13 +5471,7 @@
           <w:rPr>
             <w:rFonts w:ascii="Cambria Math" w:hAnsi="Cambria Math"/>
           </w:rPr>
-          <m:t>=</m:t>
-        </m:r>
-        <m:r>
-          <w:rPr>
-            <w:rFonts w:ascii="Cambria Math" w:hAnsi="Cambria Math"/>
-          </w:rPr>
-          <m:t>maximum</m:t>
+          <m:t>=maximum</m:t>
         </m:r>
         <m:d>
           <m:dPr>
@@ -5593,13 +5545,7 @@
               <w:rPr>
                 <w:rFonts w:ascii="Cambria Math" w:hAnsi="Cambria Math"/>
               </w:rPr>
-              <m:t>-</m:t>
-            </m:r>
-            <m:r>
-              <w:rPr>
-                <w:rFonts w:ascii="Cambria Math" w:hAnsi="Cambria Math"/>
-              </w:rPr>
-              <m:t xml:space="preserve"> </m:t>
+              <m:t xml:space="preserve">- </m:t>
             </m:r>
             <m:sSub>
               <m:sSubPr>
@@ -6868,19 +6814,7 @@
               <w:rPr>
                 <w:rFonts w:ascii="Cambria Math" w:hAnsi="Cambria Math"/>
               </w:rPr>
-              <m:t>P</m:t>
-            </m:r>
-            <m:r>
-              <w:rPr>
-                <w:rFonts w:ascii="Cambria Math" w:hAnsi="Cambria Math"/>
-              </w:rPr>
-              <m:t>h</m:t>
-            </m:r>
-            <m:r>
-              <w:rPr>
-                <w:rFonts w:ascii="Cambria Math" w:hAnsi="Cambria Math"/>
-              </w:rPr>
-              <m:t>ysical</m:t>
+              <m:t>Physical</m:t>
             </m:r>
           </m:sub>
         </m:sSub>
@@ -6922,13 +6856,7 @@
           <w:rPr>
             <w:rFonts w:ascii="Cambria Math" w:hAnsi="Cambria Math"/>
           </w:rPr>
-          <m:t>≤</m:t>
-        </m:r>
-        <m:r>
-          <w:rPr>
-            <w:rFonts w:ascii="Cambria Math" w:hAnsi="Cambria Math"/>
-          </w:rPr>
-          <m:t>max</m:t>
+          <m:t>≤max</m:t>
         </m:r>
         <m:d>
           <m:dPr>
@@ -6962,19 +6890,7 @@
                   <w:rPr>
                     <w:rFonts w:ascii="Cambria Math" w:hAnsi="Cambria Math"/>
                   </w:rPr>
-                  <m:t>P</m:t>
-                </m:r>
-                <m:r>
-                  <w:rPr>
-                    <w:rFonts w:ascii="Cambria Math" w:hAnsi="Cambria Math"/>
-                  </w:rPr>
-                  <m:t>h</m:t>
-                </m:r>
-                <m:r>
-                  <w:rPr>
-                    <w:rFonts w:ascii="Cambria Math" w:hAnsi="Cambria Math"/>
-                  </w:rPr>
-                  <m:t>ysical</m:t>
+                  <m:t>Physical</m:t>
                 </m:r>
               </m:sub>
             </m:sSub>
@@ -6982,13 +6898,7 @@
               <w:rPr>
                 <w:rFonts w:ascii="Cambria Math" w:hAnsi="Cambria Math"/>
               </w:rPr>
-              <m:t>-</m:t>
-            </m:r>
-            <m:r>
-              <w:rPr>
-                <w:rFonts w:ascii="Cambria Math" w:hAnsi="Cambria Math"/>
-              </w:rPr>
-              <m:t xml:space="preserve"> </m:t>
+              <m:t xml:space="preserve">- </m:t>
             </m:r>
             <m:sSub>
               <m:sSubPr>
@@ -7084,13 +6994,7 @@
           <w:rPr>
             <w:rFonts w:ascii="Cambria Math" w:hAnsi="Cambria Math"/>
           </w:rPr>
-          <m:t>=</m:t>
-        </m:r>
-        <m:r>
-          <w:rPr>
-            <w:rFonts w:ascii="Cambria Math" w:hAnsi="Cambria Math"/>
-          </w:rPr>
-          <m:t>max</m:t>
+          <m:t>=max</m:t>
         </m:r>
         <m:d>
           <m:dPr>
@@ -7142,13 +7046,7 @@
                   <w:rPr>
                     <w:rFonts w:ascii="Cambria Math" w:hAnsi="Cambria Math"/>
                   </w:rPr>
-                  <m:t>-</m:t>
-                </m:r>
-                <m:r>
-                  <w:rPr>
-                    <w:rFonts w:ascii="Cambria Math" w:hAnsi="Cambria Math"/>
-                  </w:rPr>
-                  <m:t>M</m:t>
+                  <m:t>-M</m:t>
                 </m:r>
               </m:e>
               <m:sub>
@@ -7164,13 +7062,7 @@
               <w:rPr>
                 <w:rFonts w:ascii="Cambria Math" w:hAnsi="Cambria Math"/>
               </w:rPr>
-              <m:t>-</m:t>
-            </m:r>
-            <m:r>
-              <w:rPr>
-                <w:rFonts w:ascii="Cambria Math" w:hAnsi="Cambria Math"/>
-              </w:rPr>
-              <m:t xml:space="preserve"> </m:t>
+              <m:t xml:space="preserve">- </m:t>
             </m:r>
             <m:sSub>
               <m:sSubPr>
@@ -7210,13 +7102,7 @@
           <w:rPr>
             <w:rFonts w:ascii="Cambria Math" w:hAnsi="Cambria Math"/>
           </w:rPr>
-          <m:t>∙</m:t>
-        </m:r>
-        <m:r>
-          <w:rPr>
-            <w:rFonts w:ascii="Cambria Math" w:hAnsi="Cambria Math"/>
-          </w:rPr>
-          <m:t>min</m:t>
+          <m:t>∙min</m:t>
         </m:r>
         <m:d>
           <m:dPr>
@@ -7266,19 +7152,7 @@
                       <w:rPr>
                         <w:rFonts w:ascii="Cambria Math" w:hAnsi="Cambria Math"/>
                       </w:rPr>
-                      <m:t>P</m:t>
-                    </m:r>
-                    <m:r>
-                      <w:rPr>
-                        <w:rFonts w:ascii="Cambria Math" w:hAnsi="Cambria Math"/>
-                      </w:rPr>
-                      <m:t>h</m:t>
-                    </m:r>
-                    <m:r>
-                      <w:rPr>
-                        <w:rFonts w:ascii="Cambria Math" w:hAnsi="Cambria Math"/>
-                      </w:rPr>
-                      <m:t>ysical</m:t>
+                      <m:t>Physical</m:t>
                     </m:r>
                   </m:sub>
                 </m:sSub>
@@ -7350,13 +7224,7 @@
           <w:rPr>
             <w:rFonts w:ascii="Cambria Math" w:hAnsi="Cambria Math"/>
           </w:rPr>
-          <m:t>,   ∀</m:t>
-        </m:r>
-        <m:r>
-          <w:rPr>
-            <w:rFonts w:ascii="Cambria Math" w:hAnsi="Cambria Math"/>
-          </w:rPr>
-          <m:t>i</m:t>
+          <m:t>,   ∀i</m:t>
         </m:r>
       </m:oMath>
       <w:r>
@@ -7798,15 +7666,7 @@
                 <w:sz w:val="24"/>
                 <w:szCs w:val="24"/>
               </w:rPr>
-              <m:t>t</m:t>
-            </m:r>
-            <m:r>
-              <w:rPr>
-                <w:rFonts w:ascii="Cambria Math" w:hAnsi="Cambria Math" w:cstheme="majorBidi"/>
-                <w:sz w:val="24"/>
-                <w:szCs w:val="24"/>
-              </w:rPr>
-              <m:t>+1</m:t>
+              <m:t>t+1</m:t>
             </m:r>
           </m:sub>
         </m:sSub>
@@ -7868,79 +7728,7 @@
                 <w:sz w:val="24"/>
                 <w:szCs w:val="24"/>
               </w:rPr>
-              <m:t xml:space="preserve"> + </m:t>
-            </m:r>
-            <m:r>
-              <w:rPr>
-                <w:rFonts w:ascii="Cambria Math" w:hAnsi="Cambria Math" w:cstheme="majorBidi"/>
-                <w:sz w:val="24"/>
-                <w:szCs w:val="24"/>
-              </w:rPr>
-              <m:t>USBR</m:t>
-            </m:r>
-            <m:r>
-              <w:rPr>
-                <w:rFonts w:ascii="Cambria Math" w:hAnsi="Cambria Math" w:cstheme="majorBidi"/>
-                <w:sz w:val="24"/>
-                <w:szCs w:val="24"/>
-              </w:rPr>
-              <m:t xml:space="preserve"> </m:t>
-            </m:r>
-            <m:r>
-              <w:rPr>
-                <w:rFonts w:ascii="Cambria Math" w:hAnsi="Cambria Math" w:cstheme="majorBidi"/>
-                <w:sz w:val="24"/>
-                <w:szCs w:val="24"/>
-              </w:rPr>
-              <m:t>S</m:t>
-            </m:r>
-            <m:r>
-              <w:rPr>
-                <w:rFonts w:ascii="Cambria Math" w:hAnsi="Cambria Math" w:cstheme="majorBidi"/>
-                <w:sz w:val="24"/>
-                <w:szCs w:val="24"/>
-              </w:rPr>
-              <m:t>h</m:t>
-            </m:r>
-            <m:r>
-              <w:rPr>
-                <w:rFonts w:ascii="Cambria Math" w:hAnsi="Cambria Math" w:cstheme="majorBidi"/>
-                <w:sz w:val="24"/>
-                <w:szCs w:val="24"/>
-              </w:rPr>
-              <m:t>are</m:t>
-            </m:r>
-            <m:r>
-              <w:rPr>
-                <w:rFonts w:ascii="Cambria Math" w:hAnsi="Cambria Math" w:cstheme="majorBidi"/>
-                <w:sz w:val="24"/>
-                <w:szCs w:val="24"/>
-              </w:rPr>
-              <m:t xml:space="preserve"> </m:t>
-            </m:r>
-            <m:r>
-              <w:rPr>
-                <w:rFonts w:ascii="Cambria Math" w:hAnsi="Cambria Math" w:cstheme="majorBidi"/>
-                <w:sz w:val="24"/>
-                <w:szCs w:val="24"/>
-              </w:rPr>
-              <m:t>of</m:t>
-            </m:r>
-            <m:r>
-              <w:rPr>
-                <w:rFonts w:ascii="Cambria Math" w:hAnsi="Cambria Math" w:cstheme="majorBidi"/>
-                <w:sz w:val="24"/>
-                <w:szCs w:val="24"/>
-              </w:rPr>
-              <m:t xml:space="preserve"> </m:t>
-            </m:r>
-            <m:r>
-              <w:rPr>
-                <w:rFonts w:ascii="Cambria Math" w:hAnsi="Cambria Math" w:cstheme="majorBidi"/>
-                <w:sz w:val="24"/>
-                <w:szCs w:val="24"/>
-              </w:rPr>
-              <m:t>Inflow</m:t>
+              <m:t xml:space="preserve"> + USBR Share of Inflow</m:t>
             </m:r>
           </m:e>
           <m:sub>
@@ -8018,15 +7806,7 @@
             <w:sz w:val="24"/>
             <w:szCs w:val="24"/>
           </w:rPr>
-          <m:t>∀</m:t>
-        </m:r>
-        <m:r>
-          <w:rPr>
-            <w:rFonts w:ascii="Cambria Math" w:hAnsi="Cambria Math" w:cstheme="majorBidi"/>
-            <w:sz w:val="24"/>
-            <w:szCs w:val="24"/>
-          </w:rPr>
-          <m:t>t</m:t>
+          <m:t>∀t</m:t>
         </m:r>
       </m:oMath>
       <w:r>
@@ -8076,31 +7856,7 @@
                 <w:sz w:val="24"/>
                 <w:szCs w:val="24"/>
               </w:rPr>
-              <m:t>i</m:t>
-            </m:r>
-            <m:r>
-              <w:rPr>
-                <w:rFonts w:ascii="Cambria Math" w:hAnsi="Cambria Math" w:cstheme="majorBidi"/>
-                <w:sz w:val="24"/>
-                <w:szCs w:val="24"/>
-              </w:rPr>
-              <m:t>,</m:t>
-            </m:r>
-            <m:r>
-              <w:rPr>
-                <w:rFonts w:ascii="Cambria Math" w:hAnsi="Cambria Math" w:cstheme="majorBidi"/>
-                <w:sz w:val="24"/>
-                <w:szCs w:val="24"/>
-              </w:rPr>
-              <m:t>t</m:t>
-            </m:r>
-            <m:r>
-              <w:rPr>
-                <w:rFonts w:ascii="Cambria Math" w:hAnsi="Cambria Math" w:cstheme="majorBidi"/>
-                <w:sz w:val="24"/>
-                <w:szCs w:val="24"/>
-              </w:rPr>
-              <m:t>+1</m:t>
+              <m:t>i,t+1</m:t>
             </m:r>
           </m:sub>
         </m:sSub>
@@ -8140,23 +7896,7 @@
                 <w:sz w:val="24"/>
                 <w:szCs w:val="24"/>
               </w:rPr>
-              <m:t>i</m:t>
-            </m:r>
-            <m:r>
-              <w:rPr>
-                <w:rFonts w:ascii="Cambria Math" w:hAnsi="Cambria Math" w:cstheme="majorBidi"/>
-                <w:sz w:val="24"/>
-                <w:szCs w:val="24"/>
-              </w:rPr>
-              <m:t>,</m:t>
-            </m:r>
-            <m:r>
-              <w:rPr>
-                <w:rFonts w:ascii="Cambria Math" w:hAnsi="Cambria Math" w:cstheme="majorBidi"/>
-                <w:sz w:val="24"/>
-                <w:szCs w:val="24"/>
-              </w:rPr>
-              <m:t>t</m:t>
+              <m:t>i,t</m:t>
             </m:r>
           </m:sub>
         </m:sSub>
@@ -8186,55 +7926,7 @@
                 <w:sz w:val="24"/>
                 <w:szCs w:val="24"/>
               </w:rPr>
-              <m:t>S</m:t>
-            </m:r>
-            <m:r>
-              <w:rPr>
-                <w:rFonts w:ascii="Cambria Math" w:hAnsi="Cambria Math" w:cstheme="majorBidi"/>
-                <w:sz w:val="24"/>
-                <w:szCs w:val="24"/>
-              </w:rPr>
-              <m:t>h</m:t>
-            </m:r>
-            <m:r>
-              <w:rPr>
-                <w:rFonts w:ascii="Cambria Math" w:hAnsi="Cambria Math" w:cstheme="majorBidi"/>
-                <w:sz w:val="24"/>
-                <w:szCs w:val="24"/>
-              </w:rPr>
-              <m:t>are</m:t>
-            </m:r>
-            <m:r>
-              <w:rPr>
-                <w:rFonts w:ascii="Cambria Math" w:hAnsi="Cambria Math" w:cstheme="majorBidi"/>
-                <w:sz w:val="24"/>
-                <w:szCs w:val="24"/>
-              </w:rPr>
-              <m:t xml:space="preserve"> </m:t>
-            </m:r>
-            <m:r>
-              <w:rPr>
-                <w:rFonts w:ascii="Cambria Math" w:hAnsi="Cambria Math" w:cstheme="majorBidi"/>
-                <w:sz w:val="24"/>
-                <w:szCs w:val="24"/>
-              </w:rPr>
-              <m:t>of</m:t>
-            </m:r>
-            <m:r>
-              <w:rPr>
-                <w:rFonts w:ascii="Cambria Math" w:hAnsi="Cambria Math" w:cstheme="majorBidi"/>
-                <w:sz w:val="24"/>
-                <w:szCs w:val="24"/>
-              </w:rPr>
-              <m:t xml:space="preserve"> </m:t>
-            </m:r>
-            <m:r>
-              <w:rPr>
-                <w:rFonts w:ascii="Cambria Math" w:hAnsi="Cambria Math" w:cstheme="majorBidi"/>
-                <w:sz w:val="24"/>
-                <w:szCs w:val="24"/>
-              </w:rPr>
-              <m:t>Inflow</m:t>
+              <m:t>Share of Inflow</m:t>
             </m:r>
           </m:e>
           <m:sub>
@@ -8244,23 +7936,7 @@
                 <w:sz w:val="24"/>
                 <w:szCs w:val="24"/>
               </w:rPr>
-              <m:t>i</m:t>
-            </m:r>
-            <m:r>
-              <w:rPr>
-                <w:rFonts w:ascii="Cambria Math" w:hAnsi="Cambria Math" w:cstheme="majorBidi"/>
-                <w:sz w:val="24"/>
-                <w:szCs w:val="24"/>
-              </w:rPr>
-              <m:t>,</m:t>
-            </m:r>
-            <m:r>
-              <w:rPr>
-                <w:rFonts w:ascii="Cambria Math" w:hAnsi="Cambria Math" w:cstheme="majorBidi"/>
-                <w:sz w:val="24"/>
-                <w:szCs w:val="24"/>
-              </w:rPr>
-              <m:t>t</m:t>
+              <m:t>i,t</m:t>
             </m:r>
           </m:sub>
         </m:sSub>
@@ -8300,23 +7976,7 @@
                 <w:sz w:val="24"/>
                 <w:szCs w:val="24"/>
               </w:rPr>
-              <m:t>i</m:t>
-            </m:r>
-            <m:r>
-              <w:rPr>
-                <w:rFonts w:ascii="Cambria Math" w:hAnsi="Cambria Math" w:cstheme="majorBidi"/>
-                <w:sz w:val="24"/>
-                <w:szCs w:val="24"/>
-              </w:rPr>
-              <m:t>,</m:t>
-            </m:r>
-            <m:r>
-              <w:rPr>
-                <w:rFonts w:ascii="Cambria Math" w:hAnsi="Cambria Math" w:cstheme="majorBidi"/>
-                <w:sz w:val="24"/>
-                <w:szCs w:val="24"/>
-              </w:rPr>
-              <m:t>t</m:t>
+              <m:t>i,t</m:t>
             </m:r>
           </m:sub>
         </m:sSub>
@@ -8326,31 +7986,7 @@
             <w:sz w:val="24"/>
             <w:szCs w:val="24"/>
           </w:rPr>
-          <m:t>,   ∀</m:t>
-        </m:r>
-        <m:r>
-          <w:rPr>
-            <w:rFonts w:ascii="Cambria Math" w:hAnsi="Cambria Math" w:cstheme="majorBidi"/>
-            <w:sz w:val="24"/>
-            <w:szCs w:val="24"/>
-          </w:rPr>
-          <m:t>i</m:t>
-        </m:r>
-        <m:r>
-          <w:rPr>
-            <w:rFonts w:ascii="Cambria Math" w:hAnsi="Cambria Math" w:cstheme="majorBidi"/>
-            <w:sz w:val="24"/>
-            <w:szCs w:val="24"/>
-          </w:rPr>
-          <m:t>,</m:t>
-        </m:r>
-        <m:r>
-          <w:rPr>
-            <w:rFonts w:ascii="Cambria Math" w:hAnsi="Cambria Math" w:cstheme="majorBidi"/>
-            <w:sz w:val="24"/>
-            <w:szCs w:val="24"/>
-          </w:rPr>
-          <m:t>t</m:t>
+          <m:t>,   ∀i,t</m:t>
         </m:r>
       </m:oMath>
       <w:r>
@@ -8506,23 +8142,7 @@
                     <w:sz w:val="24"/>
                     <w:szCs w:val="24"/>
                   </w:rPr>
-                  <m:t>i</m:t>
-                </m:r>
-                <m:r>
-                  <w:rPr>
-                    <w:rFonts w:ascii="Cambria Math" w:hAnsi="Cambria Math" w:cstheme="majorBidi"/>
-                    <w:sz w:val="24"/>
-                    <w:szCs w:val="24"/>
-                  </w:rPr>
-                  <m:t>,</m:t>
-                </m:r>
-                <m:r>
-                  <w:rPr>
-                    <w:rFonts w:ascii="Cambria Math" w:hAnsi="Cambria Math" w:cstheme="majorBidi"/>
-                    <w:sz w:val="24"/>
-                    <w:szCs w:val="24"/>
-                  </w:rPr>
-                  <m:t>t</m:t>
+                  <m:t>i,t</m:t>
                 </m:r>
               </m:sub>
             </m:sSub>
@@ -8534,15 +8154,7 @@
             <w:sz w:val="24"/>
             <w:szCs w:val="24"/>
           </w:rPr>
-          <m:t>,   ∀</m:t>
-        </m:r>
-        <m:r>
-          <w:rPr>
-            <w:rFonts w:ascii="Cambria Math" w:hAnsi="Cambria Math" w:cstheme="majorBidi"/>
-            <w:sz w:val="24"/>
-            <w:szCs w:val="24"/>
-          </w:rPr>
-          <m:t>t</m:t>
+          <m:t>,   ∀t</m:t>
         </m:r>
       </m:oMath>
       <w:r>
@@ -10638,7 +10250,7 @@
         <w:fldChar w:fldCharType="begin"/>
       </w:r>
       <w:r>
-        <w:instrText xml:space="preserve"> ADDIN EN.CITE &lt;EndNote&gt;&lt;Cite&gt;&lt;Author&gt;Rosenberg&lt;/Author&gt;&lt;Year&gt;2026&lt;/Year&gt;&lt;RecNum&gt;3121&lt;/RecNum&gt;&lt;DisplayText&gt;(Rosenberg and Myers, 2026)&lt;/DisplayText&gt;&lt;record&gt;&lt;rec-number&gt;3121&lt;/rec-number&gt;&lt;foreign-keys&gt;&lt;key app="EN" db-id="xxt5ta9pd995dwesap0pdzzp2weaz0w9werf" timestamp="1783713642"&gt;3121&lt;/key&gt;&lt;/foreign-keys&gt;&lt;ref-type name="Journal Article"&gt;17&lt;/ref-type&gt;&lt;contributors&gt;&lt;authors&gt;&lt;author&gt;David Rosenberg&lt;/author&gt;&lt;author&gt;Anabelle Myers&lt;/author&gt;&lt;/authors&gt;&lt;/contributors&gt;&lt;titles&gt;&lt;title&gt;The Lake Mead Water Conservation Program: Reducing Users’ Conflicting Risks of Declining Flows with more Adaptation and Autonomy&lt;/title&gt;&lt;secondary-title&gt;Github, Utah State Unviersity&lt;/secondary-title&gt;&lt;/titles&gt;&lt;periodical&gt;&lt;full-title&gt;Github, Utah State Unviersity&lt;/full-title&gt;&lt;/periodical&gt;&lt;dates&gt;&lt;year&gt;2026&lt;/year&gt;&lt;/dates&gt;&lt;urls&gt;&lt;related-urls&gt;&lt;url&gt;https://github.com/ImmersiveModelsColoradoRiver/LakeMeadWaterConservationProgramAnalysis/tree/David&lt;/url&gt;&lt;/related-urls&gt;&lt;/urls&gt;&lt;/record&gt;&lt;/Cite&gt;&lt;/EndNote&gt;</w:instrText>
+        <w:instrText xml:space="preserve"> ADDIN EN.CITE &lt;EndNote&gt;&lt;Cite&gt;&lt;Author&gt;Rosenberg&lt;/Author&gt;&lt;Year&gt;2026&lt;/Year&gt;&lt;RecNum&gt;3121&lt;/RecNum&gt;&lt;DisplayText&gt;(Rosenberg and Myers, 2026)&lt;/DisplayText&gt;&lt;record&gt;&lt;rec-number&gt;3121&lt;/rec-number&gt;&lt;foreign-keys&gt;&lt;key app="EN" db-id="xxt5ta9pd995dwesap0pdzzp2weaz0w9werf" timestamp="1783713642"&gt;3121&lt;/key&gt;&lt;/foreign-keys&gt;&lt;ref-type name="Journal Article"&gt;17&lt;/ref-type&gt;&lt;contributors&gt;&lt;authors&gt;&lt;author&gt;David Rosenberg&lt;/author&gt;&lt;author&gt;Anabelle Myers&lt;/author&gt;&lt;/authors&gt;&lt;/contributors&gt;&lt;titles&gt;&lt;title&gt;The Lake Mead Water Conservation Program Analysis&lt;/title&gt;&lt;secondary-title&gt;Hydroshare&lt;/secondary-title&gt;&lt;/titles&gt;&lt;periodical&gt;&lt;full-title&gt;Hydroshare&lt;/full-title&gt;&lt;/periodical&gt;&lt;dates&gt;&lt;year&gt;2026&lt;/year&gt;&lt;/dates&gt;&lt;urls&gt;&lt;related-urls&gt;&lt;url&gt;http://www.hydroshare.org/resource/71a971cd51b64ef8a7030f25639c0a3c&lt;/url&gt;&lt;/related-urls&gt;&lt;/urls&gt;&lt;electronic-resource-num&gt;http://www.hydroshare.org/resource/71a971cd51b64ef8a7030f25639c0a3c&lt;/electronic-resource-num&gt;&lt;/record&gt;&lt;/Cite&gt;&lt;/EndNote&gt;</w:instrText>
       </w:r>
       <w:r>
         <w:fldChar w:fldCharType="separate"/>
@@ -11570,13 +11182,13 @@
         <w:ind w:left="720" w:hanging="720"/>
       </w:pPr>
       <w:r>
-        <w:t xml:space="preserve">Rosenberg, D., and Myers, A. (2026). "The Lake Mead Water Conservation Program: Reducing Users’ Conflicting Risks of Declining Flows with more Adaptation and Autonomy." </w:t>
+        <w:t xml:space="preserve">Rosenberg, D., and Myers, A. (2026). "The Lake Mead Water Conservation Program Analysis." </w:t>
       </w:r>
       <w:r>
         <w:rPr>
           <w:i/>
         </w:rPr>
-        <w:t>Github, Utah State Unviersity</w:t>
+        <w:t>Hydroshare</w:t>
       </w:r>
       <w:r>
         <w:t xml:space="preserve">. </w:t>
@@ -11586,7 +11198,7 @@
           <w:rPr>
             <w:rStyle w:val="Hyperlink"/>
           </w:rPr>
-          <w:t>https://github.com/ImmersiveModelsColoradoRiver/LakeMeadWaterConservationProgramAnalysis/tree/David</w:t>
+          <w:t>http://www.hydroshare.org/resource/71a971cd51b64ef8a7030f25639c0a3c</w:t>
         </w:r>
       </w:hyperlink>
       <w:r>
@@ -11771,7 +11383,6 @@
         <w:ind w:left="720" w:hanging="720"/>
       </w:pPr>
       <w:r>
-        <w:lastRenderedPageBreak/>
         <w:t xml:space="preserve">Stelter, D. (2022). "Towards a Utah Intentionally Created Surplus Program." </w:t>
       </w:r>
       <w:r>
@@ -16195,7 +15806,6 @@
   <w:style w:type="character" w:default="1" w:styleId="DefaultParagraphFont">
     <w:name w:val="Default Paragraph Font"/>
     <w:uiPriority w:val="1"/>
-    <w:semiHidden/>
     <w:unhideWhenUsed/>
   </w:style>
   <w:style w:type="table" w:default="1" w:styleId="TableNormal">

</xml_diff>

<commit_message>
Updates to manuscript file including count of number of participants and sessions
</commit_message>
<xml_diff>
--- a/LakeMeadWaterConservationProgramSuccessChallengesSuggestions_v4.docx
+++ b/LakeMeadWaterConservationProgramSuccessChallengesSuggestions_v4.docx
@@ -394,7 +394,7 @@
         <w:t xml:space="preserve">legal entitlements of 9.0 million acre-feet per year. This assumption is challenged as the Colorado River Basin becomes more arid. Additionally, as reservoir storage declines towards catastrophic elevations, users face difficulty accessing and withdrawing their conserved water. We suggest two novel improvements that tie accounting of reductions to the annual physically available water, rather than historical entitlements: 1) Proportionally reduce credits for conserved water, and 2) Create a new protection account to be managed by the U.S. Bureau of </w:t>
       </w:r>
       <w:r>
-        <w:t>USBR</w:t>
+        <w:t>Reclamation</w:t>
       </w:r>
       <w:r>
         <w:t xml:space="preserve"> (USBR), with separate water accounts for each user. Through these structures, the USBR take</w:t>
@@ -409,11 +409,11 @@
         <w:t xml:space="preserve"> first</w:t>
       </w:r>
       <w:r>
-        <w:t xml:space="preserve"> share of the physically </w:t>
+        <w:t xml:space="preserve"> share of the </w:t>
       </w:r>
       <w:r>
         <w:lastRenderedPageBreak/>
-        <w:t xml:space="preserve">available water that is equal to reservoir evaporation to sustain the protected volume. Then, </w:t>
+        <w:t xml:space="preserve">physically available water that is equal to reservoir evaporation to sustain the protected volume. Then, </w:t>
       </w:r>
       <w:r>
         <w:t xml:space="preserve">water </w:t>
@@ -1307,7 +1307,13 @@
         <w:fldChar w:fldCharType="end"/>
       </w:r>
       <w:r>
-        <w:t xml:space="preserve">. Minutes 319 and 323 to the 1944 United States - Mexico treaty set up similar voluntary water conservation mandatory shortage programs for Mexico </w:t>
+        <w:t xml:space="preserve">. Minutes 319 and 323 to the 1944 United States - Mexico treaty set up similar voluntary water conservation </w:t>
+      </w:r>
+      <w:r>
+        <w:t xml:space="preserve">and </w:t>
+      </w:r>
+      <w:r>
+        <w:t xml:space="preserve">mandatory shortage programs for Mexico </w:t>
       </w:r>
       <w:r>
         <w:fldChar w:fldCharType="begin"/>
@@ -1363,7 +1369,7 @@
         <w:fldChar w:fldCharType="end"/>
       </w:r>
       <w:r>
-        <w:t xml:space="preserve"> wrote that the program was the “most imaginative” part of the 2007 Interim Guidelines and that the program will increase water supply or make supply more productive.  Agencies that participate in the program are no longer subject to "use it or lose it" common to laws that do not incentivize conservation and continue to govern water use in many western states. </w:t>
+        <w:t xml:space="preserve"> wrote that the program was the “most imaginative” part of the 2007 Interim Guidelines and that the program will increase water supply or make supply more productive. Agencies that participate in the program are no longer subject to "use it or lose it" common to laws that do not incentivize conservation and continue to govern water use in many western states. </w:t>
       </w:r>
       <w:r>
         <w:t>Without the program, i</w:t>
@@ -1404,7 +1410,16 @@
         <w:t xml:space="preserve">the </w:t>
       </w:r>
       <w:r>
-        <w:t>USBR</w:t>
+        <w:t>U</w:t>
+      </w:r>
+      <w:r>
+        <w:t>.S. Bureau of Reclamation (USB</w:t>
+      </w:r>
+      <w:r>
+        <w:t>R</w:t>
+      </w:r>
+      <w:r>
+        <w:t>)</w:t>
       </w:r>
       <w:r>
         <w:t>, the Federal agency responsible to manage Lake Mead,</w:t>
@@ -1473,11 +1488,11 @@
         <w:fldChar w:fldCharType="end"/>
       </w:r>
       <w:r>
-        <w:t xml:space="preserve"> suggested to assign up to 50% of conserved water to remain in Lake Mead as system water to </w:t>
+        <w:t xml:space="preserve"> suggested to assign up to 50% of conserved water to remain in </w:t>
       </w:r>
       <w:r>
         <w:lastRenderedPageBreak/>
-        <w:t xml:space="preserve">create a balance of individual and collective resiliency. </w:t>
+        <w:t xml:space="preserve">Lake Mead as system water to create a balance of individual and collective resiliency. </w:t>
       </w:r>
       <w:r>
         <w:fldChar w:fldCharType="begin"/>
@@ -1879,7 +1894,13 @@
         <w:pStyle w:val="NoSpacing"/>
       </w:pPr>
       <w:r>
-        <w:t xml:space="preserve">This article provides an overview of the program, analyzes its operations to date, and its capacity for future success. The analysis is broken into five sections. First, we provide definitions and examples of Lake Mead water conservation program activities (Section 2). Next, we share program successes and challenges (Sections 3 and 4). </w:t>
+        <w:t xml:space="preserve">This article provides an overview of the program, analyzes its operations to date, and its capacity for future success. The analysis is broken into </w:t>
+      </w:r>
+      <w:r>
+        <w:t>7</w:t>
+      </w:r>
+      <w:r>
+        <w:t xml:space="preserve"> sections. First, we provide definitions and examples of Lake Mead water conservation program activities (Section 2). Next, we share program successes and challenges (Sections 3 and 4). </w:t>
       </w:r>
       <w:r>
         <w:t>W</w:t>
@@ -1891,13 +1912,34 @@
         <w:t xml:space="preserve"> then</w:t>
       </w:r>
       <w:r>
-        <w:t xml:space="preserve"> share suggestions to increase water user autonomy to manage risk with declining flows (Section 5). The suggestions switch reservoir accounting structures for tracking water from reductions of historical entitlements to water accounting based on the apportionment of physical reservoir inflow. We illustrate some of the many more </w:t>
-      </w:r>
-      <w:r>
-        <w:t xml:space="preserve">adaptive and </w:t>
-      </w:r>
-      <w:r>
-        <w:t xml:space="preserve">autonomous strategies that water users can adopt within a water accounting framework (Section 6). </w:t>
+        <w:t xml:space="preserve"> share </w:t>
+      </w:r>
+      <w:r>
+        <w:t>2 frameworks</w:t>
+      </w:r>
+      <w:r>
+        <w:t xml:space="preserve"> to increase water user autonomy to manage risk with declining flows (Section 5). The suggestions switch reservoir accounting structures from reductions </w:t>
+      </w:r>
+      <w:r>
+        <w:t>from</w:t>
+      </w:r>
+      <w:r>
+        <w:t xml:space="preserve"> historical entitlements to apportionment of physical reservoir inflow. We illustrate some of the many more autonomous strategies that </w:t>
+      </w:r>
+      <w:r>
+        <w:t>49 collaborator</w:t>
+      </w:r>
+      <w:r>
+        <w:t xml:space="preserve">s </w:t>
+      </w:r>
+      <w:r>
+        <w:t xml:space="preserve">adapted </w:t>
+      </w:r>
+      <w:r>
+        <w:t>during 16 immersive online collaborative model sessions</w:t>
+      </w:r>
+      <w:r>
+        <w:t xml:space="preserve"> (Section 6). </w:t>
       </w:r>
       <w:r>
         <w:t>Section 7</w:t>
@@ -3119,7 +3161,7 @@
         <w:t xml:space="preserve">Lake Mead water conservation program activities can be considered as reservoir </w:t>
       </w:r>
       <w:r>
-        <w:t>withdrawls</w:t>
+        <w:t>withdraws</w:t>
       </w:r>
       <w:r>
         <w:t xml:space="preserve"> below or above legal entitlements (credits and debits; Box 1; Examples 1 and 2). A water user (</w:t>
@@ -4767,13 +4809,19 @@
         </w:numPr>
       </w:pPr>
       <w:r>
-        <w:t>States have some additional autonomy for reservoir withdraw</w:t>
-      </w:r>
-      <w:r>
-        <w:t>l</w:t>
-      </w:r>
-      <w:r>
-        <w:t>s and  vulnerability management independent of other states' activities which reduces conflict.</w:t>
+        <w:t xml:space="preserve">States have some additional autonomy for reservoir </w:t>
+      </w:r>
+      <w:r>
+        <w:t>withdraws</w:t>
+      </w:r>
+      <w:r>
+        <w:t xml:space="preserve"> and vulnerability management independent of other states' activities</w:t>
+      </w:r>
+      <w:r>
+        <w:t>. This autonomy</w:t>
+      </w:r>
+      <w:r>
+        <w:t xml:space="preserve"> reduces conflict.</w:t>
       </w:r>
     </w:p>
     <w:p>
@@ -4980,7 +5028,7 @@
       </w:r>
       <w:r>
         <w:lastRenderedPageBreak/>
-        <w:t>drawdown Lake Mead close to the protection elevation in a few years. Within the current conservation framework, Lower Basin states and Mexico have loaned the Colorado River system 3.6 million acre-feet of water, which they may want to withdraw in the future. Absent systemwide goals, once users perceive that Lake Mead will drawdown close to the protection volume, they may race to withdraw their conserved water account balances.</w:t>
+        <w:t>drawdown Lake Mead close to the protection elevation in a few years. Within the current conservation framework, Lower Basin states and Mexico loaned the Colorado River system 3.6 million acre-feet of water, which they may want to withdraw in the future. Absent systemwide goals, once users perceive that Lake Mead will drawdown close to the protection volume, they may race to withdraw their conserved water account balances.</w:t>
       </w:r>
     </w:p>
     <w:p>
@@ -5001,12 +5049,16 @@
     <w:p>
       <w:pPr>
         <w:pStyle w:val="NoSpacing"/>
+        <w:numPr>
+          <w:ilvl w:val="0"/>
+          <w:numId w:val="38"/>
+        </w:numPr>
       </w:pPr>
       <w:r>
         <w:t xml:space="preserve">Multiple states simultaneously want to withdraw their conserved storage, which results in Lake Mead dropping below its protection elevation. States would need to agree on smaller </w:t>
       </w:r>
       <w:r>
-        <w:t>withdrawls</w:t>
+        <w:t>withdraws</w:t>
       </w:r>
       <w:r>
         <w:t xml:space="preserve"> that keep Lake Mead at or above the protection elevation.</w:t>
@@ -5015,6 +5067,10 @@
     <w:p>
       <w:pPr>
         <w:pStyle w:val="NoSpacing"/>
+        <w:numPr>
+          <w:ilvl w:val="0"/>
+          <w:numId w:val="38"/>
+        </w:numPr>
       </w:pPr>
       <w:r>
         <w:rPr>
@@ -5026,7 +5082,7 @@
         <w:t xml:space="preserve"> </w:t>
       </w:r>
       <w:r>
-        <w:t>withdrawls</w:t>
+        <w:t>withdraws</w:t>
       </w:r>
       <w:r>
         <w:t xml:space="preserve"> their conserved water which brings Lake Mead’s storage towards the protection volume. This act will prevent other states’ ability to access their conserved water.</w:t>
@@ -5053,7 +5109,13 @@
         <w:t>st</w:t>
       </w:r>
       <w:r>
-        <w:t xml:space="preserve"> Century. These needs include water for Tribal Nations, multi-species conservation between Hoover Dam and the Northern International Boundary with Mexico, and municipal. There is an ongoing debate about what is the minimum volume of supply for municipal use. </w:t>
+        <w:t xml:space="preserve"> Century. These needs include water for Tribal Nations, multi-species conservation between Hoover Dam and the Northern International Boundary with Mexico, and municipal</w:t>
+      </w:r>
+      <w:r>
+        <w:t xml:space="preserve"> uses</w:t>
+      </w:r>
+      <w:r>
+        <w:t xml:space="preserve">. There is an ongoing debate about what is the minimum volume of supply for municipal use. </w:t>
       </w:r>
     </w:p>
     <w:p>
@@ -5074,11 +5136,8 @@
         <w:t xml:space="preserve"> </w:t>
       </w:r>
       <w:r>
-        <w:t xml:space="preserve">exceeds the sum of legal entitlements of 9.0 million acre-feet per year to California, Arizona, </w:t>
-      </w:r>
-      <w:r>
         <w:lastRenderedPageBreak/>
-        <w:t>Nevada, and Mexico. When this assumption is false, Lake Mead will draw down even as states leave conserved water in Lake Mead. Essentially, states got credit for water conservation activity even though the physical water may have never entered the reservoir. There are cases when the assumption is valid and invalid (Figure 4).</w:t>
+        <w:t>exceeds the sum of legal entitlements of 9.0 million acre-feet per year to California, Arizona, Nevada, and Mexico. When this assumption is false, Lake Mead will draw down even as states leave conserved water in Lake Mead. Essentially, states got credit for water conservation activity even though the physical water may have never entered the reservoir. There are cases when the assumption is valid and invalid (Figure 4).</w:t>
       </w:r>
     </w:p>
     <w:p>
@@ -5110,7 +5169,7 @@
           <w:szCs w:val="24"/>
         </w:rPr>
         <w:drawing>
-          <wp:inline distT="0" distB="0" distL="0" distR="0" wp14:anchorId="1DF02D15" wp14:editId="367F9435">
+          <wp:inline distT="0" distB="0" distL="0" distR="0" wp14:anchorId="1DF02D15" wp14:editId="0CD1CF36">
             <wp:extent cx="5845696" cy="3329343"/>
             <wp:effectExtent l="0" t="0" r="0" b="0"/>
             <wp:docPr id="708746801" name="Picture 2"/>
@@ -5594,6 +5653,7 @@
         <w:pStyle w:val="NoSpacing"/>
       </w:pPr>
       <w:r>
+        <w:lastRenderedPageBreak/>
         <w:t>In case 1</w:t>
       </w:r>
       <w:r>
@@ -5713,11 +5773,7 @@
         <w:t>). I</w:t>
       </w:r>
       <w:r>
-        <w:t xml:space="preserve">n this </w:t>
-      </w:r>
-      <w:r>
-        <w:lastRenderedPageBreak/>
-        <w:t>case</w:t>
+        <w:t>n this case</w:t>
       </w:r>
       <w:r>
         <w:t xml:space="preserve"> [</w:t>
@@ -6251,7 +6307,15 @@
           <w:b/>
           <w:bCs/>
         </w:rPr>
-        <w:t>in relation to total legal entitlements of 9.0 million acre-feet</w:t>
+        <w:t xml:space="preserve">in relation to total legal </w:t>
+      </w:r>
+      <w:r>
+        <w:rPr>
+          <w:b/>
+          <w:bCs/>
+        </w:rPr>
+        <w:lastRenderedPageBreak/>
+        <w:t>entitlements of 9.0 million acre-feet</w:t>
       </w:r>
       <w:r>
         <w:rPr>
@@ -6591,7 +6655,11 @@
         <w:t>or</w:t>
       </w:r>
       <w:r>
-        <w:t xml:space="preserve"> pulse flows to the Colorado River delta.</w:t>
+        <w:t xml:space="preserve"> pulse flows to the Colorado </w:t>
+      </w:r>
+      <w:r>
+        <w:lastRenderedPageBreak/>
+        <w:t>River delta.</w:t>
       </w:r>
       <w:r>
         <w:t xml:space="preserve"> </w:t>
@@ -6603,11 +6671,7 @@
         <w:t>new operational policies that</w:t>
       </w:r>
       <w:r>
-        <w:t xml:space="preserve"> split conserved water between Lake Powell and </w:t>
-      </w:r>
-      <w:r>
-        <w:lastRenderedPageBreak/>
-        <w:t xml:space="preserve">Lake Mead </w:t>
+        <w:t xml:space="preserve"> split conserved water between Lake Powell and Lake Mead </w:t>
       </w:r>
       <w:r>
         <w:t xml:space="preserve">can </w:t>
@@ -7522,6 +7586,7 @@
           <w:b/>
           <w:bCs/>
         </w:rPr>
+        <w:lastRenderedPageBreak/>
         <w:t xml:space="preserve">Reservoir Storage Protection Account. </w:t>
       </w:r>
       <w:r>
@@ -7531,11 +7596,7 @@
         <w:t>USBR</w:t>
       </w:r>
       <w:r>
-        <w:t xml:space="preserve"> </w:t>
-      </w:r>
-      <w:r>
-        <w:lastRenderedPageBreak/>
-        <w:t>(</w:t>
+        <w:t xml:space="preserve"> (</w:t>
       </w:r>
       <w:r>
         <w:rPr>
@@ -8350,7 +8411,7 @@
         <w:t xml:space="preserve">prohibits </w:t>
       </w:r>
       <w:r>
-        <w:t>withdrawls</w:t>
+        <w:t>withdraws</w:t>
       </w:r>
       <w:r>
         <w:t xml:space="preserve"> of conserved water, thus providing users additional autonomy and adaptability</w:t>
@@ -8364,6 +8425,7 @@
         <w:pStyle w:val="Heading1"/>
       </w:pPr>
       <w:r>
+        <w:lastRenderedPageBreak/>
         <w:t xml:space="preserve">Illustrations of </w:t>
       </w:r>
       <w:r>
@@ -8417,17 +8479,52 @@
         <w:fldChar w:fldCharType="end"/>
       </w:r>
       <w:r>
-        <w:t xml:space="preserve">, it is difficult to predict and model users' water consumption and conservation choices, and corresponding Lake Mead storage volumes. </w:t>
-      </w:r>
-      <w:r>
-        <w:lastRenderedPageBreak/>
-        <w:t xml:space="preserve">Prediction is difficult because </w:t>
+        <w:t xml:space="preserve">, it is difficult to predict and model users' water consumption and conservation choices, and </w:t>
+      </w:r>
+      <w:r>
+        <w:t xml:space="preserve">the </w:t>
+      </w:r>
+      <w:r>
+        <w:t xml:space="preserve">corresponding Lake Mead storage volumes. Prediction is difficult </w:t>
+      </w:r>
+      <w:r>
+        <w:t xml:space="preserve">in water accounting frameworks </w:t>
+      </w:r>
+      <w:r>
+        <w:t xml:space="preserve">because </w:t>
       </w:r>
       <w:r>
         <w:t xml:space="preserve">water </w:t>
       </w:r>
       <w:r>
-        <w:t xml:space="preserve">users can adapt their choices year-to-year for a variety of reasons that are not readily coded into simulation models and rules. Here, we instead use collaborator choices in recent immersive, online, collaborative modeling sessions to illustrate a few possibilities of water accounting. Within a session, collaborators immersed in and personified a Lake Mead </w:t>
+        <w:t xml:space="preserve">users can adapt their choices year-to-year for a variety of reasons that are not readily coded into simulation models and rules. Here, we instead use </w:t>
+      </w:r>
+      <w:r>
+        <w:t xml:space="preserve">49 </w:t>
+      </w:r>
+      <w:r>
+        <w:t>collaborator</w:t>
+      </w:r>
+      <w:r>
+        <w:t>’s</w:t>
+      </w:r>
+      <w:r>
+        <w:t xml:space="preserve"> choices in </w:t>
+      </w:r>
+      <w:r>
+        <w:t xml:space="preserve">16 </w:t>
+      </w:r>
+      <w:r>
+        <w:t xml:space="preserve">immersive, online, collaborative modeling sessions </w:t>
+      </w:r>
+      <w:r>
+        <w:t xml:space="preserve">going </w:t>
+      </w:r>
+      <w:r>
+        <w:t xml:space="preserve">back to May 2025 </w:t>
+      </w:r>
+      <w:r>
+        <w:t xml:space="preserve">to illustrate a few possibilities of water accounting. Within a session, collaborators immersed in and personified a Lake Mead </w:t>
       </w:r>
       <w:r>
         <w:t xml:space="preserve">water </w:t>
@@ -8439,23 +8536,7 @@
         <w:t>USBR</w:t>
       </w:r>
       <w:r>
-        <w:t xml:space="preserve"> (protection volume), California, Arizona, Nevada, Mexico, and Tribal Nations of the Lower Basin. Each year, we chose and </w:t>
-      </w:r>
-      <w:commentRangeStart w:id="2"/>
-      <w:r>
-        <w:t xml:space="preserve">revealed </w:t>
-      </w:r>
-      <w:commentRangeEnd w:id="2"/>
-      <w:r>
-        <w:rPr>
-          <w:rStyle w:val="CommentReference"/>
-          <w:sz w:val="24"/>
-          <w:szCs w:val="24"/>
-        </w:rPr>
-        <w:commentReference w:id="2"/>
-      </w:r>
-      <w:r>
-        <w:t xml:space="preserve">the Lake Mead inflow. </w:t>
+        <w:t xml:space="preserve"> (protection volume), California, Arizona, Nevada, Mexico, and Tribal Nations of the Lower Basin. Each year, we chose and revealed the Lake Mead inflow. </w:t>
       </w:r>
       <w:r>
         <w:t xml:space="preserve">We chose </w:t>
@@ -8470,7 +8551,37 @@
         <w:t xml:space="preserve"> </w:t>
       </w:r>
       <w:r>
-        <w:t xml:space="preserve">The model apportioned the inflow among the user accounts. Then, each collaborator consumed, conserved, or traded within their account balance. Collaborators carried over account balances to the next year, which also kept Lake Mead storage above the protection volume. Each collaborator participated in one  session, and each session lasted ~ 2 hours. Otherwise, sessions followed the structure of prior immersive modeling work </w:t>
+        <w:t>The model apportioned the inflow among the user accounts. Then, each collaborator consumed, conserved, or traded within their account balance. Collaborators carried over account balances to the next year, which also kept Lake Mead storage above the protection volume. Each collaborator participated in one session</w:t>
+      </w:r>
+      <w:r>
+        <w:t xml:space="preserve"> and played a role different than themselves. S</w:t>
+      </w:r>
+      <w:r>
+        <w:t xml:space="preserve">essions had 1 to 7 people </w:t>
+      </w:r>
+      <w:r>
+        <w:t xml:space="preserve">and each session lasted ~ 2 hours. </w:t>
+      </w:r>
+      <w:r>
+        <w:t>In sessions with less than 6 people, some collaborators played multiple</w:t>
+      </w:r>
+      <w:r>
+        <w:t xml:space="preserve"> roles</w:t>
+      </w:r>
+      <w:r>
+        <w:t>. In the session with 7 people, 2 collaborators partnered and played the same</w:t>
+      </w:r>
+      <w:r>
+        <w:t xml:space="preserve"> role</w:t>
+      </w:r>
+      <w:r>
+        <w:t>.</w:t>
+      </w:r>
+      <w:r>
+        <w:t xml:space="preserve"> </w:t>
+      </w:r>
+      <w:r>
+        <w:t xml:space="preserve">Otherwise, sessions followed the structure of prior immersive modeling work </w:t>
       </w:r>
       <w:r>
         <w:fldChar w:fldCharType="begin"/>
@@ -8493,6 +8604,15 @@
       <w:r>
         <w:t>.</w:t>
       </w:r>
+      <w:r>
+        <w:t xml:space="preserve"> </w:t>
+      </w:r>
+      <w:r>
+        <w:t>This work was conducted under Utah State University Institutional Review Board protocol #</w:t>
+      </w:r>
+      <w:r>
+        <w:t>14808.</w:t>
+      </w:r>
     </w:p>
     <w:p>
       <w:pPr>
@@ -8529,7 +8649,13 @@
         <w:t>1.9</w:t>
       </w:r>
       <w:r>
-        <w:t xml:space="preserve"> million acre-feet in their accounts, keeping Lake Mead storage above the protection elevation even with inflows of 3.8, 6.3, and 4.0 million acre-feet.</w:t>
+        <w:t xml:space="preserve"> million acre-feet in their accounts, keeping Lake Mead storage above the protection elevation even with inflows of 3.8, 6.3, and 4.0 million acre-feet</w:t>
+      </w:r>
+      <w:r>
+        <w:t xml:space="preserve"> per year</w:t>
+      </w:r>
+      <w:r>
+        <w:t>.</w:t>
       </w:r>
     </w:p>
     <w:p>
@@ -8640,7 +8766,16 @@
         <w:t xml:space="preserve">Across </w:t>
       </w:r>
       <w:r>
-        <w:t xml:space="preserve">15 </w:t>
+        <w:t xml:space="preserve">the </w:t>
+      </w:r>
+      <w:r>
+        <w:t>1</w:t>
+      </w:r>
+      <w:r>
+        <w:t>6</w:t>
+      </w:r>
+      <w:r>
+        <w:t xml:space="preserve"> </w:t>
       </w:r>
       <w:r>
         <w:t>sessions, c</w:t>
@@ -8745,7 +8880,13 @@
         <w:t xml:space="preserve"> </w:t>
       </w:r>
       <w:r>
-        <w:t>Tribes to build expensive potable water supply systems or repair aging infrastructure.</w:t>
+        <w:t xml:space="preserve">Tribes to build expensive potable water supply systems </w:t>
+      </w:r>
+      <w:r>
+        <w:t>and</w:t>
+      </w:r>
+      <w:r>
+        <w:t xml:space="preserve"> repair aging infrastructure.</w:t>
       </w:r>
       <w:r>
         <w:t xml:space="preserve"> </w:t>
@@ -8764,7 +8905,37 @@
       </w:r>
       <w:r>
         <w:lastRenderedPageBreak/>
-        <w:t xml:space="preserve">users who had very low account balances (red diamonds in Figure </w:t>
+        <w:t xml:space="preserve">users </w:t>
+      </w:r>
+      <w:r>
+        <w:t xml:space="preserve">with low account balances. Those users </w:t>
+      </w:r>
+      <w:r>
+        <w:t xml:space="preserve">then </w:t>
+      </w:r>
+      <w:r>
+        <w:t>consumed th</w:t>
+      </w:r>
+      <w:r>
+        <w:t>e</w:t>
+      </w:r>
+      <w:r>
+        <w:t xml:space="preserve"> sold water</w:t>
+      </w:r>
+      <w:r>
+        <w:t xml:space="preserve">, </w:t>
+      </w:r>
+      <w:r>
+        <w:t>lower</w:t>
+      </w:r>
+      <w:r>
+        <w:t>ing</w:t>
+      </w:r>
+      <w:r>
+        <w:t xml:space="preserve"> Lake Mead below the protection elevation</w:t>
+      </w:r>
+      <w:r>
+        <w:t xml:space="preserve"> (red diamonds in Figure </w:t>
       </w:r>
       <w:r>
         <w:t>7</w:t>
@@ -8869,27 +9040,34 @@
           <w:b/>
           <w:bCs/>
         </w:rPr>
-        <w:t>15</w:t>
+        <w:t>1</w:t>
       </w:r>
       <w:r>
         <w:rPr>
           <w:b/>
           <w:bCs/>
         </w:rPr>
-        <w:t xml:space="preserve"> immersive modeling sessions (x axis)</w:t>
+        <w:t>6</w:t>
       </w:r>
       <w:r>
         <w:rPr>
           <w:b/>
           <w:bCs/>
         </w:rPr>
-        <w:t xml:space="preserve"> and r</w:t>
+        <w:t xml:space="preserve"> immersive modeling sessions (x axis)</w:t>
       </w:r>
       <w:r>
         <w:rPr>
           <w:b/>
           <w:bCs/>
         </w:rPr>
+        <w:t xml:space="preserve"> and r</w:t>
+      </w:r>
+      <w:r>
+        <w:rPr>
+          <w:b/>
+          <w:bCs/>
+        </w:rPr>
         <w:t>esulting storage was expressed as a fraction of the chosen protection volume (y axis).</w:t>
       </w:r>
       <w:r>
@@ -8905,7 +9083,34 @@
         <w:t>USBR</w:t>
       </w:r>
       <w:r>
-        <w:t xml:space="preserve"> role chose to sell some of the protection water to bail out users who had low account balances (red diamonds).</w:t>
+        <w:t xml:space="preserve"> role chose</w:t>
+      </w:r>
+      <w:r>
+        <w:t xml:space="preserve"> to </w:t>
+      </w:r>
+      <w:r>
+        <w:t>s</w:t>
+      </w:r>
+      <w:r>
+        <w:t>ell</w:t>
+      </w:r>
+      <w:r>
+        <w:t xml:space="preserve"> some protection water to bail out</w:t>
+      </w:r>
+      <w:r>
+        <w:t xml:space="preserve"> </w:t>
+      </w:r>
+      <w:r>
+        <w:t xml:space="preserve">users </w:t>
+      </w:r>
+      <w:r>
+        <w:t>with low account balances. Those users then consumed the sold water, lowering Lake Mead below the protection elevation</w:t>
+      </w:r>
+      <w:r>
+        <w:t xml:space="preserve"> </w:t>
+      </w:r>
+      <w:r>
+        <w:t>(red diamonds).</w:t>
       </w:r>
     </w:p>
     <w:p>
@@ -9025,13 +9230,37 @@
         <w:fldChar w:fldCharType="end"/>
       </w:r>
       <w:r>
-        <w:t xml:space="preserve"> suggested that 50% of conserved water remain in Lake Mead as system water. </w:t>
-      </w:r>
-      <w:r>
-        <w:t>USBR</w:t>
-      </w:r>
-      <w:r>
-        <w:t xml:space="preserve"> proposed to exclude mandatory reductions from the calculation of voluntary credits. Larger shortages that trigger at higher reservoir levels will help Lake Mead. But there is also a downside. Shortages will vary year-to-year in response to volatile Colorado River flow and Lake Mead storage. Swings in shortages limit users' autonomy and make it difficult for users to plan future water use. </w:t>
+        <w:t xml:space="preserve"> suggested that 50% of conserved water remain in Lake Mead as system water. Larger shortages that trigger at higher </w:t>
+      </w:r>
+      <w:r>
+        <w:t>Lake Mead</w:t>
+      </w:r>
+      <w:r>
+        <w:t xml:space="preserve"> levels will help Lake Mead</w:t>
+      </w:r>
+      <w:r>
+        <w:t xml:space="preserve"> </w:t>
+      </w:r>
+      <w:r>
+        <w:fldChar w:fldCharType="begin"/>
+      </w:r>
+      <w:r>
+        <w:instrText xml:space="preserve"> ADDIN EN.CITE &lt;EndNote&gt;&lt;Cite&gt;&lt;Author&gt;USBR&lt;/Author&gt;&lt;Year&gt;2026&lt;/Year&gt;&lt;RecNum&gt;3124&lt;/RecNum&gt;&lt;DisplayText&gt;(USBR, 2026b)&lt;/DisplayText&gt;&lt;record&gt;&lt;rec-number&gt;3124&lt;/rec-number&gt;&lt;foreign-keys&gt;&lt;key app="EN" db-id="xxt5ta9pd995dwesap0pdzzp2weaz0w9werf" timestamp="1786136712"&gt;3124&lt;/key&gt;&lt;/foreign-keys&gt;&lt;ref-type name="Report"&gt;27&lt;/ref-type&gt;&lt;contributors&gt;&lt;authors&gt;&lt;author&gt;USBR&lt;/author&gt;&lt;/authors&gt;&lt;/contributors&gt;&lt;titles&gt;&lt;title&gt;Post-2026 Operational Guidelines and Strategies for Lake Powell and Lake Mead – Final Environmental Impact Statement&lt;/title&gt;&lt;/titles&gt;&lt;dates&gt;&lt;year&gt;2026&lt;/year&gt;&lt;/dates&gt;&lt;publisher&gt;U.S. Bureau of Reclamation&lt;/publisher&gt;&lt;urls&gt;&lt;related-urls&gt;&lt;url&gt;https://www.usbr.gov/ColoradoRiverBasin/post2026/final-eis/index.html&lt;/url&gt;&lt;/related-urls&gt;&lt;/urls&gt;&lt;/record&gt;&lt;/Cite&gt;&lt;/EndNote&gt;</w:instrText>
+      </w:r>
+      <w:r>
+        <w:fldChar w:fldCharType="separate"/>
+      </w:r>
+      <w:r>
+        <w:rPr>
+          <w:noProof/>
+        </w:rPr>
+        <w:t>(USBR, 2026b)</w:t>
+      </w:r>
+      <w:r>
+        <w:fldChar w:fldCharType="end"/>
+      </w:r>
+      <w:r>
+        <w:t xml:space="preserve">. But there is also a downside. Shortages will vary year-to-year in response to volatile Colorado River flow and Lake Mead storage. Swings in shortages limit users' autonomy and make it difficult for users to plan future water use. </w:t>
       </w:r>
     </w:p>
     <w:p>
@@ -9207,17 +9436,17 @@
         <w:pStyle w:val="NoSpacing"/>
       </w:pPr>
       <w:r>
-        <w:t xml:space="preserve">Both of our proposals address the challenge of sustainability. Our first proposal constrains total water consumption and credits to be less than the annual reservoir inflow. Our second proposal </w:t>
+        <w:t xml:space="preserve">Both of our proposals address the challenge of sustainability. Our first proposal constrains total water consumption and credits to be less than the annual reservoir inflow. Our second proposal apportions reservoir inflow among </w:t>
+      </w:r>
+      <w:r>
+        <w:t>USBR</w:t>
+      </w:r>
+      <w:r>
+        <w:t xml:space="preserve"> and the users and allows users to consume, conserve, </w:t>
       </w:r>
       <w:r>
         <w:lastRenderedPageBreak/>
-        <w:t xml:space="preserve">apportions reservoir inflow among </w:t>
-      </w:r>
-      <w:r>
-        <w:t>USBR</w:t>
-      </w:r>
-      <w:r>
-        <w:t xml:space="preserve"> and the users and allows users to consume, conserve, and trade within their water account balance. There are several other benefits of our proposals, which increase user autonomy and adaptability.</w:t>
+        <w:t>and trade within their water account balance. There are several other benefits of our proposals, which increase user autonomy and adaptability.</w:t>
       </w:r>
     </w:p>
     <w:p>
@@ -9421,97 +9650,66 @@
           <w:b/>
           <w:bCs/>
         </w:rPr>
+        <w:t>Water accounting can be coordinated with other proposals for Lake Powell releases.</w:t>
+      </w:r>
+      <w:r>
+        <w:t xml:space="preserve"> </w:t>
+      </w:r>
+      <w:r>
+        <w:t xml:space="preserve">A Lake Powell release </w:t>
+      </w:r>
+      <w:r>
+        <w:t>plus gains</w:t>
+      </w:r>
+      <w:r>
+        <w:t xml:space="preserve"> </w:t>
+      </w:r>
+      <w:r>
+        <w:t xml:space="preserve">through Grand Canyon become the inflow to Lake </w:t>
+      </w:r>
+      <w:r>
         <w:lastRenderedPageBreak/>
-        <w:t>Water accounting can be coordinated with other proposals for Lake Powell releases.</w:t>
+        <w:t xml:space="preserve">Mead. </w:t>
+      </w:r>
+      <w:r>
+        <w:t>USBR</w:t>
+      </w:r>
+      <w:r>
+        <w:t xml:space="preserve"> can then take the</w:t>
       </w:r>
       <w:r>
         <w:t xml:space="preserve"> </w:t>
       </w:r>
       <w:r>
-        <w:t xml:space="preserve">A Lake Powell release </w:t>
-      </w:r>
-      <w:r>
-        <w:t>plus gains</w:t>
+        <w:t>first share of inflow equal to Lake Mead evaporation to sustain the Lake Mead protection</w:t>
       </w:r>
       <w:r>
         <w:t xml:space="preserve"> </w:t>
       </w:r>
       <w:r>
-        <w:t xml:space="preserve">through Grand Canyon become the inflow to Lake Mead. </w:t>
-      </w:r>
-      <w:r>
-        <w:t>USBR</w:t>
-      </w:r>
-      <w:r>
-        <w:t xml:space="preserve"> can then take the</w:t>
-      </w:r>
-      <w:r>
-        <w:t xml:space="preserve"> </w:t>
-      </w:r>
-      <w:r>
-        <w:t>first share of inflow equal to Lake Mead evaporation to sustain the Lake Mead protection</w:t>
-      </w:r>
-      <w:r>
-        <w:t xml:space="preserve"> </w:t>
-      </w:r>
-      <w:r>
         <w:t>account balance.</w:t>
       </w:r>
     </w:p>
     <w:p>
       <w:pPr>
-        <w:rPr>
-          <w:rFonts w:asciiTheme="majorBidi" w:hAnsiTheme="majorBidi" w:cstheme="majorBidi"/>
-          <w:sz w:val="24"/>
-          <w:szCs w:val="24"/>
-        </w:rPr>
-      </w:pPr>
-      <w:r>
-        <w:rPr>
-          <w:rFonts w:asciiTheme="majorBidi" w:hAnsiTheme="majorBidi" w:cstheme="majorBidi"/>
-          <w:sz w:val="24"/>
-          <w:szCs w:val="24"/>
-        </w:rPr>
+        <w:pStyle w:val="NoSpacing"/>
+      </w:pPr>
+      <w:r>
         <w:t>There are a</w:t>
       </w:r>
       <w:r>
-        <w:rPr>
-          <w:rFonts w:asciiTheme="majorBidi" w:hAnsiTheme="majorBidi" w:cstheme="majorBidi"/>
-          <w:sz w:val="24"/>
-          <w:szCs w:val="24"/>
-        </w:rPr>
         <w:t>lso</w:t>
       </w:r>
       <w:r>
-        <w:rPr>
-          <w:rFonts w:asciiTheme="majorBidi" w:hAnsiTheme="majorBidi" w:cstheme="majorBidi"/>
-          <w:sz w:val="24"/>
-          <w:szCs w:val="24"/>
-        </w:rPr>
         <w:t xml:space="preserve"> l</w:t>
       </w:r>
       <w:r>
-        <w:rPr>
-          <w:rFonts w:asciiTheme="majorBidi" w:hAnsiTheme="majorBidi" w:cstheme="majorBidi"/>
-          <w:sz w:val="24"/>
-          <w:szCs w:val="24"/>
-        </w:rPr>
         <w:t xml:space="preserve">imitations </w:t>
       </w:r>
       <w:r>
-        <w:rPr>
-          <w:rFonts w:asciiTheme="majorBidi" w:hAnsiTheme="majorBidi" w:cstheme="majorBidi"/>
-          <w:sz w:val="24"/>
-          <w:szCs w:val="24"/>
-        </w:rPr>
         <w:t>of our proposals</w:t>
       </w:r>
       <w:r>
-        <w:rPr>
-          <w:rFonts w:asciiTheme="majorBidi" w:hAnsiTheme="majorBidi" w:cstheme="majorBidi"/>
-          <w:sz w:val="24"/>
-          <w:szCs w:val="24"/>
-        </w:rPr>
         <w:t>.</w:t>
       </w:r>
     </w:p>
@@ -9725,20 +9923,20 @@
         <w:t xml:space="preserve">existing </w:t>
       </w:r>
       <w:r>
-        <w:t xml:space="preserve">3.6 million acre-feet in the water conservation </w:t>
+        <w:t xml:space="preserve">3.6 million acre-feet in the water conservation program. Setting a protection elevation of 975 feet (3.2 maf of active storage) would allow the complete roll over of all existing conserved water with </w:t>
+      </w:r>
+      <w:r>
+        <w:t>0.</w:t>
+      </w:r>
+      <w:r>
+        <w:t>2</w:t>
+      </w:r>
+      <w:r>
+        <w:t xml:space="preserve"> maf of unassigned </w:t>
       </w:r>
       <w:r>
         <w:lastRenderedPageBreak/>
-        <w:t xml:space="preserve">program. Setting a protection elevation of 975 feet (3.2 maf of active storage) would allow the complete roll over of all existing conserved water with </w:t>
-      </w:r>
-      <w:r>
-        <w:t>0.</w:t>
-      </w:r>
-      <w:r>
-        <w:t>2</w:t>
-      </w:r>
-      <w:r>
-        <w:t xml:space="preserve"> maf of unassigned storage. This storage could be assigned to users such as</w:t>
+        <w:t>storage. This storage could be assigned to users such as</w:t>
       </w:r>
       <w:r>
         <w:t xml:space="preserve"> Tribal Nations, who were previously excluded from participation</w:t>
@@ -10044,74 +10242,107 @@
         <w:t>proportionally reduces credits</w:t>
       </w:r>
       <w:r>
-        <w:t xml:space="preserve"> for </w:t>
+        <w:t xml:space="preserve"> for conserved water</w:t>
+      </w:r>
+      <w:r>
+        <w:t xml:space="preserve">. A second </w:t>
+      </w:r>
+      <w:r>
+        <w:t>suggestion</w:t>
+      </w:r>
+      <w:r>
+        <w:t xml:space="preserve"> </w:t>
+      </w:r>
+      <w:r>
+        <w:t xml:space="preserve">creates a new protection account to be managed by </w:t>
+      </w:r>
+      <w:r>
+        <w:t>USBR</w:t>
+      </w:r>
+      <w:r>
+        <w:t xml:space="preserve"> and separate water accounts for each user. Each year, </w:t>
+      </w:r>
+      <w:r>
+        <w:t>USBR</w:t>
+      </w:r>
+      <w:r>
+        <w:t xml:space="preserve"> takes a first share of the physically </w:t>
       </w:r>
       <w:r>
         <w:lastRenderedPageBreak/>
-        <w:t>conserved water</w:t>
-      </w:r>
-      <w:r>
-        <w:t xml:space="preserve">. A second </w:t>
-      </w:r>
-      <w:r>
-        <w:t>suggestion</w:t>
+        <w:t>available water</w:t>
+      </w:r>
+      <w:r>
+        <w:t xml:space="preserve"> equal to reservoir evaporation to sustain the protected volume. T</w:t>
+      </w:r>
+      <w:r>
+        <w:t xml:space="preserve">he users then divide the remaining inflow and consume, conserve, and/or trade within their account balances. </w:t>
+      </w:r>
+      <w:r>
+        <w:t xml:space="preserve">Both strategies have </w:t>
+      </w:r>
+      <w:r>
+        <w:t>potential</w:t>
+      </w:r>
+      <w:r>
+        <w:t xml:space="preserve"> benefits to stabilize</w:t>
+      </w:r>
+      <w:r>
+        <w:t xml:space="preserve"> and recover</w:t>
+      </w:r>
+      <w:r>
+        <w:t xml:space="preserve"> Lake Mead</w:t>
+      </w:r>
+      <w:r>
+        <w:t xml:space="preserve"> storage while</w:t>
       </w:r>
       <w:r>
         <w:t xml:space="preserve"> </w:t>
       </w:r>
       <w:r>
-        <w:t xml:space="preserve">creates a new protection account to be managed by </w:t>
-      </w:r>
-      <w:r>
-        <w:t>USBR</w:t>
-      </w:r>
-      <w:r>
-        <w:t xml:space="preserve"> and separate water accounts for each user. Each year, </w:t>
-      </w:r>
-      <w:r>
-        <w:t>USBR</w:t>
-      </w:r>
-      <w:r>
-        <w:t xml:space="preserve"> takes a first share of the physically available water</w:t>
-      </w:r>
-      <w:r>
-        <w:t xml:space="preserve"> equal to reservoir evaporation to sustain the protected volume. T</w:t>
-      </w:r>
-      <w:r>
-        <w:t xml:space="preserve">he users then divide the remaining inflow and consume, conserve, and/or trade within their account balances. </w:t>
-      </w:r>
-      <w:r>
-        <w:t xml:space="preserve">Both strategies have </w:t>
-      </w:r>
-      <w:r>
-        <w:t>potential</w:t>
-      </w:r>
-      <w:r>
-        <w:t xml:space="preserve"> benefits to stabilize</w:t>
-      </w:r>
-      <w:r>
-        <w:t xml:space="preserve"> and recover</w:t>
-      </w:r>
-      <w:r>
-        <w:t xml:space="preserve"> Lake Mead</w:t>
-      </w:r>
-      <w:r>
-        <w:t xml:space="preserve"> storage while</w:t>
+        <w:t>increas</w:t>
+      </w:r>
+      <w:r>
+        <w:t>ing</w:t>
+      </w:r>
+      <w:r>
+        <w:t xml:space="preserve"> u</w:t>
+      </w:r>
+      <w:r>
+        <w:t>ser</w:t>
+      </w:r>
+      <w:r>
+        <w:t>s</w:t>
       </w:r>
       <w:r>
         <w:t xml:space="preserve"> </w:t>
       </w:r>
       <w:r>
-        <w:t>increas</w:t>
-      </w:r>
-      <w:r>
-        <w:t>ing</w:t>
-      </w:r>
-      <w:r>
-        <w:t xml:space="preserve"> u</w:t>
-      </w:r>
-      <w:r>
-        <w:t>ser</w:t>
+        <w:t>a</w:t>
+      </w:r>
+      <w:r>
+        <w:t xml:space="preserve">utonomy to </w:t>
+      </w:r>
+      <w:r>
+        <w:t xml:space="preserve">adaptively </w:t>
+      </w:r>
+      <w:r>
+        <w:t>m</w:t>
+      </w:r>
+      <w:r>
+        <w:t>anage</w:t>
+      </w:r>
+      <w:r>
+        <w:t xml:space="preserve"> their differing and sometimes conflicting</w:t>
+      </w:r>
+      <w:r>
+        <w:t xml:space="preserve"> </w:t>
+      </w:r>
+      <w:r>
+        <w:t>r</w:t>
+      </w:r>
+      <w:r>
+        <w:t>isk</w:t>
       </w:r>
       <w:r>
         <w:t>s</w:t>
@@ -10120,152 +10351,141 @@
         <w:t xml:space="preserve"> </w:t>
       </w:r>
       <w:r>
-        <w:t>a</w:t>
-      </w:r>
-      <w:r>
-        <w:t xml:space="preserve">utonomy to </w:t>
-      </w:r>
-      <w:r>
-        <w:t xml:space="preserve">adaptively </w:t>
-      </w:r>
-      <w:r>
-        <w:t>m</w:t>
-      </w:r>
-      <w:r>
-        <w:t>anage</w:t>
-      </w:r>
-      <w:r>
-        <w:t xml:space="preserve"> their differing and sometimes conflicting</w:t>
+        <w:t>of</w:t>
       </w:r>
       <w:r>
         <w:t xml:space="preserve"> </w:t>
       </w:r>
       <w:r>
-        <w:t>r</w:t>
-      </w:r>
-      <w:r>
-        <w:t>isk</w:t>
-      </w:r>
-      <w:r>
-        <w:t>s</w:t>
+        <w:t>d</w:t>
+      </w:r>
+      <w:r>
+        <w:t xml:space="preserve">eclining </w:t>
+      </w:r>
+      <w:r>
+        <w:t>f</w:t>
+      </w:r>
+      <w:r>
+        <w:t>lows</w:t>
+      </w:r>
+      <w:r>
+        <w:t>.</w:t>
       </w:r>
       <w:r>
         <w:t xml:space="preserve"> </w:t>
       </w:r>
       <w:r>
-        <w:t>of</w:t>
+        <w:t xml:space="preserve">These strategies can serve as examples for other </w:t>
+      </w:r>
+      <w:r>
+        <w:t>water</w:t>
+      </w:r>
+      <w:r>
+        <w:t xml:space="preserve"> systems </w:t>
+      </w:r>
+      <w:r>
+        <w:t xml:space="preserve">that </w:t>
+      </w:r>
+      <w:r>
+        <w:t>fac</w:t>
+      </w:r>
+      <w:r>
+        <w:t>e</w:t>
+      </w:r>
+      <w:r>
+        <w:t xml:space="preserve"> aridity</w:t>
+      </w:r>
+      <w:r>
+        <w:t xml:space="preserve">, </w:t>
+      </w:r>
+      <w:r>
+        <w:t xml:space="preserve">declining </w:t>
+      </w:r>
+      <w:r>
+        <w:t xml:space="preserve">reservoir </w:t>
+      </w:r>
+      <w:r>
+        <w:t>storage</w:t>
+      </w:r>
+      <w:r>
+        <w:t>, and user conflicts</w:t>
+      </w:r>
+      <w:r>
+        <w:t>.</w:t>
+      </w:r>
+    </w:p>
+    <w:p>
+      <w:pPr>
+        <w:pStyle w:val="Heading1"/>
+      </w:pPr>
+      <w:r>
+        <w:t>Data Availability</w:t>
+      </w:r>
+    </w:p>
+    <w:p>
+      <w:pPr>
+        <w:pStyle w:val="NoSpacing"/>
+      </w:pPr>
+      <w:r>
+        <w:t xml:space="preserve">The data, models, and code used to generate </w:t>
+      </w:r>
+      <w:r>
+        <w:t>Figures 1</w:t>
+      </w:r>
+      <w:r>
+        <w:t xml:space="preserve"> to 7</w:t>
+      </w:r>
+      <w:r>
+        <w:t xml:space="preserve"> and Table 2 </w:t>
+      </w:r>
+      <w:r>
+        <w:t>are available at</w:t>
       </w:r>
       <w:r>
         <w:t xml:space="preserve"> </w:t>
       </w:r>
       <w:r>
-        <w:t>d</w:t>
-      </w:r>
-      <w:r>
-        <w:t xml:space="preserve">eclining </w:t>
-      </w:r>
-      <w:r>
-        <w:t>f</w:t>
-      </w:r>
-      <w:r>
-        <w:t>lows</w:t>
+        <w:fldChar w:fldCharType="begin"/>
+      </w:r>
+      <w:r>
+        <w:instrText xml:space="preserve"> ADDIN EN.CITE &lt;EndNote&gt;&lt;Cite&gt;&lt;Author&gt;Rosenberg&lt;/Author&gt;&lt;Year&gt;2026&lt;/Year&gt;&lt;RecNum&gt;3121&lt;/RecNum&gt;&lt;DisplayText&gt;(Rosenberg and Myers, 2026)&lt;/DisplayText&gt;&lt;record&gt;&lt;rec-number&gt;3121&lt;/rec-number&gt;&lt;foreign-keys&gt;&lt;key app="EN" db-id="xxt5ta9pd995dwesap0pdzzp2weaz0w9werf" timestamp="1783713642"&gt;3121&lt;/key&gt;&lt;/foreign-keys&gt;&lt;ref-type name="Journal Article"&gt;17&lt;/ref-type&gt;&lt;contributors&gt;&lt;authors&gt;&lt;author&gt;David Rosenberg&lt;/author&gt;&lt;author&gt;Anabelle Myers&lt;/author&gt;&lt;/authors&gt;&lt;/contributors&gt;&lt;titles&gt;&lt;title&gt;The Lake Mead Water Conservation Program Analysis&lt;/title&gt;&lt;secondary-title&gt;Hydroshare&lt;/secondary-title&gt;&lt;/titles&gt;&lt;periodical&gt;&lt;full-title&gt;Hydroshare&lt;/full-title&gt;&lt;/periodical&gt;&lt;dates&gt;&lt;year&gt;2026&lt;/year&gt;&lt;/dates&gt;&lt;urls&gt;&lt;related-urls&gt;&lt;url&gt;http://www.hydroshare.org/resource/71a971cd51b64ef8a7030f25639c0a3c&lt;/url&gt;&lt;/related-urls&gt;&lt;/urls&gt;&lt;electronic-resource-num&gt;http://www.hydroshare.org/resource/71a971cd51b64ef8a7030f25639c0a3c&lt;/electronic-resource-num&gt;&lt;/record&gt;&lt;/Cite&gt;&lt;/EndNote&gt;</w:instrText>
+      </w:r>
+      <w:r>
+        <w:fldChar w:fldCharType="separate"/>
+      </w:r>
+      <w:r>
+        <w:rPr>
+          <w:noProof/>
+        </w:rPr>
+        <w:t>(Rosenberg and Myers, 2026)</w:t>
+      </w:r>
+      <w:r>
+        <w:fldChar w:fldCharType="end"/>
       </w:r>
       <w:r>
         <w:t>.</w:t>
       </w:r>
+    </w:p>
+    <w:p>
+      <w:pPr>
+        <w:pStyle w:val="Heading1"/>
+      </w:pPr>
+      <w:r>
+        <w:t>Reproduced Results</w:t>
+      </w:r>
+    </w:p>
+    <w:p>
+      <w:pPr>
+        <w:pStyle w:val="NoSpacing"/>
+      </w:pPr>
+      <w:r>
+        <w:t xml:space="preserve">______ download the materials </w:t>
+      </w:r>
+      <w:r>
+        <w:t>and generated results in Figures 1 to 7.</w:t>
+      </w:r>
       <w:r>
         <w:t xml:space="preserve"> </w:t>
-      </w:r>
-      <w:r>
-        <w:t xml:space="preserve">These strategies can serve as examples for other </w:t>
-      </w:r>
-      <w:r>
-        <w:t>water</w:t>
-      </w:r>
-      <w:r>
-        <w:t xml:space="preserve"> systems </w:t>
-      </w:r>
-      <w:r>
-        <w:t xml:space="preserve">that </w:t>
-      </w:r>
-      <w:r>
-        <w:t>fac</w:t>
-      </w:r>
-      <w:r>
-        <w:t>e</w:t>
-      </w:r>
-      <w:r>
-        <w:t xml:space="preserve"> aridity</w:t>
-      </w:r>
-      <w:r>
-        <w:t xml:space="preserve">, </w:t>
-      </w:r>
-      <w:r>
-        <w:t xml:space="preserve">declining </w:t>
-      </w:r>
-      <w:r>
-        <w:t xml:space="preserve">reservoir </w:t>
-      </w:r>
-      <w:r>
-        <w:t>storage</w:t>
-      </w:r>
-      <w:r>
-        <w:t>, and user conflicts</w:t>
-      </w:r>
-      <w:r>
-        <w:t>.</w:t>
-      </w:r>
-    </w:p>
-    <w:p>
-      <w:pPr>
-        <w:pStyle w:val="Heading1"/>
-      </w:pPr>
-      <w:r>
-        <w:t>Data Availability</w:t>
-      </w:r>
-    </w:p>
-    <w:p>
-      <w:pPr>
-        <w:pStyle w:val="NoSpacing"/>
-      </w:pPr>
-      <w:r>
-        <w:t xml:space="preserve">The data, models, and code used to generate </w:t>
-      </w:r>
-      <w:r>
-        <w:t>Figures 1</w:t>
-      </w:r>
-      <w:r>
-        <w:t xml:space="preserve"> to 7</w:t>
-      </w:r>
-      <w:r>
-        <w:t xml:space="preserve"> and Table 2 </w:t>
-      </w:r>
-      <w:r>
-        <w:t>are available at</w:t>
-      </w:r>
-      <w:r>
-        <w:t xml:space="preserve"> </w:t>
-      </w:r>
-      <w:r>
-        <w:fldChar w:fldCharType="begin"/>
-      </w:r>
-      <w:r>
-        <w:instrText xml:space="preserve"> ADDIN EN.CITE &lt;EndNote&gt;&lt;Cite&gt;&lt;Author&gt;Rosenberg&lt;/Author&gt;&lt;Year&gt;2026&lt;/Year&gt;&lt;RecNum&gt;3121&lt;/RecNum&gt;&lt;DisplayText&gt;(Rosenberg and Myers, 2026)&lt;/DisplayText&gt;&lt;record&gt;&lt;rec-number&gt;3121&lt;/rec-number&gt;&lt;foreign-keys&gt;&lt;key app="EN" db-id="xxt5ta9pd995dwesap0pdzzp2weaz0w9werf" timestamp="1783713642"&gt;3121&lt;/key&gt;&lt;/foreign-keys&gt;&lt;ref-type name="Journal Article"&gt;17&lt;/ref-type&gt;&lt;contributors&gt;&lt;authors&gt;&lt;author&gt;David Rosenberg&lt;/author&gt;&lt;author&gt;Anabelle Myers&lt;/author&gt;&lt;/authors&gt;&lt;/contributors&gt;&lt;titles&gt;&lt;title&gt;The Lake Mead Water Conservation Program Analysis&lt;/title&gt;&lt;secondary-title&gt;Hydroshare&lt;/secondary-title&gt;&lt;/titles&gt;&lt;periodical&gt;&lt;full-title&gt;Hydroshare&lt;/full-title&gt;&lt;/periodical&gt;&lt;dates&gt;&lt;year&gt;2026&lt;/year&gt;&lt;/dates&gt;&lt;urls&gt;&lt;related-urls&gt;&lt;url&gt;http://www.hydroshare.org/resource/71a971cd51b64ef8a7030f25639c0a3c&lt;/url&gt;&lt;/related-urls&gt;&lt;/urls&gt;&lt;electronic-resource-num&gt;http://www.hydroshare.org/resource/71a971cd51b64ef8a7030f25639c0a3c&lt;/electronic-resource-num&gt;&lt;/record&gt;&lt;/Cite&gt;&lt;/EndNote&gt;</w:instrText>
-      </w:r>
-      <w:r>
-        <w:fldChar w:fldCharType="separate"/>
-      </w:r>
-      <w:r>
-        <w:rPr>
-          <w:noProof/>
-        </w:rPr>
-        <w:t>(Rosenberg and Myers, 2026)</w:t>
-      </w:r>
-      <w:r>
-        <w:fldChar w:fldCharType="end"/>
-      </w:r>
-      <w:r>
-        <w:t>.</w:t>
       </w:r>
     </w:p>
     <w:p>
@@ -10523,28 +10743,6 @@
           <w:sz w:val="24"/>
           <w:szCs w:val="24"/>
         </w:rPr>
-        <w:br w:type="page"/>
-      </w:r>
-    </w:p>
-    <w:p>
-      <w:pPr>
-        <w:rPr>
-          <w:rFonts w:asciiTheme="majorBidi" w:hAnsiTheme="majorBidi" w:cstheme="majorBidi"/>
-          <w:b/>
-          <w:bCs/>
-          <w:sz w:val="24"/>
-          <w:szCs w:val="24"/>
-        </w:rPr>
-      </w:pPr>
-      <w:r>
-        <w:rPr>
-          <w:rFonts w:asciiTheme="majorBidi" w:hAnsiTheme="majorBidi" w:cstheme="majorBidi"/>
-          <w:b/>
-          <w:bCs/>
-          <w:sz w:val="24"/>
-          <w:szCs w:val="24"/>
-        </w:rPr>
-        <w:lastRenderedPageBreak/>
         <w:t xml:space="preserve">Table A1. </w:t>
       </w:r>
       <w:r>
@@ -10953,6 +11151,7 @@
         <w:ind w:left="720" w:hanging="720"/>
       </w:pPr>
       <w:r>
+        <w:lastRenderedPageBreak/>
         <w:t xml:space="preserve">Hegwood, M., Langendorf, R. E., and Burgess, M. G. (2022). "Why win–wins are rare in complex environmental management." </w:t>
       </w:r>
       <w:r>
@@ -10983,7 +11182,6 @@
         <w:ind w:left="720" w:hanging="720"/>
       </w:pPr>
       <w:r>
-        <w:lastRenderedPageBreak/>
         <w:t xml:space="preserve">Huizar, L., Díaz, S., Lansey, K., and Arnold, R. (2023). "Water Supply in the Lower Colorado River Basin: Effectiveness of the 2019 Drought Contingency Plan." </w:t>
       </w:r>
       <w:r>
@@ -11383,6 +11581,7 @@
         <w:ind w:left="720" w:hanging="720"/>
       </w:pPr>
       <w:r>
+        <w:lastRenderedPageBreak/>
         <w:t xml:space="preserve">Stelter, D. (2022). "Towards a Utah Intentionally Created Surplus Program." </w:t>
       </w:r>
       <w:r>
@@ -11745,22 +11944,6 @@
       </w:r>
     </w:p>
   </w:comment>
-  <w:comment w:id="2" w:author="Erik Porse" w:date="2026-07-21T16:58:00Z" w:initials="EP">
-    <w:p>
-      <w:pPr>
-        <w:pStyle w:val="CommentText"/>
-      </w:pPr>
-      <w:r>
-        <w:rPr>
-          <w:rStyle w:val="CommentReference"/>
-        </w:rPr>
-        <w:annotationRef/>
-      </w:r>
-      <w:r>
-        <w:t>check grammar throughout and use a verb tense consistently</w:t>
-      </w:r>
-    </w:p>
-  </w:comment>
 </w:comments>
 </file>
 
@@ -11768,7 +11951,6 @@
 <w15:commentsEx xmlns:wpc="http://schemas.microsoft.com/office/word/2010/wordprocessingCanvas" xmlns:cx="http://schemas.microsoft.com/office/drawing/2014/chartex" xmlns:cx1="http://schemas.microsoft.com/office/drawing/2015/9/8/chartex" xmlns:cx2="http://schemas.microsoft.com/office/drawing/2015/10/21/chartex" xmlns:cx3="http://schemas.microsoft.com/office/drawing/2016/5/9/chartex" xmlns:cx4="http://schemas.microsoft.com/office/drawing/2016/5/10/chartex" xmlns:cx5="http://schemas.microsoft.com/office/drawing/2016/5/11/chartex" xmlns:cx6="http://schemas.microsoft.com/office/drawing/2016/5/12/chartex" xmlns:cx7="http://schemas.microsoft.com/office/drawing/2016/5/13/chartex" xmlns:cx8="http://schemas.microsoft.com/office/drawing/2016/5/14/chartex" xmlns:mc="http://schemas.openxmlformats.org/markup-compatibility/2006" xmlns:aink="http://schemas.microsoft.com/office/drawing/2016/ink" xmlns:am3d="http://schemas.microsoft.com/office/drawing/2017/model3d" xmlns:o="urn:schemas-microsoft-com:office:office" xmlns:oel="http://schemas.microsoft.com/office/2019/extlst" xmlns:r="http://schemas.openxmlformats.org/officeDocument/2006/relationships" xmlns:m="http://schemas.openxmlformats.org/officeDocument/2006/math" xmlns:v="urn:schemas-microsoft-com:vml" xmlns:wp14="http://schemas.microsoft.com/office/word/2010/wordprocessingDrawing" xmlns:wp="http://schemas.openxmlformats.org/drawingml/2006/wordprocessingDrawing" xmlns:w10="urn:schemas-microsoft-com:office:word" xmlns:w="http://schemas.openxmlformats.org/wordprocessingml/2006/main" xmlns:w14="http://schemas.microsoft.com/office/word/2010/wordml" xmlns:w15="http://schemas.microsoft.com/office/word/2012/wordml" xmlns:w16cei="http://schemas.microsoft.com/office/word/2026/wordml/cei" xmlns:w16cex="http://schemas.microsoft.com/office/word/2018/wordml/cex" xmlns:w16cid="http://schemas.microsoft.com/office/word/2016/wordml/cid" xmlns:w16="http://schemas.microsoft.com/office/word/2018/wordml" xmlns:w16du="http://schemas.microsoft.com/office/word/2023/wordml/word16du" xmlns:w16sdtdh="http://schemas.microsoft.com/office/word/2020/wordml/sdtdatahash" xmlns:w16sdtfl="http://schemas.microsoft.com/office/word/2024/wordml/sdtformatlock" xmlns:w16se="http://schemas.microsoft.com/office/word/2015/wordml/symex" xmlns:wpg="http://schemas.microsoft.com/office/word/2010/wordprocessingGroup" xmlns:wpi="http://schemas.microsoft.com/office/word/2010/wordprocessingInk" xmlns:wne="http://schemas.microsoft.com/office/word/2006/wordml" xmlns:wps="http://schemas.microsoft.com/office/word/2010/wordprocessingShape" mc:Ignorable="w14 w15 w16se w16cid w16 w16cex w16sdtdh w16sdtfl w16du wp14">
   <w15:commentEx w15:paraId="5028B586" w15:done="0"/>
   <w15:commentEx w15:paraId="65F86C7F" w15:done="0"/>
-  <w15:commentEx w15:paraId="3B9F6331" w15:done="0"/>
 </w15:commentsEx>
 </file>
 
@@ -11776,7 +11958,6 @@
 <w16cex:commentsExtensible xmlns:wpc="http://schemas.microsoft.com/office/word/2010/wordprocessingCanvas" xmlns:cx="http://schemas.microsoft.com/office/drawing/2014/chartex" xmlns:cx1="http://schemas.microsoft.com/office/drawing/2015/9/8/chartex" xmlns:cx2="http://schemas.microsoft.com/office/drawing/2015/10/21/chartex" xmlns:cx3="http://schemas.microsoft.com/office/drawing/2016/5/9/chartex" xmlns:cx4="http://schemas.microsoft.com/office/drawing/2016/5/10/chartex" xmlns:cx5="http://schemas.microsoft.com/office/drawing/2016/5/11/chartex" xmlns:cx6="http://schemas.microsoft.com/office/drawing/2016/5/12/chartex" xmlns:cx7="http://schemas.microsoft.com/office/drawing/2016/5/13/chartex" xmlns:cx8="http://schemas.microsoft.com/office/drawing/2016/5/14/chartex" xmlns:cr="http://schemas.microsoft.com/office/comments/2020/reactions" xmlns:mc="http://schemas.openxmlformats.org/markup-compatibility/2006" xmlns:aink="http://schemas.microsoft.com/office/drawing/2016/ink" xmlns:am3d="http://schemas.microsoft.com/office/drawing/2017/model3d" xmlns:o="urn:schemas-microsoft-com:office:office" xmlns:oel="http://schemas.microsoft.com/office/2019/extlst" xmlns:r="http://schemas.openxmlformats.org/officeDocument/2006/relationships" xmlns:m="http://schemas.openxmlformats.org/officeDocument/2006/math" xmlns:v="urn:schemas-microsoft-com:vml" xmlns:wp14="http://schemas.microsoft.com/office/word/2010/wordprocessingDrawing" xmlns:wp="http://schemas.openxmlformats.org/drawingml/2006/wordprocessingDrawing" xmlns:w10="urn:schemas-microsoft-com:office:word" xmlns:w="http://schemas.openxmlformats.org/wordprocessingml/2006/main" xmlns:w14="http://schemas.microsoft.com/office/word/2010/wordml" xmlns:w15="http://schemas.microsoft.com/office/word/2012/wordml" xmlns:w16cei="http://schemas.microsoft.com/office/word/2026/wordml/cei" xmlns:w16cex="http://schemas.microsoft.com/office/word/2018/wordml/cex" xmlns:w16cid="http://schemas.microsoft.com/office/word/2016/wordml/cid" xmlns:w16="http://schemas.microsoft.com/office/word/2018/wordml" xmlns:w16du="http://schemas.microsoft.com/office/word/2023/wordml/word16du" xmlns:w16sdtdh="http://schemas.microsoft.com/office/word/2020/wordml/sdtdatahash" xmlns:w16sdtfl="http://schemas.microsoft.com/office/word/2024/wordml/sdtformatlock" xmlns:w16se="http://schemas.microsoft.com/office/word/2015/wordml/symex" xmlns:wpg="http://schemas.microsoft.com/office/word/2010/wordprocessingGroup" xmlns:wpi="http://schemas.microsoft.com/office/word/2010/wordprocessingInk" xmlns:wne="http://schemas.microsoft.com/office/word/2006/wordml" xmlns:wps="http://schemas.microsoft.com/office/word/2010/wordprocessingShape" mc:Ignorable="w14 w15 w16se w16cid w16 w16cex w16sdtdh w16sdtfl cr w16du wp14">
   <w16cex:commentExtensible w16cex:durableId="29F1A260" w16cex:dateUtc="2026-05-27T19:47:00Z"/>
   <w16cex:commentExtensible w16cex:durableId="45F6D256" w16cex:dateUtc="2026-07-21T23:51:00Z"/>
-  <w16cex:commentExtensible w16cex:durableId="31C16E79" w16cex:dateUtc="2026-07-21T23:58:00Z"/>
 </w16cex:commentsExtensible>
 </file>
 
@@ -11784,7 +11965,6 @@
 <w16cid:commentsIds xmlns:wpc="http://schemas.microsoft.com/office/word/2010/wordprocessingCanvas" xmlns:cx="http://schemas.microsoft.com/office/drawing/2014/chartex" xmlns:cx1="http://schemas.microsoft.com/office/drawing/2015/9/8/chartex" xmlns:cx2="http://schemas.microsoft.com/office/drawing/2015/10/21/chartex" xmlns:cx3="http://schemas.microsoft.com/office/drawing/2016/5/9/chartex" xmlns:cx4="http://schemas.microsoft.com/office/drawing/2016/5/10/chartex" xmlns:cx5="http://schemas.microsoft.com/office/drawing/2016/5/11/chartex" xmlns:cx6="http://schemas.microsoft.com/office/drawing/2016/5/12/chartex" xmlns:cx7="http://schemas.microsoft.com/office/drawing/2016/5/13/chartex" xmlns:cx8="http://schemas.microsoft.com/office/drawing/2016/5/14/chartex" xmlns:mc="http://schemas.openxmlformats.org/markup-compatibility/2006" xmlns:aink="http://schemas.microsoft.com/office/drawing/2016/ink" xmlns:am3d="http://schemas.microsoft.com/office/drawing/2017/model3d" xmlns:o="urn:schemas-microsoft-com:office:office" xmlns:oel="http://schemas.microsoft.com/office/2019/extlst" xmlns:r="http://schemas.openxmlformats.org/officeDocument/2006/relationships" xmlns:m="http://schemas.openxmlformats.org/officeDocument/2006/math" xmlns:v="urn:schemas-microsoft-com:vml" xmlns:wp14="http://schemas.microsoft.com/office/word/2010/wordprocessingDrawing" xmlns:wp="http://schemas.openxmlformats.org/drawingml/2006/wordprocessingDrawing" xmlns:w10="urn:schemas-microsoft-com:office:word" xmlns:w="http://schemas.openxmlformats.org/wordprocessingml/2006/main" xmlns:w14="http://schemas.microsoft.com/office/word/2010/wordml" xmlns:w15="http://schemas.microsoft.com/office/word/2012/wordml" xmlns:w16cei="http://schemas.microsoft.com/office/word/2026/wordml/cei" xmlns:w16cex="http://schemas.microsoft.com/office/word/2018/wordml/cex" xmlns:w16cid="http://schemas.microsoft.com/office/word/2016/wordml/cid" xmlns:w16="http://schemas.microsoft.com/office/word/2018/wordml" xmlns:w16du="http://schemas.microsoft.com/office/word/2023/wordml/word16du" xmlns:w16sdtdh="http://schemas.microsoft.com/office/word/2020/wordml/sdtdatahash" xmlns:w16sdtfl="http://schemas.microsoft.com/office/word/2024/wordml/sdtformatlock" xmlns:w16se="http://schemas.microsoft.com/office/word/2015/wordml/symex" xmlns:wpg="http://schemas.microsoft.com/office/word/2010/wordprocessingGroup" xmlns:wpi="http://schemas.microsoft.com/office/word/2010/wordprocessingInk" xmlns:wne="http://schemas.microsoft.com/office/word/2006/wordml" xmlns:wps="http://schemas.microsoft.com/office/word/2010/wordprocessingShape" mc:Ignorable="w14 w15 w16se w16cid w16 w16cex w16sdtdh w16sdtfl w16du wp14">
   <w16cid:commentId w16cid:paraId="5028B586" w16cid:durableId="29F1A260"/>
   <w16cid:commentId w16cid:paraId="65F86C7F" w16cid:durableId="45F6D256"/>
-  <w16cid:commentId w16cid:paraId="3B9F6331" w16cid:durableId="31C16E79"/>
 </w16cid:commentsIds>
 </file>
 
@@ -13526,6 +13706,119 @@
     </w:lvl>
   </w:abstractNum>
   <w:abstractNum w:abstractNumId="18" w15:restartNumberingAfterBreak="0">
+    <w:nsid w:val="36382FA2"/>
+    <w:multiLevelType w:val="hybridMultilevel"/>
+    <w:tmpl w:val="106C3ADC"/>
+    <w:lvl w:ilvl="0" w:tplc="04090001">
+      <w:start w:val="1"/>
+      <w:numFmt w:val="bullet"/>
+      <w:lvlText w:val=""/>
+      <w:lvlJc w:val="left"/>
+      <w:pPr>
+        <w:ind w:left="720" w:hanging="360"/>
+      </w:pPr>
+      <w:rPr>
+        <w:rFonts w:ascii="Symbol" w:hAnsi="Symbol" w:hint="default"/>
+      </w:rPr>
+    </w:lvl>
+    <w:lvl w:ilvl="1" w:tplc="04090003" w:tentative="1">
+      <w:start w:val="1"/>
+      <w:numFmt w:val="bullet"/>
+      <w:lvlText w:val="o"/>
+      <w:lvlJc w:val="left"/>
+      <w:pPr>
+        <w:ind w:left="1440" w:hanging="360"/>
+      </w:pPr>
+      <w:rPr>
+        <w:rFonts w:ascii="Courier New" w:hAnsi="Courier New" w:cs="Courier New" w:hint="default"/>
+      </w:rPr>
+    </w:lvl>
+    <w:lvl w:ilvl="2" w:tplc="04090005" w:tentative="1">
+      <w:start w:val="1"/>
+      <w:numFmt w:val="bullet"/>
+      <w:lvlText w:val=""/>
+      <w:lvlJc w:val="left"/>
+      <w:pPr>
+        <w:ind w:left="2160" w:hanging="360"/>
+      </w:pPr>
+      <w:rPr>
+        <w:rFonts w:ascii="Wingdings" w:hAnsi="Wingdings" w:hint="default"/>
+      </w:rPr>
+    </w:lvl>
+    <w:lvl w:ilvl="3" w:tplc="04090001" w:tentative="1">
+      <w:start w:val="1"/>
+      <w:numFmt w:val="bullet"/>
+      <w:lvlText w:val=""/>
+      <w:lvlJc w:val="left"/>
+      <w:pPr>
+        <w:ind w:left="2880" w:hanging="360"/>
+      </w:pPr>
+      <w:rPr>
+        <w:rFonts w:ascii="Symbol" w:hAnsi="Symbol" w:hint="default"/>
+      </w:rPr>
+    </w:lvl>
+    <w:lvl w:ilvl="4" w:tplc="04090003" w:tentative="1">
+      <w:start w:val="1"/>
+      <w:numFmt w:val="bullet"/>
+      <w:lvlText w:val="o"/>
+      <w:lvlJc w:val="left"/>
+      <w:pPr>
+        <w:ind w:left="3600" w:hanging="360"/>
+      </w:pPr>
+      <w:rPr>
+        <w:rFonts w:ascii="Courier New" w:hAnsi="Courier New" w:cs="Courier New" w:hint="default"/>
+      </w:rPr>
+    </w:lvl>
+    <w:lvl w:ilvl="5" w:tplc="04090005" w:tentative="1">
+      <w:start w:val="1"/>
+      <w:numFmt w:val="bullet"/>
+      <w:lvlText w:val=""/>
+      <w:lvlJc w:val="left"/>
+      <w:pPr>
+        <w:ind w:left="4320" w:hanging="360"/>
+      </w:pPr>
+      <w:rPr>
+        <w:rFonts w:ascii="Wingdings" w:hAnsi="Wingdings" w:hint="default"/>
+      </w:rPr>
+    </w:lvl>
+    <w:lvl w:ilvl="6" w:tplc="04090001" w:tentative="1">
+      <w:start w:val="1"/>
+      <w:numFmt w:val="bullet"/>
+      <w:lvlText w:val=""/>
+      <w:lvlJc w:val="left"/>
+      <w:pPr>
+        <w:ind w:left="5040" w:hanging="360"/>
+      </w:pPr>
+      <w:rPr>
+        <w:rFonts w:ascii="Symbol" w:hAnsi="Symbol" w:hint="default"/>
+      </w:rPr>
+    </w:lvl>
+    <w:lvl w:ilvl="7" w:tplc="04090003" w:tentative="1">
+      <w:start w:val="1"/>
+      <w:numFmt w:val="bullet"/>
+      <w:lvlText w:val="o"/>
+      <w:lvlJc w:val="left"/>
+      <w:pPr>
+        <w:ind w:left="5760" w:hanging="360"/>
+      </w:pPr>
+      <w:rPr>
+        <w:rFonts w:ascii="Courier New" w:hAnsi="Courier New" w:cs="Courier New" w:hint="default"/>
+      </w:rPr>
+    </w:lvl>
+    <w:lvl w:ilvl="8" w:tplc="04090005" w:tentative="1">
+      <w:start w:val="1"/>
+      <w:numFmt w:val="bullet"/>
+      <w:lvlText w:val=""/>
+      <w:lvlJc w:val="left"/>
+      <w:pPr>
+        <w:ind w:left="6480" w:hanging="360"/>
+      </w:pPr>
+      <w:rPr>
+        <w:rFonts w:ascii="Wingdings" w:hAnsi="Wingdings" w:hint="default"/>
+      </w:rPr>
+    </w:lvl>
+  </w:abstractNum>
+  <w:abstractNum w:abstractNumId="19" w15:restartNumberingAfterBreak="0">
     <w:nsid w:val="375C09E7"/>
     <w:multiLevelType w:val="hybridMultilevel"/>
     <w:tmpl w:val="F80A41B6"/>
@@ -13615,7 +13908,7 @@
       </w:pPr>
     </w:lvl>
   </w:abstractNum>
-  <w:abstractNum w:abstractNumId="19" w15:restartNumberingAfterBreak="0">
+  <w:abstractNum w:abstractNumId="20" w15:restartNumberingAfterBreak="0">
     <w:nsid w:val="38F66EB5"/>
     <w:multiLevelType w:val="hybridMultilevel"/>
     <w:tmpl w:val="5CDA7BF4"/>
@@ -13701,7 +13994,7 @@
       </w:pPr>
     </w:lvl>
   </w:abstractNum>
-  <w:abstractNum w:abstractNumId="20" w15:restartNumberingAfterBreak="0">
+  <w:abstractNum w:abstractNumId="21" w15:restartNumberingAfterBreak="0">
     <w:nsid w:val="3A436E7D"/>
     <w:multiLevelType w:val="hybridMultilevel"/>
     <w:tmpl w:val="5BE83056"/>
@@ -13790,7 +14083,7 @@
       </w:pPr>
     </w:lvl>
   </w:abstractNum>
-  <w:abstractNum w:abstractNumId="21" w15:restartNumberingAfterBreak="0">
+  <w:abstractNum w:abstractNumId="22" w15:restartNumberingAfterBreak="0">
     <w:nsid w:val="3C386883"/>
     <w:multiLevelType w:val="hybridMultilevel"/>
     <w:tmpl w:val="83C498BA"/>
@@ -13876,7 +14169,7 @@
       </w:pPr>
     </w:lvl>
   </w:abstractNum>
-  <w:abstractNum w:abstractNumId="22" w15:restartNumberingAfterBreak="0">
+  <w:abstractNum w:abstractNumId="23" w15:restartNumberingAfterBreak="0">
     <w:nsid w:val="3F8052E1"/>
     <w:multiLevelType w:val="hybridMultilevel"/>
     <w:tmpl w:val="9BFCA8BC"/>
@@ -13966,7 +14259,7 @@
       </w:pPr>
     </w:lvl>
   </w:abstractNum>
-  <w:abstractNum w:abstractNumId="23" w15:restartNumberingAfterBreak="0">
+  <w:abstractNum w:abstractNumId="24" w15:restartNumberingAfterBreak="0">
     <w:nsid w:val="40A708FC"/>
     <w:multiLevelType w:val="hybridMultilevel"/>
     <w:tmpl w:val="9DF068AE"/>
@@ -14055,7 +14348,7 @@
       </w:pPr>
     </w:lvl>
   </w:abstractNum>
-  <w:abstractNum w:abstractNumId="24" w15:restartNumberingAfterBreak="0">
+  <w:abstractNum w:abstractNumId="25" w15:restartNumberingAfterBreak="0">
     <w:nsid w:val="459D55A0"/>
     <w:multiLevelType w:val="hybridMultilevel"/>
     <w:tmpl w:val="347241F6"/>
@@ -14168,7 +14461,7 @@
       </w:rPr>
     </w:lvl>
   </w:abstractNum>
-  <w:abstractNum w:abstractNumId="25" w15:restartNumberingAfterBreak="0">
+  <w:abstractNum w:abstractNumId="26" w15:restartNumberingAfterBreak="0">
     <w:nsid w:val="4C7E30DD"/>
     <w:multiLevelType w:val="hybridMultilevel"/>
     <w:tmpl w:val="71D0CF7C"/>
@@ -14254,7 +14547,7 @@
       </w:pPr>
     </w:lvl>
   </w:abstractNum>
-  <w:abstractNum w:abstractNumId="26" w15:restartNumberingAfterBreak="0">
+  <w:abstractNum w:abstractNumId="27" w15:restartNumberingAfterBreak="0">
     <w:nsid w:val="4CD84D8B"/>
     <w:multiLevelType w:val="hybridMultilevel"/>
     <w:tmpl w:val="02A4ABD4"/>
@@ -14340,7 +14633,7 @@
       </w:pPr>
     </w:lvl>
   </w:abstractNum>
-  <w:abstractNum w:abstractNumId="27" w15:restartNumberingAfterBreak="0">
+  <w:abstractNum w:abstractNumId="28" w15:restartNumberingAfterBreak="0">
     <w:nsid w:val="4E6D6F00"/>
     <w:multiLevelType w:val="hybridMultilevel"/>
     <w:tmpl w:val="671AEC84"/>
@@ -14426,7 +14719,7 @@
       </w:pPr>
     </w:lvl>
   </w:abstractNum>
-  <w:abstractNum w:abstractNumId="28" w15:restartNumberingAfterBreak="0">
+  <w:abstractNum w:abstractNumId="29" w15:restartNumberingAfterBreak="0">
     <w:nsid w:val="50C9662C"/>
     <w:multiLevelType w:val="hybridMultilevel"/>
     <w:tmpl w:val="E39C7BC8"/>
@@ -14515,7 +14808,7 @@
       </w:pPr>
     </w:lvl>
   </w:abstractNum>
-  <w:abstractNum w:abstractNumId="29" w15:restartNumberingAfterBreak="0">
+  <w:abstractNum w:abstractNumId="30" w15:restartNumberingAfterBreak="0">
     <w:nsid w:val="58712D8A"/>
     <w:multiLevelType w:val="hybridMultilevel"/>
     <w:tmpl w:val="A2CE657E"/>
@@ -14601,7 +14894,7 @@
       </w:pPr>
     </w:lvl>
   </w:abstractNum>
-  <w:abstractNum w:abstractNumId="30" w15:restartNumberingAfterBreak="0">
+  <w:abstractNum w:abstractNumId="31" w15:restartNumberingAfterBreak="0">
     <w:nsid w:val="5A356A66"/>
     <w:multiLevelType w:val="hybridMultilevel"/>
     <w:tmpl w:val="1C2662E0"/>
@@ -14687,7 +14980,7 @@
       </w:pPr>
     </w:lvl>
   </w:abstractNum>
-  <w:abstractNum w:abstractNumId="31" w15:restartNumberingAfterBreak="0">
+  <w:abstractNum w:abstractNumId="32" w15:restartNumberingAfterBreak="0">
     <w:nsid w:val="5A4545F9"/>
     <w:multiLevelType w:val="hybridMultilevel"/>
     <w:tmpl w:val="4FE8E398"/>
@@ -14773,7 +15066,7 @@
       </w:pPr>
     </w:lvl>
   </w:abstractNum>
-  <w:abstractNum w:abstractNumId="32" w15:restartNumberingAfterBreak="0">
+  <w:abstractNum w:abstractNumId="33" w15:restartNumberingAfterBreak="0">
     <w:nsid w:val="677D6215"/>
     <w:multiLevelType w:val="hybridMultilevel"/>
     <w:tmpl w:val="26C47B12"/>
@@ -14859,7 +15152,7 @@
       </w:pPr>
     </w:lvl>
   </w:abstractNum>
-  <w:abstractNum w:abstractNumId="33" w15:restartNumberingAfterBreak="0">
+  <w:abstractNum w:abstractNumId="34" w15:restartNumberingAfterBreak="0">
     <w:nsid w:val="693D06B8"/>
     <w:multiLevelType w:val="hybridMultilevel"/>
     <w:tmpl w:val="771C0D84"/>
@@ -14972,7 +15265,7 @@
       </w:rPr>
     </w:lvl>
   </w:abstractNum>
-  <w:abstractNum w:abstractNumId="34" w15:restartNumberingAfterBreak="0">
+  <w:abstractNum w:abstractNumId="35" w15:restartNumberingAfterBreak="0">
     <w:nsid w:val="71F811A0"/>
     <w:multiLevelType w:val="hybridMultilevel"/>
     <w:tmpl w:val="B5A032CE"/>
@@ -15058,7 +15351,7 @@
       </w:pPr>
     </w:lvl>
   </w:abstractNum>
-  <w:abstractNum w:abstractNumId="35" w15:restartNumberingAfterBreak="0">
+  <w:abstractNum w:abstractNumId="36" w15:restartNumberingAfterBreak="0">
     <w:nsid w:val="72DF333F"/>
     <w:multiLevelType w:val="hybridMultilevel"/>
     <w:tmpl w:val="5AF6E552"/>
@@ -15144,7 +15437,7 @@
       </w:pPr>
     </w:lvl>
   </w:abstractNum>
-  <w:abstractNum w:abstractNumId="36" w15:restartNumberingAfterBreak="0">
+  <w:abstractNum w:abstractNumId="37" w15:restartNumberingAfterBreak="0">
     <w:nsid w:val="7A526120"/>
     <w:multiLevelType w:val="hybridMultilevel"/>
     <w:tmpl w:val="C2C4573A"/>
@@ -15258,25 +15551,25 @@
     </w:lvl>
   </w:abstractNum>
   <w:num w:numId="1" w16cid:durableId="965937199">
-    <w:abstractNumId w:val="24"/>
+    <w:abstractNumId w:val="25"/>
   </w:num>
   <w:num w:numId="2" w16cid:durableId="911934510">
     <w:abstractNumId w:val="7"/>
   </w:num>
   <w:num w:numId="3" w16cid:durableId="821198676">
-    <w:abstractNumId w:val="33"/>
+    <w:abstractNumId w:val="34"/>
   </w:num>
   <w:num w:numId="4" w16cid:durableId="1907567680">
-    <w:abstractNumId w:val="27"/>
+    <w:abstractNumId w:val="28"/>
   </w:num>
   <w:num w:numId="5" w16cid:durableId="1841505650">
-    <w:abstractNumId w:val="21"/>
+    <w:abstractNumId w:val="22"/>
   </w:num>
   <w:num w:numId="6" w16cid:durableId="1264605535">
     <w:abstractNumId w:val="6"/>
   </w:num>
   <w:num w:numId="7" w16cid:durableId="1168056695">
-    <w:abstractNumId w:val="35"/>
+    <w:abstractNumId w:val="36"/>
   </w:num>
   <w:num w:numId="8" w16cid:durableId="572354863">
     <w:abstractNumId w:val="8"/>
@@ -15285,28 +15578,28 @@
     <w:abstractNumId w:val="4"/>
   </w:num>
   <w:num w:numId="10" w16cid:durableId="1768574090">
-    <w:abstractNumId w:val="29"/>
+    <w:abstractNumId w:val="30"/>
   </w:num>
   <w:num w:numId="11" w16cid:durableId="1058554659">
     <w:abstractNumId w:val="14"/>
   </w:num>
   <w:num w:numId="12" w16cid:durableId="496581295">
-    <w:abstractNumId w:val="19"/>
+    <w:abstractNumId w:val="20"/>
   </w:num>
   <w:num w:numId="13" w16cid:durableId="1078096430">
     <w:abstractNumId w:val="15"/>
   </w:num>
   <w:num w:numId="14" w16cid:durableId="779838575">
-    <w:abstractNumId w:val="20"/>
+    <w:abstractNumId w:val="21"/>
   </w:num>
   <w:num w:numId="15" w16cid:durableId="775095447">
     <w:abstractNumId w:val="2"/>
   </w:num>
   <w:num w:numId="16" w16cid:durableId="1617448374">
-    <w:abstractNumId w:val="34"/>
+    <w:abstractNumId w:val="35"/>
   </w:num>
   <w:num w:numId="17" w16cid:durableId="1663703446">
-    <w:abstractNumId w:val="25"/>
+    <w:abstractNumId w:val="26"/>
   </w:num>
   <w:num w:numId="18" w16cid:durableId="1382828457">
     <w:abstractNumId w:val="12"/>
@@ -15318,13 +15611,13 @@
     <w:abstractNumId w:val="0"/>
   </w:num>
   <w:num w:numId="21" w16cid:durableId="377709132">
-    <w:abstractNumId w:val="26"/>
+    <w:abstractNumId w:val="27"/>
   </w:num>
   <w:num w:numId="22" w16cid:durableId="10647268">
     <w:abstractNumId w:val="13"/>
   </w:num>
   <w:num w:numId="23" w16cid:durableId="1663267235">
-    <w:abstractNumId w:val="31"/>
+    <w:abstractNumId w:val="32"/>
   </w:num>
   <w:num w:numId="24" w16cid:durableId="1502042358">
     <w:abstractNumId w:val="3"/>
@@ -15333,25 +15626,25 @@
     <w:abstractNumId w:val="16"/>
   </w:num>
   <w:num w:numId="26" w16cid:durableId="12854">
-    <w:abstractNumId w:val="36"/>
+    <w:abstractNumId w:val="37"/>
   </w:num>
   <w:num w:numId="27" w16cid:durableId="81613038">
-    <w:abstractNumId w:val="32"/>
+    <w:abstractNumId w:val="33"/>
   </w:num>
   <w:num w:numId="28" w16cid:durableId="335108775">
-    <w:abstractNumId w:val="28"/>
+    <w:abstractNumId w:val="29"/>
   </w:num>
   <w:num w:numId="29" w16cid:durableId="1461151196">
-    <w:abstractNumId w:val="22"/>
+    <w:abstractNumId w:val="23"/>
   </w:num>
   <w:num w:numId="30" w16cid:durableId="1371494436">
     <w:abstractNumId w:val="5"/>
   </w:num>
   <w:num w:numId="31" w16cid:durableId="384456167">
-    <w:abstractNumId w:val="23"/>
+    <w:abstractNumId w:val="24"/>
   </w:num>
   <w:num w:numId="32" w16cid:durableId="1938320866">
-    <w:abstractNumId w:val="18"/>
+    <w:abstractNumId w:val="19"/>
   </w:num>
   <w:num w:numId="33" w16cid:durableId="340471497">
     <w:abstractNumId w:val="11"/>
@@ -15360,13 +15653,16 @@
     <w:abstractNumId w:val="10"/>
   </w:num>
   <w:num w:numId="35" w16cid:durableId="1545632194">
-    <w:abstractNumId w:val="30"/>
+    <w:abstractNumId w:val="31"/>
   </w:num>
   <w:num w:numId="36" w16cid:durableId="1024015665">
     <w:abstractNumId w:val="17"/>
   </w:num>
   <w:num w:numId="37" w16cid:durableId="1261065261">
     <w:abstractNumId w:val="1"/>
+  </w:num>
+  <w:num w:numId="38" w16cid:durableId="160317064">
+    <w:abstractNumId w:val="18"/>
   </w:num>
 </w:numbering>
 </file>

</xml_diff>

<commit_message>
Updates to add option to retrieve streamflow from local cached copy
</commit_message>
<xml_diff>
--- a/LakeMeadWaterConservationProgramSuccessChallengesSuggestions_v4.docx
+++ b/LakeMeadWaterConservationProgramSuccessChallengesSuggestions_v4.docx
@@ -5169,7 +5169,7 @@
           <w:szCs w:val="24"/>
         </w:rPr>
         <w:drawing>
-          <wp:inline distT="0" distB="0" distL="0" distR="0" wp14:anchorId="1DF02D15" wp14:editId="0CD1CF36">
+          <wp:inline distT="0" distB="0" distL="0" distR="0" wp14:anchorId="1DF02D15" wp14:editId="45CAB2EB">
             <wp:extent cx="5845696" cy="3329343"/>
             <wp:effectExtent l="0" t="0" r="0" b="0"/>
             <wp:docPr id="708746801" name="Picture 2"/>
@@ -10478,11 +10478,28 @@
       <w:pPr>
         <w:pStyle w:val="NoSpacing"/>
       </w:pPr>
-      <w:r>
-        <w:t xml:space="preserve">______ download the materials </w:t>
-      </w:r>
-      <w:r>
-        <w:t>and generated results in Figures 1 to 7.</w:t>
+    </w:p>
+    <w:p>
+      <w:pPr>
+        <w:pStyle w:val="NoSpacing"/>
+      </w:pPr>
+      <w:r>
+        <w:t>Matti W</w:t>
+      </w:r>
+      <w:r>
+        <w:t>itte (Utah State University)</w:t>
+      </w:r>
+      <w:r>
+        <w:t xml:space="preserve"> download the materials </w:t>
+      </w:r>
+      <w:r>
+        <w:t xml:space="preserve">and generated </w:t>
+      </w:r>
+      <w:r>
+        <w:t>Figures 6 and</w:t>
+      </w:r>
+      <w:r>
+        <w:t xml:space="preserve"> 7.</w:t>
       </w:r>
       <w:r>
         <w:t xml:space="preserve"> </w:t>
@@ -10613,7 +10630,11 @@
         <w:t>hortage</w:t>
       </w:r>
       <w:r>
-        <w:t xml:space="preserve"> into </w:t>
+        <w:t xml:space="preserve"> </w:t>
+      </w:r>
+      <w:r>
+        <w:lastRenderedPageBreak/>
+        <w:t xml:space="preserve">into </w:t>
       </w:r>
       <w:r>
         <w:t xml:space="preserve">shortage </w:t>
@@ -10640,11 +10661,7 @@
         <w:t>W</w:t>
       </w:r>
       <w:r>
-        <w:t xml:space="preserve">ater is Total Legal Entitlements minus </w:t>
-      </w:r>
-      <w:r>
-        <w:lastRenderedPageBreak/>
-        <w:t xml:space="preserve">Total Shortage. </w:t>
+        <w:t xml:space="preserve">ater is Total Legal Entitlements minus Total Shortage. </w:t>
       </w:r>
       <w:r>
         <w:t xml:space="preserve">Third, each </w:t>
@@ -11121,7 +11138,11 @@
         <w:ind w:left="720" w:hanging="720"/>
       </w:pPr>
       <w:r>
-        <w:t xml:space="preserve">Hecht, J. S., Vogel, R. M., McManamay, R. A., Kroll, C. N., and Reed, J. M. (2020). "Decision Trees for Incorporating Hypothesis Tests of Hydrologic Alteration into Hydropower&amp;#x2013;Ecosystem Tradeoffs." </w:t>
+        <w:t xml:space="preserve">Hecht, J. S., Vogel, R. M., McManamay, R. A., Kroll, C. N., and Reed, J. M. (2020). "Decision Trees for Incorporating Hypothesis Tests of Hydrologic Alteration into Hydropower&amp;#x2013;Ecosystem </w:t>
+      </w:r>
+      <w:r>
+        <w:lastRenderedPageBreak/>
+        <w:t xml:space="preserve">Tradeoffs." </w:t>
       </w:r>
       <w:r>
         <w:rPr>
@@ -11151,7 +11172,6 @@
         <w:ind w:left="720" w:hanging="720"/>
       </w:pPr>
       <w:r>
-        <w:lastRenderedPageBreak/>
         <w:t xml:space="preserve">Hegwood, M., Langendorf, R. E., and Burgess, M. G. (2022). "Why win–wins are rare in complex environmental management." </w:t>
       </w:r>
       <w:r>
@@ -11551,7 +11571,11 @@
         <w:ind w:left="720" w:hanging="720"/>
       </w:pPr>
       <w:r>
-        <w:t xml:space="preserve">Smith, R., Zagona, E., Kasprzyk, J., Bonham, N., Alexander, E., Butler, A., Prairie, J., and Jerla, C. (2022). "Decision Science Can Help Address the Challenges of Long-Term Planning in the Colorado River Basin." </w:t>
+        <w:t xml:space="preserve">Smith, R., Zagona, E., Kasprzyk, J., Bonham, N., Alexander, E., Butler, A., Prairie, J., and Jerla, C. (2022). "Decision Science Can Help Address the Challenges of Long-Term Planning in the Colorado River </w:t>
+      </w:r>
+      <w:r>
+        <w:lastRenderedPageBreak/>
+        <w:t xml:space="preserve">Basin." </w:t>
       </w:r>
       <w:r>
         <w:rPr>
@@ -11581,7 +11605,6 @@
         <w:ind w:left="720" w:hanging="720"/>
       </w:pPr>
       <w:r>
-        <w:lastRenderedPageBreak/>
         <w:t xml:space="preserve">Stelter, D. (2022). "Towards a Utah Intentionally Created Surplus Program." </w:t>
       </w:r>
       <w:r>
@@ -16102,6 +16125,7 @@
   <w:style w:type="character" w:default="1" w:styleId="DefaultParagraphFont">
     <w:name w:val="Default Paragraph Font"/>
     <w:uiPriority w:val="1"/>
+    <w:semiHidden/>
     <w:unhideWhenUsed/>
   </w:style>
   <w:style w:type="table" w:default="1" w:styleId="TableNormal">

</xml_diff>

<commit_message>
Final updates to Figure 5 code in Rmd and R
</commit_message>
<xml_diff>
--- a/LakeMeadWaterConservationProgramSuccessChallengesSuggestions_v4.docx
+++ b/LakeMeadWaterConservationProgramSuccessChallengesSuggestions_v4.docx
@@ -10478,6 +10478,12 @@
       <w:pPr>
         <w:pStyle w:val="NoSpacing"/>
       </w:pPr>
+      <w:r>
+        <w:t>Hope H</w:t>
+      </w:r>
+      <w:r>
+        <w:t>auptman (University of California Agriculture and Natural Resources) downloaded materials and reproduced Figures 1 to 4.</w:t>
+      </w:r>
     </w:p>
     <w:p>
       <w:pPr>
@@ -10493,7 +10499,13 @@
         <w:t xml:space="preserve"> download the materials </w:t>
       </w:r>
       <w:r>
-        <w:t xml:space="preserve">and generated </w:t>
+        <w:t xml:space="preserve">and </w:t>
+      </w:r>
+      <w:r>
+        <w:t>reproduced</w:t>
+      </w:r>
+      <w:r>
+        <w:t xml:space="preserve"> </w:t>
       </w:r>
       <w:r>
         <w:t>Figures 6 and</w:t>
@@ -10588,7 +10600,11 @@
         <w:t xml:space="preserve">age shares of shortages listed in Table </w:t>
       </w:r>
       <w:r>
-        <w:t xml:space="preserve">2-3 of the FEIS </w:t>
+        <w:t xml:space="preserve">2-3 of the </w:t>
+      </w:r>
+      <w:r>
+        <w:lastRenderedPageBreak/>
+        <w:t xml:space="preserve">FEIS </w:t>
       </w:r>
       <w:r>
         <w:fldChar w:fldCharType="begin"/>
@@ -10630,11 +10646,7 @@
         <w:t>hortage</w:t>
       </w:r>
       <w:r>
-        <w:t xml:space="preserve"> </w:t>
-      </w:r>
-      <w:r>
-        <w:lastRenderedPageBreak/>
-        <w:t xml:space="preserve">into </w:t>
+        <w:t xml:space="preserve"> into </w:t>
       </w:r>
       <w:r>
         <w:t xml:space="preserve">shortage </w:t>
@@ -11138,11 +11150,8 @@
         <w:ind w:left="720" w:hanging="720"/>
       </w:pPr>
       <w:r>
-        <w:t xml:space="preserve">Hecht, J. S., Vogel, R. M., McManamay, R. A., Kroll, C. N., and Reed, J. M. (2020). "Decision Trees for Incorporating Hypothesis Tests of Hydrologic Alteration into Hydropower&amp;#x2013;Ecosystem </w:t>
-      </w:r>
-      <w:r>
         <w:lastRenderedPageBreak/>
-        <w:t xml:space="preserve">Tradeoffs." </w:t>
+        <w:t xml:space="preserve">Hecht, J. S., Vogel, R. M., McManamay, R. A., Kroll, C. N., and Reed, J. M. (2020). "Decision Trees for Incorporating Hypothesis Tests of Hydrologic Alteration into Hydropower&amp;#x2013;Ecosystem Tradeoffs." </w:t>
       </w:r>
       <w:r>
         <w:rPr>
@@ -11571,11 +11580,8 @@
         <w:ind w:left="720" w:hanging="720"/>
       </w:pPr>
       <w:r>
-        <w:t xml:space="preserve">Smith, R., Zagona, E., Kasprzyk, J., Bonham, N., Alexander, E., Butler, A., Prairie, J., and Jerla, C. (2022). "Decision Science Can Help Address the Challenges of Long-Term Planning in the Colorado River </w:t>
-      </w:r>
-      <w:r>
         <w:lastRenderedPageBreak/>
-        <w:t xml:space="preserve">Basin." </w:t>
+        <w:t xml:space="preserve">Smith, R., Zagona, E., Kasprzyk, J., Bonham, N., Alexander, E., Butler, A., Prairie, J., and Jerla, C. (2022). "Decision Science Can Help Address the Challenges of Long-Term Planning in the Colorado River Basin." </w:t>
       </w:r>
       <w:r>
         <w:rPr>

</xml_diff>

<commit_message>
Reran python code for Figure 6 time series to regenerate figure
</commit_message>
<xml_diff>
--- a/LakeMeadWaterConservationProgramSuccessChallengesSuggestions_v4.docx
+++ b/LakeMeadWaterConservationProgramSuccessChallengesSuggestions_v4.docx
@@ -489,38 +489,7 @@
         <w:t xml:space="preserve">across the western United States </w:t>
       </w:r>
       <w:r>
-        <w:t xml:space="preserve">and uncertainty in future water supply put agricultural users, urban users, Tribal Nations, and ecosystems at risk of water shortages </w:t>
-      </w:r>
-      <w:commentRangeStart w:id="0"/>
-      <w:r>
-        <w:fldChar w:fldCharType="begin"/>
-      </w:r>
-      <w:r>
-        <w:instrText xml:space="preserve"> ADDIN EN.CITE &lt;EndNote&gt;&lt;Cite&gt;&lt;Author&gt;Jasechko&lt;/Author&gt;&lt;Year&gt;2021&lt;/Year&gt;&lt;RecNum&gt;2988&lt;/RecNum&gt;&lt;DisplayText&gt;(Jasechko and Perrone, 2021)&lt;/DisplayText&gt;&lt;record&gt;&lt;rec-number&gt;2988&lt;/rec-number&gt;&lt;foreign-keys&gt;&lt;key app="EN" db-id="xxt5ta9pd995dwesap0pdzzp2weaz0w9werf" timestamp="1712786645"&gt;2988&lt;/key&gt;&lt;/foreign-keys&gt;&lt;ref-type name="Journal Article"&gt;17&lt;/ref-type&gt;&lt;contributors&gt;&lt;authors&gt;&lt;author&gt;Jasechko, Scott&lt;/author&gt;&lt;author&gt;Perrone, Debra&lt;/author&gt;&lt;/authors&gt;&lt;/contributors&gt;&lt;titles&gt;&lt;title&gt;Global groundwater wells at risk of running dry&lt;/title&gt;&lt;secondary-title&gt;Science&lt;/secondary-title&gt;&lt;/titles&gt;&lt;periodical&gt;&lt;full-title&gt;Science&lt;/full-title&gt;&lt;/periodical&gt;&lt;pages&gt;418-421&lt;/pages&gt;&lt;volume&gt;372&lt;/volume&gt;&lt;number&gt;6540&lt;/number&gt;&lt;dates&gt;&lt;year&gt;2021&lt;/year&gt;&lt;/dates&gt;&lt;urls&gt;&lt;related-urls&gt;&lt;url&gt;https://www.science.org/doi/abs/10.1126/science.abc2755&lt;/url&gt;&lt;/related-urls&gt;&lt;/urls&gt;&lt;electronic-resource-num&gt;https://doi.org/10.1126/science.abc2755&lt;/electronic-resource-num&gt;&lt;/record&gt;&lt;/Cite&gt;&lt;/EndNote&gt;</w:instrText>
-      </w:r>
-      <w:r>
-        <w:fldChar w:fldCharType="separate"/>
-      </w:r>
-      <w:r>
-        <w:rPr>
-          <w:noProof/>
-        </w:rPr>
-        <w:t>(Jasechko and Perrone, 2021)</w:t>
-      </w:r>
-      <w:r>
-        <w:fldChar w:fldCharType="end"/>
-      </w:r>
-      <w:commentRangeEnd w:id="0"/>
-      <w:r>
-        <w:rPr>
-          <w:rStyle w:val="CommentReference"/>
-          <w:sz w:val="24"/>
-          <w:szCs w:val="24"/>
-        </w:rPr>
-        <w:commentReference w:id="0"/>
-      </w:r>
-      <w:r>
-        <w:t xml:space="preserve">. Communities </w:t>
+        <w:t xml:space="preserve">and uncertainty in future water supply put agricultural users, urban users, Tribal Nations, and ecosystems at risk of water shortages. Communities </w:t>
       </w:r>
       <w:r>
         <w:t xml:space="preserve">with varied access to water sources, capital, and information face different levels of </w:t>
@@ -949,62 +918,81 @@
       <w:r>
         <w:fldChar w:fldCharType="begin">
           <w:fldData xml:space="preserve">PEVuZE5vdGU+PENpdGU+PEF1dGhvcj5IZWd3b29kPC9BdXRob3I+PFllYXI+MjAyMjwvWWVhcj48
-UmVjTnVtPjI4ODg8L1JlY051bT48RGlzcGxheVRleHQ+KEhlY2h0IGV0IGFsLiwgMjAyMDsgSGVn
-d29vZCBldCBhbC4sIDIwMjI7IFJvc2VuYmVyZywgMjAyNCk8L0Rpc3BsYXlUZXh0PjxyZWNvcmQ+
-PHJlYy1udW1iZXI+Mjg4ODwvcmVjLW51bWJlcj48Zm9yZWlnbi1rZXlzPjxrZXkgYXBwPSJFTiIg
-ZGItaWQ9Inh4dDV0YTlwZDk5NWR3ZXNhcDBwZHp6cDJ3ZWF6MHc5d2VyZiIgdGltZXN0YW1wPSIx
-NjU1MzkxNDgwIj4yODg4PC9rZXk+PC9mb3JlaWduLWtleXM+PHJlZi10eXBlIG5hbWU9IkpvdXJu
-YWwgQXJ0aWNsZSI+MTc8L3JlZi10eXBlPjxjb250cmlidXRvcnM+PGF1dGhvcnM+PGF1dGhvcj5I
-ZWd3b29kLCBNYXJnYXJldDwvYXV0aG9yPjxhdXRob3I+TGFuZ2VuZG9yZiwgUnlhbiBFLjwvYXV0
-aG9yPjxhdXRob3I+QnVyZ2VzcywgTWF0dGhldyBHLjwvYXV0aG9yPjwvYXV0aG9ycz48L2NvbnRy
-aWJ1dG9ycz48dGl0bGVzPjx0aXRsZT5XaHkgd2lu4oCTd2lucyBhcmUgcmFyZSBpbiBjb21wbGV4
-IGVudmlyb25tZW50YWwgbWFuYWdlbWVudDwvdGl0bGU+PHNlY29uZGFyeS10aXRsZT5OYXR1cmUg
-U3VzdGFpbmFiaWxpdHk8L3NlY29uZGFyeS10aXRsZT48L3RpdGxlcz48cGVyaW9kaWNhbD48ZnVs
-bC10aXRsZT5OYXR1cmUgU3VzdGFpbmFiaWxpdHk8L2Z1bGwtdGl0bGU+PC9wZXJpb2RpY2FsPjxk
-YXRlcz48eWVhcj4yMDIyPC95ZWFyPjxwdWItZGF0ZXM+PGRhdGU+MjAyMi8wMy8yNDwvZGF0ZT48
-L3B1Yi1kYXRlcz48L2RhdGVzPjxpc2JuPjIzOTgtOTYyOTwvaXNibj48dXJscz48cmVsYXRlZC11
-cmxzPjx1cmw+aHR0cHM6Ly9kb2kub3JnLzEwLjEwMzgvczQxODkzLTAyMi0wMDg2Ni16PC91cmw+
-PC9yZWxhdGVkLXVybHM+PC91cmxzPjxlbGVjdHJvbmljLXJlc291cmNlLW51bT5odHRwczovL2Rv
-aS5vcmcvMTAuMTAzOC9zNDE4OTMtMDIyLTAwODY2LXo8L2VsZWN0cm9uaWMtcmVzb3VyY2UtbnVt
-PjwvcmVjb3JkPjwvQ2l0ZT48Q2l0ZT48QXV0aG9yPkhlY2h0PC9BdXRob3I+PFllYXI+MjAyMDwv
-WWVhcj48UmVjTnVtPjI3MTc8L1JlY051bT48cmVjb3JkPjxyZWMtbnVtYmVyPjI3MTc8L3JlYy1u
-dW1iZXI+PGZvcmVpZ24ta2V5cz48a2V5IGFwcD0iRU4iIGRiLWlkPSJ4eHQ1dGE5cGQ5OTVkd2Vz
-YXAwcGR6enAyd2VhejB3OXdlcmYiIHRpbWVzdGFtcD0iMTU5MTgxMDg5NCI+MjcxNzwva2V5Pjwv
-Zm9yZWlnbi1rZXlzPjxyZWYtdHlwZSBuYW1lPSJKb3VybmFsIEFydGljbGUiPjE3PC9yZWYtdHlw
-ZT48Y29udHJpYnV0b3JzPjxhdXRob3JzPjxhdXRob3I+Sm9yeSBTLiBIZWNodDwvYXV0aG9yPjxh
-dXRob3I+UmljaGFyZCBNLiBWb2dlbDwvYXV0aG9yPjxhdXRob3I+UnlhbiBBLiBNY01hbmFtYXk8
-L2F1dGhvcj48YXV0aG9yPkNoYXJsZXMgTi4gS3JvbGw8L2F1dGhvcj48YXV0aG9yPkouIE1pY2hh
-ZWwgUmVlZDwvYXV0aG9yPjwvYXV0aG9ycz48L2NvbnRyaWJ1dG9ycz48dGl0bGVzPjx0aXRsZT5E
-ZWNpc2lvbiBUcmVlcyBmb3IgSW5jb3Jwb3JhdGluZyBIeXBvdGhlc2lzIFRlc3RzIG9mIEh5ZHJv
-bG9naWMgQWx0ZXJhdGlvbiBpbnRvIEh5ZHJvcG93ZXImYW1wOyN4MjAxMztFY29zeXN0ZW0gVHJh
-ZGVvZmZzPC90aXRsZT48c2Vjb25kYXJ5LXRpdGxlPkpvdXJuYWwgb2YgV2F0ZXIgUmVzb3VyY2Vz
-IFBsYW5uaW5nIGFuZCBNYW5hZ2VtZW50PC9zZWNvbmRhcnktdGl0bGU+PC90aXRsZXM+PHBlcmlv
-ZGljYWw+PGZ1bGwtdGl0bGU+Sm91cm5hbCBvZiBXYXRlciBSZXNvdXJjZXMgUGxhbm5pbmcgYW5k
-IE1hbmFnZW1lbnQ8L2Z1bGwtdGl0bGU+PC9wZXJpb2RpY2FsPjxwYWdlcz4wNDAyMDAxNzwvcGFn
-ZXM+PHZvbHVtZT4xNDY8L3ZvbHVtZT48bnVtYmVyPjU8L251bWJlcj48ZGF0ZXM+PHllYXI+MjAy
-MDwveWVhcj48L2RhdGVzPjx1cmxzPjxyZWxhdGVkLXVybHM+PHVybD5odHRwczovL2FzY2VsaWJy
-YXJ5Lm9yZy9kb2kvYWJzLzEwLjEwNjEvJTI4QVNDRSUyOVdSLjE5NDMtNTQ1Mi4wMDAxMTg0PC91
-cmw+PC9yZWxhdGVkLXVybHM+PC91cmxzPjxlbGVjdHJvbmljLXJlc291cmNlLW51bT5odHRwczov
-L2RvaS5vcmcvMTAuMTA2MS8oQVNDRSlXUi4xOTQzLTU0NTIuMDAwMTE4NDwvZWxlY3Ryb25pYy1y
-ZXNvdXJjZS1udW0+PC9yZWNvcmQ+PC9DaXRlPjxDaXRlPjxBdXRob3I+Um9zZW5iZXJnPC9BdXRo
-b3I+PFllYXI+MjAyNDwvWWVhcj48UmVjTnVtPjI4NDc8L1JlY051bT48cmVjb3JkPjxyZWMtbnVt
-YmVyPjI4NDc8L3JlYy1udW1iZXI+PGZvcmVpZ24ta2V5cz48a2V5IGFwcD0iRU4iIGRiLWlkPSJ4
-eHQ1dGE5cGQ5OTVkd2VzYXAwcGR6enAyd2VhejB3OXdlcmYiIHRpbWVzdGFtcD0iMTY0MjQ3MTQ2
-NyI+Mjg0Nzwva2V5PjwvZm9yZWlnbi1rZXlzPjxyZWYtdHlwZSBuYW1lPSJKb3VybmFsIEFydGlj
-bGUiPjE3PC9yZWYtdHlwZT48Y29udHJpYnV0b3JzPjxhdXRob3JzPjxhdXRob3I+RGF2aWQgRS4g
-Um9zZW5iZXJnPC9hdXRob3I+PC9hdXRob3JzPjwvY29udHJpYnV0b3JzPjx0aXRsZXM+PHRpdGxl
-Pkxlc3NvbnMgZnJvbSBpbW1lcnNpdmUgb25saW5lIGNvbGxhYm9yYXRpdmUgbW9kZWxpbmcgdG8g
-ZGlzY3VzcyBtb3JlIGFkYXB0aXZlIHJlc2Vydm9pciBvcGVyYXRpb25zPC90aXRsZT48c2Vjb25k
-YXJ5LXRpdGxlPkpvdXJuYWwgb2YgV2F0ZXIgUmVzb3VyY2VzIFBsYW5uaW5nIGFuZCBNYW5hZ2Vt
-ZW50PC9zZWNvbmRhcnktdGl0bGU+PC90aXRsZXM+PHBlcmlvZGljYWw+PGZ1bGwtdGl0bGU+Sm91
-cm5hbCBvZiBXYXRlciBSZXNvdXJjZXMgUGxhbm5pbmcgYW5kIE1hbmFnZW1lbnQ8L2Z1bGwtdGl0
-bGU+PC9wZXJpb2RpY2FsPjx2b2x1bWU+MTUwPC92b2x1bWU+PG51bWJlcj43PC9udW1iZXI+PGRh
-dGVzPjx5ZWFyPjIwMjQ8L3llYXI+PC9kYXRlcz48cHVibGlzaGVyPkFtZXJpY2FuIFNvY2lldHkg
-b2YgQ2l2aWwgRW5naW5lZXJzPC9wdWJsaXNoZXI+PHVybHM+PHJlbGF0ZWQtdXJscz48dXJsPmh0
-dHBzOi8vZG9pLm9yZy8xMC40MjExL2hzLmUwY2JlNTJhZDQ1MjRjMDdiYjViN2ZmOGMzNzNhMzQz
-PC91cmw+PC9yZWxhdGVkLXVybHM+PC91cmxzPjxlbGVjdHJvbmljLXJlc291cmNlLW51bT5odHRw
-czovL2RvaS5vcmcvMTAuMTA2MS9KV1JNRDUuV1JFTkctNTg5MzwvZWxlY3Ryb25pYy1yZXNvdXJj
-ZS1udW0+PC9yZWNvcmQ+PC9DaXRlPjwvRW5kTm90ZT5=
+UmVjTnVtPjI4ODg8L1JlY051bT48RGlzcGxheVRleHQ+KENvbGJ5IGV0IGFsLiwgMjAyNTsgSGVj
+aHQgZXQgYWwuLCAyMDIwOyBIZWd3b29kIGV0IGFsLiwgMjAyMjsgUm9zZW5iZXJnLCAyMDI0KTwv
+RGlzcGxheVRleHQ+PHJlY29yZD48cmVjLW51bWJlcj4yODg4PC9yZWMtbnVtYmVyPjxmb3JlaWdu
+LWtleXM+PGtleSBhcHA9IkVOIiBkYi1pZD0ieHh0NXRhOXBkOTk1ZHdlc2FwMHBkenpwMndlYXow
+dzl3ZXJmIiB0aW1lc3RhbXA9IjE2NTUzOTE0ODAiPjI4ODg8L2tleT48L2ZvcmVpZ24ta2V5cz48
+cmVmLXR5cGUgbmFtZT0iSm91cm5hbCBBcnRpY2xlIj4xNzwvcmVmLXR5cGU+PGNvbnRyaWJ1dG9y
+cz48YXV0aG9ycz48YXV0aG9yPkhlZ3dvb2QsIE1hcmdhcmV0PC9hdXRob3I+PGF1dGhvcj5MYW5n
+ZW5kb3JmLCBSeWFuIEUuPC9hdXRob3I+PGF1dGhvcj5CdXJnZXNzLCBNYXR0aGV3IEcuPC9hdXRo
+b3I+PC9hdXRob3JzPjwvY29udHJpYnV0b3JzPjx0aXRsZXM+PHRpdGxlPldoeSB3aW7igJN3aW5z
+IGFyZSByYXJlIGluIGNvbXBsZXggZW52aXJvbm1lbnRhbCBtYW5hZ2VtZW50PC90aXRsZT48c2Vj
+b25kYXJ5LXRpdGxlPk5hdHVyZSBTdXN0YWluYWJpbGl0eTwvc2Vjb25kYXJ5LXRpdGxlPjwvdGl0
+bGVzPjxwZXJpb2RpY2FsPjxmdWxsLXRpdGxlPk5hdHVyZSBTdXN0YWluYWJpbGl0eTwvZnVsbC10
+aXRsZT48L3BlcmlvZGljYWw+PGRhdGVzPjx5ZWFyPjIwMjI8L3llYXI+PHB1Yi1kYXRlcz48ZGF0
+ZT4yMDIyLzAzLzI0PC9kYXRlPjwvcHViLWRhdGVzPjwvZGF0ZXM+PGlzYm4+MjM5OC05NjI5PC9p
+c2JuPjx1cmxzPjxyZWxhdGVkLXVybHM+PHVybD5odHRwczovL2RvaS5vcmcvMTAuMTAzOC9zNDE4
+OTMtMDIyLTAwODY2LXo8L3VybD48L3JlbGF0ZWQtdXJscz48L3VybHM+PGVsZWN0cm9uaWMtcmVz
+b3VyY2UtbnVtPmh0dHBzOi8vZG9pLm9yZy8xMC4xMDM4L3M0MTg5My0wMjItMDA4NjYtejwvZWxl
+Y3Ryb25pYy1yZXNvdXJjZS1udW0+PC9yZWNvcmQ+PC9DaXRlPjxDaXRlPjxBdXRob3I+SGVjaHQ8
+L0F1dGhvcj48WWVhcj4yMDIwPC9ZZWFyPjxSZWNOdW0+MjcxNzwvUmVjTnVtPjxyZWNvcmQ+PHJl
+Yy1udW1iZXI+MjcxNzwvcmVjLW51bWJlcj48Zm9yZWlnbi1rZXlzPjxrZXkgYXBwPSJFTiIgZGIt
+aWQ9Inh4dDV0YTlwZDk5NWR3ZXNhcDBwZHp6cDJ3ZWF6MHc5d2VyZiIgdGltZXN0YW1wPSIxNTkx
+ODEwODk0Ij4yNzE3PC9rZXk+PC9mb3JlaWduLWtleXM+PHJlZi10eXBlIG5hbWU9IkpvdXJuYWwg
+QXJ0aWNsZSI+MTc8L3JlZi10eXBlPjxjb250cmlidXRvcnM+PGF1dGhvcnM+PGF1dGhvcj5Kb3J5
+IFMuIEhlY2h0PC9hdXRob3I+PGF1dGhvcj5SaWNoYXJkIE0uIFZvZ2VsPC9hdXRob3I+PGF1dGhv
+cj5SeWFuIEEuIE1jTWFuYW1heTwvYXV0aG9yPjxhdXRob3I+Q2hhcmxlcyBOLiBLcm9sbDwvYXV0
+aG9yPjxhdXRob3I+Si4gTWljaGFlbCBSZWVkPC9hdXRob3I+PC9hdXRob3JzPjwvY29udHJpYnV0
+b3JzPjx0aXRsZXM+PHRpdGxlPkRlY2lzaW9uIFRyZWVzIGZvciBJbmNvcnBvcmF0aW5nIEh5cG90
+aGVzaXMgVGVzdHMgb2YgSHlkcm9sb2dpYyBBbHRlcmF0aW9uIGludG8gSHlkcm9wb3dlciZhbXA7
+I3gyMDEzO0Vjb3N5c3RlbSBUcmFkZW9mZnM8L3RpdGxlPjxzZWNvbmRhcnktdGl0bGU+Sm91cm5h
+bCBvZiBXYXRlciBSZXNvdXJjZXMgUGxhbm5pbmcgYW5kIE1hbmFnZW1lbnQ8L3NlY29uZGFyeS10
+aXRsZT48L3RpdGxlcz48cGVyaW9kaWNhbD48ZnVsbC10aXRsZT5Kb3VybmFsIG9mIFdhdGVyIFJl
+c291cmNlcyBQbGFubmluZyBhbmQgTWFuYWdlbWVudDwvZnVsbC10aXRsZT48L3BlcmlvZGljYWw+
+PHBhZ2VzPjA0MDIwMDE3PC9wYWdlcz48dm9sdW1lPjE0Njwvdm9sdW1lPjxudW1iZXI+NTwvbnVt
+YmVyPjxkYXRlcz48eWVhcj4yMDIwPC95ZWFyPjwvZGF0ZXM+PHVybHM+PHJlbGF0ZWQtdXJscz48
+dXJsPmh0dHBzOi8vYXNjZWxpYnJhcnkub3JnL2RvaS9hYnMvMTAuMTA2MS8lMjhBU0NFJTI5V1Iu
+MTk0My01NDUyLjAwMDExODQ8L3VybD48L3JlbGF0ZWQtdXJscz48L3VybHM+PGVsZWN0cm9uaWMt
+cmVzb3VyY2UtbnVtPmh0dHBzOi8vZG9pLm9yZy8xMC4xMDYxLyhBU0NFKVdSLjE5NDMtNTQ1Mi4w
+MDAxMTg0PC9lbGVjdHJvbmljLXJlc291cmNlLW51bT48L3JlY29yZD48L0NpdGU+PENpdGU+PEF1
+dGhvcj5Sb3NlbmJlcmc8L0F1dGhvcj48WWVhcj4yMDI0PC9ZZWFyPjxSZWNOdW0+Mjg0NzwvUmVj
+TnVtPjxyZWNvcmQ+PHJlYy1udW1iZXI+Mjg0NzwvcmVjLW51bWJlcj48Zm9yZWlnbi1rZXlzPjxr
+ZXkgYXBwPSJFTiIgZGItaWQ9Inh4dDV0YTlwZDk5NWR3ZXNhcDBwZHp6cDJ3ZWF6MHc5d2VyZiIg
+dGltZXN0YW1wPSIxNjQyNDcxNDY3Ij4yODQ3PC9rZXk+PC9mb3JlaWduLWtleXM+PHJlZi10eXBl
+IG5hbWU9IkpvdXJuYWwgQXJ0aWNsZSI+MTc8L3JlZi10eXBlPjxjb250cmlidXRvcnM+PGF1dGhv
+cnM+PGF1dGhvcj5EYXZpZCBFLiBSb3NlbmJlcmc8L2F1dGhvcj48L2F1dGhvcnM+PC9jb250cmli
+dXRvcnM+PHRpdGxlcz48dGl0bGU+TGVzc29ucyBmcm9tIGltbWVyc2l2ZSBvbmxpbmUgY29sbGFi
+b3JhdGl2ZSBtb2RlbGluZyB0byBkaXNjdXNzIG1vcmUgYWRhcHRpdmUgcmVzZXJ2b2lyIG9wZXJh
+dGlvbnM8L3RpdGxlPjxzZWNvbmRhcnktdGl0bGU+Sm91cm5hbCBvZiBXYXRlciBSZXNvdXJjZXMg
+UGxhbm5pbmcgYW5kIE1hbmFnZW1lbnQ8L3NlY29uZGFyeS10aXRsZT48L3RpdGxlcz48cGVyaW9k
+aWNhbD48ZnVsbC10aXRsZT5Kb3VybmFsIG9mIFdhdGVyIFJlc291cmNlcyBQbGFubmluZyBhbmQg
+TWFuYWdlbWVudDwvZnVsbC10aXRsZT48L3BlcmlvZGljYWw+PHZvbHVtZT4xNTA8L3ZvbHVtZT48
+bnVtYmVyPjc8L251bWJlcj48ZGF0ZXM+PHllYXI+MjAyNDwveWVhcj48L2RhdGVzPjxwdWJsaXNo
+ZXI+QW1lcmljYW4gU29jaWV0eSBvZiBDaXZpbCBFbmdpbmVlcnM8L3B1Ymxpc2hlcj48dXJscz48
+cmVsYXRlZC11cmxzPjx1cmw+aHR0cHM6Ly9kb2kub3JnLzEwLjQyMTEvaHMuZTBjYmU1MmFkNDUy
+NGMwN2JiNWI3ZmY4YzM3M2EzNDM8L3VybD48L3JlbGF0ZWQtdXJscz48L3VybHM+PGVsZWN0cm9u
+aWMtcmVzb3VyY2UtbnVtPmh0dHBzOi8vZG9pLm9yZy8xMC4xMDYxL0pXUk1ENS5XUkVORy01ODkz
+PC9lbGVjdHJvbmljLXJlc291cmNlLW51bT48L3JlY29yZD48L0NpdGU+PENpdGU+PEF1dGhvcj5D
+b2xieTwvQXV0aG9yPjxZZWFyPjIwMjU8L1llYXI+PFJlY051bT4zMTA5PC9SZWNOdW0+PHJlY29y
+ZD48cmVjLW51bWJlcj4zMTA5PC9yZWMtbnVtYmVyPjxmb3JlaWduLWtleXM+PGtleSBhcHA9IkVO
+IiBkYi1pZD0ieHh0NXRhOXBkOTk1ZHdlc2FwMHBkenpwMndlYXowdzl3ZXJmIiB0aW1lc3RhbXA9
+IjE3NzY0NjY1MzIiPjMxMDk8L2tleT48L2ZvcmVpZ24ta2V5cz48cmVmLXR5cGUgbmFtZT0iSm91
+cm5hbCBBcnRpY2xlIj4xNzwvcmVmLXR5cGU+PGNvbnRyaWJ1dG9ycz48YXV0aG9ycz48YXV0aG9y
+PkNvbGJ5LCBCb25uaWU8L2F1dGhvcj48YXV0aG9yPkhhbnNlbiwgS3Jpc3RpYW5hPC9hdXRob3I+
+PGF1dGhvcj5Tb3JlbnNlbiwgS2F0aHJ5bjwvYXV0aG9yPjwvYXV0aG9ycz48L2NvbnRyaWJ1dG9y
+cz48dGl0bGVzPjx0aXRsZT5Qb2xpY3kgTm9vayDigJQgUG9saWN5IE5vdGU6IFRvdWdoIFRyYWRl
+b2ZmcyBpbiB0aGUgQ29sb3JhZG8gUml2ZXIgQmFzaW48L3RpdGxlPjxzZWNvbmRhcnktdGl0bGU+
+V2F0ZXIgRWNvbm9taWNzIGFuZCBQb2xpY3k8L3NlY29uZGFyeS10aXRsZT48L3RpdGxlcz48cGVy
+aW9kaWNhbD48ZnVsbC10aXRsZT5XYXRlciBFY29ub21pY3MgYW5kIFBvbGljeTwvZnVsbC10aXRs
+ZT48L3BlcmlvZGljYWw+PHBhZ2VzPjI0NzEwMDI8L3BhZ2VzPjx2b2x1bWU+MTE8L3ZvbHVtZT48
+bnVtYmVyPjA0PC9udW1iZXI+PGtleXdvcmRzPjxrZXl3b3JkPkNvbG9yYWRvIFJpdmVyIEJhc2lu
+LHdhdGVyIHNob3J0YWdlLHdhdGVyIGNvbnNlcnZhdGlvbix3YXRlciBlcXVpdHksdHJpYmFsIHdh
+dGVyPC9rZXl3b3JkPjwva2V5d29yZHM+PGRhdGVzPjx5ZWFyPjIwMjU8L3llYXI+PC9kYXRlcz48
+dXJscz48cmVsYXRlZC11cmxzPjx1cmw+aHR0cHM6Ly93d3cud29ybGRzY2llbnRpZmljLmNvbS9k
+b2kvYWJzLzEwLjExNDIvUzIzODI2MjRYMjQ3MTAwMjQ8L3VybD48L3JlbGF0ZWQtdXJscz48L3Vy
+bHM+PGVsZWN0cm9uaWMtcmVzb3VyY2UtbnVtPjEwLjExNDIvczIzODI2MjR4MjQ3MTAwMjQ8L2Vs
+ZWN0cm9uaWMtcmVzb3VyY2UtbnVtPjwvcmVjb3JkPjwvQ2l0ZT48L0VuZE5vdGU+AG==
 </w:fldData>
         </w:fldChar>
       </w:r>
@@ -1014,62 +1002,81 @@
       <w:r>
         <w:fldChar w:fldCharType="begin">
           <w:fldData xml:space="preserve">PEVuZE5vdGU+PENpdGU+PEF1dGhvcj5IZWd3b29kPC9BdXRob3I+PFllYXI+MjAyMjwvWWVhcj48
-UmVjTnVtPjI4ODg8L1JlY051bT48RGlzcGxheVRleHQ+KEhlY2h0IGV0IGFsLiwgMjAyMDsgSGVn
-d29vZCBldCBhbC4sIDIwMjI7IFJvc2VuYmVyZywgMjAyNCk8L0Rpc3BsYXlUZXh0PjxyZWNvcmQ+
-PHJlYy1udW1iZXI+Mjg4ODwvcmVjLW51bWJlcj48Zm9yZWlnbi1rZXlzPjxrZXkgYXBwPSJFTiIg
-ZGItaWQ9Inh4dDV0YTlwZDk5NWR3ZXNhcDBwZHp6cDJ3ZWF6MHc5d2VyZiIgdGltZXN0YW1wPSIx
-NjU1MzkxNDgwIj4yODg4PC9rZXk+PC9mb3JlaWduLWtleXM+PHJlZi10eXBlIG5hbWU9IkpvdXJu
-YWwgQXJ0aWNsZSI+MTc8L3JlZi10eXBlPjxjb250cmlidXRvcnM+PGF1dGhvcnM+PGF1dGhvcj5I
-ZWd3b29kLCBNYXJnYXJldDwvYXV0aG9yPjxhdXRob3I+TGFuZ2VuZG9yZiwgUnlhbiBFLjwvYXV0
-aG9yPjxhdXRob3I+QnVyZ2VzcywgTWF0dGhldyBHLjwvYXV0aG9yPjwvYXV0aG9ycz48L2NvbnRy
-aWJ1dG9ycz48dGl0bGVzPjx0aXRsZT5XaHkgd2lu4oCTd2lucyBhcmUgcmFyZSBpbiBjb21wbGV4
-IGVudmlyb25tZW50YWwgbWFuYWdlbWVudDwvdGl0bGU+PHNlY29uZGFyeS10aXRsZT5OYXR1cmUg
-U3VzdGFpbmFiaWxpdHk8L3NlY29uZGFyeS10aXRsZT48L3RpdGxlcz48cGVyaW9kaWNhbD48ZnVs
-bC10aXRsZT5OYXR1cmUgU3VzdGFpbmFiaWxpdHk8L2Z1bGwtdGl0bGU+PC9wZXJpb2RpY2FsPjxk
-YXRlcz48eWVhcj4yMDIyPC95ZWFyPjxwdWItZGF0ZXM+PGRhdGU+MjAyMi8wMy8yNDwvZGF0ZT48
-L3B1Yi1kYXRlcz48L2RhdGVzPjxpc2JuPjIzOTgtOTYyOTwvaXNibj48dXJscz48cmVsYXRlZC11
-cmxzPjx1cmw+aHR0cHM6Ly9kb2kub3JnLzEwLjEwMzgvczQxODkzLTAyMi0wMDg2Ni16PC91cmw+
-PC9yZWxhdGVkLXVybHM+PC91cmxzPjxlbGVjdHJvbmljLXJlc291cmNlLW51bT5odHRwczovL2Rv
-aS5vcmcvMTAuMTAzOC9zNDE4OTMtMDIyLTAwODY2LXo8L2VsZWN0cm9uaWMtcmVzb3VyY2UtbnVt
-PjwvcmVjb3JkPjwvQ2l0ZT48Q2l0ZT48QXV0aG9yPkhlY2h0PC9BdXRob3I+PFllYXI+MjAyMDwv
-WWVhcj48UmVjTnVtPjI3MTc8L1JlY051bT48cmVjb3JkPjxyZWMtbnVtYmVyPjI3MTc8L3JlYy1u
-dW1iZXI+PGZvcmVpZ24ta2V5cz48a2V5IGFwcD0iRU4iIGRiLWlkPSJ4eHQ1dGE5cGQ5OTVkd2Vz
-YXAwcGR6enAyd2VhejB3OXdlcmYiIHRpbWVzdGFtcD0iMTU5MTgxMDg5NCI+MjcxNzwva2V5Pjwv
-Zm9yZWlnbi1rZXlzPjxyZWYtdHlwZSBuYW1lPSJKb3VybmFsIEFydGljbGUiPjE3PC9yZWYtdHlw
-ZT48Y29udHJpYnV0b3JzPjxhdXRob3JzPjxhdXRob3I+Sm9yeSBTLiBIZWNodDwvYXV0aG9yPjxh
-dXRob3I+UmljaGFyZCBNLiBWb2dlbDwvYXV0aG9yPjxhdXRob3I+UnlhbiBBLiBNY01hbmFtYXk8
-L2F1dGhvcj48YXV0aG9yPkNoYXJsZXMgTi4gS3JvbGw8L2F1dGhvcj48YXV0aG9yPkouIE1pY2hh
-ZWwgUmVlZDwvYXV0aG9yPjwvYXV0aG9ycz48L2NvbnRyaWJ1dG9ycz48dGl0bGVzPjx0aXRsZT5E
-ZWNpc2lvbiBUcmVlcyBmb3IgSW5jb3Jwb3JhdGluZyBIeXBvdGhlc2lzIFRlc3RzIG9mIEh5ZHJv
-bG9naWMgQWx0ZXJhdGlvbiBpbnRvIEh5ZHJvcG93ZXImYW1wOyN4MjAxMztFY29zeXN0ZW0gVHJh
-ZGVvZmZzPC90aXRsZT48c2Vjb25kYXJ5LXRpdGxlPkpvdXJuYWwgb2YgV2F0ZXIgUmVzb3VyY2Vz
-IFBsYW5uaW5nIGFuZCBNYW5hZ2VtZW50PC9zZWNvbmRhcnktdGl0bGU+PC90aXRsZXM+PHBlcmlv
-ZGljYWw+PGZ1bGwtdGl0bGU+Sm91cm5hbCBvZiBXYXRlciBSZXNvdXJjZXMgUGxhbm5pbmcgYW5k
-IE1hbmFnZW1lbnQ8L2Z1bGwtdGl0bGU+PC9wZXJpb2RpY2FsPjxwYWdlcz4wNDAyMDAxNzwvcGFn
-ZXM+PHZvbHVtZT4xNDY8L3ZvbHVtZT48bnVtYmVyPjU8L251bWJlcj48ZGF0ZXM+PHllYXI+MjAy
-MDwveWVhcj48L2RhdGVzPjx1cmxzPjxyZWxhdGVkLXVybHM+PHVybD5odHRwczovL2FzY2VsaWJy
-YXJ5Lm9yZy9kb2kvYWJzLzEwLjEwNjEvJTI4QVNDRSUyOVdSLjE5NDMtNTQ1Mi4wMDAxMTg0PC91
-cmw+PC9yZWxhdGVkLXVybHM+PC91cmxzPjxlbGVjdHJvbmljLXJlc291cmNlLW51bT5odHRwczov
-L2RvaS5vcmcvMTAuMTA2MS8oQVNDRSlXUi4xOTQzLTU0NTIuMDAwMTE4NDwvZWxlY3Ryb25pYy1y
-ZXNvdXJjZS1udW0+PC9yZWNvcmQ+PC9DaXRlPjxDaXRlPjxBdXRob3I+Um9zZW5iZXJnPC9BdXRo
-b3I+PFllYXI+MjAyNDwvWWVhcj48UmVjTnVtPjI4NDc8L1JlY051bT48cmVjb3JkPjxyZWMtbnVt
-YmVyPjI4NDc8L3JlYy1udW1iZXI+PGZvcmVpZ24ta2V5cz48a2V5IGFwcD0iRU4iIGRiLWlkPSJ4
-eHQ1dGE5cGQ5OTVkd2VzYXAwcGR6enAyd2VhejB3OXdlcmYiIHRpbWVzdGFtcD0iMTY0MjQ3MTQ2
-NyI+Mjg0Nzwva2V5PjwvZm9yZWlnbi1rZXlzPjxyZWYtdHlwZSBuYW1lPSJKb3VybmFsIEFydGlj
-bGUiPjE3PC9yZWYtdHlwZT48Y29udHJpYnV0b3JzPjxhdXRob3JzPjxhdXRob3I+RGF2aWQgRS4g
-Um9zZW5iZXJnPC9hdXRob3I+PC9hdXRob3JzPjwvY29udHJpYnV0b3JzPjx0aXRsZXM+PHRpdGxl
-Pkxlc3NvbnMgZnJvbSBpbW1lcnNpdmUgb25saW5lIGNvbGxhYm9yYXRpdmUgbW9kZWxpbmcgdG8g
-ZGlzY3VzcyBtb3JlIGFkYXB0aXZlIHJlc2Vydm9pciBvcGVyYXRpb25zPC90aXRsZT48c2Vjb25k
-YXJ5LXRpdGxlPkpvdXJuYWwgb2YgV2F0ZXIgUmVzb3VyY2VzIFBsYW5uaW5nIGFuZCBNYW5hZ2Vt
-ZW50PC9zZWNvbmRhcnktdGl0bGU+PC90aXRsZXM+PHBlcmlvZGljYWw+PGZ1bGwtdGl0bGU+Sm91
-cm5hbCBvZiBXYXRlciBSZXNvdXJjZXMgUGxhbm5pbmcgYW5kIE1hbmFnZW1lbnQ8L2Z1bGwtdGl0
-bGU+PC9wZXJpb2RpY2FsPjx2b2x1bWU+MTUwPC92b2x1bWU+PG51bWJlcj43PC9udW1iZXI+PGRh
-dGVzPjx5ZWFyPjIwMjQ8L3llYXI+PC9kYXRlcz48cHVibGlzaGVyPkFtZXJpY2FuIFNvY2lldHkg
-b2YgQ2l2aWwgRW5naW5lZXJzPC9wdWJsaXNoZXI+PHVybHM+PHJlbGF0ZWQtdXJscz48dXJsPmh0
-dHBzOi8vZG9pLm9yZy8xMC40MjExL2hzLmUwY2JlNTJhZDQ1MjRjMDdiYjViN2ZmOGMzNzNhMzQz
-PC91cmw+PC9yZWxhdGVkLXVybHM+PC91cmxzPjxlbGVjdHJvbmljLXJlc291cmNlLW51bT5odHRw
-czovL2RvaS5vcmcvMTAuMTA2MS9KV1JNRDUuV1JFTkctNTg5MzwvZWxlY3Ryb25pYy1yZXNvdXJj
-ZS1udW0+PC9yZWNvcmQ+PC9DaXRlPjwvRW5kTm90ZT5=
+UmVjTnVtPjI4ODg8L1JlY051bT48RGlzcGxheVRleHQ+KENvbGJ5IGV0IGFsLiwgMjAyNTsgSGVj
+aHQgZXQgYWwuLCAyMDIwOyBIZWd3b29kIGV0IGFsLiwgMjAyMjsgUm9zZW5iZXJnLCAyMDI0KTwv
+RGlzcGxheVRleHQ+PHJlY29yZD48cmVjLW51bWJlcj4yODg4PC9yZWMtbnVtYmVyPjxmb3JlaWdu
+LWtleXM+PGtleSBhcHA9IkVOIiBkYi1pZD0ieHh0NXRhOXBkOTk1ZHdlc2FwMHBkenpwMndlYXow
+dzl3ZXJmIiB0aW1lc3RhbXA9IjE2NTUzOTE0ODAiPjI4ODg8L2tleT48L2ZvcmVpZ24ta2V5cz48
+cmVmLXR5cGUgbmFtZT0iSm91cm5hbCBBcnRpY2xlIj4xNzwvcmVmLXR5cGU+PGNvbnRyaWJ1dG9y
+cz48YXV0aG9ycz48YXV0aG9yPkhlZ3dvb2QsIE1hcmdhcmV0PC9hdXRob3I+PGF1dGhvcj5MYW5n
+ZW5kb3JmLCBSeWFuIEUuPC9hdXRob3I+PGF1dGhvcj5CdXJnZXNzLCBNYXR0aGV3IEcuPC9hdXRo
+b3I+PC9hdXRob3JzPjwvY29udHJpYnV0b3JzPjx0aXRsZXM+PHRpdGxlPldoeSB3aW7igJN3aW5z
+IGFyZSByYXJlIGluIGNvbXBsZXggZW52aXJvbm1lbnRhbCBtYW5hZ2VtZW50PC90aXRsZT48c2Vj
+b25kYXJ5LXRpdGxlPk5hdHVyZSBTdXN0YWluYWJpbGl0eTwvc2Vjb25kYXJ5LXRpdGxlPjwvdGl0
+bGVzPjxwZXJpb2RpY2FsPjxmdWxsLXRpdGxlPk5hdHVyZSBTdXN0YWluYWJpbGl0eTwvZnVsbC10
+aXRsZT48L3BlcmlvZGljYWw+PGRhdGVzPjx5ZWFyPjIwMjI8L3llYXI+PHB1Yi1kYXRlcz48ZGF0
+ZT4yMDIyLzAzLzI0PC9kYXRlPjwvcHViLWRhdGVzPjwvZGF0ZXM+PGlzYm4+MjM5OC05NjI5PC9p
+c2JuPjx1cmxzPjxyZWxhdGVkLXVybHM+PHVybD5odHRwczovL2RvaS5vcmcvMTAuMTAzOC9zNDE4
+OTMtMDIyLTAwODY2LXo8L3VybD48L3JlbGF0ZWQtdXJscz48L3VybHM+PGVsZWN0cm9uaWMtcmVz
+b3VyY2UtbnVtPmh0dHBzOi8vZG9pLm9yZy8xMC4xMDM4L3M0MTg5My0wMjItMDA4NjYtejwvZWxl
+Y3Ryb25pYy1yZXNvdXJjZS1udW0+PC9yZWNvcmQ+PC9DaXRlPjxDaXRlPjxBdXRob3I+SGVjaHQ8
+L0F1dGhvcj48WWVhcj4yMDIwPC9ZZWFyPjxSZWNOdW0+MjcxNzwvUmVjTnVtPjxyZWNvcmQ+PHJl
+Yy1udW1iZXI+MjcxNzwvcmVjLW51bWJlcj48Zm9yZWlnbi1rZXlzPjxrZXkgYXBwPSJFTiIgZGIt
+aWQ9Inh4dDV0YTlwZDk5NWR3ZXNhcDBwZHp6cDJ3ZWF6MHc5d2VyZiIgdGltZXN0YW1wPSIxNTkx
+ODEwODk0Ij4yNzE3PC9rZXk+PC9mb3JlaWduLWtleXM+PHJlZi10eXBlIG5hbWU9IkpvdXJuYWwg
+QXJ0aWNsZSI+MTc8L3JlZi10eXBlPjxjb250cmlidXRvcnM+PGF1dGhvcnM+PGF1dGhvcj5Kb3J5
+IFMuIEhlY2h0PC9hdXRob3I+PGF1dGhvcj5SaWNoYXJkIE0uIFZvZ2VsPC9hdXRob3I+PGF1dGhv
+cj5SeWFuIEEuIE1jTWFuYW1heTwvYXV0aG9yPjxhdXRob3I+Q2hhcmxlcyBOLiBLcm9sbDwvYXV0
+aG9yPjxhdXRob3I+Si4gTWljaGFlbCBSZWVkPC9hdXRob3I+PC9hdXRob3JzPjwvY29udHJpYnV0
+b3JzPjx0aXRsZXM+PHRpdGxlPkRlY2lzaW9uIFRyZWVzIGZvciBJbmNvcnBvcmF0aW5nIEh5cG90
+aGVzaXMgVGVzdHMgb2YgSHlkcm9sb2dpYyBBbHRlcmF0aW9uIGludG8gSHlkcm9wb3dlciZhbXA7
+I3gyMDEzO0Vjb3N5c3RlbSBUcmFkZW9mZnM8L3RpdGxlPjxzZWNvbmRhcnktdGl0bGU+Sm91cm5h
+bCBvZiBXYXRlciBSZXNvdXJjZXMgUGxhbm5pbmcgYW5kIE1hbmFnZW1lbnQ8L3NlY29uZGFyeS10
+aXRsZT48L3RpdGxlcz48cGVyaW9kaWNhbD48ZnVsbC10aXRsZT5Kb3VybmFsIG9mIFdhdGVyIFJl
+c291cmNlcyBQbGFubmluZyBhbmQgTWFuYWdlbWVudDwvZnVsbC10aXRsZT48L3BlcmlvZGljYWw+
+PHBhZ2VzPjA0MDIwMDE3PC9wYWdlcz48dm9sdW1lPjE0Njwvdm9sdW1lPjxudW1iZXI+NTwvbnVt
+YmVyPjxkYXRlcz48eWVhcj4yMDIwPC95ZWFyPjwvZGF0ZXM+PHVybHM+PHJlbGF0ZWQtdXJscz48
+dXJsPmh0dHBzOi8vYXNjZWxpYnJhcnkub3JnL2RvaS9hYnMvMTAuMTA2MS8lMjhBU0NFJTI5V1Iu
+MTk0My01NDUyLjAwMDExODQ8L3VybD48L3JlbGF0ZWQtdXJscz48L3VybHM+PGVsZWN0cm9uaWMt
+cmVzb3VyY2UtbnVtPmh0dHBzOi8vZG9pLm9yZy8xMC4xMDYxLyhBU0NFKVdSLjE5NDMtNTQ1Mi4w
+MDAxMTg0PC9lbGVjdHJvbmljLXJlc291cmNlLW51bT48L3JlY29yZD48L0NpdGU+PENpdGU+PEF1
+dGhvcj5Sb3NlbmJlcmc8L0F1dGhvcj48WWVhcj4yMDI0PC9ZZWFyPjxSZWNOdW0+Mjg0NzwvUmVj
+TnVtPjxyZWNvcmQ+PHJlYy1udW1iZXI+Mjg0NzwvcmVjLW51bWJlcj48Zm9yZWlnbi1rZXlzPjxr
+ZXkgYXBwPSJFTiIgZGItaWQ9Inh4dDV0YTlwZDk5NWR3ZXNhcDBwZHp6cDJ3ZWF6MHc5d2VyZiIg
+dGltZXN0YW1wPSIxNjQyNDcxNDY3Ij4yODQ3PC9rZXk+PC9mb3JlaWduLWtleXM+PHJlZi10eXBl
+IG5hbWU9IkpvdXJuYWwgQXJ0aWNsZSI+MTc8L3JlZi10eXBlPjxjb250cmlidXRvcnM+PGF1dGhv
+cnM+PGF1dGhvcj5EYXZpZCBFLiBSb3NlbmJlcmc8L2F1dGhvcj48L2F1dGhvcnM+PC9jb250cmli
+dXRvcnM+PHRpdGxlcz48dGl0bGU+TGVzc29ucyBmcm9tIGltbWVyc2l2ZSBvbmxpbmUgY29sbGFi
+b3JhdGl2ZSBtb2RlbGluZyB0byBkaXNjdXNzIG1vcmUgYWRhcHRpdmUgcmVzZXJ2b2lyIG9wZXJh
+dGlvbnM8L3RpdGxlPjxzZWNvbmRhcnktdGl0bGU+Sm91cm5hbCBvZiBXYXRlciBSZXNvdXJjZXMg
+UGxhbm5pbmcgYW5kIE1hbmFnZW1lbnQ8L3NlY29uZGFyeS10aXRsZT48L3RpdGxlcz48cGVyaW9k
+aWNhbD48ZnVsbC10aXRsZT5Kb3VybmFsIG9mIFdhdGVyIFJlc291cmNlcyBQbGFubmluZyBhbmQg
+TWFuYWdlbWVudDwvZnVsbC10aXRsZT48L3BlcmlvZGljYWw+PHZvbHVtZT4xNTA8L3ZvbHVtZT48
+bnVtYmVyPjc8L251bWJlcj48ZGF0ZXM+PHllYXI+MjAyNDwveWVhcj48L2RhdGVzPjxwdWJsaXNo
+ZXI+QW1lcmljYW4gU29jaWV0eSBvZiBDaXZpbCBFbmdpbmVlcnM8L3B1Ymxpc2hlcj48dXJscz48
+cmVsYXRlZC11cmxzPjx1cmw+aHR0cHM6Ly9kb2kub3JnLzEwLjQyMTEvaHMuZTBjYmU1MmFkNDUy
+NGMwN2JiNWI3ZmY4YzM3M2EzNDM8L3VybD48L3JlbGF0ZWQtdXJscz48L3VybHM+PGVsZWN0cm9u
+aWMtcmVzb3VyY2UtbnVtPmh0dHBzOi8vZG9pLm9yZy8xMC4xMDYxL0pXUk1ENS5XUkVORy01ODkz
+PC9lbGVjdHJvbmljLXJlc291cmNlLW51bT48L3JlY29yZD48L0NpdGU+PENpdGU+PEF1dGhvcj5D
+b2xieTwvQXV0aG9yPjxZZWFyPjIwMjU8L1llYXI+PFJlY051bT4zMTA5PC9SZWNOdW0+PHJlY29y
+ZD48cmVjLW51bWJlcj4zMTA5PC9yZWMtbnVtYmVyPjxmb3JlaWduLWtleXM+PGtleSBhcHA9IkVO
+IiBkYi1pZD0ieHh0NXRhOXBkOTk1ZHdlc2FwMHBkenpwMndlYXowdzl3ZXJmIiB0aW1lc3RhbXA9
+IjE3NzY0NjY1MzIiPjMxMDk8L2tleT48L2ZvcmVpZ24ta2V5cz48cmVmLXR5cGUgbmFtZT0iSm91
+cm5hbCBBcnRpY2xlIj4xNzwvcmVmLXR5cGU+PGNvbnRyaWJ1dG9ycz48YXV0aG9ycz48YXV0aG9y
+PkNvbGJ5LCBCb25uaWU8L2F1dGhvcj48YXV0aG9yPkhhbnNlbiwgS3Jpc3RpYW5hPC9hdXRob3I+
+PGF1dGhvcj5Tb3JlbnNlbiwgS2F0aHJ5bjwvYXV0aG9yPjwvYXV0aG9ycz48L2NvbnRyaWJ1dG9y
+cz48dGl0bGVzPjx0aXRsZT5Qb2xpY3kgTm9vayDigJQgUG9saWN5IE5vdGU6IFRvdWdoIFRyYWRl
+b2ZmcyBpbiB0aGUgQ29sb3JhZG8gUml2ZXIgQmFzaW48L3RpdGxlPjxzZWNvbmRhcnktdGl0bGU+
+V2F0ZXIgRWNvbm9taWNzIGFuZCBQb2xpY3k8L3NlY29uZGFyeS10aXRsZT48L3RpdGxlcz48cGVy
+aW9kaWNhbD48ZnVsbC10aXRsZT5XYXRlciBFY29ub21pY3MgYW5kIFBvbGljeTwvZnVsbC10aXRs
+ZT48L3BlcmlvZGljYWw+PHBhZ2VzPjI0NzEwMDI8L3BhZ2VzPjx2b2x1bWU+MTE8L3ZvbHVtZT48
+bnVtYmVyPjA0PC9udW1iZXI+PGtleXdvcmRzPjxrZXl3b3JkPkNvbG9yYWRvIFJpdmVyIEJhc2lu
+LHdhdGVyIHNob3J0YWdlLHdhdGVyIGNvbnNlcnZhdGlvbix3YXRlciBlcXVpdHksdHJpYmFsIHdh
+dGVyPC9rZXl3b3JkPjwva2V5d29yZHM+PGRhdGVzPjx5ZWFyPjIwMjU8L3llYXI+PC9kYXRlcz48
+dXJscz48cmVsYXRlZC11cmxzPjx1cmw+aHR0cHM6Ly93d3cud29ybGRzY2llbnRpZmljLmNvbS9k
+b2kvYWJzLzEwLjExNDIvUzIzODI2MjRYMjQ3MTAwMjQ8L3VybD48L3JlbGF0ZWQtdXJscz48L3Vy
+bHM+PGVsZWN0cm9uaWMtcmVzb3VyY2UtbnVtPjEwLjExNDIvczIzODI2MjR4MjQ3MTAwMjQ8L2Vs
+ZWN0cm9uaWMtcmVzb3VyY2UtbnVtPjwvcmVjb3JkPjwvQ2l0ZT48L0VuZE5vdGU+AG==
 </w:fldData>
         </w:fldChar>
       </w:r>
@@ -1086,7 +1093,7 @@
         <w:rPr>
           <w:noProof/>
         </w:rPr>
-        <w:t>(Hecht et al., 2020; Hegwood et al., 2022; Rosenberg, 2024)</w:t>
+        <w:t>(Colby et al., 2025; Hecht et al., 2020; Hegwood et al., 2022; Rosenberg, 2024)</w:t>
       </w:r>
       <w:r>
         <w:fldChar w:fldCharType="end"/>
@@ -1096,6 +1103,12 @@
       </w:r>
       <w:r>
         <w:t xml:space="preserve"> </w:t>
+      </w:r>
+      <w:r>
+        <w:t xml:space="preserve">There is need to protect reservoirs while reduce user </w:t>
+      </w:r>
+      <w:r>
+        <w:t>conflicts.</w:t>
       </w:r>
     </w:p>
     <w:p>
@@ -1170,13 +1183,43 @@
         <w:t xml:space="preserve">and conserved water </w:t>
       </w:r>
       <w:r>
-        <w:t xml:space="preserve">Intentionally Created Surplus (ICS) or “assigned water”. </w:t>
+        <w:t>Intentionally Created Surplus (ICS) or “assigned water”</w:t>
+      </w:r>
+      <w:r>
+        <w:t xml:space="preserve"> </w:t>
+      </w:r>
+      <w:r>
+        <w:fldChar w:fldCharType="begin"/>
+      </w:r>
+      <w:r>
+        <w:instrText xml:space="preserve"> ADDIN EN.CITE &lt;EndNote&gt;&lt;Cite&gt;&lt;Author&gt;Colby&lt;/Author&gt;&lt;Year&gt;2025&lt;/Year&gt;&lt;RecNum&gt;3109&lt;/RecNum&gt;&lt;DisplayText&gt;(Colby et al., 2025)&lt;/DisplayText&gt;&lt;record&gt;&lt;rec-number&gt;3109&lt;/rec-number&gt;&lt;foreign-keys&gt;&lt;key app="EN" db-id="xxt5ta9pd995dwesap0pdzzp2weaz0w9werf" timestamp="1776466532"&gt;3109&lt;/key&gt;&lt;/foreign-keys&gt;&lt;ref-type name="Journal Article"&gt;17&lt;/ref-type&gt;&lt;contributors&gt;&lt;authors&gt;&lt;author&gt;Colby, Bonnie&lt;/author&gt;&lt;author&gt;Hansen, Kristiana&lt;/author&gt;&lt;author&gt;Sorensen, Kathryn&lt;/author&gt;&lt;/authors&gt;&lt;/contributors&gt;&lt;titles&gt;&lt;title&gt;Policy Nook — Policy Note: Tough Tradeoffs in the Colorado River Basin&lt;/title&gt;&lt;secondary-title&gt;Water Economics and Policy&lt;/secondary-title&gt;&lt;/titles&gt;&lt;periodical&gt;&lt;full-title&gt;Water Economics and Policy&lt;/full-title&gt;&lt;/periodical&gt;&lt;pages&gt;2471002&lt;/pages&gt;&lt;volume&gt;11&lt;/volume&gt;&lt;number&gt;04&lt;/number&gt;&lt;keywords&gt;&lt;keyword&gt;Colorado River Basin,water shortage,water conservation,water equity,tribal water&lt;/keyword&gt;&lt;/keywords&gt;&lt;dates&gt;&lt;year&gt;2025&lt;/year&gt;&lt;/dates&gt;&lt;urls&gt;&lt;related-urls&gt;&lt;url&gt;https://www.worldscientific.com/doi/abs/10.1142/S2382624X24710024&lt;/url&gt;&lt;/related-urls&gt;&lt;/urls&gt;&lt;electronic-resource-num&gt;10.1142/s2382624x24710024&lt;/electronic-resource-num&gt;&lt;/record&gt;&lt;/Cite&gt;&lt;/EndNote&gt;</w:instrText>
+      </w:r>
+      <w:r>
+        <w:fldChar w:fldCharType="separate"/>
+      </w:r>
+      <w:r>
+        <w:rPr>
+          <w:noProof/>
+        </w:rPr>
+        <w:t>(Colby et al., 2025)</w:t>
+      </w:r>
+      <w:r>
+        <w:fldChar w:fldCharType="end"/>
+      </w:r>
+      <w:r>
+        <w:t xml:space="preserve">. </w:t>
       </w:r>
       <w:r>
         <w:t xml:space="preserve">The Interim Guidelines also created a second </w:t>
       </w:r>
       <w:r>
-        <w:t xml:space="preserve">mandatory water use reduction program </w:t>
+        <w:t xml:space="preserve">mandatory water </w:t>
+      </w:r>
+      <w:r>
+        <w:t>shortage</w:t>
+      </w:r>
+      <w:r>
+        <w:t xml:space="preserve"> program </w:t>
       </w:r>
       <w:r>
         <w:t>that requires</w:t>
@@ -1369,7 +1412,13 @@
         <w:fldChar w:fldCharType="end"/>
       </w:r>
       <w:r>
-        <w:t xml:space="preserve"> wrote that the program was the “most imaginative” part of the 2007 Interim Guidelines and that the program will increase water supply or make supply more productive. Agencies that participate in the program are no longer subject to "use it or lose it" common to laws that do not incentivize conservation and continue to govern water use in many western states. </w:t>
+        <w:t xml:space="preserve"> wrote that the program was the “most imaginative” part of the 2007 Interim Guidelines and that the program will increase water supply or make supply more productive. Agencies that participate in the program are no longer subject to "use it or lose it" laws </w:t>
+      </w:r>
+      <w:r>
+        <w:t>that</w:t>
+      </w:r>
+      <w:r>
+        <w:t xml:space="preserve"> govern water use in many western states. </w:t>
       </w:r>
       <w:r>
         <w:t>Without the program, i</w:t>
@@ -1488,17 +1537,44 @@
         <w:fldChar w:fldCharType="end"/>
       </w:r>
       <w:r>
-        <w:t xml:space="preserve"> suggested to assign up to 50% of conserved water to remain in </w:t>
-      </w:r>
-      <w:r>
+        <w:t xml:space="preserve"> suggested to assign up to 50% of conserved water to remain in Lake Mead as system water to create a balance of individual and collective resiliency. </w:t>
+      </w:r>
+      <w:r>
+        <w:fldChar w:fldCharType="begin"/>
+      </w:r>
+      <w:r>
+        <w:instrText xml:space="preserve"> ADDIN EN.CITE &lt;EndNote&gt;&lt;Cite AuthorYear="1"&gt;&lt;Author&gt;Huizar&lt;/Author&gt;&lt;Year&gt;2023&lt;/Year&gt;&lt;RecNum&gt;3110&lt;/RecNum&gt;&lt;DisplayText&gt;Huizar et al. (2023)&lt;/DisplayText&gt;&lt;record&gt;&lt;rec-number&gt;3110&lt;/rec-number&gt;&lt;foreign-keys&gt;&lt;key app="EN" db-id="xxt5ta9pd995dwesap0pdzzp2weaz0w9werf" timestamp="1776715189"&gt;3110&lt;/key&gt;&lt;/foreign-keys&gt;&lt;ref-type name="Journal Article"&gt;17&lt;/ref-type&gt;&lt;contributors&gt;&lt;authors&gt;&lt;author&gt;Luis Huizar&lt;/author&gt;&lt;author&gt;Sarai Díaz&lt;/author&gt;&lt;author&gt;Kevin Lansey&lt;/author&gt;&lt;author&gt;Robert Arnold&lt;/author&gt;&lt;/authors&gt;&lt;/contributors&gt;&lt;titles&gt;&lt;title&gt;Water Supply in the Lower Colorado River Basin: Effectiveness of the 2019 Drought Contingency Plan&lt;/title&gt;&lt;secondary-title&gt;Journal of Environmental Engineering&lt;/secondary-title&gt;&lt;/titles&gt;&lt;periodical&gt;&lt;full-title&gt;Journal of Environmental Engineering&lt;/full-title&gt;&lt;/periodical&gt;&lt;pages&gt;04023058&lt;/pages&gt;&lt;volume&gt;149&lt;/volume&gt;&lt;number&gt;10&lt;/number&gt;&lt;dates&gt;&lt;year&gt;2023&lt;/year&gt;&lt;/dates&gt;&lt;urls&gt;&lt;related-urls&gt;&lt;url&gt;https://ascelibrary.org/doi/abs/10.1061/JOEEDU.EEENG-7324&lt;/url&gt;&lt;/related-urls&gt;&lt;/urls&gt;&lt;electronic-resource-num&gt;doi:10.1061/JOEEDU.EEENG-7324&lt;/electronic-resource-num&gt;&lt;/record&gt;&lt;/Cite&gt;&lt;/EndNote&gt;</w:instrText>
+      </w:r>
+      <w:r>
+        <w:fldChar w:fldCharType="separate"/>
+      </w:r>
+      <w:r>
+        <w:rPr>
+          <w:noProof/>
+        </w:rPr>
+        <w:t xml:space="preserve">Huizar et </w:t>
+      </w:r>
+      <w:r>
+        <w:rPr>
+          <w:noProof/>
+        </w:rPr>
         <w:lastRenderedPageBreak/>
-        <w:t xml:space="preserve">Lake Mead as system water to create a balance of individual and collective resiliency. </w:t>
+        <w:t>al. (2023)</w:t>
+      </w:r>
+      <w:r>
+        <w:fldChar w:fldCharType="end"/>
+      </w:r>
+      <w:r>
+        <w:t xml:space="preserve"> </w:t>
+      </w:r>
+      <w:r>
+        <w:t xml:space="preserve">and </w:t>
       </w:r>
       <w:r>
         <w:fldChar w:fldCharType="begin"/>
       </w:r>
       <w:r>
-        <w:instrText xml:space="preserve"> ADDIN EN.CITE &lt;EndNote&gt;&lt;Cite AuthorYear="1"&gt;&lt;Author&gt;Huizar&lt;/Author&gt;&lt;Year&gt;2023&lt;/Year&gt;&lt;RecNum&gt;3110&lt;/RecNum&gt;&lt;DisplayText&gt;Huizar et al. (2023)&lt;/DisplayText&gt;&lt;record&gt;&lt;rec-number&gt;3110&lt;/rec-number&gt;&lt;foreign-keys&gt;&lt;key app="EN" db-id="xxt5ta9pd995dwesap0pdzzp2weaz0w9werf" timestamp="1776715189"&gt;3110&lt;/key&gt;&lt;/foreign-keys&gt;&lt;ref-type name="Journal Article"&gt;17&lt;/ref-type&gt;&lt;contributors&gt;&lt;authors&gt;&lt;author&gt;Luis Huizar&lt;/author&gt;&lt;author&gt;Sarai Díaz&lt;/author&gt;&lt;author&gt;Kevin Lansey&lt;/author&gt;&lt;author&gt;Robert Arnold&lt;/author&gt;&lt;/authors&gt;&lt;/contributors&gt;&lt;titles&gt;&lt;title&gt;Water Supply in the Lower Colorado River Basin: Effectiveness of the 2019 Drought Contingency Plan&lt;/title&gt;&lt;secondary-title&gt;Journal of Environmental Engineering&lt;/secondary-title&gt;&lt;/titles&gt;&lt;periodical&gt;&lt;full-title&gt;Journal of Environmental Engineering&lt;/full-title&gt;&lt;/periodical&gt;&lt;pages&gt;04023058&lt;/pages&gt;&lt;volume&gt;149&lt;/volume&gt;&lt;number&gt;10&lt;/number&gt;&lt;dates&gt;&lt;year&gt;2023&lt;/year&gt;&lt;/dates&gt;&lt;urls&gt;&lt;related-urls&gt;&lt;url&gt;https://ascelibrary.org/doi/abs/10.1061/JOEEDU.EEENG-7324&lt;/url&gt;&lt;/related-urls&gt;&lt;/urls&gt;&lt;electronic-resource-num&gt;doi:10.1061/JOEEDU.EEENG-7324&lt;/electronic-resource-num&gt;&lt;/record&gt;&lt;/Cite&gt;&lt;/EndNote&gt;</w:instrText>
+        <w:instrText xml:space="preserve"> ADDIN EN.CITE &lt;EndNote&gt;&lt;Cite AuthorYear="1"&gt;&lt;Author&gt;USBR&lt;/Author&gt;&lt;Year&gt;2026&lt;/Year&gt;&lt;RecNum&gt;3124&lt;/RecNum&gt;&lt;DisplayText&gt;USBR (2026b)&lt;/DisplayText&gt;&lt;record&gt;&lt;rec-number&gt;3124&lt;/rec-number&gt;&lt;foreign-keys&gt;&lt;key app="EN" db-id="xxt5ta9pd995dwesap0pdzzp2weaz0w9werf" timestamp="1786136712"&gt;3124&lt;/key&gt;&lt;/foreign-keys&gt;&lt;ref-type name="Report"&gt;27&lt;/ref-type&gt;&lt;contributors&gt;&lt;authors&gt;&lt;author&gt;USBR&lt;/author&gt;&lt;/authors&gt;&lt;/contributors&gt;&lt;titles&gt;&lt;title&gt;Post-2026 Operational Guidelines and Strategies for Lake Powell and Lake Mead – Final Environmental Impact Statement&lt;/title&gt;&lt;/titles&gt;&lt;dates&gt;&lt;year&gt;2026&lt;/year&gt;&lt;/dates&gt;&lt;publisher&gt;U.S. Bureau of Reclamation&lt;/publisher&gt;&lt;urls&gt;&lt;related-urls&gt;&lt;url&gt;https://www.usbr.gov/ColoradoRiverBasin/post2026/final-eis/index.html&lt;/url&gt;&lt;/related-urls&gt;&lt;/urls&gt;&lt;/record&gt;&lt;/Cite&gt;&lt;/EndNote&gt;</w:instrText>
       </w:r>
       <w:r>
         <w:fldChar w:fldCharType="separate"/>
@@ -1507,13 +1583,16 @@
         <w:rPr>
           <w:noProof/>
         </w:rPr>
-        <w:t>Huizar et al. (2023)</w:t>
+        <w:t>USBR (2026b)</w:t>
       </w:r>
       <w:r>
         <w:fldChar w:fldCharType="end"/>
       </w:r>
       <w:r>
-        <w:t xml:space="preserve"> reported difficulty to predict and model state’s water conservation choices. </w:t>
+        <w:t xml:space="preserve"> </w:t>
+      </w:r>
+      <w:r>
+        <w:t xml:space="preserve">reported difficulty to predict and model state’s water conservation choices. </w:t>
       </w:r>
       <w:r>
         <w:fldChar w:fldCharType="begin"/>
@@ -1927,10 +2006,13 @@
         <w:t xml:space="preserve"> historical entitlements to apportionment of physical reservoir inflow. We illustrate some of the many more autonomous strategies that </w:t>
       </w:r>
       <w:r>
-        <w:t>49 collaborator</w:t>
-      </w:r>
-      <w:r>
-        <w:t xml:space="preserve">s </w:t>
+        <w:t>49 collaborat</w:t>
+      </w:r>
+      <w:r>
+        <w:t>ing Colorado River managers and experts</w:t>
+      </w:r>
+      <w:r>
+        <w:t xml:space="preserve"> </w:t>
       </w:r>
       <w:r>
         <w:t xml:space="preserve">adapted </w:t>
@@ -1939,13 +2021,40 @@
         <w:t>during 16 immersive online collaborative model sessions</w:t>
       </w:r>
       <w:r>
-        <w:t xml:space="preserve"> (Section 6). </w:t>
+        <w:t xml:space="preserve"> </w:t>
+      </w:r>
+      <w:r>
+        <w:fldChar w:fldCharType="begin"/>
+      </w:r>
+      <w:r>
+        <w:instrText xml:space="preserve"> ADDIN EN.CITE &lt;EndNote&gt;&lt;Cite&gt;&lt;Author&gt;Rosenberg&lt;/Author&gt;&lt;Year&gt;2024&lt;/Year&gt;&lt;RecNum&gt;2847&lt;/RecNum&gt;&lt;DisplayText&gt;(Rosenberg, 2024)&lt;/DisplayText&gt;&lt;record&gt;&lt;rec-number&gt;2847&lt;/rec-number&gt;&lt;foreign-keys&gt;&lt;key app="EN" db-id="xxt5ta9pd995dwesap0pdzzp2weaz0w9werf" timestamp="1642471467"&gt;2847&lt;/key&gt;&lt;/foreign-keys&gt;&lt;ref-type name="Journal Article"&gt;17&lt;/ref-type&gt;&lt;contributors&gt;&lt;authors&gt;&lt;author&gt;David E. Rosenberg&lt;/author&gt;&lt;/authors&gt;&lt;/contributors&gt;&lt;titles&gt;&lt;title&gt;Lessons from immersive online collaborative modeling to discuss more adaptive reservoir operations&lt;/title&gt;&lt;secondary-title&gt;Journal of Water Resources Planning and Management&lt;/secondary-title&gt;&lt;/titles&gt;&lt;periodical&gt;&lt;full-title&gt;Journal of Water Resources Planning and Management&lt;/full-title&gt;&lt;/periodical&gt;&lt;volume&gt;150&lt;/volume&gt;&lt;number&gt;7&lt;/number&gt;&lt;dates&gt;&lt;year&gt;2024&lt;/year&gt;&lt;/dates&gt;&lt;publisher&gt;American Society of Civil Engineers&lt;/publisher&gt;&lt;urls&gt;&lt;related-urls&gt;&lt;url&gt;https://doi.org/10.4211/hs.e0cbe52ad4524c07bb5b7ff8c373a343&lt;/url&gt;&lt;/related-urls&gt;&lt;/urls&gt;&lt;electronic-resource-num&gt;https://doi.org/10.1061/JWRMD5.WRENG-5893&lt;/electronic-resource-num&gt;&lt;/record&gt;&lt;/Cite&gt;&lt;/EndNote&gt;</w:instrText>
+      </w:r>
+      <w:r>
+        <w:fldChar w:fldCharType="separate"/>
+      </w:r>
+      <w:r>
+        <w:rPr>
+          <w:noProof/>
+        </w:rPr>
+        <w:t>(Rosenberg, 2024)</w:t>
+      </w:r>
+      <w:r>
+        <w:fldChar w:fldCharType="end"/>
+      </w:r>
+      <w:r>
+        <w:t xml:space="preserve">(Section 6). </w:t>
       </w:r>
       <w:r>
         <w:t>Section 7</w:t>
       </w:r>
       <w:r>
-        <w:t xml:space="preserve"> discusses our suggestions in the context of prior work and lists additional benefits and limitations of water accounting. This work has potential benefits to stabilize and recover Lake Mead storage while increasing water users autonomy to manage their differing and sometimes conflicting risks of declining and low Colorado River flow.</w:t>
+        <w:t xml:space="preserve"> discusses our suggestions in the context of prior work and lists additional benefits and limitations of </w:t>
+      </w:r>
+      <w:r>
+        <w:t>the new frameworks</w:t>
+      </w:r>
+      <w:r>
+        <w:t>. This work has potential benefits to stabilize and recover Lake Mead storage while increasing water users autonomy to manage their differing and sometimes conflicting risks of declining and low Colorado River flow.</w:t>
       </w:r>
     </w:p>
     <w:p>
@@ -3468,7 +3577,10 @@
         <w:t xml:space="preserve"> than its </w:t>
       </w:r>
       <w:r>
-        <w:t xml:space="preserve">historical allocation of </w:t>
+        <w:t>legal entitlement</w:t>
+      </w:r>
+      <w:r>
+        <w:t xml:space="preserve"> of </w:t>
       </w:r>
       <w:r>
         <w:t>2.</w:t>
@@ -4097,16 +4209,7 @@
         <w:pStyle w:val="NoSpacing"/>
       </w:pPr>
       <w:r>
-        <w:t xml:space="preserve">We draw and report annual data on water conservation account balances, credits, and debits from </w:t>
-      </w:r>
-      <w:r>
-        <w:t>USBR</w:t>
-      </w:r>
-      <w:r>
-        <w:t>’</w:t>
-      </w:r>
-      <w:r>
-        <w:t xml:space="preserve">s water accounting reports </w:t>
+        <w:t xml:space="preserve">We draw and report annual data on water conservation account balances, credits, and debits from ater accounting reports </w:t>
       </w:r>
       <w:r>
         <w:fldChar w:fldCharType="begin"/>
@@ -4278,7 +4381,7 @@
                     <pic:cNvPicPr/>
                   </pic:nvPicPr>
                   <pic:blipFill>
-                    <a:blip r:embed="rId17"/>
+                    <a:blip r:embed="rId13"/>
                     <a:stretch>
                       <a:fillRect/>
                     </a:stretch>
@@ -4355,7 +4458,7 @@
                     <pic:cNvPicPr/>
                   </pic:nvPicPr>
                   <pic:blipFill>
-                    <a:blip r:embed="rId18"/>
+                    <a:blip r:embed="rId14"/>
                     <a:stretch>
                       <a:fillRect/>
                     </a:stretch>
@@ -4758,7 +4861,7 @@
                     </pic:cNvPicPr>
                   </pic:nvPicPr>
                   <pic:blipFill>
-                    <a:blip r:embed="rId19">
+                    <a:blip r:embed="rId15">
                       <a:extLst>
                         <a:ext uri="{28A0092B-C50C-407E-A947-70E740481C1C}">
                           <a14:useLocalDpi xmlns:a14="http://schemas.microsoft.com/office/drawing/2010/main" val="0"/>
@@ -4910,7 +5013,7 @@
                     <pic:cNvPicPr/>
                   </pic:nvPicPr>
                   <pic:blipFill>
-                    <a:blip r:embed="rId20"/>
+                    <a:blip r:embed="rId16"/>
                     <a:stretch>
                       <a:fillRect/>
                     </a:stretch>
@@ -5043,7 +5146,19 @@
         <w:t xml:space="preserve">Motivating additional voluntary water conservation is challenging. </w:t>
       </w:r>
       <w:r>
-        <w:t>As reservoir storage reduces to the protection volume, states and contractors face increasing difficulty accessing their conserved water. This challenge can spur conflicts if:</w:t>
+        <w:t xml:space="preserve">As reservoir storage </w:t>
+      </w:r>
+      <w:r>
+        <w:t>declines</w:t>
+      </w:r>
+      <w:r>
+        <w:t xml:space="preserve"> to the protection volume, states and contractors face increasing difficulty </w:t>
+      </w:r>
+      <w:r>
+        <w:t xml:space="preserve">to </w:t>
+      </w:r>
+      <w:r>
+        <w:t>access their conserved water. This challenge can spur conflicts:</w:t>
       </w:r>
     </w:p>
     <w:p>
@@ -5085,7 +5200,13 @@
         <w:t>withdraws</w:t>
       </w:r>
       <w:r>
-        <w:t xml:space="preserve"> their conserved water which brings Lake Mead’s storage towards the protection volume. This act will prevent other states’ ability to access their conserved water.</w:t>
+        <w:t xml:space="preserve"> their conserved water which brings Lake Mead’s storage towards the protection volume. This act prevent</w:t>
+      </w:r>
+      <w:r>
+        <w:t>s</w:t>
+      </w:r>
+      <w:r>
+        <w:t xml:space="preserve"> other states’ ability to access their conserved water.</w:t>
       </w:r>
     </w:p>
     <w:p>
@@ -5100,7 +5221,13 @@
         <w:t xml:space="preserve">Tribal, environmental, and municipal water needs are not explicitly included. </w:t>
       </w:r>
       <w:r>
-        <w:t>The Lake Mead water conservation program is built on legal entitlements to states, which were developed at a time that did not include key water needs that we recognize in the 21</w:t>
+        <w:t>The Lake Mead water conservation program is built on legal entitlements to states</w:t>
+      </w:r>
+      <w:r>
+        <w:t xml:space="preserve"> and Mexico</w:t>
+      </w:r>
+      <w:r>
+        <w:t>, which were developed at a time that did not include key water needs that we recognize in the 21</w:t>
       </w:r>
       <w:r>
         <w:rPr>
@@ -5136,8 +5263,11 @@
         <w:t xml:space="preserve"> </w:t>
       </w:r>
       <w:r>
+        <w:t xml:space="preserve">exceeds the sum of legal entitlements of 9.0 million acre-feet per year to California, Arizona, </w:t>
+      </w:r>
+      <w:r>
         <w:lastRenderedPageBreak/>
-        <w:t>exceeds the sum of legal entitlements of 9.0 million acre-feet per year to California, Arizona, Nevada, and Mexico. When this assumption is false, Lake Mead will draw down even as states leave conserved water in Lake Mead. Essentially, states got credit for water conservation activity even though the physical water may have never entered the reservoir. There are cases when the assumption is valid and invalid (Figure 4).</w:t>
+        <w:t>Nevada, and Mexico. When this assumption is false, Lake Mead will draw down even as states leave conserved water in Lake Mead. Essentially, states got credit for water conservation activity even though the physical water may have never entered the reservoir. There are cases when the assumption is valid and invalid (Figure 4).</w:t>
       </w:r>
     </w:p>
     <w:p>
@@ -5169,7 +5299,7 @@
           <w:szCs w:val="24"/>
         </w:rPr>
         <w:drawing>
-          <wp:inline distT="0" distB="0" distL="0" distR="0" wp14:anchorId="1DF02D15" wp14:editId="45CAB2EB">
+          <wp:inline distT="0" distB="0" distL="0" distR="0" wp14:anchorId="1DF02D15" wp14:editId="0C10DDFD">
             <wp:extent cx="5845696" cy="3329343"/>
             <wp:effectExtent l="0" t="0" r="0" b="0"/>
             <wp:docPr id="708746801" name="Picture 2"/>
@@ -5186,7 +5316,7 @@
                     </pic:cNvPicPr>
                   </pic:nvPicPr>
                   <pic:blipFill>
-                    <a:blip r:embed="rId21" cstate="print">
+                    <a:blip r:embed="rId17" cstate="print">
                       <a:extLst>
                         <a:ext uri="{28A0092B-C50C-407E-A947-70E740481C1C}">
                           <a14:useLocalDpi xmlns:a14="http://schemas.microsoft.com/office/drawing/2010/main" val="0"/>
@@ -5653,7 +5783,6 @@
         <w:pStyle w:val="NoSpacing"/>
       </w:pPr>
       <w:r>
-        <w:lastRenderedPageBreak/>
         <w:t>In case 1</w:t>
       </w:r>
       <w:r>
@@ -5773,7 +5902,11 @@
         <w:t>). I</w:t>
       </w:r>
       <w:r>
-        <w:t>n this case</w:t>
+        <w:t xml:space="preserve">n this </w:t>
+      </w:r>
+      <w:r>
+        <w:lastRenderedPageBreak/>
+        <w:t>case</w:t>
       </w:r>
       <w:r>
         <w:t xml:space="preserve"> [</w:t>
@@ -6144,7 +6277,7 @@
                     <pic:cNvPicPr/>
                   </pic:nvPicPr>
                   <pic:blipFill>
-                    <a:blip r:embed="rId22"/>
+                    <a:blip r:embed="rId18"/>
                     <a:stretch>
                       <a:fillRect/>
                     </a:stretch>
@@ -6307,49 +6440,83 @@
           <w:b/>
           <w:bCs/>
         </w:rPr>
-        <w:t xml:space="preserve">in relation to total legal </w:t>
+        <w:t>in relation to total legal entitlements of 9.0 million acre-feet</w:t>
       </w:r>
       <w:r>
         <w:rPr>
           <w:b/>
           <w:bCs/>
         </w:rPr>
+        <w:t xml:space="preserve"> (black horizontal dashed line)</w:t>
+      </w:r>
+      <w:r>
+        <w:t>.</w:t>
+      </w:r>
+      <w:r>
+        <w:t xml:space="preserve"> When the available water was less than legal entitlements, conserved water was credited even though that water did not flow into Lake Mead (dark red bars).</w:t>
+      </w:r>
+    </w:p>
+    <w:p>
+      <w:pPr>
+        <w:pStyle w:val="NoSpacing"/>
+      </w:pPr>
+      <w:r>
         <w:lastRenderedPageBreak/>
-        <w:t>entitlements of 9.0 million acre-feet</w:t>
-      </w:r>
-      <w:r>
-        <w:rPr>
-          <w:b/>
-          <w:bCs/>
-        </w:rPr>
-        <w:t xml:space="preserve"> (black horizontal dashed line)</w:t>
-      </w:r>
-      <w:r>
-        <w:t>.</w:t>
-      </w:r>
-      <w:r>
-        <w:t xml:space="preserve"> When the available water was less than legal entitlements, conserved water was credited even though that water did not flow into Lake Mead (dark red bars).</w:t>
-      </w:r>
-    </w:p>
-    <w:p>
-      <w:pPr>
-        <w:pStyle w:val="NoSpacing"/>
-        <w:spacing w:after="0" w:line="240" w:lineRule="auto"/>
-        <w:rPr>
-          <w:b/>
-          <w:bCs/>
-        </w:rPr>
-      </w:pPr>
-    </w:p>
-    <w:p>
-      <w:pPr>
-        <w:pStyle w:val="NoSpacing"/>
-      </w:pPr>
-      <w:r>
-        <w:t>Conditions</w:t>
-      </w:r>
-      <w:r>
-        <w:t xml:space="preserve"> where the Physically Available Water is less than Total Legal Entitlements will likely continue to occur as future Colorado River flows become more volatile and risk of reservoir level declines increase (Table 2). For example, with a Lake Powell release of 7.0 million acre-feet per year and Total Legal Entitlements of 9.0 million acre-feet per year, Total Mandatory Shortages must exceed 1.5 maf per year for there to be sufficient physically available water to award all requested credits. When the Lake Powell release is 6 million acre-feet as in Water Year 2025-2026, Total Mandatory Shortages must exceed 2.6 maf per year.</w:t>
+        <w:t xml:space="preserve">There is agreement in USBR’s </w:t>
+      </w:r>
+      <w:r>
+        <w:t xml:space="preserve">22 </w:t>
+      </w:r>
+      <w:r>
+        <w:t xml:space="preserve">hydrologic ensembles that </w:t>
+      </w:r>
+      <w:r>
+        <w:t xml:space="preserve">conditions </w:t>
+      </w:r>
+      <w:r>
+        <w:t>where</w:t>
+      </w:r>
+      <w:r>
+        <w:t xml:space="preserve"> Physically Available Water </w:t>
+      </w:r>
+      <w:r>
+        <w:t>will be</w:t>
+      </w:r>
+      <w:r>
+        <w:t xml:space="preserve"> less than Total Legal Entitlements will continue </w:t>
+      </w:r>
+      <w:r>
+        <w:t>and increase</w:t>
+      </w:r>
+      <w:r>
+        <w:t xml:space="preserve"> </w:t>
+      </w:r>
+      <w:r>
+        <w:fldChar w:fldCharType="begin"/>
+      </w:r>
+      <w:r>
+        <w:instrText xml:space="preserve"> ADDIN EN.CITE &lt;EndNote&gt;&lt;Cite&gt;&lt;Author&gt;USBR&lt;/Author&gt;&lt;Year&gt;2026&lt;/Year&gt;&lt;RecNum&gt;3124&lt;/RecNum&gt;&lt;DisplayText&gt;(USBR, 2026b)&lt;/DisplayText&gt;&lt;record&gt;&lt;rec-number&gt;3124&lt;/rec-number&gt;&lt;foreign-keys&gt;&lt;key app="EN" db-id="xxt5ta9pd995dwesap0pdzzp2weaz0w9werf" timestamp="1786136712"&gt;3124&lt;/key&gt;&lt;/foreign-keys&gt;&lt;ref-type name="Report"&gt;27&lt;/ref-type&gt;&lt;contributors&gt;&lt;authors&gt;&lt;author&gt;USBR&lt;/author&gt;&lt;/authors&gt;&lt;/contributors&gt;&lt;titles&gt;&lt;title&gt;Post-2026 Operational Guidelines and Strategies for Lake Powell and Lake Mead – Final Environmental Impact Statement&lt;/title&gt;&lt;/titles&gt;&lt;dates&gt;&lt;year&gt;2026&lt;/year&gt;&lt;/dates&gt;&lt;publisher&gt;U.S. Bureau of Reclamation&lt;/publisher&gt;&lt;urls&gt;&lt;related-urls&gt;&lt;url&gt;https://www.usbr.gov/ColoradoRiverBasin/post2026/final-eis/index.html&lt;/url&gt;&lt;/related-urls&gt;&lt;/urls&gt;&lt;/record&gt;&lt;/Cite&gt;&lt;/EndNote&gt;</w:instrText>
+      </w:r>
+      <w:r>
+        <w:fldChar w:fldCharType="separate"/>
+      </w:r>
+      <w:r>
+        <w:rPr>
+          <w:noProof/>
+        </w:rPr>
+        <w:t>(USBR, 2026b)</w:t>
+      </w:r>
+      <w:r>
+        <w:fldChar w:fldCharType="end"/>
+      </w:r>
+      <w:r>
+        <w:t>. For example, with a Lake Powell release of 7.0 million acre-feet per year and Total Legal Entitlements of 9.0 million acre-feet per year, Total Mandatory Shortages must exceed 1.5 maf per year for there to be sufficient physically available water to award all requested credits</w:t>
+      </w:r>
+      <w:r>
+        <w:t xml:space="preserve"> (Table 2)</w:t>
+      </w:r>
+      <w:r>
+        <w:t>. When the Lake Powell release is 6 million acre-feet as in Water Year 2025-2026, Total Mandatory Shortages must exceed 2.6 maf per year.</w:t>
       </w:r>
     </w:p>
     <w:p>
@@ -6409,7 +6576,7 @@
                     </pic:cNvPicPr>
                   </pic:nvPicPr>
                   <pic:blipFill>
-                    <a:blip r:embed="rId23">
+                    <a:blip r:embed="rId19">
                       <a:extLst>
                         <a:ext uri="{28A0092B-C50C-407E-A947-70E740481C1C}">
                           <a14:useLocalDpi xmlns:a14="http://schemas.microsoft.com/office/drawing/2010/main" val="0"/>
@@ -6449,23 +6616,29 @@
     </w:p>
     <w:p>
       <w:pPr>
+        <w:pStyle w:val="NoSpacing"/>
+        <w:spacing w:after="0" w:line="240" w:lineRule="auto"/>
+      </w:pPr>
+    </w:p>
+    <w:p>
+      <w:pPr>
         <w:pStyle w:val="Heading1"/>
       </w:pPr>
       <w:r>
         <w:t xml:space="preserve">Strategies to </w:t>
       </w:r>
-      <w:commentRangeStart w:id="1"/>
+      <w:commentRangeStart w:id="0"/>
       <w:r>
         <w:t xml:space="preserve">Motivate Conservation and Increase User Autonomy </w:t>
       </w:r>
-      <w:commentRangeEnd w:id="1"/>
+      <w:commentRangeEnd w:id="0"/>
       <w:r>
         <w:rPr>
           <w:rStyle w:val="CommentReference"/>
           <w:sz w:val="24"/>
           <w:szCs w:val="24"/>
         </w:rPr>
-        <w:commentReference w:id="1"/>
+        <w:commentReference w:id="0"/>
       </w:r>
     </w:p>
     <w:p>
@@ -6495,6 +6668,12 @@
       </w:r>
       <w:r>
         <w:t xml:space="preserve"> water conservation</w:t>
+      </w:r>
+      <w:r>
+        <w:t xml:space="preserve"> and increase </w:t>
+      </w:r>
+      <w:r>
+        <w:t>users autonomy to consume and conserve water</w:t>
       </w:r>
       <w:r>
         <w:t xml:space="preserve"> </w:t>
@@ -6655,45 +6834,45 @@
         <w:t>or</w:t>
       </w:r>
       <w:r>
-        <w:t xml:space="preserve"> pulse flows to the Colorado </w:t>
+        <w:t xml:space="preserve"> pulse flows to the Colorado River delta.</w:t>
+      </w:r>
+      <w:r>
+        <w:t xml:space="preserve"> </w:t>
+      </w:r>
+      <w:r>
+        <w:t xml:space="preserve">Third, </w:t>
+      </w:r>
+      <w:r>
+        <w:t>new operational policies that</w:t>
+      </w:r>
+      <w:r>
+        <w:t xml:space="preserve"> split conserved water between Lake Powell and Lake Mead </w:t>
+      </w:r>
+      <w:r>
+        <w:t xml:space="preserve">can </w:t>
+      </w:r>
+      <w:r>
+        <w:t xml:space="preserve">provide more </w:t>
       </w:r>
       <w:r>
         <w:lastRenderedPageBreak/>
-        <w:t>River delta.</w:t>
+        <w:t>flexibility in operations to sustain ecosystems in Grand Canyon</w:t>
+      </w:r>
+      <w:r>
+        <w:t xml:space="preserve">. Fourth, </w:t>
+      </w:r>
+      <w:r>
+        <w:t xml:space="preserve">create a system pool to be managed by </w:t>
+      </w:r>
+      <w:r>
+        <w:t>USBR</w:t>
+      </w:r>
+      <w:r>
+        <w:t>.</w:t>
       </w:r>
       <w:r>
         <w:t xml:space="preserve"> </w:t>
       </w:r>
-      <w:r>
-        <w:t xml:space="preserve">Third, </w:t>
-      </w:r>
-      <w:r>
-        <w:t>new operational policies that</w:t>
-      </w:r>
-      <w:r>
-        <w:t xml:space="preserve"> split conserved water between Lake Powell and Lake Mead </w:t>
-      </w:r>
-      <w:r>
-        <w:t xml:space="preserve">can </w:t>
-      </w:r>
-      <w:r>
-        <w:t>provide more flexibility in operations to sustain ecosystems in Grand Canyon</w:t>
-      </w:r>
-      <w:r>
-        <w:t xml:space="preserve">. Fourth, </w:t>
-      </w:r>
-      <w:r>
-        <w:t xml:space="preserve">create a system pool to be managed by </w:t>
-      </w:r>
-      <w:r>
-        <w:t>USBR</w:t>
-      </w:r>
-      <w:r>
-        <w:t>.</w:t>
-      </w:r>
-      <w:r>
-        <w:t xml:space="preserve"> </w:t>
-      </w:r>
     </w:p>
     <w:p>
       <w:pPr>
@@ -6706,7 +6885,13 @@
         <w:t xml:space="preserve"> water</w:t>
       </w:r>
       <w:r>
-        <w:t xml:space="preserve"> users more autonomy to manage their risks of water shortages in the face of aridity. Both strategies switch the conservation accounting from reductions from historical entitlements to reductions from the annual physically available water.</w:t>
+        <w:t xml:space="preserve"> users more autonomy to manage their </w:t>
+      </w:r>
+      <w:r>
+        <w:t xml:space="preserve">sometimes conflicting </w:t>
+      </w:r>
+      <w:r>
+        <w:t>risks of water shortages in the face of aridity. Both strategies switch the conservation accounting from reductions from historical entitlements to reductions from the annual physically available water.</w:t>
       </w:r>
     </w:p>
     <w:p>
@@ -7150,7 +7335,7 @@
                   <w:rPr>
                     <w:rFonts w:ascii="Cambria Math" w:hAnsi="Cambria Math"/>
                   </w:rPr>
-                  <m:t>Total</m:t>
+                  <m:t>i</m:t>
                 </m:r>
               </m:sub>
             </m:sSub>
@@ -7586,17 +7771,20 @@
           <w:b/>
           <w:bCs/>
         </w:rPr>
+        <w:t xml:space="preserve">Reservoir Storage Protection Account. </w:t>
+      </w:r>
+      <w:r>
+        <w:t xml:space="preserve">In this framework, the Lake Mead elevation and corresponding storage volume are defined for a protection account—to be managed by </w:t>
+      </w:r>
+      <w:r>
+        <w:t>USBR</w:t>
+      </w:r>
+      <w:r>
+        <w:t xml:space="preserve"> </w:t>
+      </w:r>
+      <w:r>
         <w:lastRenderedPageBreak/>
-        <w:t xml:space="preserve">Reservoir Storage Protection Account. </w:t>
-      </w:r>
-      <w:r>
-        <w:t xml:space="preserve">In this framework, the Lake Mead elevation and corresponding storage volume are defined for a protection account—to be managed by </w:t>
-      </w:r>
-      <w:r>
-        <w:t>USBR</w:t>
-      </w:r>
-      <w:r>
-        <w:t xml:space="preserve"> (</w:t>
+        <w:t>(</w:t>
       </w:r>
       <w:r>
         <w:rPr>
@@ -8302,37 +8490,10 @@
         <w:t xml:space="preserve"> </w:t>
       </w:r>
       <w:r>
-        <w:t>The annual Lake Mead inflow is typically known at the beginning of the year because the annual Lake Powell release—that is set in Fall of each year—</w:t>
-      </w:r>
-      <w:r>
-        <w:t xml:space="preserve">is </w:t>
-      </w:r>
-      <w:r>
-        <w:t xml:space="preserve">often 85 to 91% of Mead inflow </w:t>
-      </w:r>
-      <w:r>
-        <w:fldChar w:fldCharType="begin"/>
-      </w:r>
-      <w:r>
-        <w:instrText xml:space="preserve"> ADDIN EN.CITE &lt;EndNote&gt;&lt;Cite&gt;&lt;Author&gt;Rosenberg&lt;/Author&gt;&lt;Year&gt;2022&lt;/Year&gt;&lt;RecNum&gt;2903&lt;/RecNum&gt;&lt;DisplayText&gt;(Rosenberg, 2022; Wang and Schmidt, 2020)&lt;/DisplayText&gt;&lt;record&gt;&lt;rec-number&gt;2903&lt;/rec-number&gt;&lt;foreign-keys&gt;&lt;key app="EN" db-id="xxt5ta9pd995dwesap0pdzzp2weaz0w9werf" timestamp="1663608602"&gt;2903&lt;/key&gt;&lt;/foreign-keys&gt;&lt;ref-type name="Journal Article"&gt;17&lt;/ref-type&gt;&lt;contributors&gt;&lt;authors&gt;&lt;author&gt;David E. Rosenberg&lt;/author&gt;&lt;/authors&gt;&lt;/contributors&gt;&lt;titles&gt;&lt;title&gt;Adapt Lake Mead Releases to Inflow to Give Managers More Flexibility to Slow Reservoir Drawdown&lt;/title&gt;&lt;secondary-title&gt;Journal of Water Resources Planning and Management&lt;/secondary-title&gt;&lt;/titles&gt;&lt;periodical&gt;&lt;full-title&gt;Journal of Water Resources Planning and Management&lt;/full-title&gt;&lt;/periodical&gt;&lt;pages&gt;02522006&lt;/pages&gt;&lt;volume&gt;148&lt;/volume&gt;&lt;number&gt;10&lt;/number&gt;&lt;dates&gt;&lt;year&gt;2022&lt;/year&gt;&lt;/dates&gt;&lt;urls&gt;&lt;related-urls&gt;&lt;url&gt;https://ascelibrary.org/doi/abs/10.1061/%28ASCE%29WR.1943-5452.0001592. Free version: https://digitalcommons.usu.edu/water_pubs/170/.&lt;/url&gt;&lt;/related-urls&gt;&lt;/urls&gt;&lt;electronic-resource-num&gt;https://doi.org/10.1061/(ASCE)WR.1943-5452.0001592&lt;/electronic-resource-num&gt;&lt;/record&gt;&lt;/Cite&gt;&lt;Cite&gt;&lt;Author&gt;Wang&lt;/Author&gt;&lt;Year&gt;2020&lt;/Year&gt;&lt;RecNum&gt;2782&lt;/RecNum&gt;&lt;record&gt;&lt;rec-number&gt;2782&lt;/rec-number&gt;&lt;foreign-keys&gt;&lt;key app="EN" db-id="xxt5ta9pd995dwesap0pdzzp2weaz0w9werf" timestamp="1620768668"&gt;2782&lt;/key&gt;&lt;/foreign-keys&gt;&lt;ref-type name="Report"&gt;27&lt;/ref-type&gt;&lt;contributors&gt;&lt;authors&gt;&lt;author&gt;Jian Wang&lt;/author&gt;&lt;author&gt;John C. Schmidt&lt;/author&gt;&lt;/authors&gt;&lt;/contributors&gt;&lt;titles&gt;&lt;title&gt;Stream flow and Losses of the Colorado River in the Southern Colorado Plateau&lt;/title&gt;&lt;/titles&gt;&lt;pages&gt;30&lt;/pages&gt;&lt;number&gt;White Paper #5&lt;/number&gt;&lt;dates&gt;&lt;year&gt;2020&lt;/year&gt;&lt;pub-dates&gt;&lt;date&gt;Febuary 10&lt;/date&gt;&lt;/pub-dates&gt;&lt;/dates&gt;&lt;pub-location&gt;Logan, Utah&lt;/pub-location&gt;&lt;publisher&gt;Center for Colorado River Studies, Utah State University&lt;/publisher&gt;&lt;urls&gt;&lt;related-urls&gt;&lt;url&gt;https://qcnr.usu.edu//coloradoriver/files/news/White-Paper-7.pdf&lt;/url&gt;&lt;/related-urls&gt;&lt;/urls&gt;&lt;/record&gt;&lt;/Cite&gt;&lt;/EndNote&gt;</w:instrText>
-      </w:r>
-      <w:r>
-        <w:fldChar w:fldCharType="separate"/>
-      </w:r>
-      <w:r>
-        <w:rPr>
-          <w:noProof/>
-        </w:rPr>
-        <w:t>(Rosenberg, 2022; Wang and Schmidt, 2020)</w:t>
-      </w:r>
-      <w:r>
-        <w:fldChar w:fldCharType="end"/>
-      </w:r>
-      <w:r>
-        <w:t>.</w:t>
-      </w:r>
-      <w:r>
-        <w:t xml:space="preserve"> With water accounting, each user can </w:t>
+        <w:t>Thus,</w:t>
+      </w:r>
+      <w:r>
+        <w:t xml:space="preserve"> each user can </w:t>
       </w:r>
       <w:r>
         <w:t xml:space="preserve">withdraw some up to </w:t>
@@ -8365,40 +8526,25 @@
         <w:t xml:space="preserve">any </w:t>
       </w:r>
       <w:r>
-        <w:t>Lake Mead storage volume.</w:t>
-      </w:r>
-      <w:r>
-        <w:t xml:space="preserve"> This </w:t>
-      </w:r>
-      <w:r>
-        <w:t>flexibility</w:t>
-      </w:r>
-      <w:r>
-        <w:t xml:space="preserve"> gives users more autonomy to adapt their consumption and conservation activities as system conditions change. </w:t>
-      </w:r>
-      <w:r>
-        <w:t>Water accounts can be created for any users or uses</w:t>
-      </w:r>
-      <w:r>
-        <w:t xml:space="preserve"> such as Tribal Nations</w:t>
-      </w:r>
-      <w:r>
-        <w:t xml:space="preserve">, </w:t>
-      </w:r>
-      <w:r>
-        <w:t>endangered species conservation programs</w:t>
-      </w:r>
-      <w:r>
-        <w:t>, or flows to the Colorado River delta</w:t>
-      </w:r>
-      <w:r>
-        <w:t xml:space="preserve">. </w:t>
-      </w:r>
-      <w:r>
-        <w:t xml:space="preserve">Additionally, </w:t>
-      </w:r>
-      <w:r>
-        <w:t xml:space="preserve">there is no </w:t>
+        <w:t>Lake Mead storage volume</w:t>
+      </w:r>
+      <w:r>
+        <w:t xml:space="preserve">, even </w:t>
+      </w:r>
+      <w:r>
+        <w:t>as system conditions change</w:t>
+      </w:r>
+      <w:r>
+        <w:t>.</w:t>
+      </w:r>
+      <w:r>
+        <w:t xml:space="preserve"> </w:t>
+      </w:r>
+      <w:r>
+        <w:t>T</w:t>
+      </w:r>
+      <w:r>
+        <w:t xml:space="preserve">here is no </w:t>
       </w:r>
       <w:r>
         <w:t xml:space="preserve">elevation trigger that </w:t>
@@ -8411,25 +8557,258 @@
         <w:t xml:space="preserve">prohibits </w:t>
       </w:r>
       <w:r>
-        <w:t>withdraws</w:t>
-      </w:r>
-      <w:r>
-        <w:t xml:space="preserve"> of conserved water, thus providing users additional autonomy and adaptability</w:t>
+        <w:t>withdraws of conserved water, thus providing users additional autonomy and adaptability</w:t>
       </w:r>
       <w:r>
         <w:t>.</w:t>
       </w:r>
+      <w:r>
+        <w:t xml:space="preserve"> </w:t>
+      </w:r>
+      <w:r>
+        <w:t>Creating water accounts</w:t>
+      </w:r>
+      <w:r>
+        <w:t xml:space="preserve"> for any users or uses</w:t>
+      </w:r>
+      <w:r>
+        <w:t>—</w:t>
+      </w:r>
+      <w:r>
+        <w:t>such</w:t>
+      </w:r>
+      <w:r>
+        <w:t xml:space="preserve"> </w:t>
+      </w:r>
+      <w:r>
+        <w:t>as Tribal Nations, endangered species conservation programs, or flows to the Colorado River delta</w:t>
+      </w:r>
+      <w:r>
+        <w:t>—</w:t>
+      </w:r>
+      <w:r>
+        <w:t>offers additional autonomy and adaptability</w:t>
+      </w:r>
+      <w:r>
+        <w:t>.</w:t>
+      </w:r>
+      <w:r>
+        <w:t xml:space="preserve"> </w:t>
+      </w:r>
+      <w:r>
+        <w:t>The annual Lake Mead inflow is typically known at the beginning of the year because the annual Lake Powell release—that is set in Fall of each year—</w:t>
+      </w:r>
+      <w:r>
+        <w:t xml:space="preserve">is </w:t>
+      </w:r>
+      <w:r>
+        <w:t xml:space="preserve">often 85 to 91% of Mead inflow </w:t>
+      </w:r>
+      <w:r>
+        <w:fldChar w:fldCharType="begin"/>
+      </w:r>
+      <w:r>
+        <w:instrText xml:space="preserve"> ADDIN EN.CITE &lt;EndNote&gt;&lt;Cite&gt;&lt;Author&gt;Rosenberg&lt;/Author&gt;&lt;Year&gt;2022&lt;/Year&gt;&lt;RecNum&gt;2903&lt;/RecNum&gt;&lt;DisplayText&gt;(Rosenberg, 2022; Wang and Schmidt, 2020)&lt;/DisplayText&gt;&lt;record&gt;&lt;rec-number&gt;2903&lt;/rec-number&gt;&lt;foreign-keys&gt;&lt;key app="EN" db-id="xxt5ta9pd995dwesap0pdzzp2weaz0w9werf" timestamp="1663608602"&gt;2903&lt;/key&gt;&lt;/foreign-keys&gt;&lt;ref-type name="Journal Article"&gt;17&lt;/ref-type&gt;&lt;contributors&gt;&lt;authors&gt;&lt;author&gt;David E. Rosenberg&lt;/author&gt;&lt;/authors&gt;&lt;/contributors&gt;&lt;titles&gt;&lt;title&gt;Adapt Lake Mead Releases to Inflow to Give Managers More Flexibility to Slow Reservoir Drawdown&lt;/title&gt;&lt;secondary-title&gt;Journal of Water Resources Planning and Management&lt;/secondary-title&gt;&lt;/titles&gt;&lt;periodical&gt;&lt;full-title&gt;Journal of Water Resources Planning and Management&lt;/full-title&gt;&lt;/periodical&gt;&lt;pages&gt;02522006&lt;/pages&gt;&lt;volume&gt;148&lt;/volume&gt;&lt;number&gt;10&lt;/number&gt;&lt;dates&gt;&lt;year&gt;2022&lt;/year&gt;&lt;/dates&gt;&lt;urls&gt;&lt;related-urls&gt;&lt;url&gt;https://ascelibrary.org/doi/abs/10.1061/%28ASCE%29WR.1943-5452.0001592. Free version: https://digitalcommons.usu.edu/water_pubs/170/.&lt;/url&gt;&lt;/related-urls&gt;&lt;/urls&gt;&lt;electronic-resource-num&gt;https://doi.org/10.1061/(ASCE)WR.1943-5452.0001592&lt;/electronic-resource-num&gt;&lt;/record&gt;&lt;/Cite&gt;&lt;Cite&gt;&lt;Author&gt;Wang&lt;/Author&gt;&lt;Year&gt;2020&lt;/Year&gt;&lt;RecNum&gt;2782&lt;/RecNum&gt;&lt;record&gt;&lt;rec-number&gt;2782&lt;/rec-number&gt;&lt;foreign-keys&gt;&lt;key app="EN" db-id="xxt5ta9pd995dwesap0pdzzp2weaz0w9werf" timestamp="1620768668"&gt;2782&lt;/key&gt;&lt;/foreign-keys&gt;&lt;ref-type name="Report"&gt;27&lt;/ref-type&gt;&lt;contributors&gt;&lt;authors&gt;&lt;author&gt;Jian Wang&lt;/author&gt;&lt;author&gt;John C. Schmidt&lt;/author&gt;&lt;/authors&gt;&lt;/contributors&gt;&lt;titles&gt;&lt;title&gt;Stream flow and Losses of the Colorado River in the Southern Colorado Plateau&lt;/title&gt;&lt;/titles&gt;&lt;pages&gt;30&lt;/pages&gt;&lt;number&gt;White Paper #5&lt;/number&gt;&lt;dates&gt;&lt;year&gt;2020&lt;/year&gt;&lt;pub-dates&gt;&lt;date&gt;Febuary 10&lt;/date&gt;&lt;/pub-dates&gt;&lt;/dates&gt;&lt;pub-location&gt;Logan, Utah&lt;/pub-location&gt;&lt;publisher&gt;Center for Colorado River Studies, Utah State University&lt;/publisher&gt;&lt;urls&gt;&lt;related-urls&gt;&lt;url&gt;https://qcnr.usu.edu//coloradoriver/files/news/White-Paper-7.pdf&lt;/url&gt;&lt;/related-urls&gt;&lt;/urls&gt;&lt;/record&gt;&lt;/Cite&gt;&lt;/EndNote&gt;</w:instrText>
+      </w:r>
+      <w:r>
+        <w:fldChar w:fldCharType="separate"/>
+      </w:r>
+      <w:r>
+        <w:rPr>
+          <w:noProof/>
+        </w:rPr>
+        <w:t>(Rosenberg, 2022; Wang and Schmidt, 2020)</w:t>
+      </w:r>
+      <w:r>
+        <w:fldChar w:fldCharType="end"/>
+      </w:r>
+      <w:r>
+        <w:t>.</w:t>
+      </w:r>
+      <w:r>
+        <w:t xml:space="preserve"> </w:t>
+      </w:r>
     </w:p>
     <w:p>
       <w:pPr>
         <w:pStyle w:val="Heading1"/>
       </w:pPr>
       <w:r>
+        <w:t>Immersive Modeling to I</w:t>
+      </w:r>
+      <w:r>
+        <w:t>llustrat</w:t>
+      </w:r>
+      <w:r>
+        <w:t>e</w:t>
+      </w:r>
+      <w:r>
+        <w:t xml:space="preserve"> </w:t>
+      </w:r>
+      <w:r>
+        <w:t>Possible Uses of</w:t>
+      </w:r>
+      <w:r>
+        <w:t xml:space="preserve"> </w:t>
+      </w:r>
+      <w:r>
+        <w:t xml:space="preserve">a </w:t>
+      </w:r>
+      <w:r>
+        <w:t>Storage Protection Account</w:t>
+      </w:r>
+    </w:p>
+    <w:p>
+      <w:pPr>
+        <w:pStyle w:val="NoSpacing"/>
+      </w:pPr>
+      <w:r>
+        <w:t xml:space="preserve">Like </w:t>
+      </w:r>
+      <w:r>
+        <w:fldChar w:fldCharType="begin"/>
+      </w:r>
+      <w:r>
+        <w:instrText xml:space="preserve"> ADDIN EN.CITE &lt;EndNote&gt;&lt;Cite AuthorYear="1"&gt;&lt;Author&gt;Huizar&lt;/Author&gt;&lt;Year&gt;2023&lt;/Year&gt;&lt;RecNum&gt;3110&lt;/RecNum&gt;&lt;DisplayText&gt;Huizar et al. (2023)&lt;/DisplayText&gt;&lt;record&gt;&lt;rec-number&gt;3110&lt;/rec-number&gt;&lt;foreign-keys&gt;&lt;key app="EN" db-id="xxt5ta9pd995dwesap0pdzzp2weaz0w9werf" timestamp="1776715189"&gt;3110&lt;/key&gt;&lt;/foreign-keys&gt;&lt;ref-type name="Journal Article"&gt;17&lt;/ref-type&gt;&lt;contributors&gt;&lt;authors&gt;&lt;author&gt;Luis Huizar&lt;/author&gt;&lt;author&gt;Sarai Díaz&lt;/author&gt;&lt;author&gt;Kevin Lansey&lt;/author&gt;&lt;author&gt;Robert Arnold&lt;/author&gt;&lt;/authors&gt;&lt;/contributors&gt;&lt;titles&gt;&lt;title&gt;Water Supply in the Lower Colorado River Basin: Effectiveness of the 2019 Drought Contingency Plan&lt;/title&gt;&lt;secondary-title&gt;Journal of Environmental Engineering&lt;/secondary-title&gt;&lt;/titles&gt;&lt;periodical&gt;&lt;full-title&gt;Journal of Environmental Engineering&lt;/full-title&gt;&lt;/periodical&gt;&lt;pages&gt;04023058&lt;/pages&gt;&lt;volume&gt;149&lt;/volume&gt;&lt;number&gt;10&lt;/number&gt;&lt;dates&gt;&lt;year&gt;2023&lt;/year&gt;&lt;/dates&gt;&lt;urls&gt;&lt;related-urls&gt;&lt;url&gt;https://ascelibrary.org/doi/abs/10.1061/JOEEDU.EEENG-7324&lt;/url&gt;&lt;/related-urls&gt;&lt;/urls&gt;&lt;electronic-resource-num&gt;doi:10.1061/JOEEDU.EEENG-7324&lt;/electronic-resource-num&gt;&lt;/record&gt;&lt;/Cite&gt;&lt;/EndNote&gt;</w:instrText>
+      </w:r>
+      <w:r>
+        <w:fldChar w:fldCharType="separate"/>
+      </w:r>
+      <w:r>
+        <w:rPr>
+          <w:noProof/>
+        </w:rPr>
+        <w:t>Huizar et al. (2023)</w:t>
+      </w:r>
+      <w:r>
+        <w:fldChar w:fldCharType="end"/>
+      </w:r>
+      <w:r>
+        <w:t xml:space="preserve"> and </w:t>
+      </w:r>
+      <w:r>
+        <w:fldChar w:fldCharType="begin"/>
+      </w:r>
+      <w:r>
+        <w:instrText xml:space="preserve"> ADDIN EN.CITE &lt;EndNote&gt;&lt;Cite AuthorYear="1"&gt;&lt;Author&gt;USBR&lt;/Author&gt;&lt;Year&gt;2026&lt;/Year&gt;&lt;RecNum&gt;3124&lt;/RecNum&gt;&lt;DisplayText&gt;USBR (2026b)&lt;/DisplayText&gt;&lt;record&gt;&lt;rec-number&gt;3124&lt;/rec-number&gt;&lt;foreign-keys&gt;&lt;key app="EN" db-id="xxt5ta9pd995dwesap0pdzzp2weaz0w9werf" timestamp="1786136712"&gt;3124&lt;/key&gt;&lt;/foreign-keys&gt;&lt;ref-type name="Report"&gt;27&lt;/ref-type&gt;&lt;contributors&gt;&lt;authors&gt;&lt;author&gt;USBR&lt;/author&gt;&lt;/authors&gt;&lt;/contributors&gt;&lt;titles&gt;&lt;title&gt;Post-2026 Operational Guidelines and Strategies for Lake Powell and Lake Mead – Final Environmental Impact Statement&lt;/title&gt;&lt;/titles&gt;&lt;dates&gt;&lt;year&gt;2026&lt;/year&gt;&lt;/dates&gt;&lt;publisher&gt;U.S. Bureau of Reclamation&lt;/publisher&gt;&lt;urls&gt;&lt;related-urls&gt;&lt;url&gt;https://www.usbr.gov/ColoradoRiverBasin/post2026/final-eis/index.html&lt;/url&gt;&lt;/related-urls&gt;&lt;/urls&gt;&lt;/record&gt;&lt;/Cite&gt;&lt;/EndNote&gt;</w:instrText>
+      </w:r>
+      <w:r>
+        <w:fldChar w:fldCharType="separate"/>
+      </w:r>
+      <w:r>
+        <w:rPr>
+          <w:noProof/>
+        </w:rPr>
+        <w:t>USBR (2026b)</w:t>
+      </w:r>
+      <w:r>
+        <w:fldChar w:fldCharType="end"/>
+      </w:r>
+      <w:r>
+        <w:t xml:space="preserve">, it is difficult to predict and model users' water </w:t>
+      </w:r>
+      <w:r>
+        <w:t xml:space="preserve">future </w:t>
+      </w:r>
+      <w:r>
+        <w:t xml:space="preserve">consumption and conservation choices, and </w:t>
+      </w:r>
+      <w:r>
+        <w:t xml:space="preserve">the </w:t>
+      </w:r>
+      <w:r>
+        <w:t xml:space="preserve">corresponding Lake Mead storage volumes. Prediction is difficult </w:t>
+      </w:r>
+      <w:r>
+        <w:t xml:space="preserve">in water accounting frameworks </w:t>
+      </w:r>
+      <w:r>
+        <w:t xml:space="preserve">because </w:t>
+      </w:r>
+      <w:r>
+        <w:t xml:space="preserve">water </w:t>
+      </w:r>
+      <w:r>
+        <w:t xml:space="preserve">users can adapt </w:t>
+      </w:r>
+      <w:r>
         <w:lastRenderedPageBreak/>
-        <w:t xml:space="preserve">Illustrations of </w:t>
-      </w:r>
-      <w:r>
-        <w:t>Storage Protection Account</w:t>
+        <w:t xml:space="preserve">their choices year-to-year for a variety of reasons that are not readily coded into simulation models and rules. Here, we instead use </w:t>
+      </w:r>
+      <w:r>
+        <w:t xml:space="preserve">choices by </w:t>
+      </w:r>
+      <w:r>
+        <w:t xml:space="preserve">49 </w:t>
+      </w:r>
+      <w:r>
+        <w:t>collaborat</w:t>
+      </w:r>
+      <w:r>
+        <w:t xml:space="preserve">ing </w:t>
+      </w:r>
+      <w:r>
+        <w:t xml:space="preserve">Colorado River managers and experts during </w:t>
+      </w:r>
+      <w:r>
+        <w:t xml:space="preserve">16 </w:t>
+      </w:r>
+      <w:r>
+        <w:t xml:space="preserve">immersive, online, collaborative modeling sessions </w:t>
+      </w:r>
+      <w:r>
+        <w:t xml:space="preserve">going </w:t>
+      </w:r>
+      <w:r>
+        <w:t xml:space="preserve">back to May 2025 </w:t>
+      </w:r>
+      <w:r>
+        <w:t xml:space="preserve">to illustrate a few possibilities of water accounting. </w:t>
+      </w:r>
+      <w:r>
+        <w:t xml:space="preserve">We invited </w:t>
+      </w:r>
+      <w:r>
+        <w:t xml:space="preserve">experts </w:t>
+      </w:r>
+      <w:r>
+        <w:t xml:space="preserve">and basin managers from individual farmers </w:t>
+      </w:r>
+      <w:r>
+        <w:t xml:space="preserve">up </w:t>
+      </w:r>
+      <w:r>
+        <w:t>to</w:t>
+      </w:r>
+      <w:r>
+        <w:t xml:space="preserve"> people at the </w:t>
+      </w:r>
+      <w:r>
+        <w:t xml:space="preserve">highest levels of decision making. </w:t>
+      </w:r>
+      <w:r>
+        <w:t xml:space="preserve">We invited people with whom we </w:t>
+      </w:r>
+      <w:r>
+        <w:t xml:space="preserve">already had professional relationships, met at conferences, </w:t>
+      </w:r>
+      <w:r>
+        <w:t xml:space="preserve">or </w:t>
+      </w:r>
+      <w:r>
+        <w:t>emailed to ask for a 20-minute conversation</w:t>
+      </w:r>
+      <w:r>
+        <w:t xml:space="preserve"> to learn more about their work</w:t>
+      </w:r>
+      <w:r>
+        <w:t xml:space="preserve"> </w:t>
+      </w:r>
+      <w:r>
+        <w:t xml:space="preserve">and then </w:t>
+      </w:r>
+      <w:r>
+        <w:t>invite them to join a session.</w:t>
       </w:r>
     </w:p>
     <w:p>
@@ -8437,13 +8816,125 @@
         <w:pStyle w:val="NoSpacing"/>
       </w:pPr>
       <w:r>
-        <w:t xml:space="preserve">Like </w:t>
+        <w:t xml:space="preserve">Within a session, collaborators immersed in and personified a Lake Mead </w:t>
+      </w:r>
+      <w:r>
+        <w:t xml:space="preserve">water </w:t>
+      </w:r>
+      <w:r>
+        <w:t xml:space="preserve">user. The user roles were </w:t>
+      </w:r>
+      <w:r>
+        <w:t>USBR</w:t>
+      </w:r>
+      <w:r>
+        <w:t xml:space="preserve"> (protection volume), California, Arizona, Nevada, Mexico, and Tribal Nations of the Lower Basin. </w:t>
+      </w:r>
+      <w:r>
+        <w:t xml:space="preserve">Collaborators first identified their risk(s) of water shortages and articulated strategies to manage their risk(s). The collaborator </w:t>
+      </w:r>
+      <w:r>
+        <w:t>who immersed in the USBR role also selected a protection account volume. Next, we as researches chose the annual inflow to Lake Mead. We</w:t>
+      </w:r>
+      <w:r>
+        <w:t xml:space="preserve"> chose </w:t>
+      </w:r>
+      <w:r>
+        <w:t>inflows well below historical inflows to stress the system</w:t>
+      </w:r>
+      <w:r>
+        <w:t>.</w:t>
+      </w:r>
+      <w:r>
+        <w:t xml:space="preserve"> </w:t>
+      </w:r>
+      <w:r>
+        <w:t xml:space="preserve">The model apportioned the inflow among the user accounts. Then, each collaborator consumed, conserved, or traded within their account balance. Collaborators carried over account balances to the next year, which also kept Lake Mead storage above the protection volume. </w:t>
+      </w:r>
+      <w:r>
+        <w:t xml:space="preserve">Sessions lasted for 1 to 3 years. </w:t>
+      </w:r>
+      <w:r>
+        <w:t xml:space="preserve">At the end of each session we asked collaborators </w:t>
+      </w:r>
+      <w:r>
+        <w:rPr>
+          <w:i/>
+          <w:iCs/>
+        </w:rPr>
+        <w:t xml:space="preserve">why </w:t>
+      </w:r>
+      <w:r>
+        <w:t xml:space="preserve">they made their choices, </w:t>
+      </w:r>
+      <w:r>
+        <w:rPr>
+          <w:i/>
+          <w:iCs/>
+        </w:rPr>
+        <w:t>which</w:t>
+      </w:r>
+      <w:r>
+        <w:t xml:space="preserve"> </w:t>
+      </w:r>
+      <w:r>
+        <w:t xml:space="preserve">new insights did they take from the model session, and </w:t>
+      </w:r>
+      <w:r>
+        <w:rPr>
+          <w:i/>
+          <w:iCs/>
+        </w:rPr>
+        <w:t>how</w:t>
+      </w:r>
+      <w:r>
+        <w:t xml:space="preserve"> the session would impact their work going forward. </w:t>
+      </w:r>
+      <w:r>
+        <w:t>Each</w:t>
+      </w:r>
+      <w:r>
+        <w:t xml:space="preserve"> collaborator participated in one session</w:t>
+      </w:r>
+      <w:r>
+        <w:t xml:space="preserve"> and played a role different than themselves. S</w:t>
+      </w:r>
+      <w:r>
+        <w:t xml:space="preserve">essions had 1 to 7 people </w:t>
+      </w:r>
+      <w:r>
+        <w:t xml:space="preserve">and each session lasted ~ 2 hours. </w:t>
+      </w:r>
+      <w:r>
+        <w:t>In sessions with less than 6 people, some collaborators played multiple</w:t>
+      </w:r>
+      <w:r>
+        <w:t xml:space="preserve"> roles</w:t>
+      </w:r>
+      <w:r>
+        <w:t>. In the session with 7 people, 2 collaborators partnered and played the same</w:t>
+      </w:r>
+      <w:r>
+        <w:t xml:space="preserve"> role</w:t>
+      </w:r>
+      <w:r>
+        <w:t>.</w:t>
+      </w:r>
+      <w:r>
+        <w:t xml:space="preserve"> </w:t>
+      </w:r>
+      <w:r>
+        <w:t xml:space="preserve">Otherwise, sessions followed the structure of prior immersive modeling </w:t>
+      </w:r>
+      <w:r>
+        <w:lastRenderedPageBreak/>
+        <w:t xml:space="preserve">work </w:t>
       </w:r>
       <w:r>
         <w:fldChar w:fldCharType="begin"/>
       </w:r>
       <w:r>
-        <w:instrText xml:space="preserve"> ADDIN EN.CITE &lt;EndNote&gt;&lt;Cite AuthorYear="1"&gt;&lt;Author&gt;Huizar&lt;/Author&gt;&lt;Year&gt;2023&lt;/Year&gt;&lt;RecNum&gt;3110&lt;/RecNum&gt;&lt;DisplayText&gt;Huizar et al. (2023)&lt;/DisplayText&gt;&lt;record&gt;&lt;rec-number&gt;3110&lt;/rec-number&gt;&lt;foreign-keys&gt;&lt;key app="EN" db-id="xxt5ta9pd995dwesap0pdzzp2weaz0w9werf" timestamp="1776715189"&gt;3110&lt;/key&gt;&lt;/foreign-keys&gt;&lt;ref-type name="Journal Article"&gt;17&lt;/ref-type&gt;&lt;contributors&gt;&lt;authors&gt;&lt;author&gt;Luis Huizar&lt;/author&gt;&lt;author&gt;Sarai Díaz&lt;/author&gt;&lt;author&gt;Kevin Lansey&lt;/author&gt;&lt;author&gt;Robert Arnold&lt;/author&gt;&lt;/authors&gt;&lt;/contributors&gt;&lt;titles&gt;&lt;title&gt;Water Supply in the Lower Colorado River Basin: Effectiveness of the 2019 Drought Contingency Plan&lt;/title&gt;&lt;secondary-title&gt;Journal of Environmental Engineering&lt;/secondary-title&gt;&lt;/titles&gt;&lt;periodical&gt;&lt;full-title&gt;Journal of Environmental Engineering&lt;/full-title&gt;&lt;/periodical&gt;&lt;pages&gt;04023058&lt;/pages&gt;&lt;volume&gt;149&lt;/volume&gt;&lt;number&gt;10&lt;/number&gt;&lt;dates&gt;&lt;year&gt;2023&lt;/year&gt;&lt;/dates&gt;&lt;urls&gt;&lt;related-urls&gt;&lt;url&gt;https://ascelibrary.org/doi/abs/10.1061/JOEEDU.EEENG-7324&lt;/url&gt;&lt;/related-urls&gt;&lt;/urls&gt;&lt;electronic-resource-num&gt;doi:10.1061/JOEEDU.EEENG-7324&lt;/electronic-resource-num&gt;&lt;/record&gt;&lt;/Cite&gt;&lt;/EndNote&gt;</w:instrText>
+        <w:instrText xml:space="preserve"> ADDIN EN.CITE &lt;EndNote&gt;&lt;Cite&gt;&lt;Author&gt;Rosenberg&lt;/Author&gt;&lt;Year&gt;2024&lt;/Year&gt;&lt;RecNum&gt;2847&lt;/RecNum&gt;&lt;DisplayText&gt;(Rosenberg, 2024)&lt;/DisplayText&gt;&lt;record&gt;&lt;rec-number&gt;2847&lt;/rec-number&gt;&lt;foreign-keys&gt;&lt;key app="EN" db-id="xxt5ta9pd995dwesap0pdzzp2weaz0w9werf" timestamp="1642471467"&gt;2847&lt;/key&gt;&lt;/foreign-keys&gt;&lt;ref-type name="Journal Article"&gt;17&lt;/ref-type&gt;&lt;contributors&gt;&lt;authors&gt;&lt;author&gt;David E. Rosenberg&lt;/author&gt;&lt;/authors&gt;&lt;/contributors&gt;&lt;titles&gt;&lt;title&gt;Lessons from immersive online collaborative modeling to discuss more adaptive reservoir operations&lt;/title&gt;&lt;secondary-title&gt;Journal of Water Resources Planning and Management&lt;/secondary-title&gt;&lt;/titles&gt;&lt;periodical&gt;&lt;full-title&gt;Journal of Water Resources Planning and Management&lt;/full-title&gt;&lt;/periodical&gt;&lt;volume&gt;150&lt;/volume&gt;&lt;number&gt;7&lt;/number&gt;&lt;dates&gt;&lt;year&gt;2024&lt;/year&gt;&lt;/dates&gt;&lt;publisher&gt;American Society of Civil Engineers&lt;/publisher&gt;&lt;urls&gt;&lt;related-urls&gt;&lt;url&gt;https://doi.org/10.4211/hs.e0cbe52ad4524c07bb5b7ff8c373a343&lt;/url&gt;&lt;/related-urls&gt;&lt;/urls&gt;&lt;electronic-resource-num&gt;https://doi.org/10.1061/JWRMD5.WRENG-5893&lt;/electronic-resource-num&gt;&lt;/record&gt;&lt;/Cite&gt;&lt;/EndNote&gt;</w:instrText>
       </w:r>
       <w:r>
         <w:fldChar w:fldCharType="separate"/>
@@ -8452,211 +8943,78 @@
         <w:rPr>
           <w:noProof/>
         </w:rPr>
-        <w:t>Huizar et al. (2023)</w:t>
+        <w:t>(Rosenberg, 2024)</w:t>
       </w:r>
       <w:r>
         <w:fldChar w:fldCharType="end"/>
       </w:r>
       <w:r>
-        <w:t xml:space="preserve"> and </w:t>
-      </w:r>
-      <w:r>
-        <w:fldChar w:fldCharType="begin"/>
-      </w:r>
-      <w:r>
-        <w:instrText xml:space="preserve"> ADDIN EN.CITE &lt;EndNote&gt;&lt;Cite&gt;&lt;Author&gt;USBR&lt;/Author&gt;&lt;Year&gt;2026&lt;/Year&gt;&lt;RecNum&gt;3124&lt;/RecNum&gt;&lt;DisplayText&gt;(USBR, 2026b)&lt;/DisplayText&gt;&lt;record&gt;&lt;rec-number&gt;3124&lt;/rec-number&gt;&lt;foreign-keys&gt;&lt;key app="EN" db-id="xxt5ta9pd995dwesap0pdzzp2weaz0w9werf" timestamp="1786136712"&gt;3124&lt;/key&gt;&lt;/foreign-keys&gt;&lt;ref-type name="Report"&gt;27&lt;/ref-type&gt;&lt;contributors&gt;&lt;authors&gt;&lt;author&gt;USBR&lt;/author&gt;&lt;/authors&gt;&lt;/contributors&gt;&lt;titles&gt;&lt;title&gt;Post-2026 Operational Guidelines and Strategies for Lake Powell and Lake Mead – Final Environmental Impact Statement&lt;/title&gt;&lt;/titles&gt;&lt;dates&gt;&lt;year&gt;2026&lt;/year&gt;&lt;/dates&gt;&lt;publisher&gt;U.S. Bureau of Reclamation&lt;/publisher&gt;&lt;urls&gt;&lt;related-urls&gt;&lt;url&gt;https://www.usbr.gov/ColoradoRiverBasin/post2026/final-eis/index.html&lt;/url&gt;&lt;/related-urls&gt;&lt;/urls&gt;&lt;/record&gt;&lt;/Cite&gt;&lt;/EndNote&gt;</w:instrText>
-      </w:r>
-      <w:r>
-        <w:fldChar w:fldCharType="separate"/>
-      </w:r>
-      <w:r>
-        <w:rPr>
-          <w:noProof/>
-        </w:rPr>
-        <w:t>(USBR, 2026b)</w:t>
-      </w:r>
-      <w:r>
-        <w:fldChar w:fldCharType="end"/>
-      </w:r>
-      <w:r>
-        <w:t xml:space="preserve">, it is difficult to predict and model users' water consumption and conservation choices, and </w:t>
-      </w:r>
-      <w:r>
-        <w:t xml:space="preserve">the </w:t>
-      </w:r>
-      <w:r>
-        <w:t xml:space="preserve">corresponding Lake Mead storage volumes. Prediction is difficult </w:t>
-      </w:r>
-      <w:r>
-        <w:t xml:space="preserve">in water accounting frameworks </w:t>
-      </w:r>
-      <w:r>
-        <w:t xml:space="preserve">because </w:t>
-      </w:r>
-      <w:r>
-        <w:t xml:space="preserve">water </w:t>
-      </w:r>
-      <w:r>
-        <w:t xml:space="preserve">users can adapt their choices year-to-year for a variety of reasons that are not readily coded into simulation models and rules. Here, we instead use </w:t>
-      </w:r>
-      <w:r>
-        <w:t xml:space="preserve">49 </w:t>
-      </w:r>
-      <w:r>
-        <w:t>collaborator</w:t>
-      </w:r>
-      <w:r>
-        <w:t>’s</w:t>
-      </w:r>
-      <w:r>
-        <w:t xml:space="preserve"> choices in </w:t>
-      </w:r>
-      <w:r>
-        <w:t xml:space="preserve">16 </w:t>
-      </w:r>
-      <w:r>
-        <w:t xml:space="preserve">immersive, online, collaborative modeling sessions </w:t>
-      </w:r>
-      <w:r>
-        <w:t xml:space="preserve">going </w:t>
-      </w:r>
-      <w:r>
-        <w:t xml:space="preserve">back to May 2025 </w:t>
-      </w:r>
-      <w:r>
-        <w:t xml:space="preserve">to illustrate a few possibilities of water accounting. Within a session, collaborators immersed in and personified a Lake Mead </w:t>
-      </w:r>
-      <w:r>
-        <w:t xml:space="preserve">water </w:t>
-      </w:r>
-      <w:r>
-        <w:t xml:space="preserve">user. The user roles were </w:t>
+        <w:t>.</w:t>
+      </w:r>
+      <w:r>
+        <w:t xml:space="preserve"> </w:t>
+      </w:r>
+      <w:r>
+        <w:t>This work was conducted under Utah State University Institutional Review Board protocol #</w:t>
+      </w:r>
+      <w:r>
+        <w:t>14808.</w:t>
+      </w:r>
+    </w:p>
+    <w:p>
+      <w:pPr>
+        <w:pStyle w:val="NoSpacing"/>
+      </w:pPr>
+      <w:r>
+        <w:t>Here we focus on some of the quantitative results from session</w:t>
+      </w:r>
+      <w:r>
+        <w:t xml:space="preserve">s. </w:t>
+      </w:r>
+      <w:r>
+        <w:t xml:space="preserve">Figure 6 shows results from one session where the person who immersed in the </w:t>
       </w:r>
       <w:r>
         <w:t>USBR</w:t>
       </w:r>
       <w:r>
-        <w:t xml:space="preserve"> (protection volume), California, Arizona, Nevada, Mexico, and Tribal Nations of the Lower Basin. Each year, we chose and revealed the Lake Mead inflow. </w:t>
-      </w:r>
-      <w:r>
-        <w:t xml:space="preserve">We chose </w:t>
-      </w:r>
-      <w:r>
-        <w:t>inflows well below historical inflows to stress the system</w:t>
+        <w:t xml:space="preserve"> role chose a protection volume of </w:t>
+      </w:r>
+      <w:r>
+        <w:t>4.5</w:t>
+      </w:r>
+      <w:r>
+        <w:t xml:space="preserve"> million acre-feet (1,0</w:t>
+      </w:r>
+      <w:r>
+        <w:t>0</w:t>
+      </w:r>
+      <w:r>
+        <w:t>0 feet). The remaining collaborators reserved 1.</w:t>
+      </w:r>
+      <w:r>
+        <w:t>0</w:t>
+      </w:r>
+      <w:r>
+        <w:t xml:space="preserve"> to </w:t>
+      </w:r>
+      <w:r>
+        <w:t>1.9</w:t>
+      </w:r>
+      <w:r>
+        <w:t xml:space="preserve"> million acre-feet in their accounts, keeping Lake Mead storage above the protection elevation even with inflows of 3.8, 6.3, and 4.0 million acre-feet</w:t>
+      </w:r>
+      <w:r>
+        <w:t xml:space="preserve"> per year</w:t>
       </w:r>
       <w:r>
         <w:t>.</w:t>
       </w:r>
-      <w:r>
-        <w:t xml:space="preserve"> </w:t>
-      </w:r>
-      <w:r>
-        <w:t>The model apportioned the inflow among the user accounts. Then, each collaborator consumed, conserved, or traded within their account balance. Collaborators carried over account balances to the next year, which also kept Lake Mead storage above the protection volume. Each collaborator participated in one session</w:t>
-      </w:r>
-      <w:r>
-        <w:t xml:space="preserve"> and played a role different than themselves. S</w:t>
-      </w:r>
-      <w:r>
-        <w:t xml:space="preserve">essions had 1 to 7 people </w:t>
-      </w:r>
-      <w:r>
-        <w:t xml:space="preserve">and each session lasted ~ 2 hours. </w:t>
-      </w:r>
-      <w:r>
-        <w:t>In sessions with less than 6 people, some collaborators played multiple</w:t>
-      </w:r>
-      <w:r>
-        <w:t xml:space="preserve"> roles</w:t>
-      </w:r>
-      <w:r>
-        <w:t>. In the session with 7 people, 2 collaborators partnered and played the same</w:t>
-      </w:r>
-      <w:r>
-        <w:t xml:space="preserve"> role</w:t>
-      </w:r>
-      <w:r>
-        <w:t>.</w:t>
-      </w:r>
-      <w:r>
-        <w:t xml:space="preserve"> </w:t>
-      </w:r>
-      <w:r>
-        <w:t xml:space="preserve">Otherwise, sessions followed the structure of prior immersive modeling work </w:t>
-      </w:r>
-      <w:r>
-        <w:fldChar w:fldCharType="begin"/>
-      </w:r>
-      <w:r>
-        <w:instrText xml:space="preserve"> ADDIN EN.CITE &lt;EndNote&gt;&lt;Cite&gt;&lt;Author&gt;Rosenberg&lt;/Author&gt;&lt;Year&gt;2024&lt;/Year&gt;&lt;RecNum&gt;2847&lt;/RecNum&gt;&lt;DisplayText&gt;(Rosenberg, 2024)&lt;/DisplayText&gt;&lt;record&gt;&lt;rec-number&gt;2847&lt;/rec-number&gt;&lt;foreign-keys&gt;&lt;key app="EN" db-id="xxt5ta9pd995dwesap0pdzzp2weaz0w9werf" timestamp="1642471467"&gt;2847&lt;/key&gt;&lt;/foreign-keys&gt;&lt;ref-type name="Journal Article"&gt;17&lt;/ref-type&gt;&lt;contributors&gt;&lt;authors&gt;&lt;author&gt;David E. Rosenberg&lt;/author&gt;&lt;/authors&gt;&lt;/contributors&gt;&lt;titles&gt;&lt;title&gt;Lessons from immersive online collaborative modeling to discuss more adaptive reservoir operations&lt;/title&gt;&lt;secondary-title&gt;Journal of Water Resources Planning and Management&lt;/secondary-title&gt;&lt;/titles&gt;&lt;periodical&gt;&lt;full-title&gt;Journal of Water Resources Planning and Management&lt;/full-title&gt;&lt;/periodical&gt;&lt;volume&gt;150&lt;/volume&gt;&lt;number&gt;7&lt;/number&gt;&lt;dates&gt;&lt;year&gt;2024&lt;/year&gt;&lt;/dates&gt;&lt;publisher&gt;American Society of Civil Engineers&lt;/publisher&gt;&lt;urls&gt;&lt;related-urls&gt;&lt;url&gt;https://doi.org/10.4211/hs.e0cbe52ad4524c07bb5b7ff8c373a343&lt;/url&gt;&lt;/related-urls&gt;&lt;/urls&gt;&lt;electronic-resource-num&gt;https://doi.org/10.1061/JWRMD5.WRENG-5893&lt;/electronic-resource-num&gt;&lt;/record&gt;&lt;/Cite&gt;&lt;/EndNote&gt;</w:instrText>
-      </w:r>
-      <w:r>
-        <w:fldChar w:fldCharType="separate"/>
-      </w:r>
-      <w:r>
-        <w:rPr>
-          <w:noProof/>
-        </w:rPr>
-        <w:t>(Rosenberg, 2024)</w:t>
-      </w:r>
-      <w:r>
-        <w:fldChar w:fldCharType="end"/>
-      </w:r>
-      <w:r>
-        <w:t>.</w:t>
-      </w:r>
-      <w:r>
-        <w:t xml:space="preserve"> </w:t>
-      </w:r>
-      <w:r>
-        <w:t>This work was conducted under Utah State University Institutional Review Board protocol #</w:t>
-      </w:r>
-      <w:r>
-        <w:t>14808.</w:t>
-      </w:r>
     </w:p>
     <w:p>
       <w:pPr>
         <w:pStyle w:val="NoSpacing"/>
       </w:pPr>
-      <w:r>
-        <w:t xml:space="preserve">Figure 6 shows results from one session where the person who immersed in the </w:t>
-      </w:r>
-      <w:r>
-        <w:t>USBR</w:t>
-      </w:r>
-      <w:r>
-        <w:t xml:space="preserve"> role chose a protection volume of </w:t>
-      </w:r>
-      <w:r>
-        <w:t>4.5</w:t>
-      </w:r>
-      <w:r>
-        <w:t xml:space="preserve"> million acre-feet (1,0</w:t>
-      </w:r>
-      <w:r>
-        <w:t>0</w:t>
-      </w:r>
-      <w:r>
-        <w:t>0 feet). The remaining collaborators reserved 1.</w:t>
-      </w:r>
-      <w:r>
-        <w:t>0</w:t>
-      </w:r>
-      <w:r>
-        <w:t xml:space="preserve"> to </w:t>
-      </w:r>
-      <w:r>
-        <w:t>1.9</w:t>
-      </w:r>
-      <w:r>
-        <w:t xml:space="preserve"> million acre-feet in their accounts, keeping Lake Mead storage above the protection elevation even with inflows of 3.8, 6.3, and 4.0 million acre-feet</w:t>
-      </w:r>
-      <w:r>
-        <w:t xml:space="preserve"> per year</w:t>
-      </w:r>
-      <w:r>
-        <w:t>.</w:t>
-      </w:r>
     </w:p>
     <w:p>
       <w:pPr>
@@ -8670,7 +9028,6 @@
         <w:rPr>
           <w:noProof/>
         </w:rPr>
-        <w:lastRenderedPageBreak/>
         <w:drawing>
           <wp:inline distT="0" distB="0" distL="0" distR="0" wp14:anchorId="015B59BF" wp14:editId="77BE6060">
             <wp:extent cx="5943600" cy="3184525"/>
@@ -8814,7 +9171,11 @@
         <w:t xml:space="preserve"> </w:t>
       </w:r>
       <w:r>
-        <w:t xml:space="preserve">6.3 million acre-ft of active storage; Figure </w:t>
+        <w:t xml:space="preserve">6.3 million </w:t>
+      </w:r>
+      <w:r>
+        <w:lastRenderedPageBreak/>
+        <w:t xml:space="preserve">acre-ft of active storage; Figure </w:t>
       </w:r>
       <w:r>
         <w:t>7</w:t>
@@ -8904,62 +9265,62 @@
         <w:t xml:space="preserve"> </w:t>
       </w:r>
       <w:r>
+        <w:t xml:space="preserve">users </w:t>
+      </w:r>
+      <w:r>
+        <w:t xml:space="preserve">with low account balances. Those users </w:t>
+      </w:r>
+      <w:r>
+        <w:t xml:space="preserve">then </w:t>
+      </w:r>
+      <w:r>
+        <w:t>consumed th</w:t>
+      </w:r>
+      <w:r>
+        <w:t>e</w:t>
+      </w:r>
+      <w:r>
+        <w:t xml:space="preserve"> sold water</w:t>
+      </w:r>
+      <w:r>
+        <w:t xml:space="preserve">, </w:t>
+      </w:r>
+      <w:r>
+        <w:t>lower</w:t>
+      </w:r>
+      <w:r>
+        <w:t>ing</w:t>
+      </w:r>
+      <w:r>
+        <w:t xml:space="preserve"> Lake Mead below the protection elevation</w:t>
+      </w:r>
+      <w:r>
+        <w:t xml:space="preserve"> (red diamonds in Figure </w:t>
+      </w:r>
+      <w:r>
+        <w:t>7</w:t>
+      </w:r>
+      <w:r>
+        <w:t>).</w:t>
+      </w:r>
+      <w:r>
+        <w:t xml:space="preserve"> These examples illustrate some of many more autonomous and adaptive strategies that water users can adopt within a water accounting framework.</w:t>
+      </w:r>
+    </w:p>
+    <w:p>
+      <w:pPr>
+        <w:pStyle w:val="FigureCaption"/>
+      </w:pPr>
+      <w:r>
+        <w:rPr>
+          <w:noProof/>
+        </w:rPr>
         <w:lastRenderedPageBreak/>
-        <w:t xml:space="preserve">users </w:t>
-      </w:r>
-      <w:r>
-        <w:t xml:space="preserve">with low account balances. Those users </w:t>
-      </w:r>
-      <w:r>
-        <w:t xml:space="preserve">then </w:t>
-      </w:r>
-      <w:r>
-        <w:t>consumed th</w:t>
-      </w:r>
-      <w:r>
-        <w:t>e</w:t>
-      </w:r>
-      <w:r>
-        <w:t xml:space="preserve"> sold water</w:t>
-      </w:r>
-      <w:r>
-        <w:t xml:space="preserve">, </w:t>
-      </w:r>
-      <w:r>
-        <w:t>lower</w:t>
-      </w:r>
-      <w:r>
-        <w:t>ing</w:t>
-      </w:r>
-      <w:r>
-        <w:t xml:space="preserve"> Lake Mead below the protection elevation</w:t>
-      </w:r>
-      <w:r>
-        <w:t xml:space="preserve"> (red diamonds in Figure </w:t>
-      </w:r>
-      <w:r>
-        <w:t>7</w:t>
-      </w:r>
-      <w:r>
-        <w:t>).</w:t>
-      </w:r>
-      <w:r>
-        <w:t xml:space="preserve"> These examples illustrate some of many more autonomous and adaptive strategies that water users can adopt within a water accounting framework.</w:t>
-      </w:r>
-    </w:p>
-    <w:p>
-      <w:pPr>
-        <w:pStyle w:val="FigureCaption"/>
-      </w:pPr>
-      <w:r>
-        <w:rPr>
-          <w:noProof/>
-        </w:rPr>
         <w:drawing>
-          <wp:inline distT="0" distB="0" distL="0" distR="0" wp14:anchorId="1381E3AB" wp14:editId="42628701">
-            <wp:extent cx="5539839" cy="3229351"/>
-            <wp:effectExtent l="0" t="0" r="3810" b="9525"/>
-            <wp:docPr id="18750097" name="Picture 7"/>
+          <wp:inline distT="0" distB="0" distL="0" distR="0" wp14:anchorId="04745072" wp14:editId="19DD414E">
+            <wp:extent cx="5937885" cy="3461385"/>
+            <wp:effectExtent l="0" t="0" r="5715" b="5715"/>
+            <wp:docPr id="1561555861" name="Picture 2"/>
             <wp:cNvGraphicFramePr>
               <a:graphicFrameLocks xmlns:a="http://schemas.openxmlformats.org/drawingml/2006/main" noChangeAspect="1"/>
             </wp:cNvGraphicFramePr>
@@ -8967,7 +9328,7 @@
               <a:graphicData uri="http://schemas.openxmlformats.org/drawingml/2006/picture">
                 <pic:pic xmlns:pic="http://schemas.openxmlformats.org/drawingml/2006/picture">
                   <pic:nvPicPr>
-                    <pic:cNvPr id="0" name="Picture 6"/>
+                    <pic:cNvPr id="0" name="Picture 1"/>
                     <pic:cNvPicPr>
                       <a:picLocks noChangeAspect="1" noChangeArrowheads="1"/>
                     </pic:cNvPicPr>
@@ -8988,7 +9349,7 @@
                   <pic:spPr bwMode="auto">
                     <a:xfrm>
                       <a:off x="0" y="0"/>
-                      <a:ext cx="5548218" cy="3234236"/>
+                      <a:ext cx="5937885" cy="3461385"/>
                     </a:xfrm>
                     <a:prstGeom prst="rect">
                       <a:avLst/>
@@ -9005,7 +9366,7 @@
         </w:drawing>
       </w:r>
       <w:r>
-        <w:t xml:space="preserve">Figure </w:t>
+        <w:t xml:space="preserve"> </w:t>
       </w:r>
       <w:r>
         <w:rPr>
@@ -9068,7 +9429,7 @@
           <w:b/>
           <w:bCs/>
         </w:rPr>
-        <w:t>esulting storage was expressed as a fraction of the chosen protection volume (y axis).</w:t>
+        <w:t>esulting storage expressed as a fraction of the chosen protection volume (y axis).</w:t>
       </w:r>
       <w:r>
         <w:t xml:space="preserve"> Inflows were 3.8, 6.3, and 4.0 million acre-feet per year. Blue circles above the purple dashed line of 1.0 showed sessions and years where collaborators maintained Lake Mead storage at or above the protection </w:t>
@@ -9147,18 +9508,15 @@
         <w:fldChar w:fldCharType="end"/>
       </w:r>
       <w:r>
-        <w:t xml:space="preserve">. Since 2022, </w:t>
-      </w:r>
+        <w:t>. Since 2022, conservation efforts by California, Arizona, Nevada, and Mexico have kept Lake Mead above its protection elevation of 1,020 feet set in the 2019 Lower Drought Contingency Plan.</w:t>
+      </w:r>
+    </w:p>
+    <w:p>
+      <w:pPr>
+        <w:pStyle w:val="NoSpacing"/>
+      </w:pPr>
       <w:r>
         <w:lastRenderedPageBreak/>
-        <w:t>conservation efforts by California, Arizona, Nevada, and Mexico have kept Lake Mead above its protection elevation of 1,020 feet set in the 2019 Lower Drought Contingency Plan.</w:t>
-      </w:r>
-    </w:p>
-    <w:p>
-      <w:pPr>
-        <w:pStyle w:val="NoSpacing"/>
-      </w:pPr>
-      <w:r>
         <w:t xml:space="preserve">To expand program participation and increase operational flexibility, prior researchers suggested raising upper limits on water conservation account balances </w:t>
       </w:r>
       <w:r>
@@ -9442,11 +9800,7 @@
         <w:t>USBR</w:t>
       </w:r>
       <w:r>
-        <w:t xml:space="preserve"> and the users and allows users to consume, conserve, </w:t>
-      </w:r>
-      <w:r>
-        <w:lastRenderedPageBreak/>
-        <w:t>and trade within their water account balance. There are several other benefits of our proposals, which increase user autonomy and adaptability.</w:t>
+        <w:t xml:space="preserve"> and the users and allows users to consume, conserve, and trade within their water account balance. There are several other benefits of our proposals, which increase user autonomy and adaptability.</w:t>
       </w:r>
     </w:p>
     <w:p>
@@ -9462,6 +9816,7 @@
           <w:b/>
           <w:bCs/>
         </w:rPr>
+        <w:lastRenderedPageBreak/>
         <w:t>Current water conservation account balances can be rolled over</w:t>
       </w:r>
       <w:r>
@@ -9665,36 +10020,33 @@
         <w:t xml:space="preserve"> </w:t>
       </w:r>
       <w:r>
-        <w:t xml:space="preserve">through Grand Canyon become the inflow to Lake </w:t>
-      </w:r>
+        <w:t xml:space="preserve">through Grand Canyon become the inflow to Lake Mead. </w:t>
+      </w:r>
+      <w:r>
+        <w:t>USBR</w:t>
+      </w:r>
+      <w:r>
+        <w:t xml:space="preserve"> can then take the</w:t>
+      </w:r>
+      <w:r>
+        <w:t xml:space="preserve"> </w:t>
+      </w:r>
+      <w:r>
+        <w:t>first share of inflow equal to Lake Mead evaporation to sustain the Lake Mead protection</w:t>
+      </w:r>
+      <w:r>
+        <w:t xml:space="preserve"> </w:t>
+      </w:r>
+      <w:r>
+        <w:t>account balance.</w:t>
+      </w:r>
+    </w:p>
+    <w:p>
+      <w:pPr>
+        <w:pStyle w:val="NoSpacing"/>
+      </w:pPr>
       <w:r>
         <w:lastRenderedPageBreak/>
-        <w:t xml:space="preserve">Mead. </w:t>
-      </w:r>
-      <w:r>
-        <w:t>USBR</w:t>
-      </w:r>
-      <w:r>
-        <w:t xml:space="preserve"> can then take the</w:t>
-      </w:r>
-      <w:r>
-        <w:t xml:space="preserve"> </w:t>
-      </w:r>
-      <w:r>
-        <w:t>first share of inflow equal to Lake Mead evaporation to sustain the Lake Mead protection</w:t>
-      </w:r>
-      <w:r>
-        <w:t xml:space="preserve"> </w:t>
-      </w:r>
-      <w:r>
-        <w:t>account balance.</w:t>
-      </w:r>
-    </w:p>
-    <w:p>
-      <w:pPr>
-        <w:pStyle w:val="NoSpacing"/>
-      </w:pPr>
-      <w:r>
         <w:t>There are a</w:t>
       </w:r>
       <w:r>
@@ -9932,25 +10284,508 @@
         <w:t>2</w:t>
       </w:r>
       <w:r>
-        <w:t xml:space="preserve"> maf of unassigned </w:t>
-      </w:r>
+        <w:t xml:space="preserve"> maf of unassigned storage. This storage could be assigned to users such as</w:t>
+      </w:r>
+      <w:r>
+        <w:t xml:space="preserve"> Tribal Nations, who were previously excluded from participation</w:t>
+      </w:r>
+      <w:r>
+        <w:t>.</w:t>
+      </w:r>
+    </w:p>
+    <w:p>
+      <w:pPr>
+        <w:pStyle w:val="NoSpacing"/>
+      </w:pPr>
       <w:r>
         <w:lastRenderedPageBreak/>
-        <w:t>storage. This storage could be assigned to users such as</w:t>
-      </w:r>
-      <w:r>
-        <w:t xml:space="preserve"> Tribal Nations, who were previously excluded from participation</w:t>
+        <w:t>The proposals described in this paper were submitted as public input to USBR in November 2025 and March 2026. On August 1, 2026, USBR released its Final Environmental Impact Statement</w:t>
+      </w:r>
+      <w:r>
+        <w:t xml:space="preserve"> </w:t>
+      </w:r>
+      <w:r>
+        <w:fldChar w:fldCharType="begin"/>
+      </w:r>
+      <w:r>
+        <w:instrText xml:space="preserve"> ADDIN EN.CITE &lt;EndNote&gt;&lt;Cite&gt;&lt;Author&gt;USBR&lt;/Author&gt;&lt;Year&gt;2026&lt;/Year&gt;&lt;RecNum&gt;3124&lt;/RecNum&gt;&lt;Prefix&gt;FEIS`; &lt;/Prefix&gt;&lt;DisplayText&gt;(FEIS; USBR, 2026b)&lt;/DisplayText&gt;&lt;record&gt;&lt;rec-number&gt;3124&lt;/rec-number&gt;&lt;foreign-keys&gt;&lt;key app="EN" db-id="xxt5ta9pd995dwesap0pdzzp2weaz0w9werf" timestamp="1786136712"&gt;3124&lt;/key&gt;&lt;/foreign-keys&gt;&lt;ref-type name="Report"&gt;27&lt;/ref-type&gt;&lt;contributors&gt;&lt;authors&gt;&lt;author&gt;USBR&lt;/author&gt;&lt;/authors&gt;&lt;/contributors&gt;&lt;titles&gt;&lt;title&gt;Post-2026 Operational Guidelines and Strategies for Lake Powell and Lake Mead – Final Environmental Impact Statement&lt;/title&gt;&lt;/titles&gt;&lt;dates&gt;&lt;year&gt;2026&lt;/year&gt;&lt;/dates&gt;&lt;publisher&gt;U.S. Bureau of Reclamation&lt;/publisher&gt;&lt;urls&gt;&lt;related-urls&gt;&lt;url&gt;https://www.usbr.gov/ColoradoRiverBasin/post2026/final-eis/index.html&lt;/url&gt;&lt;/related-urls&gt;&lt;/urls&gt;&lt;/record&gt;&lt;/Cite&gt;&lt;/EndNote&gt;</w:instrText>
+      </w:r>
+      <w:r>
+        <w:fldChar w:fldCharType="separate"/>
+      </w:r>
+      <w:r>
+        <w:rPr>
+          <w:noProof/>
+        </w:rPr>
+        <w:t>(FEIS; USBR, 2026b)</w:t>
+      </w:r>
+      <w:r>
+        <w:fldChar w:fldCharType="end"/>
+      </w:r>
+      <w:r>
+        <w:t xml:space="preserve">. Within </w:t>
+      </w:r>
+      <w:r>
+        <w:t>the FEIS</w:t>
+      </w:r>
+      <w:r>
+        <w:t xml:space="preserve">, </w:t>
+      </w:r>
+      <w:r>
+        <w:t>USBR defined a Lake Mead protection elevation of 1,000 feet as a buffer to mitigate risk of drawdown t</w:t>
+      </w:r>
+      <w:r>
+        <w:t xml:space="preserve">o loss of hydropower production at 950 feet. The </w:t>
+      </w:r>
+      <w:r>
+        <w:t>FEIS also allows for storage of conserved water upstream in Lake Powell</w:t>
+      </w:r>
+      <w:r>
+        <w:t xml:space="preserve"> and the rollover of all current water conservation account balances</w:t>
+      </w:r>
+      <w:r>
+        <w:t xml:space="preserve"> to the new Storage and Recovery mechanism</w:t>
+      </w:r>
+      <w:r>
+        <w:t xml:space="preserve">. </w:t>
+      </w:r>
+    </w:p>
+    <w:p>
+      <w:pPr>
+        <w:pStyle w:val="Heading1"/>
+      </w:pPr>
+      <w:r>
+        <w:t>Conclusions</w:t>
+      </w:r>
+    </w:p>
+    <w:p>
+      <w:pPr>
+        <w:pStyle w:val="NoSpacing"/>
+      </w:pPr>
+      <w:r>
+        <w:rPr>
+          <w:rFonts w:ascii="Times New Roman" w:eastAsia="Times New Roman" w:hAnsi="Times New Roman" w:cs="Times New Roman"/>
+        </w:rPr>
+        <w:t>Since 2007</w:t>
+      </w:r>
+      <w:r>
+        <w:rPr>
+          <w:rFonts w:ascii="Times New Roman" w:eastAsia="Times New Roman" w:hAnsi="Times New Roman" w:cs="Times New Roman"/>
+        </w:rPr>
+        <w:t>,</w:t>
+      </w:r>
+      <w:r>
+        <w:rPr>
+          <w:rFonts w:ascii="Times New Roman" w:eastAsia="Times New Roman" w:hAnsi="Times New Roman" w:cs="Times New Roman"/>
+        </w:rPr>
+        <w:t xml:space="preserve"> </w:t>
+      </w:r>
+      <w:r>
+        <w:rPr>
+          <w:rFonts w:ascii="Times New Roman" w:eastAsia="Times New Roman" w:hAnsi="Times New Roman" w:cs="Times New Roman"/>
+        </w:rPr>
+        <w:t>California, Arizona, Nevada</w:t>
+      </w:r>
+      <w:r>
+        <w:rPr>
+          <w:rFonts w:ascii="Times New Roman" w:eastAsia="Times New Roman" w:hAnsi="Times New Roman" w:cs="Times New Roman"/>
+        </w:rPr>
+        <w:t>, and Mexico</w:t>
+      </w:r>
+      <w:r>
+        <w:rPr>
+          <w:rFonts w:ascii="Times New Roman" w:eastAsia="Times New Roman" w:hAnsi="Times New Roman" w:cs="Times New Roman"/>
+        </w:rPr>
+        <w:t xml:space="preserve"> </w:t>
+      </w:r>
+      <w:r>
+        <w:t>ha</w:t>
+      </w:r>
+      <w:r>
+        <w:t>ve</w:t>
+      </w:r>
+      <w:r>
+        <w:t xml:space="preserve"> </w:t>
+      </w:r>
+      <w:r>
+        <w:t xml:space="preserve">voluntarily reduced their Colorado River water use from legal entitlements by </w:t>
+      </w:r>
+      <w:r>
+        <w:t>4.</w:t>
+      </w:r>
+      <w:r>
+        <w:t>4</w:t>
+      </w:r>
+      <w:r>
+        <w:t xml:space="preserve"> million acre-feet with 3.</w:t>
+      </w:r>
+      <w:r>
+        <w:t>6</w:t>
+      </w:r>
+      <w:r>
+        <w:t xml:space="preserve"> million acre-feet </w:t>
+      </w:r>
+      <w:r>
+        <w:t>presently</w:t>
+      </w:r>
+      <w:r>
+        <w:t xml:space="preserve"> remaining in Lake Mead. </w:t>
+      </w:r>
+      <w:r>
+        <w:t xml:space="preserve">These efforts kept Lake Mead storage above </w:t>
+      </w:r>
+      <w:r>
+        <w:t xml:space="preserve">critical elevations </w:t>
+      </w:r>
+      <w:r>
+        <w:t xml:space="preserve">through </w:t>
+      </w:r>
+      <w:r>
+        <w:t xml:space="preserve">the recent </w:t>
+      </w:r>
+      <w:r>
+        <w:t xml:space="preserve">20-year </w:t>
+      </w:r>
+      <w:r>
+        <w:t xml:space="preserve">(and ongoing) </w:t>
+      </w:r>
+      <w:r>
+        <w:t>dry period</w:t>
+      </w:r>
+      <w:r>
+        <w:t xml:space="preserve">. </w:t>
+      </w:r>
+      <w:r>
+        <w:t xml:space="preserve">The </w:t>
+      </w:r>
+      <w:r>
+        <w:t xml:space="preserve">Lake Mead water conservation </w:t>
+      </w:r>
+      <w:r>
+        <w:t xml:space="preserve">program works on the assumption that the annual </w:t>
+      </w:r>
+      <w:r>
+        <w:t xml:space="preserve">physically </w:t>
+      </w:r>
+      <w:r>
+        <w:t>available water</w:t>
+      </w:r>
+      <w:r>
+        <w:t>―</w:t>
+      </w:r>
+      <w:r>
+        <w:t xml:space="preserve">reservoir inflow minus </w:t>
+      </w:r>
+      <w:r>
+        <w:t>e</w:t>
+      </w:r>
+      <w:r>
+        <w:t>vaporation</w:t>
+      </w:r>
+      <w:r>
+        <w:t>―</w:t>
+      </w:r>
+      <w:r>
+        <w:t xml:space="preserve">exceeds </w:t>
+      </w:r>
+      <w:r>
+        <w:t>legal</w:t>
+      </w:r>
+      <w:r>
+        <w:t xml:space="preserve"> </w:t>
+      </w:r>
+      <w:r>
+        <w:t>entitlements</w:t>
+      </w:r>
+      <w:r>
+        <w:t xml:space="preserve"> of 9.0 million acre-feet per year</w:t>
+      </w:r>
+      <w:r>
+        <w:t>. This assumption is challenged as the Colorado River Basin becomes more arid.</w:t>
+      </w:r>
+      <w:r>
+        <w:t xml:space="preserve"> </w:t>
+      </w:r>
+      <w:r>
+        <w:t>Additionally, a</w:t>
+      </w:r>
+      <w:r>
+        <w:t>s reservoir storage declines</w:t>
+      </w:r>
+      <w:r>
+        <w:t xml:space="preserve"> towards catastrophic elevations</w:t>
+      </w:r>
+      <w:r>
+        <w:t xml:space="preserve">, users face </w:t>
+      </w:r>
+      <w:r>
+        <w:t>difficult</w:t>
+      </w:r>
+      <w:r>
+        <w:t>y</w:t>
+      </w:r>
+      <w:r>
+        <w:t xml:space="preserve"> </w:t>
+      </w:r>
+      <w:r>
+        <w:t>to a</w:t>
+      </w:r>
+      <w:r>
+        <w:t xml:space="preserve">ccess </w:t>
+      </w:r>
+      <w:r>
+        <w:t xml:space="preserve">and withdraw their </w:t>
+      </w:r>
+      <w:r>
+        <w:t>conserved water</w:t>
       </w:r>
       <w:r>
         <w:t>.</w:t>
       </w:r>
+      <w:r>
+        <w:t xml:space="preserve"> </w:t>
+      </w:r>
+      <w:r>
+        <w:t xml:space="preserve">We </w:t>
+      </w:r>
+      <w:r>
+        <w:t>suggested</w:t>
+      </w:r>
+      <w:r>
+        <w:t xml:space="preserve"> two novel improvements </w:t>
+      </w:r>
+      <w:r>
+        <w:t>that</w:t>
+      </w:r>
+      <w:r>
+        <w:t xml:space="preserve"> switch the </w:t>
+      </w:r>
+      <w:r>
+        <w:t xml:space="preserve">conservation </w:t>
+      </w:r>
+      <w:r>
+        <w:t xml:space="preserve">accounting </w:t>
+      </w:r>
+      <w:r>
+        <w:t>of</w:t>
+      </w:r>
+      <w:r>
+        <w:t xml:space="preserve"> reductions from historical entitlements to reductions from the annual </w:t>
+      </w:r>
+      <w:r>
+        <w:t xml:space="preserve">physically </w:t>
+      </w:r>
+      <w:r>
+        <w:t>available water</w:t>
+      </w:r>
+      <w:r>
+        <w:t xml:space="preserve">. One </w:t>
+      </w:r>
+      <w:r>
+        <w:t>suggestion</w:t>
+      </w:r>
+      <w:r>
+        <w:t xml:space="preserve"> </w:t>
+      </w:r>
+      <w:r>
+        <w:t>proportionally reduces credits</w:t>
+      </w:r>
+      <w:r>
+        <w:t xml:space="preserve"> for conserved water</w:t>
+      </w:r>
+      <w:r>
+        <w:t xml:space="preserve">. A second </w:t>
+      </w:r>
+      <w:r>
+        <w:t>suggestion</w:t>
+      </w:r>
+      <w:r>
+        <w:t xml:space="preserve"> </w:t>
+      </w:r>
+      <w:r>
+        <w:t xml:space="preserve">creates a new protection account to be managed by </w:t>
+      </w:r>
+      <w:r>
+        <w:t>USBR</w:t>
+      </w:r>
+      <w:r>
+        <w:t xml:space="preserve"> and separate water accounts for each user. Each year, </w:t>
+      </w:r>
+      <w:r>
+        <w:t>USBR</w:t>
+      </w:r>
+      <w:r>
+        <w:t xml:space="preserve"> takes a first share of the physically available water</w:t>
+      </w:r>
+      <w:r>
+        <w:t xml:space="preserve"> equal to reservoir evaporation to sustain the protected volume. T</w:t>
+      </w:r>
+      <w:r>
+        <w:t xml:space="preserve">he users then divide the remaining inflow and consume, conserve, and/or trade within their account balances. </w:t>
+      </w:r>
+      <w:r>
+        <w:lastRenderedPageBreak/>
+        <w:t xml:space="preserve">Both strategies have </w:t>
+      </w:r>
+      <w:r>
+        <w:t>potential</w:t>
+      </w:r>
+      <w:r>
+        <w:t xml:space="preserve"> benefits to stabilize</w:t>
+      </w:r>
+      <w:r>
+        <w:t xml:space="preserve"> and recover</w:t>
+      </w:r>
+      <w:r>
+        <w:t xml:space="preserve"> Lake Mead</w:t>
+      </w:r>
+      <w:r>
+        <w:t xml:space="preserve"> storage while</w:t>
+      </w:r>
+      <w:r>
+        <w:t xml:space="preserve"> </w:t>
+      </w:r>
+      <w:r>
+        <w:t>increas</w:t>
+      </w:r>
+      <w:r>
+        <w:t>ing</w:t>
+      </w:r>
+      <w:r>
+        <w:t xml:space="preserve"> u</w:t>
+      </w:r>
+      <w:r>
+        <w:t>ser</w:t>
+      </w:r>
+      <w:r>
+        <w:t>s</w:t>
+      </w:r>
+      <w:r>
+        <w:t xml:space="preserve"> </w:t>
+      </w:r>
+      <w:r>
+        <w:t>a</w:t>
+      </w:r>
+      <w:r>
+        <w:t xml:space="preserve">utonomy to </w:t>
+      </w:r>
+      <w:r>
+        <w:t xml:space="preserve">adaptively </w:t>
+      </w:r>
+      <w:r>
+        <w:t>m</w:t>
+      </w:r>
+      <w:r>
+        <w:t>anage</w:t>
+      </w:r>
+      <w:r>
+        <w:t xml:space="preserve"> their differing and sometimes conflicting</w:t>
+      </w:r>
+      <w:r>
+        <w:t xml:space="preserve"> </w:t>
+      </w:r>
+      <w:r>
+        <w:t>r</w:t>
+      </w:r>
+      <w:r>
+        <w:t>isk</w:t>
+      </w:r>
+      <w:r>
+        <w:t>s</w:t>
+      </w:r>
+      <w:r>
+        <w:t xml:space="preserve"> </w:t>
+      </w:r>
+      <w:r>
+        <w:t>of</w:t>
+      </w:r>
+      <w:r>
+        <w:t xml:space="preserve"> </w:t>
+      </w:r>
+      <w:r>
+        <w:t>d</w:t>
+      </w:r>
+      <w:r>
+        <w:t xml:space="preserve">eclining </w:t>
+      </w:r>
+      <w:r>
+        <w:t>f</w:t>
+      </w:r>
+      <w:r>
+        <w:t>lows</w:t>
+      </w:r>
+      <w:r>
+        <w:t>.</w:t>
+      </w:r>
+      <w:r>
+        <w:t xml:space="preserve"> </w:t>
+      </w:r>
+      <w:r>
+        <w:t xml:space="preserve">These strategies can serve as examples for other </w:t>
+      </w:r>
+      <w:r>
+        <w:t>water</w:t>
+      </w:r>
+      <w:r>
+        <w:t xml:space="preserve"> systems </w:t>
+      </w:r>
+      <w:r>
+        <w:t xml:space="preserve">that </w:t>
+      </w:r>
+      <w:r>
+        <w:t>fac</w:t>
+      </w:r>
+      <w:r>
+        <w:t>e</w:t>
+      </w:r>
+      <w:r>
+        <w:t xml:space="preserve"> aridity</w:t>
+      </w:r>
+      <w:r>
+        <w:t xml:space="preserve">, </w:t>
+      </w:r>
+      <w:r>
+        <w:t xml:space="preserve">declining </w:t>
+      </w:r>
+      <w:r>
+        <w:t xml:space="preserve">reservoir </w:t>
+      </w:r>
+      <w:r>
+        <w:t>storage</w:t>
+      </w:r>
+      <w:r>
+        <w:t>, and user conflicts</w:t>
+      </w:r>
+      <w:r>
+        <w:t>.</w:t>
+      </w:r>
+    </w:p>
+    <w:p>
+      <w:pPr>
+        <w:pStyle w:val="Heading1"/>
+      </w:pPr>
+      <w:r>
+        <w:t>Data Availability</w:t>
+      </w:r>
     </w:p>
     <w:p>
       <w:pPr>
         <w:pStyle w:val="NoSpacing"/>
       </w:pPr>
       <w:r>
-        <w:t>The proposals described in this paper were submitted as public input to USBR in November 2025 and March 2026. On August 1, 2026, USBR released its Final Environmental Impact Statement</w:t>
+        <w:t xml:space="preserve">The data, models, and code used to generate </w:t>
+      </w:r>
+      <w:r>
+        <w:t>Figures 1</w:t>
+      </w:r>
+      <w:r>
+        <w:t xml:space="preserve"> to 7</w:t>
+      </w:r>
+      <w:r>
+        <w:t xml:space="preserve"> and Table 2 </w:t>
+      </w:r>
+      <w:r>
+        <w:t>are available at</w:t>
       </w:r>
       <w:r>
         <w:t xml:space="preserve"> </w:t>
@@ -9959,7 +10794,7 @@
         <w:fldChar w:fldCharType="begin"/>
       </w:r>
       <w:r>
-        <w:instrText xml:space="preserve"> ADDIN EN.CITE &lt;EndNote&gt;&lt;Cite&gt;&lt;Author&gt;USBR&lt;/Author&gt;&lt;Year&gt;2026&lt;/Year&gt;&lt;RecNum&gt;3124&lt;/RecNum&gt;&lt;Prefix&gt;FEIS`; &lt;/Prefix&gt;&lt;DisplayText&gt;(FEIS; USBR, 2026b)&lt;/DisplayText&gt;&lt;record&gt;&lt;rec-number&gt;3124&lt;/rec-number&gt;&lt;foreign-keys&gt;&lt;key app="EN" db-id="xxt5ta9pd995dwesap0pdzzp2weaz0w9werf" timestamp="1786136712"&gt;3124&lt;/key&gt;&lt;/foreign-keys&gt;&lt;ref-type name="Report"&gt;27&lt;/ref-type&gt;&lt;contributors&gt;&lt;authors&gt;&lt;author&gt;USBR&lt;/author&gt;&lt;/authors&gt;&lt;/contributors&gt;&lt;titles&gt;&lt;title&gt;Post-2026 Operational Guidelines and Strategies for Lake Powell and Lake Mead – Final Environmental Impact Statement&lt;/title&gt;&lt;/titles&gt;&lt;dates&gt;&lt;year&gt;2026&lt;/year&gt;&lt;/dates&gt;&lt;publisher&gt;U.S. Bureau of Reclamation&lt;/publisher&gt;&lt;urls&gt;&lt;related-urls&gt;&lt;url&gt;https://www.usbr.gov/ColoradoRiverBasin/post2026/final-eis/index.html&lt;/url&gt;&lt;/related-urls&gt;&lt;/urls&gt;&lt;/record&gt;&lt;/Cite&gt;&lt;/EndNote&gt;</w:instrText>
+        <w:instrText xml:space="preserve"> ADDIN EN.CITE &lt;EndNote&gt;&lt;Cite&gt;&lt;Author&gt;Rosenberg&lt;/Author&gt;&lt;Year&gt;2026&lt;/Year&gt;&lt;RecNum&gt;3121&lt;/RecNum&gt;&lt;DisplayText&gt;(Rosenberg and Myers, 2026)&lt;/DisplayText&gt;&lt;record&gt;&lt;rec-number&gt;3121&lt;/rec-number&gt;&lt;foreign-keys&gt;&lt;key app="EN" db-id="xxt5ta9pd995dwesap0pdzzp2weaz0w9werf" timestamp="1783713642"&gt;3121&lt;/key&gt;&lt;/foreign-keys&gt;&lt;ref-type name="Journal Article"&gt;17&lt;/ref-type&gt;&lt;contributors&gt;&lt;authors&gt;&lt;author&gt;David Rosenberg&lt;/author&gt;&lt;author&gt;Anabelle Myers&lt;/author&gt;&lt;/authors&gt;&lt;/contributors&gt;&lt;titles&gt;&lt;title&gt;The Lake Mead Water Conservation Program Analysis&lt;/title&gt;&lt;secondary-title&gt;Hydroshare&lt;/secondary-title&gt;&lt;/titles&gt;&lt;periodical&gt;&lt;full-title&gt;Hydroshare&lt;/full-title&gt;&lt;/periodical&gt;&lt;dates&gt;&lt;year&gt;2026&lt;/year&gt;&lt;/dates&gt;&lt;urls&gt;&lt;related-urls&gt;&lt;url&gt;http://www.hydroshare.org/resource/71a971cd51b64ef8a7030f25639c0a3c&lt;/url&gt;&lt;/related-urls&gt;&lt;/urls&gt;&lt;electronic-resource-num&gt;http://www.hydroshare.org/resource/71a971cd51b64ef8a7030f25639c0a3c&lt;/electronic-resource-num&gt;&lt;/record&gt;&lt;/Cite&gt;&lt;/EndNote&gt;</w:instrText>
       </w:r>
       <w:r>
         <w:fldChar w:fldCharType="separate"/>
@@ -9968,712 +10803,223 @@
         <w:rPr>
           <w:noProof/>
         </w:rPr>
-        <w:t>(FEIS; USBR, 2026b)</w:t>
+        <w:t>(Rosenberg and Myers, 2026)</w:t>
       </w:r>
       <w:r>
         <w:fldChar w:fldCharType="end"/>
       </w:r>
       <w:r>
-        <w:t xml:space="preserve">. Within </w:t>
-      </w:r>
-      <w:r>
-        <w:t>the FEIS</w:t>
-      </w:r>
-      <w:r>
-        <w:t xml:space="preserve">, </w:t>
-      </w:r>
-      <w:r>
-        <w:t>USBR defined a Lake Mead protection elevation of 1,000 feet as a buffer to mitigate risk of drawdown t</w:t>
-      </w:r>
-      <w:r>
-        <w:t xml:space="preserve">o loss of hydropower production at 950 feet. The </w:t>
-      </w:r>
-      <w:r>
-        <w:t>FEIS also allows for storage of conserved water upstream in Lake Powell</w:t>
-      </w:r>
-      <w:r>
-        <w:t xml:space="preserve"> and the rollover of all current water conservation account balances</w:t>
-      </w:r>
-      <w:r>
-        <w:t xml:space="preserve"> to the new Storage and Recovery mechanism</w:t>
+        <w:t>.</w:t>
+      </w:r>
+    </w:p>
+    <w:p>
+      <w:pPr>
+        <w:pStyle w:val="Heading1"/>
+      </w:pPr>
+      <w:r>
+        <w:t>Reproduced Results</w:t>
+      </w:r>
+    </w:p>
+    <w:p>
+      <w:pPr>
+        <w:pStyle w:val="NoSpacing"/>
+      </w:pPr>
+      <w:r>
+        <w:t>Hope H</w:t>
+      </w:r>
+      <w:r>
+        <w:t>auptman (University of California Agriculture and Natural Resources) downloaded materials and reproduced Figures 1 to 4.</w:t>
+      </w:r>
+    </w:p>
+    <w:p>
+      <w:pPr>
+        <w:pStyle w:val="NoSpacing"/>
+      </w:pPr>
+      <w:r>
+        <w:t>Matti W</w:t>
+      </w:r>
+      <w:r>
+        <w:t>itte (Utah State University)</w:t>
+      </w:r>
+      <w:r>
+        <w:t xml:space="preserve"> download the materials </w:t>
+      </w:r>
+      <w:r>
+        <w:t xml:space="preserve">and </w:t>
+      </w:r>
+      <w:r>
+        <w:t>reproduced</w:t>
+      </w:r>
+      <w:r>
+        <w:t xml:space="preserve"> </w:t>
+      </w:r>
+      <w:r>
+        <w:t>Figures 6 and</w:t>
+      </w:r>
+      <w:r>
+        <w:t xml:space="preserve"> 7.</w:t>
+      </w:r>
+      <w:r>
+        <w:t xml:space="preserve"> </w:t>
+      </w:r>
+    </w:p>
+    <w:p>
+      <w:pPr>
+        <w:pStyle w:val="Heading1"/>
+      </w:pPr>
+      <w:r>
+        <w:t>Acknowledgements</w:t>
+      </w:r>
+    </w:p>
+    <w:p>
+      <w:pPr>
+        <w:pStyle w:val="NoSpacing"/>
+      </w:pPr>
+      <w:r>
+        <w:t>This research was supported by the Cooperative Institute for Research to Operations in Hydrology (CIROH) with funding under award NA22NWS4320003 from the NOAA Cooperative Institute Program. The statements, findings, conclusions, and recommendations are those of the author(s) and do not necessarily reflect the opinions of NOAA.</w:t>
+      </w:r>
+    </w:p>
+    <w:p>
+      <w:pPr>
+        <w:pStyle w:val="Heading1"/>
+      </w:pPr>
+      <w:r>
+        <w:t>Appendix A. Estimate Share</w:t>
+      </w:r>
+      <w:r>
+        <w:t>s</w:t>
+      </w:r>
+      <w:r>
+        <w:t xml:space="preserve"> of </w:t>
+      </w:r>
+      <w:r>
+        <w:t xml:space="preserve">Annual Lake Mead </w:t>
+      </w:r>
+      <w:r>
+        <w:t>Inflow</w:t>
+      </w:r>
+      <w:r>
+        <w:t xml:space="preserve"> from Prior Agreed Apportionment of Shortages</w:t>
+      </w:r>
+      <w:r>
+        <w:t>.</w:t>
+      </w:r>
+    </w:p>
+    <w:p>
+      <w:pPr>
+        <w:pStyle w:val="NoSpacing"/>
+      </w:pPr>
+      <w:r>
+        <w:t xml:space="preserve">This appendix </w:t>
+      </w:r>
+      <w:r>
+        <w:t>demonstrates a method to estimate</w:t>
+      </w:r>
+      <w:r>
+        <w:t xml:space="preserve"> Mexico’s and</w:t>
+      </w:r>
+      <w:r>
+        <w:t xml:space="preserve"> each Lower Basin </w:t>
+      </w:r>
+      <w:r>
+        <w:t>state</w:t>
+      </w:r>
+      <w:r>
+        <w:t xml:space="preserve">’s share of </w:t>
+      </w:r>
+      <w:r>
+        <w:t xml:space="preserve">the annual </w:t>
+      </w:r>
+      <w:r>
+        <w:t xml:space="preserve">Lake Mead </w:t>
+      </w:r>
+      <w:r>
+        <w:t>inflow</w:t>
+      </w:r>
+      <w:r>
+        <w:t xml:space="preserve"> from </w:t>
+      </w:r>
+      <w:r>
+        <w:t>percent</w:t>
+      </w:r>
+      <w:r>
+        <w:t xml:space="preserve">age shares of shortages listed in Table </w:t>
+      </w:r>
+      <w:r>
+        <w:t xml:space="preserve">2-3 of the FEIS </w:t>
+      </w:r>
+      <w:r>
+        <w:fldChar w:fldCharType="begin"/>
+      </w:r>
+      <w:r>
+        <w:instrText xml:space="preserve"> ADDIN EN.CITE &lt;EndNote&gt;&lt;Cite&gt;&lt;Author&gt;USBR&lt;/Author&gt;&lt;Year&gt;2026&lt;/Year&gt;&lt;RecNum&gt;3124&lt;/RecNum&gt;&lt;DisplayText&gt;(USBR, 2026b)&lt;/DisplayText&gt;&lt;record&gt;&lt;rec-number&gt;3124&lt;/rec-number&gt;&lt;foreign-keys&gt;&lt;key app="EN" db-id="xxt5ta9pd995dwesap0pdzzp2weaz0w9werf" timestamp="1786136712"&gt;3124&lt;/key&gt;&lt;/foreign-keys&gt;&lt;ref-type name="Report"&gt;27&lt;/ref-type&gt;&lt;contributors&gt;&lt;authors&gt;&lt;author&gt;USBR&lt;/author&gt;&lt;/authors&gt;&lt;/contributors&gt;&lt;titles&gt;&lt;title&gt;Post-2026 Operational Guidelines and Strategies for Lake Powell and Lake Mead – Final Environmental Impact Statement&lt;/title&gt;&lt;/titles&gt;&lt;dates&gt;&lt;year&gt;2026&lt;/year&gt;&lt;/dates&gt;&lt;publisher&gt;U.S. Bureau of Reclamation&lt;/publisher&gt;&lt;urls&gt;&lt;related-urls&gt;&lt;url&gt;https://www.usbr.gov/ColoradoRiverBasin/post2026/final-eis/index.html&lt;/url&gt;&lt;/related-urls&gt;&lt;/urls&gt;&lt;/record&gt;&lt;/Cite&gt;&lt;/EndNote&gt;</w:instrText>
+      </w:r>
+      <w:r>
+        <w:fldChar w:fldCharType="separate"/>
+      </w:r>
+      <w:r>
+        <w:rPr>
+          <w:noProof/>
+        </w:rPr>
+        <w:t>(USBR, 2026b)</w:t>
+      </w:r>
+      <w:r>
+        <w:fldChar w:fldCharType="end"/>
+      </w:r>
+      <w:r>
+        <w:t>(Table A1)</w:t>
       </w:r>
       <w:r>
         <w:t xml:space="preserve">. </w:t>
       </w:r>
-    </w:p>
-    <w:p>
-      <w:pPr>
-        <w:pStyle w:val="Heading1"/>
-      </w:pPr>
-      <w:r>
-        <w:t>Conclusions</w:t>
-      </w:r>
-    </w:p>
-    <w:p>
-      <w:pPr>
-        <w:pStyle w:val="NoSpacing"/>
-      </w:pPr>
-      <w:r>
-        <w:rPr>
-          <w:rFonts w:ascii="Times New Roman" w:eastAsia="Times New Roman" w:hAnsi="Times New Roman" w:cs="Times New Roman"/>
-        </w:rPr>
-        <w:t>Since 2007</w:t>
-      </w:r>
-      <w:r>
-        <w:rPr>
-          <w:rFonts w:ascii="Times New Roman" w:eastAsia="Times New Roman" w:hAnsi="Times New Roman" w:cs="Times New Roman"/>
-        </w:rPr>
-        <w:t>,</w:t>
-      </w:r>
-      <w:r>
-        <w:rPr>
-          <w:rFonts w:ascii="Times New Roman" w:eastAsia="Times New Roman" w:hAnsi="Times New Roman" w:cs="Times New Roman"/>
-        </w:rPr>
-        <w:t xml:space="preserve"> </w:t>
-      </w:r>
-      <w:r>
-        <w:rPr>
-          <w:rFonts w:ascii="Times New Roman" w:eastAsia="Times New Roman" w:hAnsi="Times New Roman" w:cs="Times New Roman"/>
-        </w:rPr>
-        <w:t>California, Arizona, Nevada</w:t>
-      </w:r>
-      <w:r>
-        <w:rPr>
-          <w:rFonts w:ascii="Times New Roman" w:eastAsia="Times New Roman" w:hAnsi="Times New Roman" w:cs="Times New Roman"/>
-        </w:rPr>
-        <w:t>, and Mexico</w:t>
-      </w:r>
-      <w:r>
-        <w:rPr>
-          <w:rFonts w:ascii="Times New Roman" w:eastAsia="Times New Roman" w:hAnsi="Times New Roman" w:cs="Times New Roman"/>
-        </w:rPr>
-        <w:t xml:space="preserve"> </w:t>
-      </w:r>
-      <w:r>
-        <w:t>ha</w:t>
-      </w:r>
-      <w:r>
-        <w:t>ve</w:t>
-      </w:r>
-      <w:r>
-        <w:t xml:space="preserve"> </w:t>
-      </w:r>
-      <w:r>
-        <w:t xml:space="preserve">voluntarily reduced their Colorado River water use from legal entitlements by </w:t>
-      </w:r>
-      <w:r>
-        <w:t>4.</w:t>
-      </w:r>
-      <w:r>
-        <w:t>4</w:t>
-      </w:r>
-      <w:r>
-        <w:t xml:space="preserve"> million acre-feet with 3.</w:t>
-      </w:r>
-      <w:r>
-        <w:t>6</w:t>
-      </w:r>
-      <w:r>
-        <w:t xml:space="preserve"> million acre-feet </w:t>
-      </w:r>
-      <w:r>
-        <w:t>presently</w:t>
-      </w:r>
-      <w:r>
-        <w:t xml:space="preserve"> remaining in Lake Mead. </w:t>
-      </w:r>
-      <w:r>
-        <w:t xml:space="preserve">These efforts kept Lake Mead storage above </w:t>
-      </w:r>
-      <w:r>
-        <w:t xml:space="preserve">critical elevations </w:t>
-      </w:r>
-      <w:r>
-        <w:t xml:space="preserve">through </w:t>
-      </w:r>
-      <w:r>
-        <w:t xml:space="preserve">the recent </w:t>
-      </w:r>
-      <w:r>
-        <w:t xml:space="preserve">20-year </w:t>
-      </w:r>
-      <w:r>
-        <w:t xml:space="preserve">(and ongoing) </w:t>
-      </w:r>
-      <w:r>
-        <w:t>dry period</w:t>
-      </w:r>
-      <w:r>
-        <w:t xml:space="preserve">. </w:t>
-      </w:r>
-      <w:r>
-        <w:t xml:space="preserve">The </w:t>
-      </w:r>
-      <w:r>
-        <w:t xml:space="preserve">Lake Mead water conservation </w:t>
-      </w:r>
-      <w:r>
-        <w:t xml:space="preserve">program works on the assumption that the annual </w:t>
-      </w:r>
-      <w:r>
-        <w:t xml:space="preserve">physically </w:t>
-      </w:r>
-      <w:r>
-        <w:t>available water</w:t>
-      </w:r>
-      <w:r>
-        <w:t>―</w:t>
-      </w:r>
-      <w:r>
-        <w:t xml:space="preserve">reservoir inflow minus </w:t>
-      </w:r>
-      <w:r>
-        <w:t>e</w:t>
-      </w:r>
-      <w:r>
-        <w:t>vaporation</w:t>
-      </w:r>
-      <w:r>
-        <w:t>―</w:t>
-      </w:r>
-      <w:r>
-        <w:t xml:space="preserve">exceeds </w:t>
-      </w:r>
-      <w:r>
-        <w:t>legal</w:t>
-      </w:r>
-      <w:r>
-        <w:t xml:space="preserve"> </w:t>
-      </w:r>
-      <w:r>
-        <w:t>entitlements</w:t>
-      </w:r>
-      <w:r>
-        <w:t xml:space="preserve"> of 9.0 million acre-feet per year</w:t>
-      </w:r>
-      <w:r>
-        <w:t>. This assumption is challenged as the Colorado River Basin becomes more arid.</w:t>
-      </w:r>
-      <w:r>
-        <w:t xml:space="preserve"> </w:t>
-      </w:r>
-      <w:r>
-        <w:t>Additionally, a</w:t>
-      </w:r>
-      <w:r>
-        <w:t>s reservoir storage declines</w:t>
-      </w:r>
-      <w:r>
-        <w:t xml:space="preserve"> towards catastrophic elevations</w:t>
-      </w:r>
-      <w:r>
-        <w:t xml:space="preserve">, users face </w:t>
-      </w:r>
-      <w:r>
-        <w:t>difficult</w:t>
-      </w:r>
-      <w:r>
-        <w:t>y</w:t>
-      </w:r>
-      <w:r>
-        <w:t xml:space="preserve"> </w:t>
-      </w:r>
-      <w:r>
-        <w:t>to a</w:t>
-      </w:r>
-      <w:r>
-        <w:t xml:space="preserve">ccess </w:t>
-      </w:r>
-      <w:r>
-        <w:t xml:space="preserve">and withdraw their </w:t>
-      </w:r>
-      <w:r>
-        <w:t>conserved water</w:t>
-      </w:r>
-      <w:r>
-        <w:t>.</w:t>
-      </w:r>
-      <w:r>
-        <w:t xml:space="preserve"> </w:t>
-      </w:r>
-      <w:r>
-        <w:t xml:space="preserve">We </w:t>
-      </w:r>
-      <w:r>
-        <w:t>suggested</w:t>
-      </w:r>
-      <w:r>
-        <w:t xml:space="preserve"> two novel improvements </w:t>
-      </w:r>
-      <w:r>
-        <w:t>that</w:t>
-      </w:r>
-      <w:r>
-        <w:t xml:space="preserve"> switch the </w:t>
-      </w:r>
-      <w:r>
-        <w:t xml:space="preserve">conservation </w:t>
-      </w:r>
-      <w:r>
-        <w:t xml:space="preserve">accounting </w:t>
-      </w:r>
-      <w:r>
-        <w:t>of</w:t>
-      </w:r>
-      <w:r>
-        <w:t xml:space="preserve"> reductions from historical entitlements to reductions from the annual </w:t>
-      </w:r>
-      <w:r>
-        <w:t xml:space="preserve">physically </w:t>
-      </w:r>
-      <w:r>
-        <w:t>available water</w:t>
-      </w:r>
-      <w:r>
-        <w:t xml:space="preserve">. One </w:t>
-      </w:r>
-      <w:r>
-        <w:t>suggestion</w:t>
-      </w:r>
-      <w:r>
-        <w:t xml:space="preserve"> </w:t>
-      </w:r>
-      <w:r>
-        <w:t>proportionally reduces credits</w:t>
-      </w:r>
-      <w:r>
-        <w:t xml:space="preserve"> for conserved water</w:t>
-      </w:r>
-      <w:r>
-        <w:t xml:space="preserve">. A second </w:t>
-      </w:r>
-      <w:r>
-        <w:t>suggestion</w:t>
-      </w:r>
-      <w:r>
-        <w:t xml:space="preserve"> </w:t>
-      </w:r>
-      <w:r>
-        <w:t xml:space="preserve">creates a new protection account to be managed by </w:t>
-      </w:r>
-      <w:r>
-        <w:t>USBR</w:t>
-      </w:r>
-      <w:r>
-        <w:t xml:space="preserve"> and separate water accounts for each user. Each year, </w:t>
-      </w:r>
-      <w:r>
-        <w:t>USBR</w:t>
-      </w:r>
-      <w:r>
-        <w:t xml:space="preserve"> takes a first share of the physically </w:t>
+      <w:r>
+        <w:t xml:space="preserve">First, convert </w:t>
+      </w:r>
+      <w:r>
+        <w:t xml:space="preserve">each water user’s </w:t>
+      </w:r>
+      <w:r>
+        <w:t xml:space="preserve">percent share of </w:t>
+      </w:r>
+      <w:r>
+        <w:t>Total S</w:t>
+      </w:r>
+      <w:r>
+        <w:t>hortage</w:t>
+      </w:r>
+      <w:r>
+        <w:t xml:space="preserve"> into </w:t>
+      </w:r>
+      <w:r>
+        <w:t xml:space="preserve">shortage </w:t>
+      </w:r>
+      <w:r>
+        <w:t xml:space="preserve">volumes. Second, </w:t>
+      </w:r>
+      <w:r>
+        <w:t xml:space="preserve">the </w:t>
+      </w:r>
+      <w:r>
+        <w:t>T</w:t>
+      </w:r>
+      <w:r>
+        <w:t xml:space="preserve">otal </w:t>
+      </w:r>
+      <w:r>
+        <w:t>A</w:t>
+      </w:r>
+      <w:r>
+        <w:t xml:space="preserve">vailable </w:t>
+      </w:r>
+      <w:r>
+        <w:t>W</w:t>
+      </w:r>
+      <w:r>
+        <w:t xml:space="preserve">ater is Total Legal Entitlements minus </w:t>
       </w:r>
       <w:r>
         <w:lastRenderedPageBreak/>
-        <w:t>available water</w:t>
-      </w:r>
-      <w:r>
-        <w:t xml:space="preserve"> equal to reservoir evaporation to sustain the protected volume. T</w:t>
-      </w:r>
-      <w:r>
-        <w:t xml:space="preserve">he users then divide the remaining inflow and consume, conserve, and/or trade within their account balances. </w:t>
-      </w:r>
-      <w:r>
-        <w:t xml:space="preserve">Both strategies have </w:t>
-      </w:r>
-      <w:r>
-        <w:t>potential</w:t>
-      </w:r>
-      <w:r>
-        <w:t xml:space="preserve"> benefits to stabilize</w:t>
-      </w:r>
-      <w:r>
-        <w:t xml:space="preserve"> and recover</w:t>
-      </w:r>
-      <w:r>
-        <w:t xml:space="preserve"> Lake Mead</w:t>
-      </w:r>
-      <w:r>
-        <w:t xml:space="preserve"> storage while</w:t>
-      </w:r>
-      <w:r>
-        <w:t xml:space="preserve"> </w:t>
-      </w:r>
-      <w:r>
-        <w:t>increas</w:t>
-      </w:r>
-      <w:r>
-        <w:t>ing</w:t>
-      </w:r>
-      <w:r>
-        <w:t xml:space="preserve"> u</w:t>
-      </w:r>
-      <w:r>
-        <w:t>ser</w:t>
-      </w:r>
-      <w:r>
-        <w:t>s</w:t>
-      </w:r>
-      <w:r>
-        <w:t xml:space="preserve"> </w:t>
-      </w:r>
-      <w:r>
-        <w:t>a</w:t>
-      </w:r>
-      <w:r>
-        <w:t xml:space="preserve">utonomy to </w:t>
-      </w:r>
-      <w:r>
-        <w:t xml:space="preserve">adaptively </w:t>
-      </w:r>
-      <w:r>
-        <w:t>m</w:t>
-      </w:r>
-      <w:r>
-        <w:t>anage</w:t>
-      </w:r>
-      <w:r>
-        <w:t xml:space="preserve"> their differing and sometimes conflicting</w:t>
-      </w:r>
-      <w:r>
-        <w:t xml:space="preserve"> </w:t>
-      </w:r>
-      <w:r>
-        <w:t>r</w:t>
-      </w:r>
-      <w:r>
-        <w:t>isk</w:t>
-      </w:r>
-      <w:r>
-        <w:t>s</w:t>
-      </w:r>
-      <w:r>
-        <w:t xml:space="preserve"> </w:t>
-      </w:r>
-      <w:r>
-        <w:t>of</w:t>
-      </w:r>
-      <w:r>
-        <w:t xml:space="preserve"> </w:t>
-      </w:r>
-      <w:r>
-        <w:t>d</w:t>
-      </w:r>
-      <w:r>
-        <w:t xml:space="preserve">eclining </w:t>
-      </w:r>
-      <w:r>
-        <w:t>f</w:t>
-      </w:r>
-      <w:r>
-        <w:t>lows</w:t>
-      </w:r>
-      <w:r>
-        <w:t>.</w:t>
-      </w:r>
-      <w:r>
-        <w:t xml:space="preserve"> </w:t>
-      </w:r>
-      <w:r>
-        <w:t xml:space="preserve">These strategies can serve as examples for other </w:t>
-      </w:r>
-      <w:r>
-        <w:t>water</w:t>
-      </w:r>
-      <w:r>
-        <w:t xml:space="preserve"> systems </w:t>
-      </w:r>
-      <w:r>
-        <w:t xml:space="preserve">that </w:t>
-      </w:r>
-      <w:r>
-        <w:t>fac</w:t>
-      </w:r>
-      <w:r>
-        <w:t>e</w:t>
-      </w:r>
-      <w:r>
-        <w:t xml:space="preserve"> aridity</w:t>
-      </w:r>
-      <w:r>
-        <w:t xml:space="preserve">, </w:t>
-      </w:r>
-      <w:r>
-        <w:t xml:space="preserve">declining </w:t>
-      </w:r>
-      <w:r>
-        <w:t xml:space="preserve">reservoir </w:t>
-      </w:r>
-      <w:r>
-        <w:t>storage</w:t>
-      </w:r>
-      <w:r>
-        <w:t>, and user conflicts</w:t>
-      </w:r>
-      <w:r>
-        <w:t>.</w:t>
-      </w:r>
-    </w:p>
-    <w:p>
-      <w:pPr>
-        <w:pStyle w:val="Heading1"/>
-      </w:pPr>
-      <w:r>
-        <w:t>Data Availability</w:t>
-      </w:r>
-    </w:p>
-    <w:p>
-      <w:pPr>
-        <w:pStyle w:val="NoSpacing"/>
-      </w:pPr>
-      <w:r>
-        <w:t xml:space="preserve">The data, models, and code used to generate </w:t>
-      </w:r>
-      <w:r>
-        <w:t>Figures 1</w:t>
-      </w:r>
-      <w:r>
-        <w:t xml:space="preserve"> to 7</w:t>
-      </w:r>
-      <w:r>
-        <w:t xml:space="preserve"> and Table 2 </w:t>
-      </w:r>
-      <w:r>
-        <w:t>are available at</w:t>
-      </w:r>
-      <w:r>
-        <w:t xml:space="preserve"> </w:t>
-      </w:r>
-      <w:r>
-        <w:fldChar w:fldCharType="begin"/>
-      </w:r>
-      <w:r>
-        <w:instrText xml:space="preserve"> ADDIN EN.CITE &lt;EndNote&gt;&lt;Cite&gt;&lt;Author&gt;Rosenberg&lt;/Author&gt;&lt;Year&gt;2026&lt;/Year&gt;&lt;RecNum&gt;3121&lt;/RecNum&gt;&lt;DisplayText&gt;(Rosenberg and Myers, 2026)&lt;/DisplayText&gt;&lt;record&gt;&lt;rec-number&gt;3121&lt;/rec-number&gt;&lt;foreign-keys&gt;&lt;key app="EN" db-id="xxt5ta9pd995dwesap0pdzzp2weaz0w9werf" timestamp="1783713642"&gt;3121&lt;/key&gt;&lt;/foreign-keys&gt;&lt;ref-type name="Journal Article"&gt;17&lt;/ref-type&gt;&lt;contributors&gt;&lt;authors&gt;&lt;author&gt;David Rosenberg&lt;/author&gt;&lt;author&gt;Anabelle Myers&lt;/author&gt;&lt;/authors&gt;&lt;/contributors&gt;&lt;titles&gt;&lt;title&gt;The Lake Mead Water Conservation Program Analysis&lt;/title&gt;&lt;secondary-title&gt;Hydroshare&lt;/secondary-title&gt;&lt;/titles&gt;&lt;periodical&gt;&lt;full-title&gt;Hydroshare&lt;/full-title&gt;&lt;/periodical&gt;&lt;dates&gt;&lt;year&gt;2026&lt;/year&gt;&lt;/dates&gt;&lt;urls&gt;&lt;related-urls&gt;&lt;url&gt;http://www.hydroshare.org/resource/71a971cd51b64ef8a7030f25639c0a3c&lt;/url&gt;&lt;/related-urls&gt;&lt;/urls&gt;&lt;electronic-resource-num&gt;http://www.hydroshare.org/resource/71a971cd51b64ef8a7030f25639c0a3c&lt;/electronic-resource-num&gt;&lt;/record&gt;&lt;/Cite&gt;&lt;/EndNote&gt;</w:instrText>
-      </w:r>
-      <w:r>
-        <w:fldChar w:fldCharType="separate"/>
-      </w:r>
-      <w:r>
-        <w:rPr>
-          <w:noProof/>
-        </w:rPr>
-        <w:t>(Rosenberg and Myers, 2026)</w:t>
-      </w:r>
-      <w:r>
-        <w:fldChar w:fldCharType="end"/>
-      </w:r>
-      <w:r>
-        <w:t>.</w:t>
-      </w:r>
-    </w:p>
-    <w:p>
-      <w:pPr>
-        <w:pStyle w:val="Heading1"/>
-      </w:pPr>
-      <w:r>
-        <w:t>Reproduced Results</w:t>
-      </w:r>
-    </w:p>
-    <w:p>
-      <w:pPr>
-        <w:pStyle w:val="NoSpacing"/>
-      </w:pPr>
-      <w:r>
-        <w:t>Hope H</w:t>
-      </w:r>
-      <w:r>
-        <w:t>auptman (University of California Agriculture and Natural Resources) downloaded materials and reproduced Figures 1 to 4.</w:t>
-      </w:r>
-    </w:p>
-    <w:p>
-      <w:pPr>
-        <w:pStyle w:val="NoSpacing"/>
-      </w:pPr>
-      <w:r>
-        <w:t>Matti W</w:t>
-      </w:r>
-      <w:r>
-        <w:t>itte (Utah State University)</w:t>
-      </w:r>
-      <w:r>
-        <w:t xml:space="preserve"> download the materials </w:t>
-      </w:r>
-      <w:r>
-        <w:t xml:space="preserve">and </w:t>
-      </w:r>
-      <w:r>
-        <w:t>reproduced</w:t>
-      </w:r>
-      <w:r>
-        <w:t xml:space="preserve"> </w:t>
-      </w:r>
-      <w:r>
-        <w:t>Figures 6 and</w:t>
-      </w:r>
-      <w:r>
-        <w:t xml:space="preserve"> 7.</w:t>
-      </w:r>
-      <w:r>
-        <w:t xml:space="preserve"> </w:t>
-      </w:r>
-    </w:p>
-    <w:p>
-      <w:pPr>
-        <w:pStyle w:val="Heading1"/>
-      </w:pPr>
-      <w:r>
-        <w:t>Acknowledgements</w:t>
-      </w:r>
-    </w:p>
-    <w:p>
-      <w:pPr>
-        <w:pStyle w:val="NoSpacing"/>
-      </w:pPr>
-      <w:r>
-        <w:t>This research was supported by the Cooperative Institute for Research to Operations in Hydrology (CIROH) with funding under award NA22NWS4320003 from the NOAA Cooperative Institute Program. The statements, findings, conclusions, and recommendations are those of the author(s) and do not necessarily reflect the opinions of NOAA.</w:t>
-      </w:r>
-    </w:p>
-    <w:p>
-      <w:pPr>
-        <w:pStyle w:val="Heading1"/>
-      </w:pPr>
-      <w:r>
-        <w:t>Appendix A. Estimate Share</w:t>
-      </w:r>
-      <w:r>
-        <w:t>s</w:t>
-      </w:r>
-      <w:r>
-        <w:t xml:space="preserve"> of </w:t>
-      </w:r>
-      <w:r>
-        <w:t xml:space="preserve">Annual Lake Mead </w:t>
-      </w:r>
-      <w:r>
-        <w:t>Inflow</w:t>
-      </w:r>
-      <w:r>
-        <w:t xml:space="preserve"> from Prior Agreed Apportionment of Shortages</w:t>
-      </w:r>
-      <w:r>
-        <w:t>.</w:t>
-      </w:r>
-    </w:p>
-    <w:p>
-      <w:pPr>
-        <w:pStyle w:val="NoSpacing"/>
-      </w:pPr>
-      <w:r>
-        <w:t xml:space="preserve">This appendix </w:t>
-      </w:r>
-      <w:r>
-        <w:t>demonstrates a method to estimate</w:t>
-      </w:r>
-      <w:r>
-        <w:t xml:space="preserve"> Mexico’s and</w:t>
-      </w:r>
-      <w:r>
-        <w:t xml:space="preserve"> each Lower Basin </w:t>
-      </w:r>
-      <w:r>
-        <w:t>state</w:t>
-      </w:r>
-      <w:r>
-        <w:t xml:space="preserve">’s share of </w:t>
-      </w:r>
-      <w:r>
-        <w:t xml:space="preserve">the annual </w:t>
-      </w:r>
-      <w:r>
-        <w:t xml:space="preserve">Lake Mead </w:t>
-      </w:r>
-      <w:r>
-        <w:t>inflow</w:t>
-      </w:r>
-      <w:r>
-        <w:t xml:space="preserve"> from </w:t>
-      </w:r>
-      <w:r>
-        <w:t>percent</w:t>
-      </w:r>
-      <w:r>
-        <w:t xml:space="preserve">age shares of shortages listed in Table </w:t>
-      </w:r>
-      <w:r>
-        <w:t xml:space="preserve">2-3 of the </w:t>
-      </w:r>
-      <w:r>
-        <w:lastRenderedPageBreak/>
-        <w:t xml:space="preserve">FEIS </w:t>
-      </w:r>
-      <w:r>
-        <w:fldChar w:fldCharType="begin"/>
-      </w:r>
-      <w:r>
-        <w:instrText xml:space="preserve"> ADDIN EN.CITE &lt;EndNote&gt;&lt;Cite&gt;&lt;Author&gt;USBR&lt;/Author&gt;&lt;Year&gt;2026&lt;/Year&gt;&lt;RecNum&gt;3124&lt;/RecNum&gt;&lt;DisplayText&gt;(USBR, 2026b)&lt;/DisplayText&gt;&lt;record&gt;&lt;rec-number&gt;3124&lt;/rec-number&gt;&lt;foreign-keys&gt;&lt;key app="EN" db-id="xxt5ta9pd995dwesap0pdzzp2weaz0w9werf" timestamp="1786136712"&gt;3124&lt;/key&gt;&lt;/foreign-keys&gt;&lt;ref-type name="Report"&gt;27&lt;/ref-type&gt;&lt;contributors&gt;&lt;authors&gt;&lt;author&gt;USBR&lt;/author&gt;&lt;/authors&gt;&lt;/contributors&gt;&lt;titles&gt;&lt;title&gt;Post-2026 Operational Guidelines and Strategies for Lake Powell and Lake Mead – Final Environmental Impact Statement&lt;/title&gt;&lt;/titles&gt;&lt;dates&gt;&lt;year&gt;2026&lt;/year&gt;&lt;/dates&gt;&lt;publisher&gt;U.S. Bureau of Reclamation&lt;/publisher&gt;&lt;urls&gt;&lt;related-urls&gt;&lt;url&gt;https://www.usbr.gov/ColoradoRiverBasin/post2026/final-eis/index.html&lt;/url&gt;&lt;/related-urls&gt;&lt;/urls&gt;&lt;/record&gt;&lt;/Cite&gt;&lt;/EndNote&gt;</w:instrText>
-      </w:r>
-      <w:r>
-        <w:fldChar w:fldCharType="separate"/>
-      </w:r>
-      <w:r>
-        <w:rPr>
-          <w:noProof/>
-        </w:rPr>
-        <w:t>(USBR, 2026b)</w:t>
-      </w:r>
-      <w:r>
-        <w:fldChar w:fldCharType="end"/>
-      </w:r>
-      <w:r>
-        <w:t>(Table A1)</w:t>
-      </w:r>
-      <w:r>
-        <w:t xml:space="preserve">. </w:t>
-      </w:r>
-      <w:r>
-        <w:t xml:space="preserve">First, convert </w:t>
-      </w:r>
-      <w:r>
-        <w:t xml:space="preserve">each water user’s </w:t>
-      </w:r>
-      <w:r>
-        <w:t xml:space="preserve">percent share of </w:t>
-      </w:r>
-      <w:r>
-        <w:t>Total S</w:t>
-      </w:r>
-      <w:r>
-        <w:t>hortage</w:t>
-      </w:r>
-      <w:r>
-        <w:t xml:space="preserve"> into </w:t>
-      </w:r>
-      <w:r>
-        <w:t xml:space="preserve">shortage </w:t>
-      </w:r>
-      <w:r>
-        <w:t xml:space="preserve">volumes. Second, </w:t>
-      </w:r>
-      <w:r>
-        <w:t xml:space="preserve">the </w:t>
-      </w:r>
-      <w:r>
-        <w:t>T</w:t>
-      </w:r>
-      <w:r>
-        <w:t xml:space="preserve">otal </w:t>
-      </w:r>
-      <w:r>
-        <w:t>A</w:t>
-      </w:r>
-      <w:r>
-        <w:t xml:space="preserve">vailable </w:t>
-      </w:r>
-      <w:r>
-        <w:t>W</w:t>
-      </w:r>
-      <w:r>
-        <w:t xml:space="preserve">ater is Total Legal Entitlements minus Total Shortage. </w:t>
+        <w:t xml:space="preserve">Total Shortage. </w:t>
       </w:r>
       <w:r>
         <w:t xml:space="preserve">Third, each </w:t>
@@ -11150,7 +11496,6 @@
         <w:ind w:left="720" w:hanging="720"/>
       </w:pPr>
       <w:r>
-        <w:lastRenderedPageBreak/>
         <w:t xml:space="preserve">Hecht, J. S., Vogel, R. M., McManamay, R. A., Kroll, C. N., and Reed, J. M. (2020). "Decision Trees for Incorporating Hypothesis Tests of Hydrologic Alteration into Hydropower&amp;#x2013;Ecosystem Tradeoffs." </w:t>
       </w:r>
       <w:r>
@@ -11181,6 +11526,7 @@
         <w:ind w:left="720" w:hanging="720"/>
       </w:pPr>
       <w:r>
+        <w:lastRenderedPageBreak/>
         <w:t xml:space="preserve">Hegwood, M., Langendorf, R. E., and Burgess, M. G. (2022). "Why win–wins are rare in complex environmental management." </w:t>
       </w:r>
       <w:r>
@@ -11251,27 +11597,16 @@
         <w:ind w:left="720" w:hanging="720"/>
       </w:pPr>
       <w:r>
-        <w:t xml:space="preserve">Jasechko, S., and Perrone, D. (2021). "Global groundwater wells at risk of running dry." </w:t>
+        <w:t xml:space="preserve">Kuhn, E., and Fleck, J. (2019). </w:t>
       </w:r>
       <w:r>
         <w:rPr>
           <w:i/>
         </w:rPr>
-        <w:t>Science</w:t>
-      </w:r>
-      <w:r>
-        <w:t xml:space="preserve">, 372(6540), 418-421. </w:t>
-      </w:r>
-      <w:hyperlink r:id="rId36" w:history="1">
-        <w:r>
-          <w:rPr>
-            <w:rStyle w:val="Hyperlink"/>
-          </w:rPr>
-          <w:t>https://doi.org/10.1126/science.abc2755</w:t>
-        </w:r>
-      </w:hyperlink>
-      <w:r>
-        <w:t>.</w:t>
+        <w:t>Science Be Dammed: How Ignoring Inconvenient Science Drained the Colorado River</w:t>
+      </w:r>
+      <w:r>
+        <w:t>, University of Arizona Press.</w:t>
       </w:r>
     </w:p>
     <w:p>
@@ -11281,37 +11616,18 @@
         <w:ind w:left="720" w:hanging="720"/>
       </w:pPr>
       <w:r>
-        <w:t xml:space="preserve">Kuhn, E., and Fleck, J. (2019). </w:t>
+        <w:t xml:space="preserve">Meehan, K., Jepson, W., Harris, L. M., Wutich, A., Beresford, M., Fencl, A., London, J., Pierce, G., Radonic, L., Wells, C., Wilson, N. J., Adams, E. A., Arsenault, R., Brewis, A., Harrington, V., Lambrinidou, Y., McGregor, D., Patrick, R., Pauli, B., Pearson, A. L., Shah, S., Splichalova, D., Workman, C., and Young, S. (2020). "Exposing the myths of household water insecurity in the global north: A critical review." </w:t>
       </w:r>
       <w:r>
         <w:rPr>
           <w:i/>
         </w:rPr>
-        <w:t>Science Be Dammed: How Ignoring Inconvenient Science Drained the Colorado River</w:t>
-      </w:r>
-      <w:r>
-        <w:t>, University of Arizona Press.</w:t>
-      </w:r>
-    </w:p>
-    <w:p>
-      <w:pPr>
-        <w:pStyle w:val="EndNoteBibliography"/>
-        <w:spacing w:after="0"/>
-        <w:ind w:left="720" w:hanging="720"/>
-      </w:pPr>
-      <w:r>
-        <w:t xml:space="preserve">Meehan, K., Jepson, W., Harris, L. M., Wutich, A., Beresford, M., Fencl, A., London, J., Pierce, G., Radonic, L., Wells, C., Wilson, N. J., Adams, E. A., Arsenault, R., Brewis, A., Harrington, V., Lambrinidou, Y., McGregor, D., Patrick, R., Pauli, B., Pearson, A. L., Shah, S., Splichalova, D., Workman, C., and Young, S. (2020). "Exposing the myths of household water insecurity in the global north: A critical review." </w:t>
-      </w:r>
-      <w:r>
-        <w:rPr>
-          <w:i/>
-        </w:rPr>
         <w:t>WIREs Water</w:t>
       </w:r>
       <w:r>
         <w:t xml:space="preserve">, 7(6), e1486. </w:t>
       </w:r>
-      <w:hyperlink r:id="rId37" w:history="1">
+      <w:hyperlink r:id="rId36" w:history="1">
         <w:r>
           <w:rPr>
             <w:rStyle w:val="Hyperlink"/>
@@ -11360,7 +11676,7 @@
       <w:r>
         <w:t xml:space="preserve">, 19(3), 1419. </w:t>
       </w:r>
-      <w:hyperlink r:id="rId38" w:history="1">
+      <w:hyperlink r:id="rId37" w:history="1">
         <w:r>
           <w:rPr>
             <w:rStyle w:val="Hyperlink"/>
@@ -11390,7 +11706,7 @@
       <w:r>
         <w:t xml:space="preserve">, 88(3). </w:t>
       </w:r>
-      <w:hyperlink r:id="rId39" w:history="1">
+      <w:hyperlink r:id="rId38" w:history="1">
         <w:r>
           <w:rPr>
             <w:rStyle w:val="Hyperlink"/>
@@ -11420,7 +11736,7 @@
       <w:r>
         <w:t xml:space="preserve">. </w:t>
       </w:r>
-      <w:hyperlink r:id="rId40" w:history="1">
+      <w:hyperlink r:id="rId39" w:history="1">
         <w:r>
           <w:rPr>
             <w:rStyle w:val="Hyperlink"/>
@@ -11450,7 +11766,7 @@
       <w:r>
         <w:t xml:space="preserve">, 148(10), 02522006. </w:t>
       </w:r>
-      <w:hyperlink r:id="rId41" w:history="1">
+      <w:hyperlink r:id="rId40" w:history="1">
         <w:r>
           <w:rPr>
             <w:rStyle w:val="Hyperlink"/>
@@ -11471,7 +11787,7 @@
       <w:r>
         <w:t xml:space="preserve">Rosenberg, D. E. (2023). "Colorado River Basin Water Accounts: Provoke discussion about more adaptive reservoir operations." Hydroshare.org. </w:t>
       </w:r>
-      <w:hyperlink r:id="rId42" w:history="1">
+      <w:hyperlink r:id="rId41" w:history="1">
         <w:r>
           <w:rPr>
             <w:rStyle w:val="Hyperlink"/>
@@ -11501,7 +11817,7 @@
       <w:r>
         <w:t xml:space="preserve">, 150(7). </w:t>
       </w:r>
-      <w:hyperlink r:id="rId43" w:history="1">
+      <w:hyperlink r:id="rId42" w:history="1">
         <w:r>
           <w:rPr>
             <w:rStyle w:val="Hyperlink"/>
@@ -11531,7 +11847,7 @@
       <w:r>
         <w:t xml:space="preserve">, 58(6), 1053-1075. </w:t>
       </w:r>
-      <w:hyperlink r:id="rId44" w:history="1">
+      <w:hyperlink r:id="rId43" w:history="1">
         <w:r>
           <w:rPr>
             <w:rStyle w:val="Hyperlink"/>
@@ -11561,7 +11877,7 @@
       <w:r>
         <w:t xml:space="preserve">, 60(7), e2024WR037225. </w:t>
       </w:r>
-      <w:hyperlink r:id="rId45" w:history="1">
+      <w:hyperlink r:id="rId44" w:history="1">
         <w:r>
           <w:rPr>
             <w:rStyle w:val="Hyperlink"/>
@@ -11580,7 +11896,6 @@
         <w:ind w:left="720" w:hanging="720"/>
       </w:pPr>
       <w:r>
-        <w:lastRenderedPageBreak/>
         <w:t xml:space="preserve">Smith, R., Zagona, E., Kasprzyk, J., Bonham, N., Alexander, E., Butler, A., Prairie, J., and Jerla, C. (2022). "Decision Science Can Help Address the Challenges of Long-Term Planning in the Colorado River Basin." </w:t>
       </w:r>
       <w:r>
@@ -11592,7 +11907,7 @@
       <w:r>
         <w:t xml:space="preserve">, 58(5), 735-745. </w:t>
       </w:r>
-      <w:hyperlink r:id="rId46" w:history="1">
+      <w:hyperlink r:id="rId45" w:history="1">
         <w:r>
           <w:rPr>
             <w:rStyle w:val="Hyperlink"/>
@@ -11622,7 +11937,7 @@
       <w:r>
         <w:t xml:space="preserve">, 22(2), 4-21. </w:t>
       </w:r>
-      <w:hyperlink r:id="rId47" w:history="1">
+      <w:hyperlink r:id="rId46" w:history="1">
         <w:r>
           <w:rPr>
             <w:rStyle w:val="Hyperlink"/>
@@ -11652,7 +11967,7 @@
       <w:r>
         <w:t xml:space="preserve">, 10(2), e565. </w:t>
       </w:r>
-      <w:hyperlink r:id="rId48" w:history="1">
+      <w:hyperlink r:id="rId47" w:history="1">
         <w:r>
           <w:rPr>
             <w:rStyle w:val="Hyperlink"/>
@@ -11682,7 +11997,7 @@
       <w:r>
         <w:t xml:space="preserve">. </w:t>
       </w:r>
-      <w:hyperlink r:id="rId49" w:history="1">
+      <w:hyperlink r:id="rId48" w:history="1">
         <w:r>
           <w:rPr>
             <w:rStyle w:val="Hyperlink"/>
@@ -11712,7 +12027,7 @@
       <w:r>
         <w:t xml:space="preserve">. </w:t>
       </w:r>
-      <w:hyperlink r:id="rId50" w:history="1">
+      <w:hyperlink r:id="rId49" w:history="1">
         <w:r>
           <w:rPr>
             <w:rStyle w:val="Hyperlink"/>
@@ -11742,7 +12057,7 @@
       <w:r>
         <w:t xml:space="preserve">, 53(3), 2404-2418. </w:t>
       </w:r>
-      <w:hyperlink r:id="rId51" w:history="1">
+      <w:hyperlink r:id="rId50" w:history="1">
         <w:r>
           <w:rPr>
             <w:rStyle w:val="Hyperlink"/>
@@ -11763,7 +12078,7 @@
       <w:r>
         <w:t xml:space="preserve">USBR. (2007). "Record of Decision: Colorado River Interim Guidelines for Lower Basin Shortages and Coordinated Operations for Lakes Powell and Mead." U.S. Bureau of Reclamation. </w:t>
       </w:r>
-      <w:hyperlink r:id="rId52" w:history="1">
+      <w:hyperlink r:id="rId51" w:history="1">
         <w:r>
           <w:rPr>
             <w:rStyle w:val="Hyperlink"/>
@@ -11784,7 +12099,7 @@
       <w:r>
         <w:t xml:space="preserve">USBR. (2019). "Agreement Concerning Colorado River Drought Contingency Management and Operations." U.S. Bureau of Reclamation, Washington, DC. </w:t>
       </w:r>
-      <w:hyperlink r:id="rId53" w:history="1">
+      <w:hyperlink r:id="rId52" w:history="1">
         <w:r>
           <w:rPr>
             <w:rStyle w:val="Hyperlink"/>
@@ -11805,7 +12120,7 @@
       <w:r>
         <w:t xml:space="preserve">USBR. (2021). "Pilot System Conservation Program." U.S. Bureau of Reclamation, </w:t>
       </w:r>
-      <w:hyperlink r:id="rId54" w:history="1">
+      <w:hyperlink r:id="rId53" w:history="1">
         <w:r>
           <w:rPr>
             <w:rStyle w:val="Hyperlink"/>
@@ -11826,7 +12141,7 @@
       <w:r>
         <w:t xml:space="preserve">USBR. (2026a). "Boulder Canyon Operations Office - Program and Activities: Water Accounting Reports." U.S. Bureau of Reclamation. </w:t>
       </w:r>
-      <w:hyperlink r:id="rId55" w:history="1">
+      <w:hyperlink r:id="rId54" w:history="1">
         <w:r>
           <w:rPr>
             <w:rStyle w:val="Hyperlink"/>
@@ -11847,7 +12162,7 @@
       <w:r>
         <w:t xml:space="preserve">USBR. (2026b). "Post-2026 Operational Guidelines and Strategies for Lake Powell and Lake Mead – Final Environmental Impact Statement." U.S. Bureau of Reclamation. </w:t>
       </w:r>
-      <w:hyperlink r:id="rId56" w:history="1">
+      <w:hyperlink r:id="rId55" w:history="1">
         <w:r>
           <w:rPr>
             <w:rStyle w:val="Hyperlink"/>
@@ -11877,7 +12192,7 @@
       <w:r>
         <w:t xml:space="preserve">, 147(9), 04021034. </w:t>
       </w:r>
-      <w:hyperlink r:id="rId57" w:history="1">
+      <w:hyperlink r:id="rId56" w:history="1">
         <w:r>
           <w:rPr>
             <w:rStyle w:val="Hyperlink"/>
@@ -11897,7 +12212,7 @@
       <w:r>
         <w:t xml:space="preserve">Wang, J., and Schmidt, J. C. (2020). "Stream flow and Losses of the Colorado River in the Southern Colorado Plateau." Center for Colorado River Studies, Utah State University, Logan, Utah. </w:t>
       </w:r>
-      <w:hyperlink r:id="rId58" w:history="1">
+      <w:hyperlink r:id="rId57" w:history="1">
         <w:r>
           <w:rPr>
             <w:rStyle w:val="Hyperlink"/>
@@ -11927,7 +12242,7 @@
       </w:r>
     </w:p>
     <w:sectPr>
-      <w:headerReference w:type="default" r:id="rId59"/>
+      <w:headerReference w:type="default" r:id="rId58"/>
       <w:pgSz w:w="12240" w:h="15840"/>
       <w:pgMar w:top="1440" w:right="1440" w:bottom="1440" w:left="1440" w:header="720" w:footer="720" w:gutter="0"/>
       <w:lnNumType w:countBy="1" w:restart="continuous"/>
@@ -11940,24 +12255,7 @@
 
 <file path=word/comments.xml><?xml version="1.0" encoding="utf-8"?>
 <w:comments xmlns:wpc="http://schemas.microsoft.com/office/word/2010/wordprocessingCanvas" xmlns:cx="http://schemas.microsoft.com/office/drawing/2014/chartex" xmlns:cx1="http://schemas.microsoft.com/office/drawing/2015/9/8/chartex" xmlns:cx2="http://schemas.microsoft.com/office/drawing/2015/10/21/chartex" xmlns:cx3="http://schemas.microsoft.com/office/drawing/2016/5/9/chartex" xmlns:cx4="http://schemas.microsoft.com/office/drawing/2016/5/10/chartex" xmlns:cx5="http://schemas.microsoft.com/office/drawing/2016/5/11/chartex" xmlns:cx6="http://schemas.microsoft.com/office/drawing/2016/5/12/chartex" xmlns:cx7="http://schemas.microsoft.com/office/drawing/2016/5/13/chartex" xmlns:cx8="http://schemas.microsoft.com/office/drawing/2016/5/14/chartex" xmlns:mc="http://schemas.openxmlformats.org/markup-compatibility/2006" xmlns:aink="http://schemas.microsoft.com/office/drawing/2016/ink" xmlns:am3d="http://schemas.microsoft.com/office/drawing/2017/model3d" xmlns:o="urn:schemas-microsoft-com:office:office" xmlns:oel="http://schemas.microsoft.com/office/2019/extlst" xmlns:r="http://schemas.openxmlformats.org/officeDocument/2006/relationships" xmlns:m="http://schemas.openxmlformats.org/officeDocument/2006/math" xmlns:v="urn:schemas-microsoft-com:vml" xmlns:wp14="http://schemas.microsoft.com/office/word/2010/wordprocessingDrawing" xmlns:wp="http://schemas.openxmlformats.org/drawingml/2006/wordprocessingDrawing" xmlns:w10="urn:schemas-microsoft-com:office:word" xmlns:w="http://schemas.openxmlformats.org/wordprocessingml/2006/main" xmlns:w14="http://schemas.microsoft.com/office/word/2010/wordml" xmlns:w15="http://schemas.microsoft.com/office/word/2012/wordml" xmlns:w16cei="http://schemas.microsoft.com/office/word/2026/wordml/cei" xmlns:w16cex="http://schemas.microsoft.com/office/word/2018/wordml/cex" xmlns:w16cid="http://schemas.microsoft.com/office/word/2016/wordml/cid" xmlns:w16="http://schemas.microsoft.com/office/word/2018/wordml" xmlns:w16du="http://schemas.microsoft.com/office/word/2023/wordml/word16du" xmlns:w16sdtdh="http://schemas.microsoft.com/office/word/2020/wordml/sdtdatahash" xmlns:w16sdtfl="http://schemas.microsoft.com/office/word/2024/wordml/sdtformatlock" xmlns:w16se="http://schemas.microsoft.com/office/word/2015/wordml/symex" xmlns:wpg="http://schemas.microsoft.com/office/word/2010/wordprocessingGroup" xmlns:wpi="http://schemas.microsoft.com/office/word/2010/wordprocessingInk" xmlns:wne="http://schemas.microsoft.com/office/word/2006/wordml" xmlns:wps="http://schemas.microsoft.com/office/word/2010/wordprocessingShape" mc:Ignorable="w14 w15 w16se w16cid w16 w16cex w16sdtdh w16sdtfl w16du wp14">
-  <w:comment w:id="0" w:author="Erik Christian Porse" w:date="2026-05-27T12:47:00Z" w:initials="EP">
-    <w:p>
-      <w:r>
-        <w:rPr>
-          <w:rStyle w:val="CommentReference"/>
-        </w:rPr>
-        <w:annotationRef/>
-      </w:r>
-      <w:r>
-        <w:rPr>
-          <w:sz w:val="20"/>
-          <w:szCs w:val="20"/>
-        </w:rPr>
-        <w:t>Scott and Deb's work is more focused on groundwater rather than surface water reservoirs. Perhaps replace with a better reference on overuse of surface water (check Julie Padowski's work)</w:t>
-      </w:r>
-    </w:p>
-  </w:comment>
-  <w:comment w:id="1" w:author="Erik Porse" w:date="2026-07-21T16:51:00Z" w:initials="EP">
+  <w:comment w:id="0" w:author="Erik Porse" w:date="2026-07-21T16:51:00Z" w:initials="EP">
     <w:p>
       <w:pPr>
         <w:pStyle w:val="CommentText"/>
@@ -11978,21 +12276,18 @@
 
 <file path=word/commentsExtended.xml><?xml version="1.0" encoding="utf-8"?>
 <w15:commentsEx xmlns:wpc="http://schemas.microsoft.com/office/word/2010/wordprocessingCanvas" xmlns:cx="http://schemas.microsoft.com/office/drawing/2014/chartex" xmlns:cx1="http://schemas.microsoft.com/office/drawing/2015/9/8/chartex" xmlns:cx2="http://schemas.microsoft.com/office/drawing/2015/10/21/chartex" xmlns:cx3="http://schemas.microsoft.com/office/drawing/2016/5/9/chartex" xmlns:cx4="http://schemas.microsoft.com/office/drawing/2016/5/10/chartex" xmlns:cx5="http://schemas.microsoft.com/office/drawing/2016/5/11/chartex" xmlns:cx6="http://schemas.microsoft.com/office/drawing/2016/5/12/chartex" xmlns:cx7="http://schemas.microsoft.com/office/drawing/2016/5/13/chartex" xmlns:cx8="http://schemas.microsoft.com/office/drawing/2016/5/14/chartex" xmlns:mc="http://schemas.openxmlformats.org/markup-compatibility/2006" xmlns:aink="http://schemas.microsoft.com/office/drawing/2016/ink" xmlns:am3d="http://schemas.microsoft.com/office/drawing/2017/model3d" xmlns:o="urn:schemas-microsoft-com:office:office" xmlns:oel="http://schemas.microsoft.com/office/2019/extlst" xmlns:r="http://schemas.openxmlformats.org/officeDocument/2006/relationships" xmlns:m="http://schemas.openxmlformats.org/officeDocument/2006/math" xmlns:v="urn:schemas-microsoft-com:vml" xmlns:wp14="http://schemas.microsoft.com/office/word/2010/wordprocessingDrawing" xmlns:wp="http://schemas.openxmlformats.org/drawingml/2006/wordprocessingDrawing" xmlns:w10="urn:schemas-microsoft-com:office:word" xmlns:w="http://schemas.openxmlformats.org/wordprocessingml/2006/main" xmlns:w14="http://schemas.microsoft.com/office/word/2010/wordml" xmlns:w15="http://schemas.microsoft.com/office/word/2012/wordml" xmlns:w16cei="http://schemas.microsoft.com/office/word/2026/wordml/cei" xmlns:w16cex="http://schemas.microsoft.com/office/word/2018/wordml/cex" xmlns:w16cid="http://schemas.microsoft.com/office/word/2016/wordml/cid" xmlns:w16="http://schemas.microsoft.com/office/word/2018/wordml" xmlns:w16du="http://schemas.microsoft.com/office/word/2023/wordml/word16du" xmlns:w16sdtdh="http://schemas.microsoft.com/office/word/2020/wordml/sdtdatahash" xmlns:w16sdtfl="http://schemas.microsoft.com/office/word/2024/wordml/sdtformatlock" xmlns:w16se="http://schemas.microsoft.com/office/word/2015/wordml/symex" xmlns:wpg="http://schemas.microsoft.com/office/word/2010/wordprocessingGroup" xmlns:wpi="http://schemas.microsoft.com/office/word/2010/wordprocessingInk" xmlns:wne="http://schemas.microsoft.com/office/word/2006/wordml" xmlns:wps="http://schemas.microsoft.com/office/word/2010/wordprocessingShape" mc:Ignorable="w14 w15 w16se w16cid w16 w16cex w16sdtdh w16sdtfl w16du wp14">
-  <w15:commentEx w15:paraId="5028B586" w15:done="0"/>
   <w15:commentEx w15:paraId="65F86C7F" w15:done="0"/>
 </w15:commentsEx>
 </file>
 
 <file path=word/commentsExtensible.xml><?xml version="1.0" encoding="utf-8"?>
 <w16cex:commentsExtensible xmlns:wpc="http://schemas.microsoft.com/office/word/2010/wordprocessingCanvas" xmlns:cx="http://schemas.microsoft.com/office/drawing/2014/chartex" xmlns:cx1="http://schemas.microsoft.com/office/drawing/2015/9/8/chartex" xmlns:cx2="http://schemas.microsoft.com/office/drawing/2015/10/21/chartex" xmlns:cx3="http://schemas.microsoft.com/office/drawing/2016/5/9/chartex" xmlns:cx4="http://schemas.microsoft.com/office/drawing/2016/5/10/chartex" xmlns:cx5="http://schemas.microsoft.com/office/drawing/2016/5/11/chartex" xmlns:cx6="http://schemas.microsoft.com/office/drawing/2016/5/12/chartex" xmlns:cx7="http://schemas.microsoft.com/office/drawing/2016/5/13/chartex" xmlns:cx8="http://schemas.microsoft.com/office/drawing/2016/5/14/chartex" xmlns:cr="http://schemas.microsoft.com/office/comments/2020/reactions" xmlns:mc="http://schemas.openxmlformats.org/markup-compatibility/2006" xmlns:aink="http://schemas.microsoft.com/office/drawing/2016/ink" xmlns:am3d="http://schemas.microsoft.com/office/drawing/2017/model3d" xmlns:o="urn:schemas-microsoft-com:office:office" xmlns:oel="http://schemas.microsoft.com/office/2019/extlst" xmlns:r="http://schemas.openxmlformats.org/officeDocument/2006/relationships" xmlns:m="http://schemas.openxmlformats.org/officeDocument/2006/math" xmlns:v="urn:schemas-microsoft-com:vml" xmlns:wp14="http://schemas.microsoft.com/office/word/2010/wordprocessingDrawing" xmlns:wp="http://schemas.openxmlformats.org/drawingml/2006/wordprocessingDrawing" xmlns:w10="urn:schemas-microsoft-com:office:word" xmlns:w="http://schemas.openxmlformats.org/wordprocessingml/2006/main" xmlns:w14="http://schemas.microsoft.com/office/word/2010/wordml" xmlns:w15="http://schemas.microsoft.com/office/word/2012/wordml" xmlns:w16cei="http://schemas.microsoft.com/office/word/2026/wordml/cei" xmlns:w16cex="http://schemas.microsoft.com/office/word/2018/wordml/cex" xmlns:w16cid="http://schemas.microsoft.com/office/word/2016/wordml/cid" xmlns:w16="http://schemas.microsoft.com/office/word/2018/wordml" xmlns:w16du="http://schemas.microsoft.com/office/word/2023/wordml/word16du" xmlns:w16sdtdh="http://schemas.microsoft.com/office/word/2020/wordml/sdtdatahash" xmlns:w16sdtfl="http://schemas.microsoft.com/office/word/2024/wordml/sdtformatlock" xmlns:w16se="http://schemas.microsoft.com/office/word/2015/wordml/symex" xmlns:wpg="http://schemas.microsoft.com/office/word/2010/wordprocessingGroup" xmlns:wpi="http://schemas.microsoft.com/office/word/2010/wordprocessingInk" xmlns:wne="http://schemas.microsoft.com/office/word/2006/wordml" xmlns:wps="http://schemas.microsoft.com/office/word/2010/wordprocessingShape" mc:Ignorable="w14 w15 w16se w16cid w16 w16cex w16sdtdh w16sdtfl cr w16du wp14">
-  <w16cex:commentExtensible w16cex:durableId="29F1A260" w16cex:dateUtc="2026-05-27T19:47:00Z"/>
   <w16cex:commentExtensible w16cex:durableId="45F6D256" w16cex:dateUtc="2026-07-21T23:51:00Z"/>
 </w16cex:commentsExtensible>
 </file>
 
 <file path=word/commentsIds.xml><?xml version="1.0" encoding="utf-8"?>
 <w16cid:commentsIds xmlns:wpc="http://schemas.microsoft.com/office/word/2010/wordprocessingCanvas" xmlns:cx="http://schemas.microsoft.com/office/drawing/2014/chartex" xmlns:cx1="http://schemas.microsoft.com/office/drawing/2015/9/8/chartex" xmlns:cx2="http://schemas.microsoft.com/office/drawing/2015/10/21/chartex" xmlns:cx3="http://schemas.microsoft.com/office/drawing/2016/5/9/chartex" xmlns:cx4="http://schemas.microsoft.com/office/drawing/2016/5/10/chartex" xmlns:cx5="http://schemas.microsoft.com/office/drawing/2016/5/11/chartex" xmlns:cx6="http://schemas.microsoft.com/office/drawing/2016/5/12/chartex" xmlns:cx7="http://schemas.microsoft.com/office/drawing/2016/5/13/chartex" xmlns:cx8="http://schemas.microsoft.com/office/drawing/2016/5/14/chartex" xmlns:mc="http://schemas.openxmlformats.org/markup-compatibility/2006" xmlns:aink="http://schemas.microsoft.com/office/drawing/2016/ink" xmlns:am3d="http://schemas.microsoft.com/office/drawing/2017/model3d" xmlns:o="urn:schemas-microsoft-com:office:office" xmlns:oel="http://schemas.microsoft.com/office/2019/extlst" xmlns:r="http://schemas.openxmlformats.org/officeDocument/2006/relationships" xmlns:m="http://schemas.openxmlformats.org/officeDocument/2006/math" xmlns:v="urn:schemas-microsoft-com:vml" xmlns:wp14="http://schemas.microsoft.com/office/word/2010/wordprocessingDrawing" xmlns:wp="http://schemas.openxmlformats.org/drawingml/2006/wordprocessingDrawing" xmlns:w10="urn:schemas-microsoft-com:office:word" xmlns:w="http://schemas.openxmlformats.org/wordprocessingml/2006/main" xmlns:w14="http://schemas.microsoft.com/office/word/2010/wordml" xmlns:w15="http://schemas.microsoft.com/office/word/2012/wordml" xmlns:w16cei="http://schemas.microsoft.com/office/word/2026/wordml/cei" xmlns:w16cex="http://schemas.microsoft.com/office/word/2018/wordml/cex" xmlns:w16cid="http://schemas.microsoft.com/office/word/2016/wordml/cid" xmlns:w16="http://schemas.microsoft.com/office/word/2018/wordml" xmlns:w16du="http://schemas.microsoft.com/office/word/2023/wordml/word16du" xmlns:w16sdtdh="http://schemas.microsoft.com/office/word/2020/wordml/sdtdatahash" xmlns:w16sdtfl="http://schemas.microsoft.com/office/word/2024/wordml/sdtformatlock" xmlns:w16se="http://schemas.microsoft.com/office/word/2015/wordml/symex" xmlns:wpg="http://schemas.microsoft.com/office/word/2010/wordprocessingGroup" xmlns:wpi="http://schemas.microsoft.com/office/word/2010/wordprocessingInk" xmlns:wne="http://schemas.microsoft.com/office/word/2006/wordml" xmlns:wps="http://schemas.microsoft.com/office/word/2010/wordprocessingShape" mc:Ignorable="w14 w15 w16se w16cid w16 w16cex w16sdtdh w16sdtfl w16du wp14">
-  <w16cid:commentId w16cid:paraId="5028B586" w16cid:durableId="29F1A260"/>
   <w16cid:commentId w16cid:paraId="65F86C7F" w16cid:durableId="45F6D256"/>
 </w16cid:commentsIds>
 </file>
@@ -15694,14 +15989,6 @@
     <w:abstractNumId w:val="18"/>
   </w:num>
 </w:numbering>
-</file>
-
-<file path=word/people.xml><?xml version="1.0" encoding="utf-8"?>
-<w15:people xmlns:wpc="http://schemas.microsoft.com/office/word/2010/wordprocessingCanvas" xmlns:cx="http://schemas.microsoft.com/office/drawing/2014/chartex" xmlns:cx1="http://schemas.microsoft.com/office/drawing/2015/9/8/chartex" xmlns:cx2="http://schemas.microsoft.com/office/drawing/2015/10/21/chartex" xmlns:cx3="http://schemas.microsoft.com/office/drawing/2016/5/9/chartex" xmlns:cx4="http://schemas.microsoft.com/office/drawing/2016/5/10/chartex" xmlns:cx5="http://schemas.microsoft.com/office/drawing/2016/5/11/chartex" xmlns:cx6="http://schemas.microsoft.com/office/drawing/2016/5/12/chartex" xmlns:cx7="http://schemas.microsoft.com/office/drawing/2016/5/13/chartex" xmlns:cx8="http://schemas.microsoft.com/office/drawing/2016/5/14/chartex" xmlns:mc="http://schemas.openxmlformats.org/markup-compatibility/2006" xmlns:aink="http://schemas.microsoft.com/office/drawing/2016/ink" xmlns:am3d="http://schemas.microsoft.com/office/drawing/2017/model3d" xmlns:o="urn:schemas-microsoft-com:office:office" xmlns:oel="http://schemas.microsoft.com/office/2019/extlst" xmlns:r="http://schemas.openxmlformats.org/officeDocument/2006/relationships" xmlns:m="http://schemas.openxmlformats.org/officeDocument/2006/math" xmlns:v="urn:schemas-microsoft-com:vml" xmlns:wp14="http://schemas.microsoft.com/office/word/2010/wordprocessingDrawing" xmlns:wp="http://schemas.openxmlformats.org/drawingml/2006/wordprocessingDrawing" xmlns:w10="urn:schemas-microsoft-com:office:word" xmlns:w="http://schemas.openxmlformats.org/wordprocessingml/2006/main" xmlns:w14="http://schemas.microsoft.com/office/word/2010/wordml" xmlns:w15="http://schemas.microsoft.com/office/word/2012/wordml" xmlns:w16cei="http://schemas.microsoft.com/office/word/2026/wordml/cei" xmlns:w16cex="http://schemas.microsoft.com/office/word/2018/wordml/cex" xmlns:w16cid="http://schemas.microsoft.com/office/word/2016/wordml/cid" xmlns:w16="http://schemas.microsoft.com/office/word/2018/wordml" xmlns:w16du="http://schemas.microsoft.com/office/word/2023/wordml/word16du" xmlns:w16sdtdh="http://schemas.microsoft.com/office/word/2020/wordml/sdtdatahash" xmlns:w16sdtfl="http://schemas.microsoft.com/office/word/2024/wordml/sdtformatlock" xmlns:w16se="http://schemas.microsoft.com/office/word/2015/wordml/symex" xmlns:wpg="http://schemas.microsoft.com/office/word/2010/wordprocessingGroup" xmlns:wpi="http://schemas.microsoft.com/office/word/2010/wordprocessingInk" xmlns:wne="http://schemas.microsoft.com/office/word/2006/wordml" xmlns:wps="http://schemas.microsoft.com/office/word/2010/wordprocessingShape" mc:Ignorable="w14 w15 w16se w16cid w16 w16cex w16sdtdh w16sdtfl w16du wp14">
-  <w15:person w15:author="Erik Christian Porse">
-    <w15:presenceInfo w15:providerId="AD" w15:userId="S::eporse@ucdavis.edu::e6b50e3b-0b40-4d96-8b53-4f3def8ebfff"/>
-  </w15:person>
-</w15:people>
 </file>
 
 <file path=word/styles.xml><?xml version="1.0" encoding="utf-8"?>
@@ -16131,7 +16418,6 @@
   <w:style w:type="character" w:default="1" w:styleId="DefaultParagraphFont">
     <w:name w:val="Default Paragraph Font"/>
     <w:uiPriority w:val="1"/>
-    <w:semiHidden/>
     <w:unhideWhenUsed/>
   </w:style>
   <w:style w:type="table" w:default="1" w:styleId="TableNormal">

</xml_diff>

<commit_message>
Remove Old folder in R-folder
</commit_message>
<xml_diff>
--- a/LakeMeadWaterConservationProgramSuccessChallengesSuggestions_v4.docx
+++ b/LakeMeadWaterConservationProgramSuccessChallengesSuggestions_v4.docx
@@ -3342,7 +3342,15 @@
             <w:sz w:val="24"/>
             <w:szCs w:val="24"/>
           </w:rPr>
-          <m:t>=max</m:t>
+          <m:t>=</m:t>
+        </m:r>
+        <m:r>
+          <w:rPr>
+            <w:rFonts w:ascii="Cambria Math" w:hAnsi="Cambria Math" w:cstheme="majorBidi"/>
+            <w:sz w:val="24"/>
+            <w:szCs w:val="24"/>
+          </w:rPr>
+          <m:t>max</m:t>
         </m:r>
         <m:d>
           <m:dPr>
@@ -3394,7 +3402,15 @@
                 <w:sz w:val="24"/>
                 <w:szCs w:val="24"/>
               </w:rPr>
-              <m:t xml:space="preserve">- </m:t>
+              <m:t>-</m:t>
+            </m:r>
+            <m:r>
+              <w:rPr>
+                <w:rFonts w:ascii="Cambria Math" w:hAnsi="Cambria Math" w:cstheme="majorBidi"/>
+                <w:sz w:val="24"/>
+                <w:szCs w:val="24"/>
+              </w:rPr>
+              <m:t xml:space="preserve"> </m:t>
             </m:r>
             <m:sSub>
               <m:sSubPr>
@@ -3444,7 +3460,15 @@
             <w:sz w:val="24"/>
             <w:szCs w:val="24"/>
           </w:rPr>
-          <m:t>,   ∀i</m:t>
+          <m:t>,   ∀</m:t>
+        </m:r>
+        <m:r>
+          <w:rPr>
+            <w:rFonts w:ascii="Cambria Math" w:hAnsi="Cambria Math" w:cstheme="majorBidi"/>
+            <w:sz w:val="24"/>
+            <w:szCs w:val="24"/>
+          </w:rPr>
+          <m:t>i</m:t>
         </m:r>
       </m:oMath>
       <w:r>
@@ -4066,7 +4090,13 @@
           <w:rPr>
             <w:rFonts w:ascii="Cambria Math" w:hAnsi="Cambria Math"/>
           </w:rPr>
-          <m:t>=max</m:t>
+          <m:t>=</m:t>
+        </m:r>
+        <m:r>
+          <w:rPr>
+            <w:rFonts w:ascii="Cambria Math" w:hAnsi="Cambria Math"/>
+          </w:rPr>
+          <m:t>max</m:t>
         </m:r>
         <m:d>
           <m:dPr>
@@ -4140,7 +4170,13 @@
               <w:rPr>
                 <w:rFonts w:ascii="Cambria Math" w:hAnsi="Cambria Math"/>
               </w:rPr>
-              <m:t xml:space="preserve">- </m:t>
+              <m:t>-</m:t>
+            </m:r>
+            <m:r>
+              <w:rPr>
+                <w:rFonts w:ascii="Cambria Math" w:hAnsi="Cambria Math"/>
+              </w:rPr>
+              <m:t xml:space="preserve"> </m:t>
             </m:r>
             <m:sSub>
               <m:sSubPr>
@@ -4180,7 +4216,13 @@
           <w:rPr>
             <w:rFonts w:ascii="Cambria Math" w:hAnsi="Cambria Math"/>
           </w:rPr>
-          <m:t>,   ∀i</m:t>
+          <m:t>,   ∀</m:t>
+        </m:r>
+        <m:r>
+          <w:rPr>
+            <w:rFonts w:ascii="Cambria Math" w:hAnsi="Cambria Math"/>
+          </w:rPr>
+          <m:t>i</m:t>
         </m:r>
       </m:oMath>
       <w:r>
@@ -5660,7 +5702,13 @@
           <w:rPr>
             <w:rFonts w:ascii="Cambria Math" w:hAnsi="Cambria Math"/>
           </w:rPr>
-          <m:t>=maximum</m:t>
+          <m:t>=</m:t>
+        </m:r>
+        <m:r>
+          <w:rPr>
+            <w:rFonts w:ascii="Cambria Math" w:hAnsi="Cambria Math"/>
+          </w:rPr>
+          <m:t>maximum</m:t>
         </m:r>
         <m:d>
           <m:dPr>
@@ -5734,7 +5782,13 @@
               <w:rPr>
                 <w:rFonts w:ascii="Cambria Math" w:hAnsi="Cambria Math"/>
               </w:rPr>
-              <m:t xml:space="preserve">- </m:t>
+              <m:t>-</m:t>
+            </m:r>
+            <m:r>
+              <w:rPr>
+                <w:rFonts w:ascii="Cambria Math" w:hAnsi="Cambria Math"/>
+              </w:rPr>
+              <m:t xml:space="preserve"> </m:t>
             </m:r>
             <m:sSub>
               <m:sSubPr>
@@ -7063,7 +7117,19 @@
               <w:rPr>
                 <w:rFonts w:ascii="Cambria Math" w:hAnsi="Cambria Math"/>
               </w:rPr>
-              <m:t>Physical</m:t>
+              <m:t>P</m:t>
+            </m:r>
+            <m:r>
+              <w:rPr>
+                <w:rFonts w:ascii="Cambria Math" w:hAnsi="Cambria Math"/>
+              </w:rPr>
+              <m:t>h</m:t>
+            </m:r>
+            <m:r>
+              <w:rPr>
+                <w:rFonts w:ascii="Cambria Math" w:hAnsi="Cambria Math"/>
+              </w:rPr>
+              <m:t>ysical</m:t>
             </m:r>
           </m:sub>
         </m:sSub>
@@ -7105,7 +7171,13 @@
           <w:rPr>
             <w:rFonts w:ascii="Cambria Math" w:hAnsi="Cambria Math"/>
           </w:rPr>
-          <m:t>≤max</m:t>
+          <m:t>≤</m:t>
+        </m:r>
+        <m:r>
+          <w:rPr>
+            <w:rFonts w:ascii="Cambria Math" w:hAnsi="Cambria Math"/>
+          </w:rPr>
+          <m:t>max</m:t>
         </m:r>
         <m:d>
           <m:dPr>
@@ -7139,7 +7211,19 @@
                   <w:rPr>
                     <w:rFonts w:ascii="Cambria Math" w:hAnsi="Cambria Math"/>
                   </w:rPr>
-                  <m:t>Physical</m:t>
+                  <m:t>P</m:t>
+                </m:r>
+                <m:r>
+                  <w:rPr>
+                    <w:rFonts w:ascii="Cambria Math" w:hAnsi="Cambria Math"/>
+                  </w:rPr>
+                  <m:t>h</m:t>
+                </m:r>
+                <m:r>
+                  <w:rPr>
+                    <w:rFonts w:ascii="Cambria Math" w:hAnsi="Cambria Math"/>
+                  </w:rPr>
+                  <m:t>ysical</m:t>
                 </m:r>
               </m:sub>
             </m:sSub>
@@ -7147,7 +7231,13 @@
               <w:rPr>
                 <w:rFonts w:ascii="Cambria Math" w:hAnsi="Cambria Math"/>
               </w:rPr>
-              <m:t xml:space="preserve">- </m:t>
+              <m:t>-</m:t>
+            </m:r>
+            <m:r>
+              <w:rPr>
+                <w:rFonts w:ascii="Cambria Math" w:hAnsi="Cambria Math"/>
+              </w:rPr>
+              <m:t xml:space="preserve"> </m:t>
             </m:r>
             <m:sSub>
               <m:sSubPr>
@@ -7243,7 +7333,13 @@
           <w:rPr>
             <w:rFonts w:ascii="Cambria Math" w:hAnsi="Cambria Math"/>
           </w:rPr>
-          <m:t>=max</m:t>
+          <m:t>=</m:t>
+        </m:r>
+        <m:r>
+          <w:rPr>
+            <w:rFonts w:ascii="Cambria Math" w:hAnsi="Cambria Math"/>
+          </w:rPr>
+          <m:t>max</m:t>
         </m:r>
         <m:d>
           <m:dPr>
@@ -7295,7 +7391,13 @@
                   <w:rPr>
                     <w:rFonts w:ascii="Cambria Math" w:hAnsi="Cambria Math"/>
                   </w:rPr>
-                  <m:t>-M</m:t>
+                  <m:t>-</m:t>
+                </m:r>
+                <m:r>
+                  <w:rPr>
+                    <w:rFonts w:ascii="Cambria Math" w:hAnsi="Cambria Math"/>
+                  </w:rPr>
+                  <m:t>M</m:t>
                 </m:r>
               </m:e>
               <m:sub>
@@ -7311,7 +7413,13 @@
               <w:rPr>
                 <w:rFonts w:ascii="Cambria Math" w:hAnsi="Cambria Math"/>
               </w:rPr>
-              <m:t xml:space="preserve">- </m:t>
+              <m:t>-</m:t>
+            </m:r>
+            <m:r>
+              <w:rPr>
+                <w:rFonts w:ascii="Cambria Math" w:hAnsi="Cambria Math"/>
+              </w:rPr>
+              <m:t xml:space="preserve"> </m:t>
             </m:r>
             <m:sSub>
               <m:sSubPr>
@@ -7351,7 +7459,13 @@
           <w:rPr>
             <w:rFonts w:ascii="Cambria Math" w:hAnsi="Cambria Math"/>
           </w:rPr>
-          <m:t>∙min</m:t>
+          <m:t>∙</m:t>
+        </m:r>
+        <m:r>
+          <w:rPr>
+            <w:rFonts w:ascii="Cambria Math" w:hAnsi="Cambria Math"/>
+          </w:rPr>
+          <m:t>min</m:t>
         </m:r>
         <m:d>
           <m:dPr>
@@ -7401,7 +7515,19 @@
                       <w:rPr>
                         <w:rFonts w:ascii="Cambria Math" w:hAnsi="Cambria Math"/>
                       </w:rPr>
-                      <m:t>Physical</m:t>
+                      <m:t>P</m:t>
+                    </m:r>
+                    <m:r>
+                      <w:rPr>
+                        <w:rFonts w:ascii="Cambria Math" w:hAnsi="Cambria Math"/>
+                      </w:rPr>
+                      <m:t>h</m:t>
+                    </m:r>
+                    <m:r>
+                      <w:rPr>
+                        <w:rFonts w:ascii="Cambria Math" w:hAnsi="Cambria Math"/>
+                      </w:rPr>
+                      <m:t>ysical</m:t>
                     </m:r>
                   </m:sub>
                 </m:sSub>
@@ -7473,7 +7599,13 @@
           <w:rPr>
             <w:rFonts w:ascii="Cambria Math" w:hAnsi="Cambria Math"/>
           </w:rPr>
-          <m:t>,   ∀i</m:t>
+          <m:t>,   ∀</m:t>
+        </m:r>
+        <m:r>
+          <w:rPr>
+            <w:rFonts w:ascii="Cambria Math" w:hAnsi="Cambria Math"/>
+          </w:rPr>
+          <m:t>i</m:t>
         </m:r>
       </m:oMath>
       <w:r>
@@ -7915,7 +8047,15 @@
                 <w:sz w:val="24"/>
                 <w:szCs w:val="24"/>
               </w:rPr>
-              <m:t>t+1</m:t>
+              <m:t>t</m:t>
+            </m:r>
+            <m:r>
+              <w:rPr>
+                <w:rFonts w:ascii="Cambria Math" w:hAnsi="Cambria Math" w:cstheme="majorBidi"/>
+                <w:sz w:val="24"/>
+                <w:szCs w:val="24"/>
+              </w:rPr>
+              <m:t>+1</m:t>
             </m:r>
           </m:sub>
         </m:sSub>
@@ -7977,7 +8117,79 @@
                 <w:sz w:val="24"/>
                 <w:szCs w:val="24"/>
               </w:rPr>
-              <m:t xml:space="preserve"> + USBR Share of Inflow</m:t>
+              <m:t xml:space="preserve"> + </m:t>
+            </m:r>
+            <m:r>
+              <w:rPr>
+                <w:rFonts w:ascii="Cambria Math" w:hAnsi="Cambria Math" w:cstheme="majorBidi"/>
+                <w:sz w:val="24"/>
+                <w:szCs w:val="24"/>
+              </w:rPr>
+              <m:t>USBR</m:t>
+            </m:r>
+            <m:r>
+              <w:rPr>
+                <w:rFonts w:ascii="Cambria Math" w:hAnsi="Cambria Math" w:cstheme="majorBidi"/>
+                <w:sz w:val="24"/>
+                <w:szCs w:val="24"/>
+              </w:rPr>
+              <m:t xml:space="preserve"> </m:t>
+            </m:r>
+            <m:r>
+              <w:rPr>
+                <w:rFonts w:ascii="Cambria Math" w:hAnsi="Cambria Math" w:cstheme="majorBidi"/>
+                <w:sz w:val="24"/>
+                <w:szCs w:val="24"/>
+              </w:rPr>
+              <m:t>S</m:t>
+            </m:r>
+            <m:r>
+              <w:rPr>
+                <w:rFonts w:ascii="Cambria Math" w:hAnsi="Cambria Math" w:cstheme="majorBidi"/>
+                <w:sz w:val="24"/>
+                <w:szCs w:val="24"/>
+              </w:rPr>
+              <m:t>h</m:t>
+            </m:r>
+            <m:r>
+              <w:rPr>
+                <w:rFonts w:ascii="Cambria Math" w:hAnsi="Cambria Math" w:cstheme="majorBidi"/>
+                <w:sz w:val="24"/>
+                <w:szCs w:val="24"/>
+              </w:rPr>
+              <m:t>are</m:t>
+            </m:r>
+            <m:r>
+              <w:rPr>
+                <w:rFonts w:ascii="Cambria Math" w:hAnsi="Cambria Math" w:cstheme="majorBidi"/>
+                <w:sz w:val="24"/>
+                <w:szCs w:val="24"/>
+              </w:rPr>
+              <m:t xml:space="preserve"> </m:t>
+            </m:r>
+            <m:r>
+              <w:rPr>
+                <w:rFonts w:ascii="Cambria Math" w:hAnsi="Cambria Math" w:cstheme="majorBidi"/>
+                <w:sz w:val="24"/>
+                <w:szCs w:val="24"/>
+              </w:rPr>
+              <m:t>of</m:t>
+            </m:r>
+            <m:r>
+              <w:rPr>
+                <w:rFonts w:ascii="Cambria Math" w:hAnsi="Cambria Math" w:cstheme="majorBidi"/>
+                <w:sz w:val="24"/>
+                <w:szCs w:val="24"/>
+              </w:rPr>
+              <m:t xml:space="preserve"> </m:t>
+            </m:r>
+            <m:r>
+              <w:rPr>
+                <w:rFonts w:ascii="Cambria Math" w:hAnsi="Cambria Math" w:cstheme="majorBidi"/>
+                <w:sz w:val="24"/>
+                <w:szCs w:val="24"/>
+              </w:rPr>
+              <m:t>Inflow</m:t>
             </m:r>
           </m:e>
           <m:sub>
@@ -8055,7 +8267,15 @@
             <w:sz w:val="24"/>
             <w:szCs w:val="24"/>
           </w:rPr>
-          <m:t>∀t</m:t>
+          <m:t>∀</m:t>
+        </m:r>
+        <m:r>
+          <w:rPr>
+            <w:rFonts w:ascii="Cambria Math" w:hAnsi="Cambria Math" w:cstheme="majorBidi"/>
+            <w:sz w:val="24"/>
+            <w:szCs w:val="24"/>
+          </w:rPr>
+          <m:t>t</m:t>
         </m:r>
       </m:oMath>
       <w:r>
@@ -8105,7 +8325,31 @@
                 <w:sz w:val="24"/>
                 <w:szCs w:val="24"/>
               </w:rPr>
-              <m:t>i,t+1</m:t>
+              <m:t>i</m:t>
+            </m:r>
+            <m:r>
+              <w:rPr>
+                <w:rFonts w:ascii="Cambria Math" w:hAnsi="Cambria Math" w:cstheme="majorBidi"/>
+                <w:sz w:val="24"/>
+                <w:szCs w:val="24"/>
+              </w:rPr>
+              <m:t>,</m:t>
+            </m:r>
+            <m:r>
+              <w:rPr>
+                <w:rFonts w:ascii="Cambria Math" w:hAnsi="Cambria Math" w:cstheme="majorBidi"/>
+                <w:sz w:val="24"/>
+                <w:szCs w:val="24"/>
+              </w:rPr>
+              <m:t>t</m:t>
+            </m:r>
+            <m:r>
+              <w:rPr>
+                <w:rFonts w:ascii="Cambria Math" w:hAnsi="Cambria Math" w:cstheme="majorBidi"/>
+                <w:sz w:val="24"/>
+                <w:szCs w:val="24"/>
+              </w:rPr>
+              <m:t>+1</m:t>
             </m:r>
           </m:sub>
         </m:sSub>
@@ -8145,7 +8389,23 @@
                 <w:sz w:val="24"/>
                 <w:szCs w:val="24"/>
               </w:rPr>
-              <m:t>i,t</m:t>
+              <m:t>i</m:t>
+            </m:r>
+            <m:r>
+              <w:rPr>
+                <w:rFonts w:ascii="Cambria Math" w:hAnsi="Cambria Math" w:cstheme="majorBidi"/>
+                <w:sz w:val="24"/>
+                <w:szCs w:val="24"/>
+              </w:rPr>
+              <m:t>,</m:t>
+            </m:r>
+            <m:r>
+              <w:rPr>
+                <w:rFonts w:ascii="Cambria Math" w:hAnsi="Cambria Math" w:cstheme="majorBidi"/>
+                <w:sz w:val="24"/>
+                <w:szCs w:val="24"/>
+              </w:rPr>
+              <m:t>t</m:t>
             </m:r>
           </m:sub>
         </m:sSub>
@@ -8175,7 +8435,55 @@
                 <w:sz w:val="24"/>
                 <w:szCs w:val="24"/>
               </w:rPr>
-              <m:t>Share of Inflow</m:t>
+              <m:t>S</m:t>
+            </m:r>
+            <m:r>
+              <w:rPr>
+                <w:rFonts w:ascii="Cambria Math" w:hAnsi="Cambria Math" w:cstheme="majorBidi"/>
+                <w:sz w:val="24"/>
+                <w:szCs w:val="24"/>
+              </w:rPr>
+              <m:t>h</m:t>
+            </m:r>
+            <m:r>
+              <w:rPr>
+                <w:rFonts w:ascii="Cambria Math" w:hAnsi="Cambria Math" w:cstheme="majorBidi"/>
+                <w:sz w:val="24"/>
+                <w:szCs w:val="24"/>
+              </w:rPr>
+              <m:t>are</m:t>
+            </m:r>
+            <m:r>
+              <w:rPr>
+                <w:rFonts w:ascii="Cambria Math" w:hAnsi="Cambria Math" w:cstheme="majorBidi"/>
+                <w:sz w:val="24"/>
+                <w:szCs w:val="24"/>
+              </w:rPr>
+              <m:t xml:space="preserve"> </m:t>
+            </m:r>
+            <m:r>
+              <w:rPr>
+                <w:rFonts w:ascii="Cambria Math" w:hAnsi="Cambria Math" w:cstheme="majorBidi"/>
+                <w:sz w:val="24"/>
+                <w:szCs w:val="24"/>
+              </w:rPr>
+              <m:t>of</m:t>
+            </m:r>
+            <m:r>
+              <w:rPr>
+                <w:rFonts w:ascii="Cambria Math" w:hAnsi="Cambria Math" w:cstheme="majorBidi"/>
+                <w:sz w:val="24"/>
+                <w:szCs w:val="24"/>
+              </w:rPr>
+              <m:t xml:space="preserve"> </m:t>
+            </m:r>
+            <m:r>
+              <w:rPr>
+                <w:rFonts w:ascii="Cambria Math" w:hAnsi="Cambria Math" w:cstheme="majorBidi"/>
+                <w:sz w:val="24"/>
+                <w:szCs w:val="24"/>
+              </w:rPr>
+              <m:t>Inflow</m:t>
             </m:r>
           </m:e>
           <m:sub>
@@ -8185,7 +8493,23 @@
                 <w:sz w:val="24"/>
                 <w:szCs w:val="24"/>
               </w:rPr>
-              <m:t>i,t</m:t>
+              <m:t>i</m:t>
+            </m:r>
+            <m:r>
+              <w:rPr>
+                <w:rFonts w:ascii="Cambria Math" w:hAnsi="Cambria Math" w:cstheme="majorBidi"/>
+                <w:sz w:val="24"/>
+                <w:szCs w:val="24"/>
+              </w:rPr>
+              <m:t>,</m:t>
+            </m:r>
+            <m:r>
+              <w:rPr>
+                <w:rFonts w:ascii="Cambria Math" w:hAnsi="Cambria Math" w:cstheme="majorBidi"/>
+                <w:sz w:val="24"/>
+                <w:szCs w:val="24"/>
+              </w:rPr>
+              <m:t>t</m:t>
             </m:r>
           </m:sub>
         </m:sSub>
@@ -8225,7 +8549,23 @@
                 <w:sz w:val="24"/>
                 <w:szCs w:val="24"/>
               </w:rPr>
-              <m:t>i,t</m:t>
+              <m:t>i</m:t>
+            </m:r>
+            <m:r>
+              <w:rPr>
+                <w:rFonts w:ascii="Cambria Math" w:hAnsi="Cambria Math" w:cstheme="majorBidi"/>
+                <w:sz w:val="24"/>
+                <w:szCs w:val="24"/>
+              </w:rPr>
+              <m:t>,</m:t>
+            </m:r>
+            <m:r>
+              <w:rPr>
+                <w:rFonts w:ascii="Cambria Math" w:hAnsi="Cambria Math" w:cstheme="majorBidi"/>
+                <w:sz w:val="24"/>
+                <w:szCs w:val="24"/>
+              </w:rPr>
+              <m:t>t</m:t>
             </m:r>
           </m:sub>
         </m:sSub>
@@ -8235,7 +8575,31 @@
             <w:sz w:val="24"/>
             <w:szCs w:val="24"/>
           </w:rPr>
-          <m:t>,   ∀i,t</m:t>
+          <m:t>,   ∀</m:t>
+        </m:r>
+        <m:r>
+          <w:rPr>
+            <w:rFonts w:ascii="Cambria Math" w:hAnsi="Cambria Math" w:cstheme="majorBidi"/>
+            <w:sz w:val="24"/>
+            <w:szCs w:val="24"/>
+          </w:rPr>
+          <m:t>i</m:t>
+        </m:r>
+        <m:r>
+          <w:rPr>
+            <w:rFonts w:ascii="Cambria Math" w:hAnsi="Cambria Math" w:cstheme="majorBidi"/>
+            <w:sz w:val="24"/>
+            <w:szCs w:val="24"/>
+          </w:rPr>
+          <m:t>,</m:t>
+        </m:r>
+        <m:r>
+          <w:rPr>
+            <w:rFonts w:ascii="Cambria Math" w:hAnsi="Cambria Math" w:cstheme="majorBidi"/>
+            <w:sz w:val="24"/>
+            <w:szCs w:val="24"/>
+          </w:rPr>
+          <m:t>t</m:t>
         </m:r>
       </m:oMath>
       <w:r>
@@ -8391,7 +8755,23 @@
                     <w:sz w:val="24"/>
                     <w:szCs w:val="24"/>
                   </w:rPr>
-                  <m:t>i,t</m:t>
+                  <m:t>i</m:t>
+                </m:r>
+                <m:r>
+                  <w:rPr>
+                    <w:rFonts w:ascii="Cambria Math" w:hAnsi="Cambria Math" w:cstheme="majorBidi"/>
+                    <w:sz w:val="24"/>
+                    <w:szCs w:val="24"/>
+                  </w:rPr>
+                  <m:t>,</m:t>
+                </m:r>
+                <m:r>
+                  <w:rPr>
+                    <w:rFonts w:ascii="Cambria Math" w:hAnsi="Cambria Math" w:cstheme="majorBidi"/>
+                    <w:sz w:val="24"/>
+                    <w:szCs w:val="24"/>
+                  </w:rPr>
+                  <m:t>t</m:t>
                 </m:r>
               </m:sub>
             </m:sSub>
@@ -8403,7 +8783,15 @@
             <w:sz w:val="24"/>
             <w:szCs w:val="24"/>
           </w:rPr>
-          <m:t>,   ∀t</m:t>
+          <m:t>,   ∀</m:t>
+        </m:r>
+        <m:r>
+          <w:rPr>
+            <w:rFonts w:ascii="Cambria Math" w:hAnsi="Cambria Math" w:cstheme="majorBidi"/>
+            <w:sz w:val="24"/>
+            <w:szCs w:val="24"/>
+          </w:rPr>
+          <m:t>t</m:t>
         </m:r>
       </m:oMath>
       <w:r>
@@ -8972,7 +9360,22 @@
         <w:t xml:space="preserve">s. </w:t>
       </w:r>
       <w:r>
-        <w:t xml:space="preserve">Figure 6 shows results from one session where the person who immersed in the </w:t>
+        <w:t xml:space="preserve">Figure 6 shows results from </w:t>
+      </w:r>
+      <w:r>
+        <w:t>a model</w:t>
+      </w:r>
+      <w:r>
+        <w:t xml:space="preserve"> session</w:t>
+      </w:r>
+      <w:r>
+        <w:t xml:space="preserve"> on March </w:t>
+      </w:r>
+      <w:r>
+        <w:t>17, 2026</w:t>
+      </w:r>
+      <w:r>
+        <w:t xml:space="preserve"> where the person who immersed in the </w:t>
       </w:r>
       <w:r>
         <w:t>USBR</w:t>
@@ -8981,28 +9384,34 @@
         <w:t xml:space="preserve"> role chose a protection volume of </w:t>
       </w:r>
       <w:r>
-        <w:t>4.5</w:t>
-      </w:r>
-      <w:r>
-        <w:t xml:space="preserve"> million acre-feet (1,0</w:t>
+        <w:t>6.0</w:t>
+      </w:r>
+      <w:r>
+        <w:t xml:space="preserve"> million acre-feet (1,</w:t>
+      </w:r>
+      <w:r>
+        <w:t>025</w:t>
+      </w:r>
+      <w:r>
+        <w:t xml:space="preserve"> feet). The remaining collaborators reserved </w:t>
       </w:r>
       <w:r>
         <w:t>0</w:t>
       </w:r>
       <w:r>
-        <w:t>0 feet). The remaining collaborators reserved 1.</w:t>
-      </w:r>
-      <w:r>
-        <w:t>0</w:t>
-      </w:r>
-      <w:r>
         <w:t xml:space="preserve"> to </w:t>
       </w:r>
       <w:r>
-        <w:t>1.9</w:t>
-      </w:r>
-      <w:r>
-        <w:t xml:space="preserve"> million acre-feet in their accounts, keeping Lake Mead storage above the protection elevation even with inflows of 3.8, 6.3, and 4.0 million acre-feet</w:t>
+        <w:t xml:space="preserve">2.0 </w:t>
+      </w:r>
+      <w:r>
+        <w:t xml:space="preserve"> million acre-feet in their accounts, keeping Lake Mead storage </w:t>
+      </w:r>
+      <w:r>
+        <w:t xml:space="preserve">at or </w:t>
+      </w:r>
+      <w:r>
+        <w:t>above the protection elevation even with inflows of 3.8, 6.3, and 4.0 million acre-feet</w:t>
       </w:r>
       <w:r>
         <w:t xml:space="preserve"> per year</w:t>
@@ -9015,24 +9424,15 @@
       <w:pPr>
         <w:pStyle w:val="NoSpacing"/>
       </w:pPr>
-    </w:p>
-    <w:p>
-      <w:pPr>
-        <w:rPr>
-          <w:rFonts w:asciiTheme="majorBidi" w:hAnsiTheme="majorBidi" w:cstheme="majorBidi"/>
-          <w:sz w:val="24"/>
-          <w:szCs w:val="24"/>
-        </w:rPr>
-      </w:pPr>
       <w:r>
         <w:rPr>
           <w:noProof/>
         </w:rPr>
         <w:drawing>
-          <wp:inline distT="0" distB="0" distL="0" distR="0" wp14:anchorId="015B59BF" wp14:editId="77BE6060">
-            <wp:extent cx="5943600" cy="3184525"/>
+          <wp:inline distT="0" distB="0" distL="0" distR="0" wp14:anchorId="6123038A" wp14:editId="354D1C53">
+            <wp:extent cx="5943600" cy="2687320"/>
             <wp:effectExtent l="0" t="0" r="0" b="0"/>
-            <wp:docPr id="1129158534" name="Picture 1"/>
+            <wp:docPr id="546003108" name="Picture 1"/>
             <wp:cNvGraphicFramePr>
               <a:graphicFrameLocks xmlns:a="http://schemas.openxmlformats.org/drawingml/2006/main" noChangeAspect="1"/>
             </wp:cNvGraphicFramePr>
@@ -9040,7 +9440,7 @@
               <a:graphicData uri="http://schemas.openxmlformats.org/drawingml/2006/picture">
                 <pic:pic xmlns:pic="http://schemas.openxmlformats.org/drawingml/2006/picture">
                   <pic:nvPicPr>
-                    <pic:cNvPr id="1129158534" name=""/>
+                    <pic:cNvPr id="546003108" name=""/>
                     <pic:cNvPicPr/>
                   </pic:nvPicPr>
                   <pic:blipFill>
@@ -9052,7 +9452,7 @@
                   <pic:spPr>
                     <a:xfrm>
                       <a:off x="0" y="0"/>
-                      <a:ext cx="5943600" cy="3184525"/>
+                      <a:ext cx="5943600" cy="2687320"/>
                     </a:xfrm>
                     <a:prstGeom prst="rect">
                       <a:avLst/>
@@ -9171,140 +9571,146 @@
         <w:t xml:space="preserve"> </w:t>
       </w:r>
       <w:r>
-        <w:t xml:space="preserve">6.3 million </w:t>
+        <w:t xml:space="preserve">6.3 million acre-ft of active storage; Figure </w:t>
+      </w:r>
+      <w:r>
+        <w:t>7</w:t>
+      </w:r>
+      <w:r>
+        <w:t>). Across these model sessions, years, and</w:t>
+      </w:r>
+      <w:r>
+        <w:t xml:space="preserve"> </w:t>
+      </w:r>
+      <w:r>
+        <w:t>inflows as low as 3.8 million acre-feet per year, Lake Mead storage was maintained at</w:t>
+      </w:r>
+      <w:r>
+        <w:t xml:space="preserve"> </w:t>
+      </w:r>
+      <w:r>
+        <w:t>100 to 280% of the chosen protection volume (blue circles in Figure 2). Lake Mead</w:t>
+      </w:r>
+      <w:r>
+        <w:t xml:space="preserve"> </w:t>
+      </w:r>
+      <w:r>
+        <w:t xml:space="preserve">storage stayed above the protection </w:t>
       </w:r>
       <w:r>
         <w:lastRenderedPageBreak/>
-        <w:t xml:space="preserve">acre-ft of active storage; Figure </w:t>
+        <w:t xml:space="preserve">volume when collaborators who personified </w:t>
+      </w:r>
+      <w:r>
+        <w:t xml:space="preserve">water </w:t>
+      </w:r>
+      <w:r>
+        <w:t>users</w:t>
+      </w:r>
+      <w:r>
+        <w:t xml:space="preserve"> </w:t>
+      </w:r>
+      <w:r>
+        <w:t>conserved some of their available water for use in future years and/or the person who</w:t>
+      </w:r>
+      <w:r>
+        <w:t xml:space="preserve"> </w:t>
+      </w:r>
+      <w:r>
+        <w:t xml:space="preserve">immersed in the </w:t>
+      </w:r>
+      <w:r>
+        <w:t>USBR</w:t>
+      </w:r>
+      <w:r>
+        <w:t xml:space="preserve"> role purchased some water from other users to add to the</w:t>
+      </w:r>
+      <w:r>
+        <w:t xml:space="preserve"> </w:t>
+      </w:r>
+      <w:r>
+        <w:t>protection account volume. For example, Federal purchases of settled, unused water from</w:t>
+      </w:r>
+      <w:r>
+        <w:t xml:space="preserve"> </w:t>
+      </w:r>
+      <w:r>
+        <w:t>an account representing the Tribal Nations of the Lower Basin provided income for</w:t>
+      </w:r>
+      <w:r>
+        <w:t xml:space="preserve"> </w:t>
+      </w:r>
+      <w:r>
+        <w:t xml:space="preserve">Tribes to build expensive potable water supply systems </w:t>
+      </w:r>
+      <w:r>
+        <w:t>and</w:t>
+      </w:r>
+      <w:r>
+        <w:t xml:space="preserve"> repair aging infrastructure.</w:t>
+      </w:r>
+      <w:r>
+        <w:t xml:space="preserve"> </w:t>
+      </w:r>
+      <w:r>
+        <w:t xml:space="preserve">People who role played </w:t>
+      </w:r>
+      <w:r>
+        <w:t>USBR</w:t>
+      </w:r>
+      <w:r>
+        <w:t xml:space="preserve"> sometimes sold some protection water to bail out</w:t>
+      </w:r>
+      <w:r>
+        <w:t xml:space="preserve"> </w:t>
+      </w:r>
+      <w:r>
+        <w:t xml:space="preserve">users </w:t>
+      </w:r>
+      <w:r>
+        <w:t xml:space="preserve">with low account balances. Those users </w:t>
+      </w:r>
+      <w:r>
+        <w:t xml:space="preserve">then </w:t>
+      </w:r>
+      <w:r>
+        <w:t>consumed th</w:t>
+      </w:r>
+      <w:r>
+        <w:t>e</w:t>
+      </w:r>
+      <w:r>
+        <w:t xml:space="preserve"> sold water</w:t>
+      </w:r>
+      <w:r>
+        <w:t xml:space="preserve">, </w:t>
+      </w:r>
+      <w:r>
+        <w:t>lower</w:t>
+      </w:r>
+      <w:r>
+        <w:t>ing</w:t>
+      </w:r>
+      <w:r>
+        <w:t xml:space="preserve"> Lake Mead below the protection elevation</w:t>
+      </w:r>
+      <w:r>
+        <w:t xml:space="preserve"> (red diamonds in Figure </w:t>
       </w:r>
       <w:r>
         <w:t>7</w:t>
       </w:r>
       <w:r>
-        <w:t>). Across these model sessions, years, and</w:t>
-      </w:r>
-      <w:r>
-        <w:t xml:space="preserve"> </w:t>
-      </w:r>
-      <w:r>
-        <w:t>inflows as low as 3.8 million acre-feet per year, Lake Mead storage was maintained at</w:t>
-      </w:r>
-      <w:r>
-        <w:t xml:space="preserve"> </w:t>
-      </w:r>
-      <w:r>
-        <w:t>100 to 280% of the chosen protection volume (blue circles in Figure 2). Lake Mead</w:t>
-      </w:r>
-      <w:r>
-        <w:t xml:space="preserve"> </w:t>
-      </w:r>
-      <w:r>
-        <w:t xml:space="preserve">storage stayed above the protection volume when collaborators who personified </w:t>
-      </w:r>
-      <w:r>
-        <w:t xml:space="preserve">water </w:t>
-      </w:r>
-      <w:r>
-        <w:t>users</w:t>
-      </w:r>
-      <w:r>
-        <w:t xml:space="preserve"> </w:t>
-      </w:r>
-      <w:r>
-        <w:t>conserved some of their available water for use in future years and/or the person who</w:t>
-      </w:r>
-      <w:r>
-        <w:t xml:space="preserve"> </w:t>
-      </w:r>
-      <w:r>
-        <w:t xml:space="preserve">immersed in the </w:t>
-      </w:r>
-      <w:r>
-        <w:t>USBR</w:t>
-      </w:r>
-      <w:r>
-        <w:t xml:space="preserve"> role purchased some water from other users to add to the</w:t>
-      </w:r>
-      <w:r>
-        <w:t xml:space="preserve"> </w:t>
-      </w:r>
-      <w:r>
-        <w:t>protection account volume. For example, Federal purchases of settled, unused water from</w:t>
-      </w:r>
-      <w:r>
-        <w:t xml:space="preserve"> </w:t>
-      </w:r>
-      <w:r>
-        <w:t>an account representing the Tribal Nations of the Lower Basin provided income for</w:t>
-      </w:r>
-      <w:r>
-        <w:t xml:space="preserve"> </w:t>
-      </w:r>
-      <w:r>
-        <w:t xml:space="preserve">Tribes to build expensive potable water supply systems </w:t>
-      </w:r>
-      <w:r>
-        <w:t>and</w:t>
-      </w:r>
-      <w:r>
-        <w:t xml:space="preserve"> repair aging infrastructure.</w:t>
-      </w:r>
-      <w:r>
-        <w:t xml:space="preserve"> </w:t>
-      </w:r>
-      <w:r>
-        <w:t xml:space="preserve">People who role played </w:t>
-      </w:r>
-      <w:r>
-        <w:t>USBR</w:t>
-      </w:r>
-      <w:r>
-        <w:t xml:space="preserve"> sometimes sold some protection water to bail out</w:t>
-      </w:r>
-      <w:r>
-        <w:t xml:space="preserve"> </w:t>
-      </w:r>
-      <w:r>
-        <w:t xml:space="preserve">users </w:t>
-      </w:r>
-      <w:r>
-        <w:t xml:space="preserve">with low account balances. Those users </w:t>
-      </w:r>
-      <w:r>
-        <w:t xml:space="preserve">then </w:t>
-      </w:r>
-      <w:r>
-        <w:t>consumed th</w:t>
-      </w:r>
-      <w:r>
-        <w:t>e</w:t>
-      </w:r>
-      <w:r>
-        <w:t xml:space="preserve"> sold water</w:t>
-      </w:r>
-      <w:r>
-        <w:t xml:space="preserve">, </w:t>
-      </w:r>
-      <w:r>
-        <w:t>lower</w:t>
-      </w:r>
-      <w:r>
-        <w:t>ing</w:t>
-      </w:r>
-      <w:r>
-        <w:t xml:space="preserve"> Lake Mead below the protection elevation</w:t>
-      </w:r>
-      <w:r>
-        <w:t xml:space="preserve"> (red diamonds in Figure </w:t>
-      </w:r>
-      <w:r>
-        <w:t>7</w:t>
-      </w:r>
-      <w:r>
         <w:t>).</w:t>
       </w:r>
       <w:r>
-        <w:t xml:space="preserve"> These examples illustrate some of many more autonomous and adaptive strategies that water users can adopt within a water accounting framework.</w:t>
+        <w:t xml:space="preserve"> These examples illustrate some of many more </w:t>
+      </w:r>
+      <w:r>
+        <w:t xml:space="preserve">adaptive and </w:t>
+      </w:r>
+      <w:r>
+        <w:t>autonomous strategies that water users can adopt within a water accounting framework.</w:t>
       </w:r>
     </w:p>
     <w:p>
@@ -9315,7 +9721,6 @@
         <w:rPr>
           <w:noProof/>
         </w:rPr>
-        <w:lastRenderedPageBreak/>
         <w:drawing>
           <wp:inline distT="0" distB="0" distL="0" distR="0" wp14:anchorId="04745072" wp14:editId="19DD414E">
             <wp:extent cx="5937885" cy="3461385"/>
@@ -9444,7 +9849,11 @@
         <w:t>USBR</w:t>
       </w:r>
       <w:r>
-        <w:t xml:space="preserve"> role chose</w:t>
+        <w:t xml:space="preserve"> role </w:t>
+      </w:r>
+      <w:r>
+        <w:lastRenderedPageBreak/>
+        <w:t>chose</w:t>
       </w:r>
       <w:r>
         <w:t xml:space="preserve"> to </w:t>
@@ -9516,7 +9925,6 @@
         <w:pStyle w:val="NoSpacing"/>
       </w:pPr>
       <w:r>
-        <w:lastRenderedPageBreak/>
         <w:t xml:space="preserve">To expand program participation and increase operational flexibility, prior researchers suggested raising upper limits on water conservation account balances </w:t>
       </w:r>
       <w:r>
@@ -9650,7 +10058,11 @@
         <w:t>t</w:t>
       </w:r>
       <w:r>
-        <w:t xml:space="preserve"> Lake Mead continue</w:t>
+        <w:t xml:space="preserve"> Lake Mead </w:t>
+      </w:r>
+      <w:r>
+        <w:lastRenderedPageBreak/>
+        <w:t>continue</w:t>
       </w:r>
       <w:r>
         <w:t>d</w:t>
@@ -9668,7 +10080,22 @@
         <w:t xml:space="preserve"> is</w:t>
       </w:r>
       <w:r>
-        <w:t xml:space="preserve"> exacerbated as reservoir inflow declines, a situation that will occur more frequently as the basin becomes more arid</w:t>
+        <w:t xml:space="preserve"> exacerbated as reservoir inflow declines, a </w:t>
+      </w:r>
+      <w:r>
+        <w:t>condition</w:t>
+      </w:r>
+      <w:r>
+        <w:t xml:space="preserve"> </w:t>
+      </w:r>
+      <w:r>
+        <w:t>for which there is agreement</w:t>
+      </w:r>
+      <w:r>
+        <w:t xml:space="preserve"> will continue</w:t>
+      </w:r>
+      <w:r>
+        <w:t xml:space="preserve"> as the basin becomes more arid</w:t>
       </w:r>
       <w:r>
         <w:t xml:space="preserve"> </w:t>
@@ -9677,43 +10104,56 @@
         <w:fldChar w:fldCharType="begin">
           <w:fldData xml:space="preserve">PEVuZE5vdGU+PENpdGU+PEF1dGhvcj5TYWxlaGFiYWRpPC9BdXRob3I+PFllYXI+MjAyNDwvWWVh
 cj48UmVjTnVtPjMwMjM8L1JlY051bT48RGlzcGxheVRleHQ+KFNhbGVoYWJhZGkgZXQgYWwuLCAy
-MDI0OyBVZGFsbCBhbmQgT3ZlcnBlY2ssIDIwMTcpPC9EaXNwbGF5VGV4dD48cmVjb3JkPjxyZWMt
-bnVtYmVyPjMwMjM8L3JlYy1udW1iZXI+PGZvcmVpZ24ta2V5cz48a2V5IGFwcD0iRU4iIGRiLWlk
-PSJ4eHQ1dGE5cGQ5OTVkd2VzYXAwcGR6enAyd2VhejB3OXdlcmYiIHRpbWVzdGFtcD0iMTcyODA3
-NDM1NSI+MzAyMzwva2V5PjwvZm9yZWlnbi1rZXlzPjxyZWYtdHlwZSBuYW1lPSJKb3VybmFsIEFy
-dGljbGUiPjE3PC9yZWYtdHlwZT48Y29udHJpYnV0b3JzPjxhdXRob3JzPjxhdXRob3I+U2FsZWhh
-YmFkaSwgSG9tYTwvYXV0aG9yPjxhdXRob3I+VGFyYm90b24sIERhdmlkIEcuPC9hdXRob3I+PGF1
-dGhvcj5XaGVlbGVyLCBLZXZpbiBHLjwvYXV0aG9yPjxhdXRob3I+U21pdGgsIFJlYmVjY2E8L2F1
-dGhvcj48YXV0aG9yPkJha2VyLCBTYXJhaDwvYXV0aG9yPjwvYXV0aG9ycz48L2NvbnRyaWJ1dG9y
-cz48dGl0bGVzPjx0aXRsZT5RdWFudGlmeWluZyBhbmQgQ2xhc3NpZnlpbmcgU3RyZWFtZmxvdyBF
-bnNlbWJsZXMgVXNpbmcgYSBCcm9hZCBSYW5nZSBvZiBNZXRyaWNzIGZvciBhbiBFdmlkZW5jZS1C
-YXNlZCBBbmFseXNpczogQ29sb3JhZG8gUml2ZXIgQ2FzZSBTdHVkeTwvdGl0bGU+PHNlY29uZGFy
-eS10aXRsZT5XYXRlciBSZXNvdXJjZXMgUmVzZWFyY2g8L3NlY29uZGFyeS10aXRsZT48L3RpdGxl
-cz48cGVyaW9kaWNhbD48ZnVsbC10aXRsZT5XYXRlciBSZXNvdXJjZXMgUmVzZWFyY2g8L2Z1bGwt
-dGl0bGU+PC9wZXJpb2RpY2FsPjxwYWdlcz5lMjAyNFdSMDM3MjI1PC9wYWdlcz48dm9sdW1lPjYw
-PC92b2x1bWU+PG51bWJlcj43PC9udW1iZXI+PGRhdGVzPjx5ZWFyPjIwMjQ8L3llYXI+PC9kYXRl
-cz48aXNibj4wMDQzLTEzOTc8L2lzYm4+PHVybHM+PHJlbGF0ZWQtdXJscz48dXJsPmh0dHBzOi8v
-YWd1cHVicy5vbmxpbmVsaWJyYXJ5LndpbGV5LmNvbS9kb2kvYWJzLzEwLjEwMjkvMjAyNFdSMDM3
-MjI1PC91cmw+PC9yZWxhdGVkLXVybHM+PC91cmxzPjxlbGVjdHJvbmljLXJlc291cmNlLW51bT5o
-dHRwczovL2RvaS5vcmcvMTAuMTAyOS8yMDI0V1IwMzcyMjU8L2VsZWN0cm9uaWMtcmVzb3VyY2Ut
-bnVtPjwvcmVjb3JkPjwvQ2l0ZT48Q2l0ZT48QXV0aG9yPlVkYWxsPC9BdXRob3I+PFllYXI+MjAx
-NzwvWWVhcj48UmVjTnVtPjIyOTA8L1JlY051bT48cmVjb3JkPjxyZWMtbnVtYmVyPjIyOTA8L3Jl
-Yy1udW1iZXI+PGZvcmVpZ24ta2V5cz48a2V5IGFwcD0iRU4iIGRiLWlkPSJ4eHQ1dGE5cGQ5OTVk
-d2VzYXAwcGR6enAyd2VhejB3OXdlcmYiIHRpbWVzdGFtcD0iMTUyMzU1MDg2OCI+MjI5MDwva2V5
-PjwvZm9yZWlnbi1rZXlzPjxyZWYtdHlwZSBuYW1lPSJKb3VybmFsIEFydGljbGUiPjE3PC9yZWYt
-dHlwZT48Y29udHJpYnV0b3JzPjxhdXRob3JzPjxhdXRob3I+QnJhZGxleSBVZGFsbDwvYXV0aG9y
-PjxhdXRob3I+Sm9uYXRoYW4gT3ZlcnBlY2s8L2F1dGhvcj48L2F1dGhvcnM+PC9jb250cmlidXRv
-cnM+PHRpdGxlcz48dGl0bGU+VGhlIHR3ZW50eeKAkGZpcnN0IGNlbnR1cnkgQ29sb3JhZG8gUml2
-ZXIgaG90IGRyb3VnaHQgYW5kIGltcGxpY2F0aW9ucyBmb3IgdGhlIGZ1dHVyZTwvdGl0bGU+PHNl
-Y29uZGFyeS10aXRsZT5XYXRlciBSZXNvdXJjZXMgUmVzZWFyY2g8L3NlY29uZGFyeS10aXRsZT48
-L3RpdGxlcz48cGVyaW9kaWNhbD48ZnVsbC10aXRsZT5XYXRlciBSZXNvdXJjZXMgUmVzZWFyY2g8
-L2Z1bGwtdGl0bGU+PC9wZXJpb2RpY2FsPjxwYWdlcz4yNDA0LTI0MTg8L3BhZ2VzPjx2b2x1bWU+
-NTM8L3ZvbHVtZT48bnVtYmVyPjM8L251bWJlcj48a2V5d29yZHM+PGtleXdvcmQ+Q29sb3JhZG8g
-Uml2ZXI8L2tleXdvcmQ+PC9rZXl3b3Jkcz48ZGF0ZXM+PHllYXI+MjAxNzwveWVhcj48L2RhdGVz
-Pjx1cmxzPjxyZWxhdGVkLXVybHM+PHVybD4gaHR0cHM6Ly9kb2kub3JnLzEwLjEwMDIvMjAxNldS
-MDE5NjM4PC91cmw+PC9yZWxhdGVkLXVybHM+PC91cmxzPjxlbGVjdHJvbmljLXJlc291cmNlLW51
-bT4gaHR0cHM6Ly9kb2kub3JnLzEwLjEwMDIvMjAxNldSMDE5NjM4PC9lbGVjdHJvbmljLXJlc291
-cmNlLW51bT48L3JlY29yZD48L0NpdGU+PC9FbmROb3RlPn==
+MDI0OyBVZGFsbCBhbmQgT3ZlcnBlY2ssIDIwMTc7IFVTQlIsIDIwMjZiKTwvRGlzcGxheVRleHQ+
+PHJlY29yZD48cmVjLW51bWJlcj4zMDIzPC9yZWMtbnVtYmVyPjxmb3JlaWduLWtleXM+PGtleSBh
+cHA9IkVOIiBkYi1pZD0ieHh0NXRhOXBkOTk1ZHdlc2FwMHBkenpwMndlYXowdzl3ZXJmIiB0aW1l
+c3RhbXA9IjE3MjgwNzQzNTUiPjMwMjM8L2tleT48L2ZvcmVpZ24ta2V5cz48cmVmLXR5cGUgbmFt
+ZT0iSm91cm5hbCBBcnRpY2xlIj4xNzwvcmVmLXR5cGU+PGNvbnRyaWJ1dG9ycz48YXV0aG9ycz48
+YXV0aG9yPlNhbGVoYWJhZGksIEhvbWE8L2F1dGhvcj48YXV0aG9yPlRhcmJvdG9uLCBEYXZpZCBH
+LjwvYXV0aG9yPjxhdXRob3I+V2hlZWxlciwgS2V2aW4gRy48L2F1dGhvcj48YXV0aG9yPlNtaXRo
+LCBSZWJlY2NhPC9hdXRob3I+PGF1dGhvcj5CYWtlciwgU2FyYWg8L2F1dGhvcj48L2F1dGhvcnM+
+PC9jb250cmlidXRvcnM+PHRpdGxlcz48dGl0bGU+UXVhbnRpZnlpbmcgYW5kIENsYXNzaWZ5aW5n
+IFN0cmVhbWZsb3cgRW5zZW1ibGVzIFVzaW5nIGEgQnJvYWQgUmFuZ2Ugb2YgTWV0cmljcyBmb3Ig
+YW4gRXZpZGVuY2UtQmFzZWQgQW5hbHlzaXM6IENvbG9yYWRvIFJpdmVyIENhc2UgU3R1ZHk8L3Rp
+dGxlPjxzZWNvbmRhcnktdGl0bGU+V2F0ZXIgUmVzb3VyY2VzIFJlc2VhcmNoPC9zZWNvbmRhcnkt
+dGl0bGU+PC90aXRsZXM+PHBlcmlvZGljYWw+PGZ1bGwtdGl0bGU+V2F0ZXIgUmVzb3VyY2VzIFJl
+c2VhcmNoPC9mdWxsLXRpdGxlPjwvcGVyaW9kaWNhbD48cGFnZXM+ZTIwMjRXUjAzNzIyNTwvcGFn
+ZXM+PHZvbHVtZT42MDwvdm9sdW1lPjxudW1iZXI+NzwvbnVtYmVyPjxkYXRlcz48eWVhcj4yMDI0
+PC95ZWFyPjwvZGF0ZXM+PGlzYm4+MDA0My0xMzk3PC9pc2JuPjx1cmxzPjxyZWxhdGVkLXVybHM+
+PHVybD5odHRwczovL2FndXB1YnMub25saW5lbGlicmFyeS53aWxleS5jb20vZG9pL2Ficy8xMC4x
+MDI5LzIwMjRXUjAzNzIyNTwvdXJsPjwvcmVsYXRlZC11cmxzPjwvdXJscz48ZWxlY3Ryb25pYy1y
+ZXNvdXJjZS1udW0+aHR0cHM6Ly9kb2kub3JnLzEwLjEwMjkvMjAyNFdSMDM3MjI1PC9lbGVjdHJv
+bmljLXJlc291cmNlLW51bT48L3JlY29yZD48L0NpdGU+PENpdGU+PEF1dGhvcj5VZGFsbDwvQXV0
+aG9yPjxZZWFyPjIwMTc8L1llYXI+PFJlY051bT4yMjkwPC9SZWNOdW0+PHJlY29yZD48cmVjLW51
+bWJlcj4yMjkwPC9yZWMtbnVtYmVyPjxmb3JlaWduLWtleXM+PGtleSBhcHA9IkVOIiBkYi1pZD0i
+eHh0NXRhOXBkOTk1ZHdlc2FwMHBkenpwMndlYXowdzl3ZXJmIiB0aW1lc3RhbXA9IjE1MjM1NTA4
+NjgiPjIyOTA8L2tleT48L2ZvcmVpZ24ta2V5cz48cmVmLXR5cGUgbmFtZT0iSm91cm5hbCBBcnRp
+Y2xlIj4xNzwvcmVmLXR5cGU+PGNvbnRyaWJ1dG9ycz48YXV0aG9ycz48YXV0aG9yPkJyYWRsZXkg
+VWRhbGw8L2F1dGhvcj48YXV0aG9yPkpvbmF0aGFuIE92ZXJwZWNrPC9hdXRob3I+PC9hdXRob3Jz
+PjwvY29udHJpYnV0b3JzPjx0aXRsZXM+PHRpdGxlPlRoZSB0d2VudHnigJBmaXJzdCBjZW50dXJ5
+IENvbG9yYWRvIFJpdmVyIGhvdCBkcm91Z2h0IGFuZCBpbXBsaWNhdGlvbnMgZm9yIHRoZSBmdXR1
+cmU8L3RpdGxlPjxzZWNvbmRhcnktdGl0bGU+V2F0ZXIgUmVzb3VyY2VzIFJlc2VhcmNoPC9zZWNv
+bmRhcnktdGl0bGU+PC90aXRsZXM+PHBlcmlvZGljYWw+PGZ1bGwtdGl0bGU+V2F0ZXIgUmVzb3Vy
+Y2VzIFJlc2VhcmNoPC9mdWxsLXRpdGxlPjwvcGVyaW9kaWNhbD48cGFnZXM+MjQwNC0yNDE4PC9w
+YWdlcz48dm9sdW1lPjUzPC92b2x1bWU+PG51bWJlcj4zPC9udW1iZXI+PGtleXdvcmRzPjxrZXl3
+b3JkPkNvbG9yYWRvIFJpdmVyPC9rZXl3b3JkPjwva2V5d29yZHM+PGRhdGVzPjx5ZWFyPjIwMTc8
+L3llYXI+PC9kYXRlcz48dXJscz48cmVsYXRlZC11cmxzPjx1cmw+IGh0dHBzOi8vZG9pLm9yZy8x
+MC4xMDAyLzIwMTZXUjAxOTYzODwvdXJsPjwvcmVsYXRlZC11cmxzPjwvdXJscz48ZWxlY3Ryb25p
+Yy1yZXNvdXJjZS1udW0+IGh0dHBzOi8vZG9pLm9yZy8xMC4xMDAyLzIwMTZXUjAxOTYzODwvZWxl
+Y3Ryb25pYy1yZXNvdXJjZS1udW0+PC9yZWNvcmQ+PC9DaXRlPjxDaXRlPjxBdXRob3I+VVNCUjwv
+QXV0aG9yPjxZZWFyPjIwMjY8L1llYXI+PFJlY051bT4zMTI0PC9SZWNOdW0+PHJlY29yZD48cmVj
+LW51bWJlcj4zMTI0PC9yZWMtbnVtYmVyPjxmb3JlaWduLWtleXM+PGtleSBhcHA9IkVOIiBkYi1p
+ZD0ieHh0NXRhOXBkOTk1ZHdlc2FwMHBkenpwMndlYXowdzl3ZXJmIiB0aW1lc3RhbXA9IjE3ODYx
+MzY3MTIiPjMxMjQ8L2tleT48L2ZvcmVpZ24ta2V5cz48cmVmLXR5cGUgbmFtZT0iUmVwb3J0Ij4y
+NzwvcmVmLXR5cGU+PGNvbnRyaWJ1dG9ycz48YXV0aG9ycz48YXV0aG9yPlVTQlI8L2F1dGhvcj48
+L2F1dGhvcnM+PC9jb250cmlidXRvcnM+PHRpdGxlcz48dGl0bGU+UG9zdC0yMDI2IE9wZXJhdGlv
+bmFsIEd1aWRlbGluZXMgYW5kIFN0cmF0ZWdpZXMgZm9yIExha2UgUG93ZWxsIGFuZCBMYWtlIE1l
+YWQg4oCTIEZpbmFsIEVudmlyb25tZW50YWwgSW1wYWN0IFN0YXRlbWVudDwvdGl0bGU+PC90aXRs
+ZXM+PGRhdGVzPjx5ZWFyPjIwMjY8L3llYXI+PC9kYXRlcz48cHVibGlzaGVyPlUuUy4gQnVyZWF1
+IG9mIFJlY2xhbWF0aW9uPC9wdWJsaXNoZXI+PHVybHM+PHJlbGF0ZWQtdXJscz48dXJsPmh0dHBz
+Oi8vd3d3LnVzYnIuZ292L0NvbG9yYWRvUml2ZXJCYXNpbi9wb3N0MjAyNi9maW5hbC1laXMvaW5k
+ZXguaHRtbDwvdXJsPjwvcmVsYXRlZC11cmxzPjwvdXJscz48L3JlY29yZD48L0NpdGU+PC9FbmRO
+b3RlPgB=
 </w:fldData>
         </w:fldChar>
       </w:r>
@@ -9724,43 +10164,56 @@
         <w:fldChar w:fldCharType="begin">
           <w:fldData xml:space="preserve">PEVuZE5vdGU+PENpdGU+PEF1dGhvcj5TYWxlaGFiYWRpPC9BdXRob3I+PFllYXI+MjAyNDwvWWVh
 cj48UmVjTnVtPjMwMjM8L1JlY051bT48RGlzcGxheVRleHQ+KFNhbGVoYWJhZGkgZXQgYWwuLCAy
-MDI0OyBVZGFsbCBhbmQgT3ZlcnBlY2ssIDIwMTcpPC9EaXNwbGF5VGV4dD48cmVjb3JkPjxyZWMt
-bnVtYmVyPjMwMjM8L3JlYy1udW1iZXI+PGZvcmVpZ24ta2V5cz48a2V5IGFwcD0iRU4iIGRiLWlk
-PSJ4eHQ1dGE5cGQ5OTVkd2VzYXAwcGR6enAyd2VhejB3OXdlcmYiIHRpbWVzdGFtcD0iMTcyODA3
-NDM1NSI+MzAyMzwva2V5PjwvZm9yZWlnbi1rZXlzPjxyZWYtdHlwZSBuYW1lPSJKb3VybmFsIEFy
-dGljbGUiPjE3PC9yZWYtdHlwZT48Y29udHJpYnV0b3JzPjxhdXRob3JzPjxhdXRob3I+U2FsZWhh
-YmFkaSwgSG9tYTwvYXV0aG9yPjxhdXRob3I+VGFyYm90b24sIERhdmlkIEcuPC9hdXRob3I+PGF1
-dGhvcj5XaGVlbGVyLCBLZXZpbiBHLjwvYXV0aG9yPjxhdXRob3I+U21pdGgsIFJlYmVjY2E8L2F1
-dGhvcj48YXV0aG9yPkJha2VyLCBTYXJhaDwvYXV0aG9yPjwvYXV0aG9ycz48L2NvbnRyaWJ1dG9y
-cz48dGl0bGVzPjx0aXRsZT5RdWFudGlmeWluZyBhbmQgQ2xhc3NpZnlpbmcgU3RyZWFtZmxvdyBF
-bnNlbWJsZXMgVXNpbmcgYSBCcm9hZCBSYW5nZSBvZiBNZXRyaWNzIGZvciBhbiBFdmlkZW5jZS1C
-YXNlZCBBbmFseXNpczogQ29sb3JhZG8gUml2ZXIgQ2FzZSBTdHVkeTwvdGl0bGU+PHNlY29uZGFy
-eS10aXRsZT5XYXRlciBSZXNvdXJjZXMgUmVzZWFyY2g8L3NlY29uZGFyeS10aXRsZT48L3RpdGxl
-cz48cGVyaW9kaWNhbD48ZnVsbC10aXRsZT5XYXRlciBSZXNvdXJjZXMgUmVzZWFyY2g8L2Z1bGwt
-dGl0bGU+PC9wZXJpb2RpY2FsPjxwYWdlcz5lMjAyNFdSMDM3MjI1PC9wYWdlcz48dm9sdW1lPjYw
-PC92b2x1bWU+PG51bWJlcj43PC9udW1iZXI+PGRhdGVzPjx5ZWFyPjIwMjQ8L3llYXI+PC9kYXRl
-cz48aXNibj4wMDQzLTEzOTc8L2lzYm4+PHVybHM+PHJlbGF0ZWQtdXJscz48dXJsPmh0dHBzOi8v
-YWd1cHVicy5vbmxpbmVsaWJyYXJ5LndpbGV5LmNvbS9kb2kvYWJzLzEwLjEwMjkvMjAyNFdSMDM3
-MjI1PC91cmw+PC9yZWxhdGVkLXVybHM+PC91cmxzPjxlbGVjdHJvbmljLXJlc291cmNlLW51bT5o
-dHRwczovL2RvaS5vcmcvMTAuMTAyOS8yMDI0V1IwMzcyMjU8L2VsZWN0cm9uaWMtcmVzb3VyY2Ut
-bnVtPjwvcmVjb3JkPjwvQ2l0ZT48Q2l0ZT48QXV0aG9yPlVkYWxsPC9BdXRob3I+PFllYXI+MjAx
-NzwvWWVhcj48UmVjTnVtPjIyOTA8L1JlY051bT48cmVjb3JkPjxyZWMtbnVtYmVyPjIyOTA8L3Jl
-Yy1udW1iZXI+PGZvcmVpZ24ta2V5cz48a2V5IGFwcD0iRU4iIGRiLWlkPSJ4eHQ1dGE5cGQ5OTVk
-d2VzYXAwcGR6enAyd2VhejB3OXdlcmYiIHRpbWVzdGFtcD0iMTUyMzU1MDg2OCI+MjI5MDwva2V5
-PjwvZm9yZWlnbi1rZXlzPjxyZWYtdHlwZSBuYW1lPSJKb3VybmFsIEFydGljbGUiPjE3PC9yZWYt
-dHlwZT48Y29udHJpYnV0b3JzPjxhdXRob3JzPjxhdXRob3I+QnJhZGxleSBVZGFsbDwvYXV0aG9y
-PjxhdXRob3I+Sm9uYXRoYW4gT3ZlcnBlY2s8L2F1dGhvcj48L2F1dGhvcnM+PC9jb250cmlidXRv
-cnM+PHRpdGxlcz48dGl0bGU+VGhlIHR3ZW50eeKAkGZpcnN0IGNlbnR1cnkgQ29sb3JhZG8gUml2
-ZXIgaG90IGRyb3VnaHQgYW5kIGltcGxpY2F0aW9ucyBmb3IgdGhlIGZ1dHVyZTwvdGl0bGU+PHNl
-Y29uZGFyeS10aXRsZT5XYXRlciBSZXNvdXJjZXMgUmVzZWFyY2g8L3NlY29uZGFyeS10aXRsZT48
-L3RpdGxlcz48cGVyaW9kaWNhbD48ZnVsbC10aXRsZT5XYXRlciBSZXNvdXJjZXMgUmVzZWFyY2g8
-L2Z1bGwtdGl0bGU+PC9wZXJpb2RpY2FsPjxwYWdlcz4yNDA0LTI0MTg8L3BhZ2VzPjx2b2x1bWU+
-NTM8L3ZvbHVtZT48bnVtYmVyPjM8L251bWJlcj48a2V5d29yZHM+PGtleXdvcmQ+Q29sb3JhZG8g
-Uml2ZXI8L2tleXdvcmQ+PC9rZXl3b3Jkcz48ZGF0ZXM+PHllYXI+MjAxNzwveWVhcj48L2RhdGVz
-Pjx1cmxzPjxyZWxhdGVkLXVybHM+PHVybD4gaHR0cHM6Ly9kb2kub3JnLzEwLjEwMDIvMjAxNldS
-MDE5NjM4PC91cmw+PC9yZWxhdGVkLXVybHM+PC91cmxzPjxlbGVjdHJvbmljLXJlc291cmNlLW51
-bT4gaHR0cHM6Ly9kb2kub3JnLzEwLjEwMDIvMjAxNldSMDE5NjM4PC9lbGVjdHJvbmljLXJlc291
-cmNlLW51bT48L3JlY29yZD48L0NpdGU+PC9FbmROb3RlPn==
+MDI0OyBVZGFsbCBhbmQgT3ZlcnBlY2ssIDIwMTc7IFVTQlIsIDIwMjZiKTwvRGlzcGxheVRleHQ+
+PHJlY29yZD48cmVjLW51bWJlcj4zMDIzPC9yZWMtbnVtYmVyPjxmb3JlaWduLWtleXM+PGtleSBh
+cHA9IkVOIiBkYi1pZD0ieHh0NXRhOXBkOTk1ZHdlc2FwMHBkenpwMndlYXowdzl3ZXJmIiB0aW1l
+c3RhbXA9IjE3MjgwNzQzNTUiPjMwMjM8L2tleT48L2ZvcmVpZ24ta2V5cz48cmVmLXR5cGUgbmFt
+ZT0iSm91cm5hbCBBcnRpY2xlIj4xNzwvcmVmLXR5cGU+PGNvbnRyaWJ1dG9ycz48YXV0aG9ycz48
+YXV0aG9yPlNhbGVoYWJhZGksIEhvbWE8L2F1dGhvcj48YXV0aG9yPlRhcmJvdG9uLCBEYXZpZCBH
+LjwvYXV0aG9yPjxhdXRob3I+V2hlZWxlciwgS2V2aW4gRy48L2F1dGhvcj48YXV0aG9yPlNtaXRo
+LCBSZWJlY2NhPC9hdXRob3I+PGF1dGhvcj5CYWtlciwgU2FyYWg8L2F1dGhvcj48L2F1dGhvcnM+
+PC9jb250cmlidXRvcnM+PHRpdGxlcz48dGl0bGU+UXVhbnRpZnlpbmcgYW5kIENsYXNzaWZ5aW5n
+IFN0cmVhbWZsb3cgRW5zZW1ibGVzIFVzaW5nIGEgQnJvYWQgUmFuZ2Ugb2YgTWV0cmljcyBmb3Ig
+YW4gRXZpZGVuY2UtQmFzZWQgQW5hbHlzaXM6IENvbG9yYWRvIFJpdmVyIENhc2UgU3R1ZHk8L3Rp
+dGxlPjxzZWNvbmRhcnktdGl0bGU+V2F0ZXIgUmVzb3VyY2VzIFJlc2VhcmNoPC9zZWNvbmRhcnkt
+dGl0bGU+PC90aXRsZXM+PHBlcmlvZGljYWw+PGZ1bGwtdGl0bGU+V2F0ZXIgUmVzb3VyY2VzIFJl
+c2VhcmNoPC9mdWxsLXRpdGxlPjwvcGVyaW9kaWNhbD48cGFnZXM+ZTIwMjRXUjAzNzIyNTwvcGFn
+ZXM+PHZvbHVtZT42MDwvdm9sdW1lPjxudW1iZXI+NzwvbnVtYmVyPjxkYXRlcz48eWVhcj4yMDI0
+PC95ZWFyPjwvZGF0ZXM+PGlzYm4+MDA0My0xMzk3PC9pc2JuPjx1cmxzPjxyZWxhdGVkLXVybHM+
+PHVybD5odHRwczovL2FndXB1YnMub25saW5lbGlicmFyeS53aWxleS5jb20vZG9pL2Ficy8xMC4x
+MDI5LzIwMjRXUjAzNzIyNTwvdXJsPjwvcmVsYXRlZC11cmxzPjwvdXJscz48ZWxlY3Ryb25pYy1y
+ZXNvdXJjZS1udW0+aHR0cHM6Ly9kb2kub3JnLzEwLjEwMjkvMjAyNFdSMDM3MjI1PC9lbGVjdHJv
+bmljLXJlc291cmNlLW51bT48L3JlY29yZD48L0NpdGU+PENpdGU+PEF1dGhvcj5VZGFsbDwvQXV0
+aG9yPjxZZWFyPjIwMTc8L1llYXI+PFJlY051bT4yMjkwPC9SZWNOdW0+PHJlY29yZD48cmVjLW51
+bWJlcj4yMjkwPC9yZWMtbnVtYmVyPjxmb3JlaWduLWtleXM+PGtleSBhcHA9IkVOIiBkYi1pZD0i
+eHh0NXRhOXBkOTk1ZHdlc2FwMHBkenpwMndlYXowdzl3ZXJmIiB0aW1lc3RhbXA9IjE1MjM1NTA4
+NjgiPjIyOTA8L2tleT48L2ZvcmVpZ24ta2V5cz48cmVmLXR5cGUgbmFtZT0iSm91cm5hbCBBcnRp
+Y2xlIj4xNzwvcmVmLXR5cGU+PGNvbnRyaWJ1dG9ycz48YXV0aG9ycz48YXV0aG9yPkJyYWRsZXkg
+VWRhbGw8L2F1dGhvcj48YXV0aG9yPkpvbmF0aGFuIE92ZXJwZWNrPC9hdXRob3I+PC9hdXRob3Jz
+PjwvY29udHJpYnV0b3JzPjx0aXRsZXM+PHRpdGxlPlRoZSB0d2VudHnigJBmaXJzdCBjZW50dXJ5
+IENvbG9yYWRvIFJpdmVyIGhvdCBkcm91Z2h0IGFuZCBpbXBsaWNhdGlvbnMgZm9yIHRoZSBmdXR1
+cmU8L3RpdGxlPjxzZWNvbmRhcnktdGl0bGU+V2F0ZXIgUmVzb3VyY2VzIFJlc2VhcmNoPC9zZWNv
+bmRhcnktdGl0bGU+PC90aXRsZXM+PHBlcmlvZGljYWw+PGZ1bGwtdGl0bGU+V2F0ZXIgUmVzb3Vy
+Y2VzIFJlc2VhcmNoPC9mdWxsLXRpdGxlPjwvcGVyaW9kaWNhbD48cGFnZXM+MjQwNC0yNDE4PC9w
+YWdlcz48dm9sdW1lPjUzPC92b2x1bWU+PG51bWJlcj4zPC9udW1iZXI+PGtleXdvcmRzPjxrZXl3
+b3JkPkNvbG9yYWRvIFJpdmVyPC9rZXl3b3JkPjwva2V5d29yZHM+PGRhdGVzPjx5ZWFyPjIwMTc8
+L3llYXI+PC9kYXRlcz48dXJscz48cmVsYXRlZC11cmxzPjx1cmw+IGh0dHBzOi8vZG9pLm9yZy8x
+MC4xMDAyLzIwMTZXUjAxOTYzODwvdXJsPjwvcmVsYXRlZC11cmxzPjwvdXJscz48ZWxlY3Ryb25p
+Yy1yZXNvdXJjZS1udW0+IGh0dHBzOi8vZG9pLm9yZy8xMC4xMDAyLzIwMTZXUjAxOTYzODwvZWxl
+Y3Ryb25pYy1yZXNvdXJjZS1udW0+PC9yZWNvcmQ+PC9DaXRlPjxDaXRlPjxBdXRob3I+VVNCUjwv
+QXV0aG9yPjxZZWFyPjIwMjY8L1llYXI+PFJlY051bT4zMTI0PC9SZWNOdW0+PHJlY29yZD48cmVj
+LW51bWJlcj4zMTI0PC9yZWMtbnVtYmVyPjxmb3JlaWduLWtleXM+PGtleSBhcHA9IkVOIiBkYi1p
+ZD0ieHh0NXRhOXBkOTk1ZHdlc2FwMHBkenpwMndlYXowdzl3ZXJmIiB0aW1lc3RhbXA9IjE3ODYx
+MzY3MTIiPjMxMjQ8L2tleT48L2ZvcmVpZ24ta2V5cz48cmVmLXR5cGUgbmFtZT0iUmVwb3J0Ij4y
+NzwvcmVmLXR5cGU+PGNvbnRyaWJ1dG9ycz48YXV0aG9ycz48YXV0aG9yPlVTQlI8L2F1dGhvcj48
+L2F1dGhvcnM+PC9jb250cmlidXRvcnM+PHRpdGxlcz48dGl0bGU+UG9zdC0yMDI2IE9wZXJhdGlv
+bmFsIEd1aWRlbGluZXMgYW5kIFN0cmF0ZWdpZXMgZm9yIExha2UgUG93ZWxsIGFuZCBMYWtlIE1l
+YWQg4oCTIEZpbmFsIEVudmlyb25tZW50YWwgSW1wYWN0IFN0YXRlbWVudDwvdGl0bGU+PC90aXRs
+ZXM+PGRhdGVzPjx5ZWFyPjIwMjY8L3llYXI+PC9kYXRlcz48cHVibGlzaGVyPlUuUy4gQnVyZWF1
+IG9mIFJlY2xhbWF0aW9uPC9wdWJsaXNoZXI+PHVybHM+PHJlbGF0ZWQtdXJscz48dXJsPmh0dHBz
+Oi8vd3d3LnVzYnIuZ292L0NvbG9yYWRvUml2ZXJCYXNpbi9wb3N0MjAyNi9maW5hbC1laXMvaW5k
+ZXguaHRtbDwvdXJsPjwvcmVsYXRlZC11cmxzPjwvdXJscz48L3JlY29yZD48L0NpdGU+PC9FbmRO
+b3RlPgB=
 </w:fldData>
         </w:fldChar>
       </w:r>
@@ -9777,7 +10230,7 @@
         <w:rPr>
           <w:noProof/>
         </w:rPr>
-        <w:t>(Salehabadi et al., 2024; Udall and Overpeck, 2017)</w:t>
+        <w:t>(Salehabadi et al., 2024; Udall and Overpeck, 2017; USBR, 2026b)</w:t>
       </w:r>
       <w:r>
         <w:fldChar w:fldCharType="end"/>
@@ -9816,7 +10269,6 @@
           <w:b/>
           <w:bCs/>
         </w:rPr>
-        <w:lastRenderedPageBreak/>
         <w:t>Current water conservation account balances can be rolled over</w:t>
       </w:r>
       <w:r>
@@ -9968,6 +10420,7 @@
           <w:b/>
           <w:bCs/>
         </w:rPr>
+        <w:lastRenderedPageBreak/>
         <w:t>Prioritize reservoir evaporation as the highest consumptive use</w:t>
       </w:r>
       <w:r>
@@ -10046,7 +10499,6 @@
         <w:pStyle w:val="NoSpacing"/>
       </w:pPr>
       <w:r>
-        <w:lastRenderedPageBreak/>
         <w:t>There are a</w:t>
       </w:r>
       <w:r>
@@ -10209,7 +10661,11 @@
         <w:t>etting a higher protection volume reduces the storage available to other users</w:t>
       </w:r>
       <w:r>
-        <w:t>, potentially limiting the roll over of existing water conservation account balances</w:t>
+        <w:t xml:space="preserve">, </w:t>
+      </w:r>
+      <w:r>
+        <w:lastRenderedPageBreak/>
+        <w:t>potentially limiting the rollover of existing water conservation account balances</w:t>
       </w:r>
       <w:r>
         <w:t xml:space="preserve">. For example, if the accounting program started on </w:t>
@@ -10298,7 +10754,6 @@
         <w:pStyle w:val="NoSpacing"/>
       </w:pPr>
       <w:r>
-        <w:lastRenderedPageBreak/>
         <w:t>The proposals described in this paper were submitted as public input to USBR in November 2025 and March 2026. On August 1, 2026, USBR released its Final Environmental Impact Statement</w:t>
       </w:r>
       <w:r>
@@ -10498,7 +10953,11 @@
         <w:t>entitlements</w:t>
       </w:r>
       <w:r>
-        <w:t xml:space="preserve"> of 9.0 million acre-feet per year</w:t>
+        <w:t xml:space="preserve"> of 9.0 million acre-feet </w:t>
+      </w:r>
+      <w:r>
+        <w:lastRenderedPageBreak/>
+        <w:t>per year</w:t>
       </w:r>
       <w:r>
         <w:t>. This assumption is challenged as the Colorado River Basin becomes more arid.</w:t>
@@ -10624,7 +11083,6 @@
         <w:t xml:space="preserve">he users then divide the remaining inflow and consume, conserve, and/or trade within their account balances. </w:t>
       </w:r>
       <w:r>
-        <w:lastRenderedPageBreak/>
         <w:t xml:space="preserve">Both strategies have </w:t>
       </w:r>
       <w:r>
@@ -10828,85 +11286,102 @@
         <w:t>Hope H</w:t>
       </w:r>
       <w:r>
-        <w:t>auptman (University of California Agriculture and Natural Resources) downloaded materials and reproduced Figures 1 to 4.</w:t>
+        <w:t xml:space="preserve">auptman (University of California Agriculture and Natural Resources) </w:t>
+      </w:r>
+      <w:r>
+        <w:t xml:space="preserve">and </w:t>
+      </w:r>
+      <w:r>
+        <w:t>Camilo  Salcedo</w:t>
+      </w:r>
+      <w:r>
+        <w:t xml:space="preserve"> </w:t>
+      </w:r>
+      <w:r>
+        <w:t>(University of California Agriculture and Natural Resources)</w:t>
+      </w:r>
+      <w:r>
+        <w:t xml:space="preserve"> </w:t>
+      </w:r>
+      <w:r>
+        <w:t>downloaded materials and reproduced Figures 1 to 4.</w:t>
+      </w:r>
+      <w:r>
+        <w:t xml:space="preserve"> </w:t>
+      </w:r>
+      <w:r>
+        <w:t>Matti W</w:t>
+      </w:r>
+      <w:r>
+        <w:t>itte (Utah State University)</w:t>
+      </w:r>
+      <w:r>
+        <w:t xml:space="preserve"> download the materials </w:t>
+      </w:r>
+      <w:r>
+        <w:t xml:space="preserve">and </w:t>
+      </w:r>
+      <w:r>
+        <w:t>reproduced</w:t>
+      </w:r>
+      <w:r>
+        <w:t xml:space="preserve"> </w:t>
+      </w:r>
+      <w:r>
+        <w:t>Figures 6 and</w:t>
+      </w:r>
+      <w:r>
+        <w:t xml:space="preserve"> 7.</w:t>
+      </w:r>
+      <w:r>
+        <w:t xml:space="preserve"> </w:t>
       </w:r>
     </w:p>
     <w:p>
       <w:pPr>
-        <w:pStyle w:val="NoSpacing"/>
-      </w:pPr>
-      <w:r>
-        <w:t>Matti W</w:t>
-      </w:r>
-      <w:r>
-        <w:t>itte (Utah State University)</w:t>
-      </w:r>
-      <w:r>
-        <w:t xml:space="preserve"> download the materials </w:t>
-      </w:r>
-      <w:r>
-        <w:t xml:space="preserve">and </w:t>
-      </w:r>
-      <w:r>
-        <w:t>reproduced</w:t>
-      </w:r>
-      <w:r>
-        <w:t xml:space="preserve"> </w:t>
-      </w:r>
-      <w:r>
-        <w:t>Figures 6 and</w:t>
-      </w:r>
-      <w:r>
-        <w:t xml:space="preserve"> 7.</w:t>
-      </w:r>
-      <w:r>
-        <w:t xml:space="preserve"> </w:t>
+        <w:pStyle w:val="Heading1"/>
+      </w:pPr>
+      <w:r>
+        <w:lastRenderedPageBreak/>
+        <w:t>Acknowledgements</w:t>
       </w:r>
     </w:p>
     <w:p>
       <w:pPr>
-        <w:pStyle w:val="Heading1"/>
-      </w:pPr>
-      <w:r>
-        <w:t>Acknowledgements</w:t>
+        <w:pStyle w:val="NoSpacing"/>
+      </w:pPr>
+      <w:r>
+        <w:t>This research was supported by the Cooperative Institute for Research to Operations in Hydrology (CIROH) with funding under award NA22NWS4320003 from the NOAA Cooperative Institute Program. The statements, findings, conclusions, and recommendations are those of the author(s) and do not necessarily reflect the opinions of NOAA.</w:t>
       </w:r>
     </w:p>
     <w:p>
       <w:pPr>
-        <w:pStyle w:val="NoSpacing"/>
-      </w:pPr>
-      <w:r>
-        <w:t>This research was supported by the Cooperative Institute for Research to Operations in Hydrology (CIROH) with funding under award NA22NWS4320003 from the NOAA Cooperative Institute Program. The statements, findings, conclusions, and recommendations are those of the author(s) and do not necessarily reflect the opinions of NOAA.</w:t>
+        <w:pStyle w:val="Heading1"/>
+      </w:pPr>
+      <w:r>
+        <w:t>Appendix A. Estimate Share</w:t>
+      </w:r>
+      <w:r>
+        <w:t>s</w:t>
+      </w:r>
+      <w:r>
+        <w:t xml:space="preserve"> of </w:t>
+      </w:r>
+      <w:r>
+        <w:t xml:space="preserve">Annual Lake Mead </w:t>
+      </w:r>
+      <w:r>
+        <w:t>Inflow</w:t>
+      </w:r>
+      <w:r>
+        <w:t xml:space="preserve"> from Prior Agreed Apportionment of Shortages</w:t>
+      </w:r>
+      <w:r>
+        <w:t>.</w:t>
       </w:r>
     </w:p>
     <w:p>
       <w:pPr>
-        <w:pStyle w:val="Heading1"/>
-      </w:pPr>
-      <w:r>
-        <w:t>Appendix A. Estimate Share</w:t>
-      </w:r>
-      <w:r>
-        <w:t>s</w:t>
-      </w:r>
-      <w:r>
-        <w:t xml:space="preserve"> of </w:t>
-      </w:r>
-      <w:r>
-        <w:t xml:space="preserve">Annual Lake Mead </w:t>
-      </w:r>
-      <w:r>
-        <w:t>Inflow</w:t>
-      </w:r>
-      <w:r>
-        <w:t xml:space="preserve"> from Prior Agreed Apportionment of Shortages</w:t>
-      </w:r>
-      <w:r>
-        <w:t>.</w:t>
-      </w:r>
-    </w:p>
-    <w:p>
-      <w:pPr>
         <w:pStyle w:val="NoSpacing"/>
       </w:pPr>
       <w:r>
@@ -11015,11 +11490,7 @@
         <w:t>W</w:t>
       </w:r>
       <w:r>
-        <w:t xml:space="preserve">ater is Total Legal Entitlements minus </w:t>
-      </w:r>
-      <w:r>
-        <w:lastRenderedPageBreak/>
-        <w:t xml:space="preserve">Total Shortage. </w:t>
+        <w:t xml:space="preserve">ater is Total Legal Entitlements minus Total Shortage. </w:t>
       </w:r>
       <w:r>
         <w:t xml:space="preserve">Third, each </w:t>
@@ -11257,6 +11728,7 @@
         <w:pStyle w:val="Heading1"/>
       </w:pPr>
       <w:r>
+        <w:lastRenderedPageBreak/>
         <w:t>References</w:t>
       </w:r>
     </w:p>
@@ -11526,7 +11998,6 @@
         <w:ind w:left="720" w:hanging="720"/>
       </w:pPr>
       <w:r>
-        <w:lastRenderedPageBreak/>
         <w:t xml:space="preserve">Hegwood, M., Langendorf, R. E., and Burgess, M. G. (2022). "Why win–wins are rare in complex environmental management." </w:t>
       </w:r>
       <w:r>
@@ -11695,6 +12166,7 @@
         <w:ind w:left="720" w:hanging="720"/>
       </w:pPr>
       <w:r>
+        <w:lastRenderedPageBreak/>
         <w:t xml:space="preserve">Robison, J. A. (2017). "The Colorado River Revisited." </w:t>
       </w:r>
       <w:r>
@@ -12118,6 +12590,7 @@
         <w:ind w:left="720" w:hanging="720"/>
       </w:pPr>
       <w:r>
+        <w:lastRenderedPageBreak/>
         <w:t xml:space="preserve">USBR. (2021). "Pilot System Conservation Program." U.S. Bureau of Reclamation, </w:t>
       </w:r>
       <w:hyperlink r:id="rId53" w:history="1">

</xml_diff>

<commit_message>
Updated manuscript and reproduced results section
</commit_message>
<xml_diff>
--- a/LakeMeadWaterConservationProgramSuccessChallengesSuggestions_v4.docx
+++ b/LakeMeadWaterConservationProgramSuccessChallengesSuggestions_v4.docx
@@ -11737,6 +11737,11 @@
         <w:pStyle w:val="EndNoteBibliography"/>
         <w:spacing w:after="0"/>
         <w:ind w:left="720" w:hanging="720"/>
+        <w:rPr>
+          <w:rFonts w:asciiTheme="majorBidi" w:hAnsiTheme="majorBidi" w:cstheme="majorBidi"/>
+          <w:sz w:val="24"/>
+          <w:szCs w:val="24"/>
+        </w:rPr>
       </w:pPr>
       <w:r>
         <w:rPr>
@@ -11763,26 +11768,47 @@
         <w:fldChar w:fldCharType="separate"/>
       </w:r>
       <w:r>
+        <w:rPr>
+          <w:rFonts w:asciiTheme="majorBidi" w:hAnsiTheme="majorBidi" w:cstheme="majorBidi"/>
+          <w:sz w:val="24"/>
+          <w:szCs w:val="24"/>
+        </w:rPr>
         <w:t xml:space="preserve">Allaire, M., and Acquah, S. (2022). "Disparities in drinking water compliance: Implications for incorporating equity into regulatory practices." </w:t>
       </w:r>
       <w:r>
         <w:rPr>
+          <w:rFonts w:asciiTheme="majorBidi" w:hAnsiTheme="majorBidi" w:cstheme="majorBidi"/>
           <w:i/>
+          <w:sz w:val="24"/>
+          <w:szCs w:val="24"/>
         </w:rPr>
         <w:t>AWWA Water Science</w:t>
       </w:r>
       <w:r>
+        <w:rPr>
+          <w:rFonts w:asciiTheme="majorBidi" w:hAnsiTheme="majorBidi" w:cstheme="majorBidi"/>
+          <w:sz w:val="24"/>
+          <w:szCs w:val="24"/>
+        </w:rPr>
         <w:t xml:space="preserve">, 4(2), e1274. </w:t>
       </w:r>
       <w:hyperlink r:id="rId27" w:history="1">
         <w:r>
           <w:rPr>
             <w:rStyle w:val="Hyperlink"/>
+            <w:rFonts w:asciiTheme="majorBidi" w:hAnsiTheme="majorBidi" w:cstheme="majorBidi"/>
+            <w:sz w:val="24"/>
+            <w:szCs w:val="24"/>
           </w:rPr>
           <w:t>https://doi.org/10.1002/aws2.1274</w:t>
         </w:r>
       </w:hyperlink>
       <w:r>
+        <w:rPr>
+          <w:rFonts w:asciiTheme="majorBidi" w:hAnsiTheme="majorBidi" w:cstheme="majorBidi"/>
+          <w:sz w:val="24"/>
+          <w:szCs w:val="24"/>
+        </w:rPr>
         <w:t>.</w:t>
       </w:r>
     </w:p>
@@ -11791,28 +11817,54 @@
         <w:pStyle w:val="EndNoteBibliography"/>
         <w:spacing w:after="0"/>
         <w:ind w:left="720" w:hanging="720"/>
-      </w:pPr>
-      <w:r>
+        <w:rPr>
+          <w:rFonts w:asciiTheme="majorBidi" w:hAnsiTheme="majorBidi" w:cstheme="majorBidi"/>
+          <w:sz w:val="24"/>
+          <w:szCs w:val="24"/>
+        </w:rPr>
+      </w:pPr>
+      <w:r>
+        <w:rPr>
+          <w:rFonts w:asciiTheme="majorBidi" w:hAnsiTheme="majorBidi" w:cstheme="majorBidi"/>
+          <w:sz w:val="24"/>
+          <w:szCs w:val="24"/>
+        </w:rPr>
         <w:t xml:space="preserve">Allhands, J. (2021). "It could take at least 500,000 acre-feet of water a year to keep Lake Mead from tanking." </w:t>
       </w:r>
       <w:r>
         <w:rPr>
+          <w:rFonts w:asciiTheme="majorBidi" w:hAnsiTheme="majorBidi" w:cstheme="majorBidi"/>
           <w:i/>
+          <w:sz w:val="24"/>
+          <w:szCs w:val="24"/>
         </w:rPr>
         <w:t>Arizona Republic</w:t>
       </w:r>
       <w:r>
+        <w:rPr>
+          <w:rFonts w:asciiTheme="majorBidi" w:hAnsiTheme="majorBidi" w:cstheme="majorBidi"/>
+          <w:sz w:val="24"/>
+          <w:szCs w:val="24"/>
+        </w:rPr>
         <w:t xml:space="preserve">, November 8, 2021. </w:t>
       </w:r>
       <w:hyperlink r:id="rId28" w:history="1">
         <w:r>
           <w:rPr>
             <w:rStyle w:val="Hyperlink"/>
+            <w:rFonts w:asciiTheme="majorBidi" w:hAnsiTheme="majorBidi" w:cstheme="majorBidi"/>
+            <w:sz w:val="24"/>
+            <w:szCs w:val="24"/>
           </w:rPr>
           <w:t>https://www.azcentral.com/story/opinion/op-ed/joannaallhands/2021/11/08/lake-mead-could-get-extra-water-from-lower-basin-annually/6306601001/</w:t>
         </w:r>
       </w:hyperlink>
       <w:r>
+        <w:rPr>
+          <w:rFonts w:asciiTheme="majorBidi" w:hAnsiTheme="majorBidi" w:cstheme="majorBidi"/>
+          <w:sz w:val="24"/>
+          <w:szCs w:val="24"/>
+        </w:rPr>
         <w:t>.</w:t>
       </w:r>
     </w:p>
@@ -11821,17 +11873,35 @@
         <w:pStyle w:val="EndNoteBibliography"/>
         <w:spacing w:after="0"/>
         <w:ind w:left="720" w:hanging="720"/>
-      </w:pPr>
-      <w:r>
+        <w:rPr>
+          <w:rFonts w:asciiTheme="majorBidi" w:hAnsiTheme="majorBidi" w:cstheme="majorBidi"/>
+          <w:sz w:val="24"/>
+          <w:szCs w:val="24"/>
+        </w:rPr>
+      </w:pPr>
+      <w:r>
+        <w:rPr>
+          <w:rFonts w:asciiTheme="majorBidi" w:hAnsiTheme="majorBidi" w:cstheme="majorBidi"/>
+          <w:sz w:val="24"/>
+          <w:szCs w:val="24"/>
+        </w:rPr>
         <w:t xml:space="preserve">Colby, B., Hansen, K., and Sorensen, K. (2025). "Policy Nook — Policy Note: Tough Tradeoffs in the Colorado River Basin." </w:t>
       </w:r>
       <w:r>
         <w:rPr>
+          <w:rFonts w:asciiTheme="majorBidi" w:hAnsiTheme="majorBidi" w:cstheme="majorBidi"/>
           <w:i/>
+          <w:sz w:val="24"/>
+          <w:szCs w:val="24"/>
         </w:rPr>
         <w:t>Water Economics and Policy</w:t>
       </w:r>
       <w:r>
+        <w:rPr>
+          <w:rFonts w:asciiTheme="majorBidi" w:hAnsiTheme="majorBidi" w:cstheme="majorBidi"/>
+          <w:sz w:val="24"/>
+          <w:szCs w:val="24"/>
+        </w:rPr>
         <w:t>, 11(04), 2471002. 10.1142/s2382624x24710024.</w:t>
       </w:r>
     </w:p>
@@ -11840,28 +11910,54 @@
         <w:pStyle w:val="EndNoteBibliography"/>
         <w:spacing w:after="0"/>
         <w:ind w:left="720" w:hanging="720"/>
-      </w:pPr>
-      <w:r>
+        <w:rPr>
+          <w:rFonts w:asciiTheme="majorBidi" w:hAnsiTheme="majorBidi" w:cstheme="majorBidi"/>
+          <w:sz w:val="24"/>
+          <w:szCs w:val="24"/>
+        </w:rPr>
+      </w:pPr>
+      <w:r>
+        <w:rPr>
+          <w:rFonts w:asciiTheme="majorBidi" w:hAnsiTheme="majorBidi" w:cstheme="majorBidi"/>
+          <w:sz w:val="24"/>
+          <w:szCs w:val="24"/>
+        </w:rPr>
         <w:t xml:space="preserve">Cutter, S. L., Boruff, B. J., and Shirley, W. L. (2003). "Social Vulnerability to Environmental Hazards*." </w:t>
       </w:r>
       <w:r>
         <w:rPr>
+          <w:rFonts w:asciiTheme="majorBidi" w:hAnsiTheme="majorBidi" w:cstheme="majorBidi"/>
           <w:i/>
+          <w:sz w:val="24"/>
+          <w:szCs w:val="24"/>
         </w:rPr>
         <w:t>Social Science Quarterly</w:t>
       </w:r>
       <w:r>
+        <w:rPr>
+          <w:rFonts w:asciiTheme="majorBidi" w:hAnsiTheme="majorBidi" w:cstheme="majorBidi"/>
+          <w:sz w:val="24"/>
+          <w:szCs w:val="24"/>
+        </w:rPr>
         <w:t xml:space="preserve">, 84(2), 242-261. </w:t>
       </w:r>
       <w:hyperlink r:id="rId29" w:history="1">
         <w:r>
           <w:rPr>
             <w:rStyle w:val="Hyperlink"/>
+            <w:rFonts w:asciiTheme="majorBidi" w:hAnsiTheme="majorBidi" w:cstheme="majorBidi"/>
+            <w:sz w:val="24"/>
+            <w:szCs w:val="24"/>
           </w:rPr>
           <w:t>https://doi.org/10.1111/1540-6237.8402002</w:t>
         </w:r>
       </w:hyperlink>
       <w:r>
+        <w:rPr>
+          <w:rFonts w:asciiTheme="majorBidi" w:hAnsiTheme="majorBidi" w:cstheme="majorBidi"/>
+          <w:sz w:val="24"/>
+          <w:szCs w:val="24"/>
+        </w:rPr>
         <w:t>.</w:t>
       </w:r>
     </w:p>
@@ -11870,28 +11966,54 @@
         <w:pStyle w:val="EndNoteBibliography"/>
         <w:spacing w:after="0"/>
         <w:ind w:left="720" w:hanging="720"/>
-      </w:pPr>
-      <w:r>
+        <w:rPr>
+          <w:rFonts w:asciiTheme="majorBidi" w:hAnsiTheme="majorBidi" w:cstheme="majorBidi"/>
+          <w:sz w:val="24"/>
+          <w:szCs w:val="24"/>
+        </w:rPr>
+      </w:pPr>
+      <w:r>
+        <w:rPr>
+          <w:rFonts w:asciiTheme="majorBidi" w:hAnsiTheme="majorBidi" w:cstheme="majorBidi"/>
+          <w:sz w:val="24"/>
+          <w:szCs w:val="24"/>
+        </w:rPr>
         <w:t xml:space="preserve">Cutter, S. L., Mitchell, J. T., and Scott, M. S. (2000). "Revealing the Vulnerability of People and Places: A Case Study of Georgetown County, South Carolina." </w:t>
       </w:r>
       <w:r>
         <w:rPr>
+          <w:rFonts w:asciiTheme="majorBidi" w:hAnsiTheme="majorBidi" w:cstheme="majorBidi"/>
           <w:i/>
+          <w:sz w:val="24"/>
+          <w:szCs w:val="24"/>
         </w:rPr>
         <w:t>Annals of the Association of American Geographers</w:t>
       </w:r>
       <w:r>
+        <w:rPr>
+          <w:rFonts w:asciiTheme="majorBidi" w:hAnsiTheme="majorBidi" w:cstheme="majorBidi"/>
+          <w:sz w:val="24"/>
+          <w:szCs w:val="24"/>
+        </w:rPr>
         <w:t xml:space="preserve">, 90(4), 713-737. </w:t>
       </w:r>
       <w:hyperlink r:id="rId30" w:history="1">
         <w:r>
           <w:rPr>
             <w:rStyle w:val="Hyperlink"/>
+            <w:rFonts w:asciiTheme="majorBidi" w:hAnsiTheme="majorBidi" w:cstheme="majorBidi"/>
+            <w:sz w:val="24"/>
+            <w:szCs w:val="24"/>
           </w:rPr>
           <w:t>https://doi.org/10.1111/0004-5608.00219</w:t>
         </w:r>
       </w:hyperlink>
       <w:r>
+        <w:rPr>
+          <w:rFonts w:asciiTheme="majorBidi" w:hAnsiTheme="majorBidi" w:cstheme="majorBidi"/>
+          <w:sz w:val="24"/>
+          <w:szCs w:val="24"/>
+        </w:rPr>
         <w:t>.</w:t>
       </w:r>
     </w:p>
@@ -11900,28 +12022,54 @@
         <w:pStyle w:val="EndNoteBibliography"/>
         <w:spacing w:after="0"/>
         <w:ind w:left="720" w:hanging="720"/>
-      </w:pPr>
-      <w:r>
+        <w:rPr>
+          <w:rFonts w:asciiTheme="majorBidi" w:hAnsiTheme="majorBidi" w:cstheme="majorBidi"/>
+          <w:sz w:val="24"/>
+          <w:szCs w:val="24"/>
+        </w:rPr>
+      </w:pPr>
+      <w:r>
+        <w:rPr>
+          <w:rFonts w:asciiTheme="majorBidi" w:hAnsiTheme="majorBidi" w:cstheme="majorBidi"/>
+          <w:sz w:val="24"/>
+          <w:szCs w:val="24"/>
+        </w:rPr>
         <w:t xml:space="preserve">Fleck, J., and Udall, B. (2021). "Managing Colorado River risk." </w:t>
       </w:r>
       <w:r>
         <w:rPr>
+          <w:rFonts w:asciiTheme="majorBidi" w:hAnsiTheme="majorBidi" w:cstheme="majorBidi"/>
           <w:i/>
+          <w:sz w:val="24"/>
+          <w:szCs w:val="24"/>
         </w:rPr>
         <w:t>Science</w:t>
       </w:r>
       <w:r>
+        <w:rPr>
+          <w:rFonts w:asciiTheme="majorBidi" w:hAnsiTheme="majorBidi" w:cstheme="majorBidi"/>
+          <w:sz w:val="24"/>
+          <w:szCs w:val="24"/>
+        </w:rPr>
         <w:t xml:space="preserve">, 372(6545), 885-885. </w:t>
       </w:r>
       <w:hyperlink r:id="rId31" w:history="1">
         <w:r>
           <w:rPr>
             <w:rStyle w:val="Hyperlink"/>
+            <w:rFonts w:asciiTheme="majorBidi" w:hAnsiTheme="majorBidi" w:cstheme="majorBidi"/>
+            <w:sz w:val="24"/>
+            <w:szCs w:val="24"/>
           </w:rPr>
           <w:t>https://doi.org/10.1126/science.abj5498</w:t>
         </w:r>
       </w:hyperlink>
       <w:r>
+        <w:rPr>
+          <w:rFonts w:asciiTheme="majorBidi" w:hAnsiTheme="majorBidi" w:cstheme="majorBidi"/>
+          <w:sz w:val="24"/>
+          <w:szCs w:val="24"/>
+        </w:rPr>
         <w:t>.</w:t>
       </w:r>
     </w:p>
@@ -11929,17 +12077,35 @@
       <w:pPr>
         <w:pStyle w:val="EndNoteBibliography"/>
         <w:ind w:left="720" w:hanging="720"/>
-      </w:pPr>
-      <w:r>
+        <w:rPr>
+          <w:rFonts w:asciiTheme="majorBidi" w:hAnsiTheme="majorBidi" w:cstheme="majorBidi"/>
+          <w:sz w:val="24"/>
+          <w:szCs w:val="24"/>
+        </w:rPr>
+      </w:pPr>
+      <w:r>
+        <w:rPr>
+          <w:rFonts w:asciiTheme="majorBidi" w:hAnsiTheme="majorBidi" w:cstheme="majorBidi"/>
+          <w:sz w:val="24"/>
+          <w:szCs w:val="24"/>
+        </w:rPr>
         <w:t xml:space="preserve">Grant, D. L. (2007). "Collaborative Solutions to Colorado River Water Shortages: The Basin States' Proposal and Beyond." </w:t>
       </w:r>
       <w:r>
         <w:rPr>
+          <w:rFonts w:asciiTheme="majorBidi" w:hAnsiTheme="majorBidi" w:cstheme="majorBidi"/>
           <w:i/>
+          <w:sz w:val="24"/>
+          <w:szCs w:val="24"/>
         </w:rPr>
         <w:t>Nevada Law Journal</w:t>
       </w:r>
       <w:r>
+        <w:rPr>
+          <w:rFonts w:asciiTheme="majorBidi" w:hAnsiTheme="majorBidi" w:cstheme="majorBidi"/>
+          <w:sz w:val="24"/>
+          <w:szCs w:val="24"/>
+        </w:rPr>
         <w:t>, 8, 964</w:t>
       </w:r>
     </w:p>
@@ -11948,16 +12114,29 @@
         <w:pStyle w:val="EndNoteBibliography"/>
         <w:spacing w:after="0"/>
         <w:ind w:left="720" w:hanging="720"/>
+        <w:rPr>
+          <w:rFonts w:asciiTheme="majorBidi" w:hAnsiTheme="majorBidi" w:cstheme="majorBidi"/>
+          <w:sz w:val="24"/>
+          <w:szCs w:val="24"/>
+        </w:rPr>
       </w:pPr>
       <w:hyperlink r:id="rId32" w:history="1">
         <w:r>
           <w:rPr>
             <w:rStyle w:val="Hyperlink"/>
+            <w:rFonts w:asciiTheme="majorBidi" w:hAnsiTheme="majorBidi" w:cstheme="majorBidi"/>
+            <w:sz w:val="24"/>
+            <w:szCs w:val="24"/>
           </w:rPr>
           <w:t>https://heinonline.org/HOL/Page?handle=hein.journals/nevlj8&amp;id=980&amp;collection=journals&amp;index</w:t>
         </w:r>
       </w:hyperlink>
       <w:r>
+        <w:rPr>
+          <w:rFonts w:asciiTheme="majorBidi" w:hAnsiTheme="majorBidi" w:cstheme="majorBidi"/>
+          <w:sz w:val="24"/>
+          <w:szCs w:val="24"/>
+        </w:rPr>
         <w:t>=.</w:t>
       </w:r>
     </w:p>
@@ -11966,28 +12145,54 @@
         <w:pStyle w:val="EndNoteBibliography"/>
         <w:spacing w:after="0"/>
         <w:ind w:left="720" w:hanging="720"/>
-      </w:pPr>
-      <w:r>
+        <w:rPr>
+          <w:rFonts w:asciiTheme="majorBidi" w:hAnsiTheme="majorBidi" w:cstheme="majorBidi"/>
+          <w:sz w:val="24"/>
+          <w:szCs w:val="24"/>
+        </w:rPr>
+      </w:pPr>
+      <w:r>
+        <w:rPr>
+          <w:rFonts w:asciiTheme="majorBidi" w:hAnsiTheme="majorBidi" w:cstheme="majorBidi"/>
+          <w:sz w:val="24"/>
+          <w:szCs w:val="24"/>
+        </w:rPr>
         <w:t xml:space="preserve">Hecht, J. S., Vogel, R. M., McManamay, R. A., Kroll, C. N., and Reed, J. M. (2020). "Decision Trees for Incorporating Hypothesis Tests of Hydrologic Alteration into Hydropower&amp;#x2013;Ecosystem Tradeoffs." </w:t>
       </w:r>
       <w:r>
         <w:rPr>
+          <w:rFonts w:asciiTheme="majorBidi" w:hAnsiTheme="majorBidi" w:cstheme="majorBidi"/>
           <w:i/>
+          <w:sz w:val="24"/>
+          <w:szCs w:val="24"/>
         </w:rPr>
         <w:t>Journal of Water Resources Planning and Management</w:t>
       </w:r>
       <w:r>
+        <w:rPr>
+          <w:rFonts w:asciiTheme="majorBidi" w:hAnsiTheme="majorBidi" w:cstheme="majorBidi"/>
+          <w:sz w:val="24"/>
+          <w:szCs w:val="24"/>
+        </w:rPr>
         <w:t xml:space="preserve">, 146(5), 04020017. </w:t>
       </w:r>
       <w:hyperlink r:id="rId33" w:history="1">
         <w:r>
           <w:rPr>
             <w:rStyle w:val="Hyperlink"/>
+            <w:rFonts w:asciiTheme="majorBidi" w:hAnsiTheme="majorBidi" w:cstheme="majorBidi"/>
+            <w:sz w:val="24"/>
+            <w:szCs w:val="24"/>
           </w:rPr>
           <w:t>https://doi.org/10.1061/(ASCE)WR.1943-5452.0001184</w:t>
         </w:r>
       </w:hyperlink>
       <w:r>
+        <w:rPr>
+          <w:rFonts w:asciiTheme="majorBidi" w:hAnsiTheme="majorBidi" w:cstheme="majorBidi"/>
+          <w:sz w:val="24"/>
+          <w:szCs w:val="24"/>
+        </w:rPr>
         <w:t>.</w:t>
       </w:r>
     </w:p>
@@ -11996,28 +12201,54 @@
         <w:pStyle w:val="EndNoteBibliography"/>
         <w:spacing w:after="0"/>
         <w:ind w:left="720" w:hanging="720"/>
-      </w:pPr>
-      <w:r>
+        <w:rPr>
+          <w:rFonts w:asciiTheme="majorBidi" w:hAnsiTheme="majorBidi" w:cstheme="majorBidi"/>
+          <w:sz w:val="24"/>
+          <w:szCs w:val="24"/>
+        </w:rPr>
+      </w:pPr>
+      <w:r>
+        <w:rPr>
+          <w:rFonts w:asciiTheme="majorBidi" w:hAnsiTheme="majorBidi" w:cstheme="majorBidi"/>
+          <w:sz w:val="24"/>
+          <w:szCs w:val="24"/>
+        </w:rPr>
         <w:t xml:space="preserve">Hegwood, M., Langendorf, R. E., and Burgess, M. G. (2022). "Why win–wins are rare in complex environmental management." </w:t>
       </w:r>
       <w:r>
         <w:rPr>
+          <w:rFonts w:asciiTheme="majorBidi" w:hAnsiTheme="majorBidi" w:cstheme="majorBidi"/>
           <w:i/>
+          <w:sz w:val="24"/>
+          <w:szCs w:val="24"/>
         </w:rPr>
         <w:t>Nature Sustainability</w:t>
       </w:r>
       <w:r>
+        <w:rPr>
+          <w:rFonts w:asciiTheme="majorBidi" w:hAnsiTheme="majorBidi" w:cstheme="majorBidi"/>
+          <w:sz w:val="24"/>
+          <w:szCs w:val="24"/>
+        </w:rPr>
         <w:t xml:space="preserve">. </w:t>
       </w:r>
       <w:hyperlink r:id="rId34" w:history="1">
         <w:r>
           <w:rPr>
             <w:rStyle w:val="Hyperlink"/>
+            <w:rFonts w:asciiTheme="majorBidi" w:hAnsiTheme="majorBidi" w:cstheme="majorBidi"/>
+            <w:sz w:val="24"/>
+            <w:szCs w:val="24"/>
           </w:rPr>
           <w:t>https://doi.org/10.1038/s41893-022-00866-z</w:t>
         </w:r>
       </w:hyperlink>
       <w:r>
+        <w:rPr>
+          <w:rFonts w:asciiTheme="majorBidi" w:hAnsiTheme="majorBidi" w:cstheme="majorBidi"/>
+          <w:sz w:val="24"/>
+          <w:szCs w:val="24"/>
+        </w:rPr>
         <w:t>.</w:t>
       </w:r>
     </w:p>
@@ -12026,17 +12257,35 @@
         <w:pStyle w:val="EndNoteBibliography"/>
         <w:spacing w:after="0"/>
         <w:ind w:left="720" w:hanging="720"/>
-      </w:pPr>
-      <w:r>
+        <w:rPr>
+          <w:rFonts w:asciiTheme="majorBidi" w:hAnsiTheme="majorBidi" w:cstheme="majorBidi"/>
+          <w:sz w:val="24"/>
+          <w:szCs w:val="24"/>
+        </w:rPr>
+      </w:pPr>
+      <w:r>
+        <w:rPr>
+          <w:rFonts w:asciiTheme="majorBidi" w:hAnsiTheme="majorBidi" w:cstheme="majorBidi"/>
+          <w:sz w:val="24"/>
+          <w:szCs w:val="24"/>
+        </w:rPr>
         <w:t xml:space="preserve">Huizar, L., Díaz, S., Lansey, K., and Arnold, R. (2023). "Water Supply in the Lower Colorado River Basin: Effectiveness of the 2019 Drought Contingency Plan." </w:t>
       </w:r>
       <w:r>
         <w:rPr>
+          <w:rFonts w:asciiTheme="majorBidi" w:hAnsiTheme="majorBidi" w:cstheme="majorBidi"/>
           <w:i/>
+          <w:sz w:val="24"/>
+          <w:szCs w:val="24"/>
         </w:rPr>
         <w:t>Journal of Environmental Engineering</w:t>
       </w:r>
       <w:r>
+        <w:rPr>
+          <w:rFonts w:asciiTheme="majorBidi" w:hAnsiTheme="majorBidi" w:cstheme="majorBidi"/>
+          <w:sz w:val="24"/>
+          <w:szCs w:val="24"/>
+        </w:rPr>
         <w:t>, 149(10), 04023058. doi:10.1061/JOEEDU.EEENG-7324.</w:t>
       </w:r>
     </w:p>
@@ -12045,19 +12294,37 @@
         <w:pStyle w:val="EndNoteBibliography"/>
         <w:spacing w:after="0"/>
         <w:ind w:left="720" w:hanging="720"/>
-      </w:pPr>
-      <w:r>
+        <w:rPr>
+          <w:rFonts w:asciiTheme="majorBidi" w:hAnsiTheme="majorBidi" w:cstheme="majorBidi"/>
+          <w:sz w:val="24"/>
+          <w:szCs w:val="24"/>
+        </w:rPr>
+      </w:pPr>
+      <w:r>
+        <w:rPr>
+          <w:rFonts w:asciiTheme="majorBidi" w:hAnsiTheme="majorBidi" w:cstheme="majorBidi"/>
+          <w:sz w:val="24"/>
+          <w:szCs w:val="24"/>
+        </w:rPr>
         <w:t xml:space="preserve">IBWC. (2021). "Minutes between the United States and Mexican Sections of the IBWC." United States Section, </w:t>
       </w:r>
       <w:hyperlink r:id="rId35" w:history="1">
         <w:r>
           <w:rPr>
             <w:rStyle w:val="Hyperlink"/>
+            <w:rFonts w:asciiTheme="majorBidi" w:hAnsiTheme="majorBidi" w:cstheme="majorBidi"/>
+            <w:sz w:val="24"/>
+            <w:szCs w:val="24"/>
           </w:rPr>
           <w:t>https://www.ibwc.gov/Treaties_Minutes/Minutes.html</w:t>
         </w:r>
       </w:hyperlink>
       <w:r>
+        <w:rPr>
+          <w:rFonts w:asciiTheme="majorBidi" w:hAnsiTheme="majorBidi" w:cstheme="majorBidi"/>
+          <w:sz w:val="24"/>
+          <w:szCs w:val="24"/>
+        </w:rPr>
         <w:t xml:space="preserve"> [Accessed on: July 22, 2021].</w:t>
       </w:r>
     </w:p>
@@ -12066,17 +12333,35 @@
         <w:pStyle w:val="EndNoteBibliography"/>
         <w:spacing w:after="0"/>
         <w:ind w:left="720" w:hanging="720"/>
-      </w:pPr>
-      <w:r>
+        <w:rPr>
+          <w:rFonts w:asciiTheme="majorBidi" w:hAnsiTheme="majorBidi" w:cstheme="majorBidi"/>
+          <w:sz w:val="24"/>
+          <w:szCs w:val="24"/>
+        </w:rPr>
+      </w:pPr>
+      <w:r>
+        <w:rPr>
+          <w:rFonts w:asciiTheme="majorBidi" w:hAnsiTheme="majorBidi" w:cstheme="majorBidi"/>
+          <w:sz w:val="24"/>
+          <w:szCs w:val="24"/>
+        </w:rPr>
         <w:t xml:space="preserve">Kuhn, E., and Fleck, J. (2019). </w:t>
       </w:r>
       <w:r>
         <w:rPr>
+          <w:rFonts w:asciiTheme="majorBidi" w:hAnsiTheme="majorBidi" w:cstheme="majorBidi"/>
           <w:i/>
+          <w:sz w:val="24"/>
+          <w:szCs w:val="24"/>
         </w:rPr>
         <w:t>Science Be Dammed: How Ignoring Inconvenient Science Drained the Colorado River</w:t>
       </w:r>
       <w:r>
+        <w:rPr>
+          <w:rFonts w:asciiTheme="majorBidi" w:hAnsiTheme="majorBidi" w:cstheme="majorBidi"/>
+          <w:sz w:val="24"/>
+          <w:szCs w:val="24"/>
+        </w:rPr>
         <w:t>, University of Arizona Press.</w:t>
       </w:r>
     </w:p>
@@ -12085,28 +12370,63 @@
         <w:pStyle w:val="EndNoteBibliography"/>
         <w:spacing w:after="0"/>
         <w:ind w:left="720" w:hanging="720"/>
-      </w:pPr>
-      <w:r>
-        <w:t xml:space="preserve">Meehan, K., Jepson, W., Harris, L. M., Wutich, A., Beresford, M., Fencl, A., London, J., Pierce, G., Radonic, L., Wells, C., Wilson, N. J., Adams, E. A., Arsenault, R., Brewis, A., Harrington, V., Lambrinidou, Y., McGregor, D., Patrick, R., Pauli, B., Pearson, A. L., Shah, S., Splichalova, D., Workman, C., and Young, S. (2020). "Exposing the myths of household water insecurity in the global north: A critical review." </w:t>
-      </w:r>
-      <w:r>
-        <w:rPr>
+        <w:rPr>
+          <w:rFonts w:asciiTheme="majorBidi" w:hAnsiTheme="majorBidi" w:cstheme="majorBidi"/>
+          <w:sz w:val="24"/>
+          <w:szCs w:val="24"/>
+        </w:rPr>
+      </w:pPr>
+      <w:r>
+        <w:rPr>
+          <w:rFonts w:asciiTheme="majorBidi" w:hAnsiTheme="majorBidi" w:cstheme="majorBidi"/>
+          <w:sz w:val="24"/>
+          <w:szCs w:val="24"/>
+        </w:rPr>
+        <w:t xml:space="preserve">Meehan, K., Jepson, W., Harris, L. M., Wutich, A., Beresford, M., Fencl, A., London, J., Pierce, G., Radonic, L., Wells, C., Wilson, N. J., Adams, E. A., Arsenault, R., Brewis, A., Harrington, V., Lambrinidou, Y., McGregor, D., Patrick, R., Pauli, B., Pearson, A. L., Shah, S., Splichalova, D., Workman, C., and Young, S. (2020). "Exposing the myths of </w:t>
+      </w:r>
+      <w:r>
+        <w:rPr>
+          <w:rFonts w:asciiTheme="majorBidi" w:hAnsiTheme="majorBidi" w:cstheme="majorBidi"/>
+          <w:sz w:val="24"/>
+          <w:szCs w:val="24"/>
+        </w:rPr>
+        <w:lastRenderedPageBreak/>
+        <w:t xml:space="preserve">household water insecurity in the global north: A critical review." </w:t>
+      </w:r>
+      <w:r>
+        <w:rPr>
+          <w:rFonts w:asciiTheme="majorBidi" w:hAnsiTheme="majorBidi" w:cstheme="majorBidi"/>
           <w:i/>
+          <w:sz w:val="24"/>
+          <w:szCs w:val="24"/>
         </w:rPr>
         <w:t>WIREs Water</w:t>
       </w:r>
       <w:r>
+        <w:rPr>
+          <w:rFonts w:asciiTheme="majorBidi" w:hAnsiTheme="majorBidi" w:cstheme="majorBidi"/>
+          <w:sz w:val="24"/>
+          <w:szCs w:val="24"/>
+        </w:rPr>
         <w:t xml:space="preserve">, 7(6), e1486. </w:t>
       </w:r>
       <w:hyperlink r:id="rId36" w:history="1">
         <w:r>
           <w:rPr>
             <w:rStyle w:val="Hyperlink"/>
+            <w:rFonts w:asciiTheme="majorBidi" w:hAnsiTheme="majorBidi" w:cstheme="majorBidi"/>
+            <w:sz w:val="24"/>
+            <w:szCs w:val="24"/>
           </w:rPr>
           <w:t>https://doi.org/10.1002/wat2.1486</w:t>
         </w:r>
       </w:hyperlink>
       <w:r>
+        <w:rPr>
+          <w:rFonts w:asciiTheme="majorBidi" w:hAnsiTheme="majorBidi" w:cstheme="majorBidi"/>
+          <w:sz w:val="24"/>
+          <w:szCs w:val="24"/>
+        </w:rPr>
         <w:t>.</w:t>
       </w:r>
     </w:p>
@@ -12115,17 +12435,35 @@
         <w:pStyle w:val="EndNoteBibliography"/>
         <w:spacing w:after="0"/>
         <w:ind w:left="720" w:hanging="720"/>
-      </w:pPr>
-      <w:r>
+        <w:rPr>
+          <w:rFonts w:asciiTheme="majorBidi" w:hAnsiTheme="majorBidi" w:cstheme="majorBidi"/>
+          <w:sz w:val="24"/>
+          <w:szCs w:val="24"/>
+        </w:rPr>
+      </w:pPr>
+      <w:r>
+        <w:rPr>
+          <w:rFonts w:asciiTheme="majorBidi" w:hAnsiTheme="majorBidi" w:cstheme="majorBidi"/>
+          <w:sz w:val="24"/>
+          <w:szCs w:val="24"/>
+        </w:rPr>
         <w:t xml:space="preserve">Mileti, D. S. (1999). </w:t>
       </w:r>
       <w:r>
         <w:rPr>
+          <w:rFonts w:asciiTheme="majorBidi" w:hAnsiTheme="majorBidi" w:cstheme="majorBidi"/>
           <w:i/>
+          <w:sz w:val="24"/>
+          <w:szCs w:val="24"/>
         </w:rPr>
         <w:t>Disasters by Design: A Reassessment of Natural Hazards in the United States</w:t>
       </w:r>
       <w:r>
+        <w:rPr>
+          <w:rFonts w:asciiTheme="majorBidi" w:hAnsiTheme="majorBidi" w:cstheme="majorBidi"/>
+          <w:sz w:val="24"/>
+          <w:szCs w:val="24"/>
+        </w:rPr>
         <w:t>, Joseph Henry Press, Washington, D.C.</w:t>
       </w:r>
     </w:p>
@@ -12134,28 +12472,54 @@
         <w:pStyle w:val="EndNoteBibliography"/>
         <w:spacing w:after="0"/>
         <w:ind w:left="720" w:hanging="720"/>
-      </w:pPr>
-      <w:r>
+        <w:rPr>
+          <w:rFonts w:asciiTheme="majorBidi" w:hAnsiTheme="majorBidi" w:cstheme="majorBidi"/>
+          <w:sz w:val="24"/>
+          <w:szCs w:val="24"/>
+        </w:rPr>
+      </w:pPr>
+      <w:r>
+        <w:rPr>
+          <w:rFonts w:asciiTheme="majorBidi" w:hAnsiTheme="majorBidi" w:cstheme="majorBidi"/>
+          <w:sz w:val="24"/>
+          <w:szCs w:val="24"/>
+        </w:rPr>
         <w:t xml:space="preserve">Pace, C., Fencl, A., Baehner, L., Lukacs, H., Cushing, L. J., and Morello-Frosch, R. (2022). "The Drinking Water Tool: A Community-Driven Data Visualization Tool for Policy Implementation." </w:t>
       </w:r>
       <w:r>
         <w:rPr>
+          <w:rFonts w:asciiTheme="majorBidi" w:hAnsiTheme="majorBidi" w:cstheme="majorBidi"/>
           <w:i/>
+          <w:sz w:val="24"/>
+          <w:szCs w:val="24"/>
         </w:rPr>
         <w:t>International Journal of Environmental Research and Public Health</w:t>
       </w:r>
       <w:r>
+        <w:rPr>
+          <w:rFonts w:asciiTheme="majorBidi" w:hAnsiTheme="majorBidi" w:cstheme="majorBidi"/>
+          <w:sz w:val="24"/>
+          <w:szCs w:val="24"/>
+        </w:rPr>
         <w:t xml:space="preserve">, 19(3), 1419. </w:t>
       </w:r>
       <w:hyperlink r:id="rId37" w:history="1">
         <w:r>
           <w:rPr>
             <w:rStyle w:val="Hyperlink"/>
+            <w:rFonts w:asciiTheme="majorBidi" w:hAnsiTheme="majorBidi" w:cstheme="majorBidi"/>
+            <w:sz w:val="24"/>
+            <w:szCs w:val="24"/>
           </w:rPr>
           <w:t>https://www.mdpi.com/1660-4601/19/3/1419</w:t>
         </w:r>
       </w:hyperlink>
       <w:r>
+        <w:rPr>
+          <w:rFonts w:asciiTheme="majorBidi" w:hAnsiTheme="majorBidi" w:cstheme="majorBidi"/>
+          <w:sz w:val="24"/>
+          <w:szCs w:val="24"/>
+        </w:rPr>
         <w:t>.</w:t>
       </w:r>
     </w:p>
@@ -12164,29 +12528,54 @@
         <w:pStyle w:val="EndNoteBibliography"/>
         <w:spacing w:after="0"/>
         <w:ind w:left="720" w:hanging="720"/>
-      </w:pPr>
-      <w:r>
-        <w:lastRenderedPageBreak/>
+        <w:rPr>
+          <w:rFonts w:asciiTheme="majorBidi" w:hAnsiTheme="majorBidi" w:cstheme="majorBidi"/>
+          <w:sz w:val="24"/>
+          <w:szCs w:val="24"/>
+        </w:rPr>
+      </w:pPr>
+      <w:r>
+        <w:rPr>
+          <w:rFonts w:asciiTheme="majorBidi" w:hAnsiTheme="majorBidi" w:cstheme="majorBidi"/>
+          <w:sz w:val="24"/>
+          <w:szCs w:val="24"/>
+        </w:rPr>
         <w:t xml:space="preserve">Robison, J. A. (2017). "The Colorado River Revisited." </w:t>
       </w:r>
       <w:r>
         <w:rPr>
+          <w:rFonts w:asciiTheme="majorBidi" w:hAnsiTheme="majorBidi" w:cstheme="majorBidi"/>
           <w:i/>
+          <w:sz w:val="24"/>
+          <w:szCs w:val="24"/>
         </w:rPr>
         <w:t>University of Colorado Law Review</w:t>
       </w:r>
       <w:r>
+        <w:rPr>
+          <w:rFonts w:asciiTheme="majorBidi" w:hAnsiTheme="majorBidi" w:cstheme="majorBidi"/>
+          <w:sz w:val="24"/>
+          <w:szCs w:val="24"/>
+        </w:rPr>
         <w:t xml:space="preserve">, 88(3). </w:t>
       </w:r>
       <w:hyperlink r:id="rId38" w:history="1">
         <w:r>
           <w:rPr>
             <w:rStyle w:val="Hyperlink"/>
+            <w:rFonts w:asciiTheme="majorBidi" w:hAnsiTheme="majorBidi" w:cstheme="majorBidi"/>
+            <w:sz w:val="24"/>
+            <w:szCs w:val="24"/>
           </w:rPr>
           <w:t>https://heinonline.org/HOL/Page?handle=hein.journals/ucollr88&amp;id=511&amp;collection=journals&amp;index</w:t>
         </w:r>
       </w:hyperlink>
       <w:r>
+        <w:rPr>
+          <w:rFonts w:asciiTheme="majorBidi" w:hAnsiTheme="majorBidi" w:cstheme="majorBidi"/>
+          <w:sz w:val="24"/>
+          <w:szCs w:val="24"/>
+        </w:rPr>
         <w:t>=.</w:t>
       </w:r>
     </w:p>
@@ -12195,28 +12584,54 @@
         <w:pStyle w:val="EndNoteBibliography"/>
         <w:spacing w:after="0"/>
         <w:ind w:left="720" w:hanging="720"/>
-      </w:pPr>
-      <w:r>
+        <w:rPr>
+          <w:rFonts w:asciiTheme="majorBidi" w:hAnsiTheme="majorBidi" w:cstheme="majorBidi"/>
+          <w:sz w:val="24"/>
+          <w:szCs w:val="24"/>
+        </w:rPr>
+      </w:pPr>
+      <w:r>
+        <w:rPr>
+          <w:rFonts w:asciiTheme="majorBidi" w:hAnsiTheme="majorBidi" w:cstheme="majorBidi"/>
+          <w:sz w:val="24"/>
+          <w:szCs w:val="24"/>
+        </w:rPr>
         <w:t xml:space="preserve">Rosenberg, D., and Myers, A. (2026). "The Lake Mead Water Conservation Program Analysis." </w:t>
       </w:r>
       <w:r>
         <w:rPr>
+          <w:rFonts w:asciiTheme="majorBidi" w:hAnsiTheme="majorBidi" w:cstheme="majorBidi"/>
           <w:i/>
+          <w:sz w:val="24"/>
+          <w:szCs w:val="24"/>
         </w:rPr>
         <w:t>Hydroshare</w:t>
       </w:r>
       <w:r>
+        <w:rPr>
+          <w:rFonts w:asciiTheme="majorBidi" w:hAnsiTheme="majorBidi" w:cstheme="majorBidi"/>
+          <w:sz w:val="24"/>
+          <w:szCs w:val="24"/>
+        </w:rPr>
         <w:t xml:space="preserve">. </w:t>
       </w:r>
       <w:hyperlink r:id="rId39" w:history="1">
         <w:r>
           <w:rPr>
             <w:rStyle w:val="Hyperlink"/>
+            <w:rFonts w:asciiTheme="majorBidi" w:hAnsiTheme="majorBidi" w:cstheme="majorBidi"/>
+            <w:sz w:val="24"/>
+            <w:szCs w:val="24"/>
           </w:rPr>
           <w:t>http://www.hydroshare.org/resource/71a971cd51b64ef8a7030f25639c0a3c</w:t>
         </w:r>
       </w:hyperlink>
       <w:r>
+        <w:rPr>
+          <w:rFonts w:asciiTheme="majorBidi" w:hAnsiTheme="majorBidi" w:cstheme="majorBidi"/>
+          <w:sz w:val="24"/>
+          <w:szCs w:val="24"/>
+        </w:rPr>
         <w:t>.</w:t>
       </w:r>
     </w:p>
@@ -12225,28 +12640,54 @@
         <w:pStyle w:val="EndNoteBibliography"/>
         <w:spacing w:after="0"/>
         <w:ind w:left="720" w:hanging="720"/>
-      </w:pPr>
-      <w:r>
+        <w:rPr>
+          <w:rFonts w:asciiTheme="majorBidi" w:hAnsiTheme="majorBidi" w:cstheme="majorBidi"/>
+          <w:sz w:val="24"/>
+          <w:szCs w:val="24"/>
+        </w:rPr>
+      </w:pPr>
+      <w:r>
+        <w:rPr>
+          <w:rFonts w:asciiTheme="majorBidi" w:hAnsiTheme="majorBidi" w:cstheme="majorBidi"/>
+          <w:sz w:val="24"/>
+          <w:szCs w:val="24"/>
+        </w:rPr>
         <w:t xml:space="preserve">Rosenberg, D. E. (2022). "Adapt Lake Mead Releases to Inflow to Give Managers More Flexibility to Slow Reservoir Drawdown." </w:t>
       </w:r>
       <w:r>
         <w:rPr>
+          <w:rFonts w:asciiTheme="majorBidi" w:hAnsiTheme="majorBidi" w:cstheme="majorBidi"/>
           <w:i/>
+          <w:sz w:val="24"/>
+          <w:szCs w:val="24"/>
         </w:rPr>
         <w:t>Journal of Water Resources Planning and Management</w:t>
       </w:r>
       <w:r>
+        <w:rPr>
+          <w:rFonts w:asciiTheme="majorBidi" w:hAnsiTheme="majorBidi" w:cstheme="majorBidi"/>
+          <w:sz w:val="24"/>
+          <w:szCs w:val="24"/>
+        </w:rPr>
         <w:t xml:space="preserve">, 148(10), 02522006. </w:t>
       </w:r>
       <w:hyperlink r:id="rId40" w:history="1">
         <w:r>
           <w:rPr>
             <w:rStyle w:val="Hyperlink"/>
+            <w:rFonts w:asciiTheme="majorBidi" w:hAnsiTheme="majorBidi" w:cstheme="majorBidi"/>
+            <w:sz w:val="24"/>
+            <w:szCs w:val="24"/>
           </w:rPr>
           <w:t>https://doi.org/10.1061/(ASCE)WR.1943-5452.0001592</w:t>
         </w:r>
       </w:hyperlink>
       <w:r>
+        <w:rPr>
+          <w:rFonts w:asciiTheme="majorBidi" w:hAnsiTheme="majorBidi" w:cstheme="majorBidi"/>
+          <w:sz w:val="24"/>
+          <w:szCs w:val="24"/>
+        </w:rPr>
         <w:t>.</w:t>
       </w:r>
     </w:p>
@@ -12255,19 +12696,37 @@
         <w:pStyle w:val="EndNoteBibliography"/>
         <w:spacing w:after="0"/>
         <w:ind w:left="720" w:hanging="720"/>
-      </w:pPr>
-      <w:r>
+        <w:rPr>
+          <w:rFonts w:asciiTheme="majorBidi" w:hAnsiTheme="majorBidi" w:cstheme="majorBidi"/>
+          <w:sz w:val="24"/>
+          <w:szCs w:val="24"/>
+        </w:rPr>
+      </w:pPr>
+      <w:r>
+        <w:rPr>
+          <w:rFonts w:asciiTheme="majorBidi" w:hAnsiTheme="majorBidi" w:cstheme="majorBidi"/>
+          <w:sz w:val="24"/>
+          <w:szCs w:val="24"/>
+        </w:rPr>
         <w:t xml:space="preserve">Rosenberg, D. E. (2023). "Colorado River Basin Water Accounts: Provoke discussion about more adaptive reservoir operations." Hydroshare.org. </w:t>
       </w:r>
       <w:hyperlink r:id="rId41" w:history="1">
         <w:r>
           <w:rPr>
             <w:rStyle w:val="Hyperlink"/>
+            <w:rFonts w:asciiTheme="majorBidi" w:hAnsiTheme="majorBidi" w:cstheme="majorBidi"/>
+            <w:sz w:val="24"/>
+            <w:szCs w:val="24"/>
           </w:rPr>
           <w:t>https://doi.org/10.4211/hs.090be1e69e734c8991a1c4d8f9b9e21c</w:t>
         </w:r>
       </w:hyperlink>
       <w:r>
+        <w:rPr>
+          <w:rFonts w:asciiTheme="majorBidi" w:hAnsiTheme="majorBidi" w:cstheme="majorBidi"/>
+          <w:sz w:val="24"/>
+          <w:szCs w:val="24"/>
+        </w:rPr>
         <w:t>.</w:t>
       </w:r>
     </w:p>
@@ -12276,28 +12735,54 @@
         <w:pStyle w:val="EndNoteBibliography"/>
         <w:spacing w:after="0"/>
         <w:ind w:left="720" w:hanging="720"/>
-      </w:pPr>
-      <w:r>
+        <w:rPr>
+          <w:rFonts w:asciiTheme="majorBidi" w:hAnsiTheme="majorBidi" w:cstheme="majorBidi"/>
+          <w:sz w:val="24"/>
+          <w:szCs w:val="24"/>
+        </w:rPr>
+      </w:pPr>
+      <w:r>
+        <w:rPr>
+          <w:rFonts w:asciiTheme="majorBidi" w:hAnsiTheme="majorBidi" w:cstheme="majorBidi"/>
+          <w:sz w:val="24"/>
+          <w:szCs w:val="24"/>
+        </w:rPr>
         <w:t xml:space="preserve">Rosenberg, D. E. (2024). "Lessons from immersive online collaborative modeling to discuss more adaptive reservoir operations." </w:t>
       </w:r>
       <w:r>
         <w:rPr>
+          <w:rFonts w:asciiTheme="majorBidi" w:hAnsiTheme="majorBidi" w:cstheme="majorBidi"/>
           <w:i/>
+          <w:sz w:val="24"/>
+          <w:szCs w:val="24"/>
         </w:rPr>
         <w:t>Journal of Water Resources Planning and Management</w:t>
       </w:r>
       <w:r>
+        <w:rPr>
+          <w:rFonts w:asciiTheme="majorBidi" w:hAnsiTheme="majorBidi" w:cstheme="majorBidi"/>
+          <w:sz w:val="24"/>
+          <w:szCs w:val="24"/>
+        </w:rPr>
         <w:t xml:space="preserve">, 150(7). </w:t>
       </w:r>
       <w:hyperlink r:id="rId42" w:history="1">
         <w:r>
           <w:rPr>
             <w:rStyle w:val="Hyperlink"/>
+            <w:rFonts w:asciiTheme="majorBidi" w:hAnsiTheme="majorBidi" w:cstheme="majorBidi"/>
+            <w:sz w:val="24"/>
+            <w:szCs w:val="24"/>
           </w:rPr>
           <w:t>https://doi.org/10.1061/JWRMD5.WRENG-5893</w:t>
         </w:r>
       </w:hyperlink>
       <w:r>
+        <w:rPr>
+          <w:rFonts w:asciiTheme="majorBidi" w:hAnsiTheme="majorBidi" w:cstheme="majorBidi"/>
+          <w:sz w:val="24"/>
+          <w:szCs w:val="24"/>
+        </w:rPr>
         <w:t>.</w:t>
       </w:r>
     </w:p>
@@ -12306,28 +12791,54 @@
         <w:pStyle w:val="EndNoteBibliography"/>
         <w:spacing w:after="0"/>
         <w:ind w:left="720" w:hanging="720"/>
-      </w:pPr>
-      <w:r>
+        <w:rPr>
+          <w:rFonts w:asciiTheme="majorBidi" w:hAnsiTheme="majorBidi" w:cstheme="majorBidi"/>
+          <w:sz w:val="24"/>
+          <w:szCs w:val="24"/>
+        </w:rPr>
+      </w:pPr>
+      <w:r>
+        <w:rPr>
+          <w:rFonts w:asciiTheme="majorBidi" w:hAnsiTheme="majorBidi" w:cstheme="majorBidi"/>
+          <w:sz w:val="24"/>
+          <w:szCs w:val="24"/>
+        </w:rPr>
         <w:t xml:space="preserve">Salehabadi, H., Tarboton, D. G., Udall, B., Wheeler, K. G., and Schmidt, J. C. (2022). "An Assessment of Potential Severe Droughts in the Colorado River Basin." </w:t>
       </w:r>
       <w:r>
         <w:rPr>
+          <w:rFonts w:asciiTheme="majorBidi" w:hAnsiTheme="majorBidi" w:cstheme="majorBidi"/>
           <w:i/>
+          <w:sz w:val="24"/>
+          <w:szCs w:val="24"/>
         </w:rPr>
         <w:t>JAWRA Journal of the American Water Resources Association</w:t>
       </w:r>
       <w:r>
+        <w:rPr>
+          <w:rFonts w:asciiTheme="majorBidi" w:hAnsiTheme="majorBidi" w:cstheme="majorBidi"/>
+          <w:sz w:val="24"/>
+          <w:szCs w:val="24"/>
+        </w:rPr>
         <w:t xml:space="preserve">, 58(6), 1053-1075. </w:t>
       </w:r>
       <w:hyperlink r:id="rId43" w:history="1">
         <w:r>
           <w:rPr>
             <w:rStyle w:val="Hyperlink"/>
+            <w:rFonts w:asciiTheme="majorBidi" w:hAnsiTheme="majorBidi" w:cstheme="majorBidi"/>
+            <w:sz w:val="24"/>
+            <w:szCs w:val="24"/>
           </w:rPr>
           <w:t>https://doi.org/10.1111/1752-1688.13061</w:t>
         </w:r>
       </w:hyperlink>
       <w:r>
+        <w:rPr>
+          <w:rFonts w:asciiTheme="majorBidi" w:hAnsiTheme="majorBidi" w:cstheme="majorBidi"/>
+          <w:sz w:val="24"/>
+          <w:szCs w:val="24"/>
+        </w:rPr>
         <w:t>.</w:t>
       </w:r>
     </w:p>
@@ -12336,28 +12847,54 @@
         <w:pStyle w:val="EndNoteBibliography"/>
         <w:spacing w:after="0"/>
         <w:ind w:left="720" w:hanging="720"/>
-      </w:pPr>
-      <w:r>
+        <w:rPr>
+          <w:rFonts w:asciiTheme="majorBidi" w:hAnsiTheme="majorBidi" w:cstheme="majorBidi"/>
+          <w:sz w:val="24"/>
+          <w:szCs w:val="24"/>
+        </w:rPr>
+      </w:pPr>
+      <w:r>
+        <w:rPr>
+          <w:rFonts w:asciiTheme="majorBidi" w:hAnsiTheme="majorBidi" w:cstheme="majorBidi"/>
+          <w:sz w:val="24"/>
+          <w:szCs w:val="24"/>
+        </w:rPr>
         <w:t xml:space="preserve">Salehabadi, H., Tarboton, D. G., Wheeler, K. G., Smith, R., and Baker, S. (2024). "Quantifying and Classifying Streamflow Ensembles Using a Broad Range of Metrics for an Evidence-Based Analysis: Colorado River Case Study." </w:t>
       </w:r>
       <w:r>
         <w:rPr>
+          <w:rFonts w:asciiTheme="majorBidi" w:hAnsiTheme="majorBidi" w:cstheme="majorBidi"/>
           <w:i/>
+          <w:sz w:val="24"/>
+          <w:szCs w:val="24"/>
         </w:rPr>
         <w:t>Water Resources Research</w:t>
       </w:r>
       <w:r>
+        <w:rPr>
+          <w:rFonts w:asciiTheme="majorBidi" w:hAnsiTheme="majorBidi" w:cstheme="majorBidi"/>
+          <w:sz w:val="24"/>
+          <w:szCs w:val="24"/>
+        </w:rPr>
         <w:t xml:space="preserve">, 60(7), e2024WR037225. </w:t>
       </w:r>
       <w:hyperlink r:id="rId44" w:history="1">
         <w:r>
           <w:rPr>
             <w:rStyle w:val="Hyperlink"/>
+            <w:rFonts w:asciiTheme="majorBidi" w:hAnsiTheme="majorBidi" w:cstheme="majorBidi"/>
+            <w:sz w:val="24"/>
+            <w:szCs w:val="24"/>
           </w:rPr>
           <w:t>https://doi.org/10.1029/2024WR037225</w:t>
         </w:r>
       </w:hyperlink>
       <w:r>
+        <w:rPr>
+          <w:rFonts w:asciiTheme="majorBidi" w:hAnsiTheme="majorBidi" w:cstheme="majorBidi"/>
+          <w:sz w:val="24"/>
+          <w:szCs w:val="24"/>
+        </w:rPr>
         <w:t>.</w:t>
       </w:r>
     </w:p>
@@ -12366,28 +12903,54 @@
         <w:pStyle w:val="EndNoteBibliography"/>
         <w:spacing w:after="0"/>
         <w:ind w:left="720" w:hanging="720"/>
-      </w:pPr>
-      <w:r>
+        <w:rPr>
+          <w:rFonts w:asciiTheme="majorBidi" w:hAnsiTheme="majorBidi" w:cstheme="majorBidi"/>
+          <w:sz w:val="24"/>
+          <w:szCs w:val="24"/>
+        </w:rPr>
+      </w:pPr>
+      <w:r>
+        <w:rPr>
+          <w:rFonts w:asciiTheme="majorBidi" w:hAnsiTheme="majorBidi" w:cstheme="majorBidi"/>
+          <w:sz w:val="24"/>
+          <w:szCs w:val="24"/>
+        </w:rPr>
         <w:t xml:space="preserve">Smith, R., Zagona, E., Kasprzyk, J., Bonham, N., Alexander, E., Butler, A., Prairie, J., and Jerla, C. (2022). "Decision Science Can Help Address the Challenges of Long-Term Planning in the Colorado River Basin." </w:t>
       </w:r>
       <w:r>
         <w:rPr>
+          <w:rFonts w:asciiTheme="majorBidi" w:hAnsiTheme="majorBidi" w:cstheme="majorBidi"/>
           <w:i/>
+          <w:sz w:val="24"/>
+          <w:szCs w:val="24"/>
         </w:rPr>
         <w:t>JAWRA Journal of the American Water Resources Association</w:t>
       </w:r>
       <w:r>
+        <w:rPr>
+          <w:rFonts w:asciiTheme="majorBidi" w:hAnsiTheme="majorBidi" w:cstheme="majorBidi"/>
+          <w:sz w:val="24"/>
+          <w:szCs w:val="24"/>
+        </w:rPr>
         <w:t xml:space="preserve">, 58(5), 735-745. </w:t>
       </w:r>
       <w:hyperlink r:id="rId45" w:history="1">
         <w:r>
           <w:rPr>
             <w:rStyle w:val="Hyperlink"/>
+            <w:rFonts w:asciiTheme="majorBidi" w:hAnsiTheme="majorBidi" w:cstheme="majorBidi"/>
+            <w:sz w:val="24"/>
+            <w:szCs w:val="24"/>
           </w:rPr>
           <w:t>https://doi.org/10.1111/1752-1688.12985</w:t>
         </w:r>
       </w:hyperlink>
       <w:r>
+        <w:rPr>
+          <w:rFonts w:asciiTheme="majorBidi" w:hAnsiTheme="majorBidi" w:cstheme="majorBidi"/>
+          <w:sz w:val="24"/>
+          <w:szCs w:val="24"/>
+        </w:rPr>
         <w:t>.</w:t>
       </w:r>
     </w:p>
@@ -12396,28 +12959,54 @@
         <w:pStyle w:val="EndNoteBibliography"/>
         <w:spacing w:after="0"/>
         <w:ind w:left="720" w:hanging="720"/>
-      </w:pPr>
-      <w:r>
+        <w:rPr>
+          <w:rFonts w:asciiTheme="majorBidi" w:hAnsiTheme="majorBidi" w:cstheme="majorBidi"/>
+          <w:sz w:val="24"/>
+          <w:szCs w:val="24"/>
+        </w:rPr>
+      </w:pPr>
+      <w:r>
+        <w:rPr>
+          <w:rFonts w:asciiTheme="majorBidi" w:hAnsiTheme="majorBidi" w:cstheme="majorBidi"/>
+          <w:sz w:val="24"/>
+          <w:szCs w:val="24"/>
+        </w:rPr>
         <w:t xml:space="preserve">Stelter, D. (2022). "Towards a Utah Intentionally Created Surplus Program." </w:t>
       </w:r>
       <w:r>
         <w:rPr>
+          <w:rFonts w:asciiTheme="majorBidi" w:hAnsiTheme="majorBidi" w:cstheme="majorBidi"/>
           <w:i/>
+          <w:sz w:val="24"/>
+          <w:szCs w:val="24"/>
         </w:rPr>
         <w:t>Sustainable Development Law and Policy</w:t>
       </w:r>
       <w:r>
+        <w:rPr>
+          <w:rFonts w:asciiTheme="majorBidi" w:hAnsiTheme="majorBidi" w:cstheme="majorBidi"/>
+          <w:sz w:val="24"/>
+          <w:szCs w:val="24"/>
+        </w:rPr>
         <w:t xml:space="preserve">, 22(2), 4-21. </w:t>
       </w:r>
       <w:hyperlink r:id="rId46" w:history="1">
         <w:r>
           <w:rPr>
             <w:rStyle w:val="Hyperlink"/>
+            <w:rFonts w:asciiTheme="majorBidi" w:hAnsiTheme="majorBidi" w:cstheme="majorBidi"/>
+            <w:sz w:val="24"/>
+            <w:szCs w:val="24"/>
           </w:rPr>
           <w:t>https://heinonline.org/HOL/Page?collection=journals&amp;handle=hein.journals/sdlp22&amp;id=44&amp;men_tab=srchresults</w:t>
         </w:r>
       </w:hyperlink>
       <w:r>
+        <w:rPr>
+          <w:rFonts w:asciiTheme="majorBidi" w:hAnsiTheme="majorBidi" w:cstheme="majorBidi"/>
+          <w:sz w:val="24"/>
+          <w:szCs w:val="24"/>
+        </w:rPr>
         <w:t>.</w:t>
       </w:r>
     </w:p>
@@ -12426,28 +13015,54 @@
         <w:pStyle w:val="EndNoteBibliography"/>
         <w:spacing w:after="0"/>
         <w:ind w:left="720" w:hanging="720"/>
-      </w:pPr>
-      <w:r>
+        <w:rPr>
+          <w:rFonts w:asciiTheme="majorBidi" w:hAnsiTheme="majorBidi" w:cstheme="majorBidi"/>
+          <w:sz w:val="24"/>
+          <w:szCs w:val="24"/>
+        </w:rPr>
+      </w:pPr>
+      <w:r>
+        <w:rPr>
+          <w:rFonts w:asciiTheme="majorBidi" w:hAnsiTheme="majorBidi" w:cstheme="majorBidi"/>
+          <w:sz w:val="24"/>
+          <w:szCs w:val="24"/>
+        </w:rPr>
         <w:t xml:space="preserve">Thomas, K., Hardy, R. D., Lazrus, H., Mendez, M., Orlove, B., Rivera-Collazo, I., Roberts, J. T., Rockman, M., Warner, B. P., and Winthrop, R. (2019). "Explaining differential vulnerability to climate change: A social science review." </w:t>
       </w:r>
       <w:r>
         <w:rPr>
+          <w:rFonts w:asciiTheme="majorBidi" w:hAnsiTheme="majorBidi" w:cstheme="majorBidi"/>
           <w:i/>
+          <w:sz w:val="24"/>
+          <w:szCs w:val="24"/>
         </w:rPr>
         <w:t>WIREs Climate Change</w:t>
       </w:r>
       <w:r>
+        <w:rPr>
+          <w:rFonts w:asciiTheme="majorBidi" w:hAnsiTheme="majorBidi" w:cstheme="majorBidi"/>
+          <w:sz w:val="24"/>
+          <w:szCs w:val="24"/>
+        </w:rPr>
         <w:t xml:space="preserve">, 10(2), e565. </w:t>
       </w:r>
       <w:hyperlink r:id="rId47" w:history="1">
         <w:r>
           <w:rPr>
             <w:rStyle w:val="Hyperlink"/>
+            <w:rFonts w:asciiTheme="majorBidi" w:hAnsiTheme="majorBidi" w:cstheme="majorBidi"/>
+            <w:sz w:val="24"/>
+            <w:szCs w:val="24"/>
           </w:rPr>
           <w:t>https://doi.org/10.1002/wcc.565</w:t>
         </w:r>
       </w:hyperlink>
       <w:r>
+        <w:rPr>
+          <w:rFonts w:asciiTheme="majorBidi" w:hAnsiTheme="majorBidi" w:cstheme="majorBidi"/>
+          <w:sz w:val="24"/>
+          <w:szCs w:val="24"/>
+        </w:rPr>
         <w:t>.</w:t>
       </w:r>
     </w:p>
@@ -12456,28 +13071,55 @@
         <w:pStyle w:val="EndNoteBibliography"/>
         <w:spacing w:after="0"/>
         <w:ind w:left="720" w:hanging="720"/>
-      </w:pPr>
-      <w:r>
+        <w:rPr>
+          <w:rFonts w:asciiTheme="majorBidi" w:hAnsiTheme="majorBidi" w:cstheme="majorBidi"/>
+          <w:sz w:val="24"/>
+          <w:szCs w:val="24"/>
+        </w:rPr>
+      </w:pPr>
+      <w:r>
+        <w:rPr>
+          <w:rFonts w:asciiTheme="majorBidi" w:hAnsiTheme="majorBidi" w:cstheme="majorBidi"/>
+          <w:sz w:val="24"/>
+          <w:szCs w:val="24"/>
+        </w:rPr>
+        <w:lastRenderedPageBreak/>
         <w:t xml:space="preserve">UCRC. (2018). "Colorado River System Conservation Pilot Program in the Upper Colorado River Basin." </w:t>
       </w:r>
       <w:r>
         <w:rPr>
+          <w:rFonts w:asciiTheme="majorBidi" w:hAnsiTheme="majorBidi" w:cstheme="majorBidi"/>
           <w:i/>
+          <w:sz w:val="24"/>
+          <w:szCs w:val="24"/>
         </w:rPr>
         <w:t>Upper Colorado River Commission</w:t>
       </w:r>
       <w:r>
+        <w:rPr>
+          <w:rFonts w:asciiTheme="majorBidi" w:hAnsiTheme="majorBidi" w:cstheme="majorBidi"/>
+          <w:sz w:val="24"/>
+          <w:szCs w:val="24"/>
+        </w:rPr>
         <w:t xml:space="preserve">. </w:t>
       </w:r>
       <w:hyperlink r:id="rId48" w:history="1">
         <w:r>
           <w:rPr>
             <w:rStyle w:val="Hyperlink"/>
+            <w:rFonts w:asciiTheme="majorBidi" w:hAnsiTheme="majorBidi" w:cstheme="majorBidi"/>
+            <w:sz w:val="24"/>
+            <w:szCs w:val="24"/>
           </w:rPr>
           <w:t>http://www.ucrcommission.com/RepDoc/SCPPDocuments/2018__SCPP_FUBRD.pdf</w:t>
         </w:r>
       </w:hyperlink>
       <w:r>
+        <w:rPr>
+          <w:rFonts w:asciiTheme="majorBidi" w:hAnsiTheme="majorBidi" w:cstheme="majorBidi"/>
+          <w:sz w:val="24"/>
+          <w:szCs w:val="24"/>
+        </w:rPr>
         <w:t>.</w:t>
       </w:r>
     </w:p>
@@ -12486,28 +13128,54 @@
         <w:pStyle w:val="EndNoteBibliography"/>
         <w:spacing w:after="0"/>
         <w:ind w:left="720" w:hanging="720"/>
-      </w:pPr>
-      <w:r>
+        <w:rPr>
+          <w:rFonts w:asciiTheme="majorBidi" w:hAnsiTheme="majorBidi" w:cstheme="majorBidi"/>
+          <w:sz w:val="24"/>
+          <w:szCs w:val="24"/>
+        </w:rPr>
+      </w:pPr>
+      <w:r>
+        <w:rPr>
+          <w:rFonts w:asciiTheme="majorBidi" w:hAnsiTheme="majorBidi" w:cstheme="majorBidi"/>
+          <w:sz w:val="24"/>
+          <w:szCs w:val="24"/>
+        </w:rPr>
         <w:t xml:space="preserve">UCRC. (2024). "Colorado River System Conservation Pilot Program in the Upper Colorado River Basin." </w:t>
       </w:r>
       <w:r>
         <w:rPr>
+          <w:rFonts w:asciiTheme="majorBidi" w:hAnsiTheme="majorBidi" w:cstheme="majorBidi"/>
           <w:i/>
+          <w:sz w:val="24"/>
+          <w:szCs w:val="24"/>
         </w:rPr>
         <w:t>Upper Colorado River Commission</w:t>
       </w:r>
       <w:r>
+        <w:rPr>
+          <w:rFonts w:asciiTheme="majorBidi" w:hAnsiTheme="majorBidi" w:cstheme="majorBidi"/>
+          <w:sz w:val="24"/>
+          <w:szCs w:val="24"/>
+        </w:rPr>
         <w:t xml:space="preserve">. </w:t>
       </w:r>
       <w:hyperlink r:id="rId49" w:history="1">
         <w:r>
           <w:rPr>
             <w:rStyle w:val="Hyperlink"/>
+            <w:rFonts w:asciiTheme="majorBidi" w:hAnsiTheme="majorBidi" w:cstheme="majorBidi"/>
+            <w:sz w:val="24"/>
+            <w:szCs w:val="24"/>
           </w:rPr>
           <w:t>http://www.ucrcommission.com/wp-content/uploads/2024/06/2023_SCPP_Report_June2024.pdf</w:t>
         </w:r>
       </w:hyperlink>
       <w:r>
+        <w:rPr>
+          <w:rFonts w:asciiTheme="majorBidi" w:hAnsiTheme="majorBidi" w:cstheme="majorBidi"/>
+          <w:sz w:val="24"/>
+          <w:szCs w:val="24"/>
+        </w:rPr>
         <w:t>.</w:t>
       </w:r>
     </w:p>
@@ -12516,28 +13184,54 @@
         <w:pStyle w:val="EndNoteBibliography"/>
         <w:spacing w:after="0"/>
         <w:ind w:left="720" w:hanging="720"/>
-      </w:pPr>
-      <w:r>
+        <w:rPr>
+          <w:rFonts w:asciiTheme="majorBidi" w:hAnsiTheme="majorBidi" w:cstheme="majorBidi"/>
+          <w:sz w:val="24"/>
+          <w:szCs w:val="24"/>
+        </w:rPr>
+      </w:pPr>
+      <w:r>
+        <w:rPr>
+          <w:rFonts w:asciiTheme="majorBidi" w:hAnsiTheme="majorBidi" w:cstheme="majorBidi"/>
+          <w:sz w:val="24"/>
+          <w:szCs w:val="24"/>
+        </w:rPr>
         <w:t xml:space="preserve">Udall, B., and Overpeck, J. (2017). "The twenty‐first century Colorado River hot drought and implications for the future." </w:t>
       </w:r>
       <w:r>
         <w:rPr>
+          <w:rFonts w:asciiTheme="majorBidi" w:hAnsiTheme="majorBidi" w:cstheme="majorBidi"/>
           <w:i/>
+          <w:sz w:val="24"/>
+          <w:szCs w:val="24"/>
         </w:rPr>
         <w:t>Water Resources Research</w:t>
       </w:r>
       <w:r>
+        <w:rPr>
+          <w:rFonts w:asciiTheme="majorBidi" w:hAnsiTheme="majorBidi" w:cstheme="majorBidi"/>
+          <w:sz w:val="24"/>
+          <w:szCs w:val="24"/>
+        </w:rPr>
         <w:t xml:space="preserve">, 53(3), 2404-2418. </w:t>
       </w:r>
       <w:hyperlink r:id="rId50" w:history="1">
         <w:r>
           <w:rPr>
             <w:rStyle w:val="Hyperlink"/>
+            <w:rFonts w:asciiTheme="majorBidi" w:hAnsiTheme="majorBidi" w:cstheme="majorBidi"/>
+            <w:sz w:val="24"/>
+            <w:szCs w:val="24"/>
           </w:rPr>
           <w:t>https://doi.org/10.1002/2016WR019638</w:t>
         </w:r>
       </w:hyperlink>
       <w:r>
+        <w:rPr>
+          <w:rFonts w:asciiTheme="majorBidi" w:hAnsiTheme="majorBidi" w:cstheme="majorBidi"/>
+          <w:sz w:val="24"/>
+          <w:szCs w:val="24"/>
+        </w:rPr>
         <w:t>.</w:t>
       </w:r>
     </w:p>
@@ -12546,19 +13240,37 @@
         <w:pStyle w:val="EndNoteBibliography"/>
         <w:spacing w:after="0"/>
         <w:ind w:left="720" w:hanging="720"/>
-      </w:pPr>
-      <w:r>
+        <w:rPr>
+          <w:rFonts w:asciiTheme="majorBidi" w:hAnsiTheme="majorBidi" w:cstheme="majorBidi"/>
+          <w:sz w:val="24"/>
+          <w:szCs w:val="24"/>
+        </w:rPr>
+      </w:pPr>
+      <w:r>
+        <w:rPr>
+          <w:rFonts w:asciiTheme="majorBidi" w:hAnsiTheme="majorBidi" w:cstheme="majorBidi"/>
+          <w:sz w:val="24"/>
+          <w:szCs w:val="24"/>
+        </w:rPr>
         <w:t xml:space="preserve">USBR. (2007). "Record of Decision: Colorado River Interim Guidelines for Lower Basin Shortages and Coordinated Operations for Lakes Powell and Mead." U.S. Bureau of Reclamation. </w:t>
       </w:r>
       <w:hyperlink r:id="rId51" w:history="1">
         <w:r>
           <w:rPr>
             <w:rStyle w:val="Hyperlink"/>
+            <w:rFonts w:asciiTheme="majorBidi" w:hAnsiTheme="majorBidi" w:cstheme="majorBidi"/>
+            <w:sz w:val="24"/>
+            <w:szCs w:val="24"/>
           </w:rPr>
           <w:t>https://www.usbr.gov/lc/region/programs/strategies/RecordofDecision.pdf</w:t>
         </w:r>
       </w:hyperlink>
       <w:r>
+        <w:rPr>
+          <w:rFonts w:asciiTheme="majorBidi" w:hAnsiTheme="majorBidi" w:cstheme="majorBidi"/>
+          <w:sz w:val="24"/>
+          <w:szCs w:val="24"/>
+        </w:rPr>
         <w:t>.</w:t>
       </w:r>
     </w:p>
@@ -12567,19 +13279,37 @@
         <w:pStyle w:val="EndNoteBibliography"/>
         <w:spacing w:after="0"/>
         <w:ind w:left="720" w:hanging="720"/>
-      </w:pPr>
-      <w:r>
+        <w:rPr>
+          <w:rFonts w:asciiTheme="majorBidi" w:hAnsiTheme="majorBidi" w:cstheme="majorBidi"/>
+          <w:sz w:val="24"/>
+          <w:szCs w:val="24"/>
+        </w:rPr>
+      </w:pPr>
+      <w:r>
+        <w:rPr>
+          <w:rFonts w:asciiTheme="majorBidi" w:hAnsiTheme="majorBidi" w:cstheme="majorBidi"/>
+          <w:sz w:val="24"/>
+          <w:szCs w:val="24"/>
+        </w:rPr>
         <w:t xml:space="preserve">USBR. (2019). "Agreement Concerning Colorado River Drought Contingency Management and Operations." U.S. Bureau of Reclamation, Washington, DC. </w:t>
       </w:r>
       <w:hyperlink r:id="rId52" w:history="1">
         <w:r>
           <w:rPr>
             <w:rStyle w:val="Hyperlink"/>
+            <w:rFonts w:asciiTheme="majorBidi" w:hAnsiTheme="majorBidi" w:cstheme="majorBidi"/>
+            <w:sz w:val="24"/>
+            <w:szCs w:val="24"/>
           </w:rPr>
           <w:t>https://www.usbr.gov/ColoradoRiverBasin/dcp/index.html</w:t>
         </w:r>
       </w:hyperlink>
       <w:r>
+        <w:rPr>
+          <w:rFonts w:asciiTheme="majorBidi" w:hAnsiTheme="majorBidi" w:cstheme="majorBidi"/>
+          <w:sz w:val="24"/>
+          <w:szCs w:val="24"/>
+        </w:rPr>
         <w:t>.</w:t>
       </w:r>
     </w:p>
@@ -12588,20 +13318,37 @@
         <w:pStyle w:val="EndNoteBibliography"/>
         <w:spacing w:after="0"/>
         <w:ind w:left="720" w:hanging="720"/>
-      </w:pPr>
-      <w:r>
-        <w:lastRenderedPageBreak/>
+        <w:rPr>
+          <w:rFonts w:asciiTheme="majorBidi" w:hAnsiTheme="majorBidi" w:cstheme="majorBidi"/>
+          <w:sz w:val="24"/>
+          <w:szCs w:val="24"/>
+        </w:rPr>
+      </w:pPr>
+      <w:r>
+        <w:rPr>
+          <w:rFonts w:asciiTheme="majorBidi" w:hAnsiTheme="majorBidi" w:cstheme="majorBidi"/>
+          <w:sz w:val="24"/>
+          <w:szCs w:val="24"/>
+        </w:rPr>
         <w:t xml:space="preserve">USBR. (2021). "Pilot System Conservation Program." U.S. Bureau of Reclamation, </w:t>
       </w:r>
       <w:hyperlink r:id="rId53" w:history="1">
         <w:r>
           <w:rPr>
             <w:rStyle w:val="Hyperlink"/>
+            <w:rFonts w:asciiTheme="majorBidi" w:hAnsiTheme="majorBidi" w:cstheme="majorBidi"/>
+            <w:sz w:val="24"/>
+            <w:szCs w:val="24"/>
           </w:rPr>
           <w:t>https://www.usbr.gov/lc/region/programs/PilotSysConsProg/pilotsystem.html</w:t>
         </w:r>
       </w:hyperlink>
       <w:r>
+        <w:rPr>
+          <w:rFonts w:asciiTheme="majorBidi" w:hAnsiTheme="majorBidi" w:cstheme="majorBidi"/>
+          <w:sz w:val="24"/>
+          <w:szCs w:val="24"/>
+        </w:rPr>
         <w:t xml:space="preserve"> [Accessed on: October 14, 2021].</w:t>
       </w:r>
     </w:p>
@@ -12610,19 +13357,37 @@
         <w:pStyle w:val="EndNoteBibliography"/>
         <w:spacing w:after="0"/>
         <w:ind w:left="720" w:hanging="720"/>
-      </w:pPr>
-      <w:r>
+        <w:rPr>
+          <w:rFonts w:asciiTheme="majorBidi" w:hAnsiTheme="majorBidi" w:cstheme="majorBidi"/>
+          <w:sz w:val="24"/>
+          <w:szCs w:val="24"/>
+        </w:rPr>
+      </w:pPr>
+      <w:r>
+        <w:rPr>
+          <w:rFonts w:asciiTheme="majorBidi" w:hAnsiTheme="majorBidi" w:cstheme="majorBidi"/>
+          <w:sz w:val="24"/>
+          <w:szCs w:val="24"/>
+        </w:rPr>
         <w:t xml:space="preserve">USBR. (2026a). "Boulder Canyon Operations Office - Program and Activities: Water Accounting Reports." U.S. Bureau of Reclamation. </w:t>
       </w:r>
       <w:hyperlink r:id="rId54" w:history="1">
         <w:r>
           <w:rPr>
             <w:rStyle w:val="Hyperlink"/>
+            <w:rFonts w:asciiTheme="majorBidi" w:hAnsiTheme="majorBidi" w:cstheme="majorBidi"/>
+            <w:sz w:val="24"/>
+            <w:szCs w:val="24"/>
           </w:rPr>
           <w:t>https://www.usbr.gov/lc/region/g4000/wtracct.html</w:t>
         </w:r>
       </w:hyperlink>
       <w:r>
+        <w:rPr>
+          <w:rFonts w:asciiTheme="majorBidi" w:hAnsiTheme="majorBidi" w:cstheme="majorBidi"/>
+          <w:sz w:val="24"/>
+          <w:szCs w:val="24"/>
+        </w:rPr>
         <w:t>.</w:t>
       </w:r>
     </w:p>
@@ -12631,19 +13396,37 @@
         <w:pStyle w:val="EndNoteBibliography"/>
         <w:spacing w:after="0"/>
         <w:ind w:left="720" w:hanging="720"/>
-      </w:pPr>
-      <w:r>
+        <w:rPr>
+          <w:rFonts w:asciiTheme="majorBidi" w:hAnsiTheme="majorBidi" w:cstheme="majorBidi"/>
+          <w:sz w:val="24"/>
+          <w:szCs w:val="24"/>
+        </w:rPr>
+      </w:pPr>
+      <w:r>
+        <w:rPr>
+          <w:rFonts w:asciiTheme="majorBidi" w:hAnsiTheme="majorBidi" w:cstheme="majorBidi"/>
+          <w:sz w:val="24"/>
+          <w:szCs w:val="24"/>
+        </w:rPr>
         <w:t xml:space="preserve">USBR. (2026b). "Post-2026 Operational Guidelines and Strategies for Lake Powell and Lake Mead – Final Environmental Impact Statement." U.S. Bureau of Reclamation. </w:t>
       </w:r>
       <w:hyperlink r:id="rId55" w:history="1">
         <w:r>
           <w:rPr>
             <w:rStyle w:val="Hyperlink"/>
+            <w:rFonts w:asciiTheme="majorBidi" w:hAnsiTheme="majorBidi" w:cstheme="majorBidi"/>
+            <w:sz w:val="24"/>
+            <w:szCs w:val="24"/>
           </w:rPr>
           <w:t>https://www.usbr.gov/ColoradoRiverBasin/post2026/final-eis/index.html</w:t>
         </w:r>
       </w:hyperlink>
       <w:r>
+        <w:rPr>
+          <w:rFonts w:asciiTheme="majorBidi" w:hAnsiTheme="majorBidi" w:cstheme="majorBidi"/>
+          <w:sz w:val="24"/>
+          <w:szCs w:val="24"/>
+        </w:rPr>
         <w:t>.</w:t>
       </w:r>
     </w:p>
@@ -12652,28 +13435,54 @@
         <w:pStyle w:val="EndNoteBibliography"/>
         <w:spacing w:after="0"/>
         <w:ind w:left="720" w:hanging="720"/>
-      </w:pPr>
-      <w:r>
+        <w:rPr>
+          <w:rFonts w:asciiTheme="majorBidi" w:hAnsiTheme="majorBidi" w:cstheme="majorBidi"/>
+          <w:sz w:val="24"/>
+          <w:szCs w:val="24"/>
+        </w:rPr>
+      </w:pPr>
+      <w:r>
+        <w:rPr>
+          <w:rFonts w:asciiTheme="majorBidi" w:hAnsiTheme="majorBidi" w:cstheme="majorBidi"/>
+          <w:sz w:val="24"/>
+          <w:szCs w:val="24"/>
+        </w:rPr>
         <w:t xml:space="preserve">Wakhungu, M. J., Abdel-Mottaleb, N., Wells, E. C., and Zhang, Q. (2021). "Geospatial Vulnerability Framework for Identifying Water Infrastructure Inequalities." </w:t>
       </w:r>
       <w:r>
         <w:rPr>
+          <w:rFonts w:asciiTheme="majorBidi" w:hAnsiTheme="majorBidi" w:cstheme="majorBidi"/>
           <w:i/>
+          <w:sz w:val="24"/>
+          <w:szCs w:val="24"/>
         </w:rPr>
         <w:t>Journal of Environmental Engineering</w:t>
       </w:r>
       <w:r>
+        <w:rPr>
+          <w:rFonts w:asciiTheme="majorBidi" w:hAnsiTheme="majorBidi" w:cstheme="majorBidi"/>
+          <w:sz w:val="24"/>
+          <w:szCs w:val="24"/>
+        </w:rPr>
         <w:t xml:space="preserve">, 147(9), 04021034. </w:t>
       </w:r>
       <w:hyperlink r:id="rId56" w:history="1">
         <w:r>
           <w:rPr>
             <w:rStyle w:val="Hyperlink"/>
+            <w:rFonts w:asciiTheme="majorBidi" w:hAnsiTheme="majorBidi" w:cstheme="majorBidi"/>
+            <w:sz w:val="24"/>
+            <w:szCs w:val="24"/>
           </w:rPr>
           <w:t>https://doi.org/10.1061/(ASCE)EE.1943-7870.0001903</w:t>
         </w:r>
       </w:hyperlink>
       <w:r>
+        <w:rPr>
+          <w:rFonts w:asciiTheme="majorBidi" w:hAnsiTheme="majorBidi" w:cstheme="majorBidi"/>
+          <w:sz w:val="24"/>
+          <w:szCs w:val="24"/>
+        </w:rPr>
         <w:t>.</w:t>
       </w:r>
     </w:p>
@@ -12683,17 +13492,30 @@
         <w:ind w:left="720" w:hanging="720"/>
       </w:pPr>
       <w:r>
+        <w:rPr>
+          <w:rFonts w:asciiTheme="majorBidi" w:hAnsiTheme="majorBidi" w:cstheme="majorBidi"/>
+          <w:sz w:val="24"/>
+          <w:szCs w:val="24"/>
+        </w:rPr>
         <w:t xml:space="preserve">Wang, J., and Schmidt, J. C. (2020). "Stream flow and Losses of the Colorado River in the Southern Colorado Plateau." Center for Colorado River Studies, Utah State University, Logan, Utah. </w:t>
       </w:r>
       <w:hyperlink r:id="rId57" w:history="1">
         <w:r>
           <w:rPr>
             <w:rStyle w:val="Hyperlink"/>
+            <w:rFonts w:asciiTheme="majorBidi" w:hAnsiTheme="majorBidi" w:cstheme="majorBidi"/>
+            <w:sz w:val="24"/>
+            <w:szCs w:val="24"/>
           </w:rPr>
           <w:t>https://qcnr.usu.edu//coloradoriver/files/news/White-Paper-7.pdf</w:t>
         </w:r>
       </w:hyperlink>
       <w:r>
+        <w:rPr>
+          <w:rFonts w:asciiTheme="majorBidi" w:hAnsiTheme="majorBidi" w:cstheme="majorBidi"/>
+          <w:sz w:val="24"/>
+          <w:szCs w:val="24"/>
+        </w:rPr>
         <w:t>.</w:t>
       </w:r>
     </w:p>

</xml_diff>